<commit_message>
UPDATE - revise content in bozza_relazione.docx and remove temporary file
</commit_message>
<xml_diff>
--- a/StudentHome/bozza_relazione.docx
+++ b/StudentHome/bozza_relazione.docx
@@ -5,15 +5,42 @@
     <w:p>
       <w:pPr>
         <w:pStyle w:val="Testonormale"/>
+        <w:spacing w:after="240"/>
+        <w:jc w:val="center"/>
         <w:rPr>
           <w:rFonts w:ascii="Century Gothic" w:hAnsi="Century Gothic" w:cs="Courier New"/>
           <w:b/>
+          <w:sz w:val="44"/>
+          <w:szCs w:val="44"/>
         </w:rPr>
       </w:pPr>
       <w:r>
         <w:rPr>
           <w:rFonts w:ascii="Century Gothic" w:hAnsi="Century Gothic" w:cs="Courier New"/>
           <w:b/>
+          <w:sz w:val="44"/>
+          <w:szCs w:val="44"/>
+        </w:rPr>
+        <w:t>Progetto ISW</w:t>
+      </w:r>
+    </w:p>
+    <w:p>
+      <w:pPr>
+        <w:pStyle w:val="Testonormale"/>
+        <w:spacing w:after="240"/>
+        <w:rPr>
+          <w:rFonts w:ascii="Century Gothic" w:hAnsi="Century Gothic" w:cs="Courier New"/>
+          <w:b/>
+          <w:sz w:val="28"/>
+          <w:szCs w:val="28"/>
+        </w:rPr>
+      </w:pPr>
+      <w:r>
+        <w:rPr>
+          <w:rFonts w:ascii="Century Gothic" w:hAnsi="Century Gothic" w:cs="Courier New"/>
+          <w:b/>
+          <w:sz w:val="28"/>
+          <w:szCs w:val="28"/>
         </w:rPr>
         <w:t>Introduzione</w:t>
       </w:r>
@@ -21,648 +48,1006 @@
     <w:p>
       <w:pPr>
         <w:pStyle w:val="Testonormale"/>
-        <w:rPr>
-          <w:rFonts w:ascii="Century Gothic" w:hAnsi="Century Gothic" w:cs="Courier New"/>
-        </w:rPr>
-      </w:pPr>
-    </w:p>
-    <w:p>
-      <w:pPr>
-        <w:pStyle w:val="Testonormale"/>
-        <w:rPr>
-          <w:rFonts w:ascii="Century Gothic" w:hAnsi="Century Gothic" w:cs="Courier New"/>
-        </w:rPr>
-      </w:pPr>
-      <w:r>
-        <w:rPr>
-          <w:rFonts w:ascii="Century Gothic" w:hAnsi="Century Gothic" w:cs="Courier New"/>
-        </w:rPr>
-        <w:t>Benvenuti nel sito di StudentHome. Questa applicazione web è un servizio gratuito per gli studenti</w:t>
-      </w:r>
-      <w:r>
-        <w:rPr>
-          <w:rFonts w:ascii="Century Gothic" w:hAnsi="Century Gothic" w:cs="Courier New"/>
+        <w:jc w:val="both"/>
+        <w:rPr>
+          <w:rFonts w:ascii="Century Gothic" w:hAnsi="Century Gothic" w:cs="Courier New"/>
+          <w:sz w:val="22"/>
+          <w:szCs w:val="22"/>
+        </w:rPr>
+      </w:pPr>
+      <w:r>
+        <w:rPr>
+          <w:rFonts w:ascii="Century Gothic" w:hAnsi="Century Gothic" w:cs="Courier New"/>
+          <w:sz w:val="22"/>
+          <w:szCs w:val="22"/>
+        </w:rPr>
+        <w:t xml:space="preserve">Benvenuti nel sito di </w:t>
+      </w:r>
+      <w:proofErr w:type="spellStart"/>
+      <w:r>
+        <w:rPr>
+          <w:rFonts w:ascii="Century Gothic" w:hAnsi="Century Gothic" w:cs="Courier New"/>
+          <w:sz w:val="22"/>
+          <w:szCs w:val="22"/>
+        </w:rPr>
+        <w:t>StudentHome</w:t>
+      </w:r>
+      <w:proofErr w:type="spellEnd"/>
+      <w:r>
+        <w:rPr>
+          <w:rFonts w:ascii="Century Gothic" w:hAnsi="Century Gothic" w:cs="Courier New"/>
+          <w:sz w:val="22"/>
+          <w:szCs w:val="22"/>
+        </w:rPr>
+        <w:t>. Questa applicazione web è un servizio gratuito per gli studenti</w:t>
+      </w:r>
+      <w:r>
+        <w:rPr>
+          <w:rFonts w:ascii="Century Gothic" w:hAnsi="Century Gothic" w:cs="Courier New"/>
+          <w:sz w:val="22"/>
+          <w:szCs w:val="22"/>
         </w:rPr>
         <w:t>,</w:t>
       </w:r>
       <w:r>
         <w:rPr>
           <w:rFonts w:ascii="Century Gothic" w:hAnsi="Century Gothic" w:cs="Courier New"/>
+          <w:sz w:val="22"/>
+          <w:szCs w:val="22"/>
         </w:rPr>
         <w:t xml:space="preserve"> ideata appunto per mettere in relazione studenti che hanno esigenza di affittare un appartamento, camera o solo un posto letto a prezzi concorrenziali con tutti i confort che si possono avere</w:t>
       </w:r>
       <w:r>
         <w:rPr>
           <w:rFonts w:ascii="Century Gothic" w:hAnsi="Century Gothic" w:cs="Courier New"/>
+          <w:sz w:val="22"/>
+          <w:szCs w:val="22"/>
         </w:rPr>
         <w:t xml:space="preserve">. Il tutto </w:t>
       </w:r>
       <w:r>
         <w:rPr>
           <w:rFonts w:ascii="Century Gothic" w:hAnsi="Century Gothic" w:cs="Courier New"/>
+          <w:sz w:val="22"/>
+          <w:szCs w:val="22"/>
         </w:rPr>
         <w:t xml:space="preserve">senza </w:t>
       </w:r>
       <w:r>
         <w:rPr>
           <w:rFonts w:ascii="Century Gothic" w:hAnsi="Century Gothic" w:cs="Courier New"/>
+          <w:sz w:val="22"/>
+          <w:szCs w:val="22"/>
         </w:rPr>
         <w:t xml:space="preserve">nessuna </w:t>
       </w:r>
       <w:r>
         <w:rPr>
           <w:rFonts w:ascii="Century Gothic" w:hAnsi="Century Gothic" w:cs="Courier New"/>
+          <w:sz w:val="22"/>
+          <w:szCs w:val="22"/>
         </w:rPr>
         <w:t xml:space="preserve">agenzia di intermediazione. </w:t>
       </w:r>
       <w:r>
         <w:rPr>
           <w:rFonts w:ascii="Century Gothic" w:hAnsi="Century Gothic" w:cs="Courier New"/>
+          <w:sz w:val="22"/>
+          <w:szCs w:val="22"/>
         </w:rPr>
         <w:t xml:space="preserve">Grazie al nostro sito potrete controllare la distanza </w:t>
       </w:r>
       <w:r>
         <w:rPr>
           <w:rFonts w:ascii="Century Gothic" w:hAnsi="Century Gothic" w:cs="Courier New"/>
+          <w:sz w:val="22"/>
+          <w:szCs w:val="22"/>
         </w:rPr>
         <w:t>dall’alloggio di vostro interesse</w:t>
       </w:r>
       <w:r>
         <w:rPr>
           <w:rFonts w:ascii="Century Gothic" w:hAnsi="Century Gothic" w:cs="Courier New"/>
+          <w:sz w:val="22"/>
+          <w:szCs w:val="22"/>
+        </w:rPr>
+        <w:t xml:space="preserve"> a</w:t>
+      </w:r>
+      <w:r>
+        <w:rPr>
+          <w:rFonts w:ascii="Century Gothic" w:hAnsi="Century Gothic" w:cs="Courier New"/>
+          <w:sz w:val="22"/>
+          <w:szCs w:val="22"/>
+        </w:rPr>
+        <w:t xml:space="preserve">l Campus </w:t>
+      </w:r>
+      <w:r>
+        <w:rPr>
+          <w:rFonts w:ascii="Century Gothic" w:hAnsi="Century Gothic" w:cs="Courier New"/>
+          <w:sz w:val="22"/>
+          <w:szCs w:val="22"/>
+        </w:rPr>
+        <w:t xml:space="preserve">dell’università </w:t>
+      </w:r>
+      <w:r>
+        <w:rPr>
+          <w:rFonts w:ascii="Century Gothic" w:hAnsi="Century Gothic" w:cs="Courier New"/>
+          <w:sz w:val="22"/>
+          <w:szCs w:val="22"/>
+        </w:rPr>
+        <w:t>di Cesena</w:t>
+      </w:r>
+      <w:r>
+        <w:rPr>
+          <w:rFonts w:ascii="Century Gothic" w:hAnsi="Century Gothic" w:cs="Courier New"/>
+          <w:sz w:val="22"/>
+          <w:szCs w:val="22"/>
+        </w:rPr>
+        <w:t>.</w:t>
+      </w:r>
+      <w:r>
+        <w:rPr>
+          <w:rFonts w:ascii="Century Gothic" w:hAnsi="Century Gothic" w:cs="Courier New"/>
+          <w:sz w:val="22"/>
+          <w:szCs w:val="22"/>
+        </w:rPr>
+        <w:t xml:space="preserve"> Troviamo altre pagine che completano il sito come News sempre aggiornate in cui si trovano anche promozioni, una guida dettagliata di come trovare il miglior alloggio</w:t>
+      </w:r>
+      <w:r>
+        <w:rPr>
+          <w:rFonts w:ascii="Century Gothic" w:hAnsi="Century Gothic" w:cs="Courier New"/>
+          <w:sz w:val="22"/>
+          <w:szCs w:val="22"/>
+        </w:rPr>
+        <w:t xml:space="preserve"> per chi è alle prime esperienze ma anche per chi sentisse il bisogno di avere un consiglio da amici</w:t>
+      </w:r>
+      <w:r>
+        <w:rPr>
+          <w:rFonts w:ascii="Century Gothic" w:hAnsi="Century Gothic" w:cs="Courier New"/>
+          <w:sz w:val="22"/>
+          <w:szCs w:val="22"/>
+        </w:rPr>
+        <w:t xml:space="preserve">, una </w:t>
+      </w:r>
+      <w:proofErr w:type="gramStart"/>
+      <w:r>
+        <w:rPr>
+          <w:rFonts w:ascii="Century Gothic" w:hAnsi="Century Gothic" w:cs="Courier New"/>
+          <w:sz w:val="22"/>
+          <w:szCs w:val="22"/>
+        </w:rPr>
+        <w:t>pagina</w:t>
+      </w:r>
+      <w:proofErr w:type="gramEnd"/>
+      <w:r>
+        <w:rPr>
+          <w:rFonts w:ascii="Century Gothic" w:hAnsi="Century Gothic" w:cs="Courier New"/>
+          <w:sz w:val="22"/>
+          <w:szCs w:val="22"/>
+        </w:rPr>
+        <w:t xml:space="preserve"> Chi siamo</w:t>
+      </w:r>
+      <w:r>
+        <w:rPr>
+          <w:rFonts w:ascii="Century Gothic" w:hAnsi="Century Gothic" w:cs="Courier New"/>
+          <w:sz w:val="22"/>
+          <w:szCs w:val="22"/>
+        </w:rPr>
+        <w:t>,</w:t>
+      </w:r>
+      <w:r>
+        <w:rPr>
+          <w:rFonts w:ascii="Century Gothic" w:hAnsi="Century Gothic" w:cs="Courier New"/>
+          <w:sz w:val="22"/>
+          <w:szCs w:val="22"/>
+        </w:rPr>
+        <w:t xml:space="preserve"> una pagina con i contatti dei gestori del sito per domande e per eventuali segnalazioni su annunci</w:t>
+      </w:r>
+      <w:r>
+        <w:rPr>
+          <w:rFonts w:ascii="Century Gothic" w:hAnsi="Century Gothic" w:cs="Courier New"/>
+          <w:sz w:val="22"/>
+          <w:szCs w:val="22"/>
+        </w:rPr>
+        <w:t xml:space="preserve"> e una sezione per l’autenticazione</w:t>
+      </w:r>
+      <w:r>
+        <w:rPr>
+          <w:rFonts w:ascii="Century Gothic" w:hAnsi="Century Gothic" w:cs="Courier New"/>
+          <w:sz w:val="22"/>
+          <w:szCs w:val="22"/>
+        </w:rPr>
+        <w:t>.</w:t>
+      </w:r>
+    </w:p>
+    <w:p>
+      <w:pPr>
+        <w:pStyle w:val="Testonormale"/>
+        <w:rPr>
+          <w:rFonts w:ascii="Century Gothic" w:hAnsi="Century Gothic" w:cs="Courier New"/>
+        </w:rPr>
+      </w:pPr>
+    </w:p>
+    <w:p>
+      <w:pPr>
+        <w:pStyle w:val="Testonormale"/>
+        <w:spacing w:after="240"/>
+        <w:rPr>
+          <w:rFonts w:ascii="Century Gothic" w:hAnsi="Century Gothic" w:cs="Courier New"/>
+          <w:b/>
+          <w:sz w:val="28"/>
+          <w:szCs w:val="28"/>
+        </w:rPr>
+      </w:pPr>
+      <w:r>
+        <w:rPr>
+          <w:rFonts w:ascii="Century Gothic" w:hAnsi="Century Gothic" w:cs="Courier New"/>
+          <w:b/>
+          <w:sz w:val="28"/>
+          <w:szCs w:val="28"/>
+        </w:rPr>
+        <w:t>Feature per utenti</w:t>
+      </w:r>
+    </w:p>
+    <w:p>
+      <w:pPr>
+        <w:pStyle w:val="Testonormale"/>
+        <w:numPr>
+          <w:ilvl w:val="0"/>
+          <w:numId w:val="10"/>
+        </w:numPr>
+        <w:jc w:val="both"/>
+        <w:rPr>
+          <w:rFonts w:ascii="Century Gothic" w:hAnsi="Century Gothic" w:cs="Courier New"/>
+          <w:sz w:val="22"/>
+          <w:szCs w:val="22"/>
+        </w:rPr>
+      </w:pPr>
+      <w:r>
+        <w:rPr>
+          <w:rFonts w:ascii="Century Gothic" w:hAnsi="Century Gothic" w:cs="Courier New"/>
+          <w:sz w:val="22"/>
+          <w:szCs w:val="22"/>
+        </w:rPr>
+        <w:t>Esplora gli annunci più recenti o filtra per tipologia, zona e prezzo massimo.</w:t>
+      </w:r>
+    </w:p>
+    <w:p>
+      <w:pPr>
+        <w:pStyle w:val="Testonormale"/>
+        <w:numPr>
+          <w:ilvl w:val="0"/>
+          <w:numId w:val="10"/>
+        </w:numPr>
+        <w:jc w:val="both"/>
+        <w:rPr>
+          <w:rFonts w:ascii="Century Gothic" w:hAnsi="Century Gothic" w:cs="Courier New"/>
+          <w:sz w:val="22"/>
+          <w:szCs w:val="22"/>
+        </w:rPr>
+      </w:pPr>
+      <w:r>
+        <w:rPr>
+          <w:rFonts w:ascii="Century Gothic" w:hAnsi="Century Gothic" w:cs="Courier New"/>
+          <w:sz w:val="22"/>
+          <w:szCs w:val="22"/>
+        </w:rPr>
+        <w:t xml:space="preserve">Un utente può visualizzare gli annunci e i dettagli in cui trova anche un link a </w:t>
+      </w:r>
+      <w:r>
+        <w:rPr>
+          <w:rFonts w:ascii="Century Gothic" w:hAnsi="Century Gothic" w:cs="Courier New"/>
+          <w:sz w:val="22"/>
+          <w:szCs w:val="22"/>
+        </w:rPr>
+        <w:t>Google</w:t>
+      </w:r>
+      <w:r>
+        <w:rPr>
+          <w:rFonts w:ascii="Century Gothic" w:hAnsi="Century Gothic" w:cs="Courier New"/>
+          <w:sz w:val="22"/>
+          <w:szCs w:val="22"/>
         </w:rPr>
         <w:t xml:space="preserve"> </w:t>
       </w:r>
       <w:r>
         <w:rPr>
           <w:rFonts w:ascii="Century Gothic" w:hAnsi="Century Gothic" w:cs="Courier New"/>
-        </w:rPr>
-        <w:t>a</w:t>
-      </w:r>
-      <w:r>
-        <w:rPr>
-          <w:rFonts w:ascii="Century Gothic" w:hAnsi="Century Gothic" w:cs="Courier New"/>
-        </w:rPr>
-        <w:t xml:space="preserve">l Campus </w:t>
-      </w:r>
-      <w:r>
-        <w:rPr>
-          <w:rFonts w:ascii="Century Gothic" w:hAnsi="Century Gothic" w:cs="Courier New"/>
-        </w:rPr>
-        <w:t xml:space="preserve">dell’università </w:t>
-      </w:r>
-      <w:r>
-        <w:rPr>
-          <w:rFonts w:ascii="Century Gothic" w:hAnsi="Century Gothic" w:cs="Courier New"/>
-        </w:rPr>
-        <w:t>di Cesena</w:t>
-      </w:r>
-      <w:r>
-        <w:rPr>
-          <w:rFonts w:ascii="Century Gothic" w:hAnsi="Century Gothic" w:cs="Courier New"/>
+          <w:sz w:val="22"/>
+          <w:szCs w:val="22"/>
+        </w:rPr>
+        <w:t>Maps</w:t>
+      </w:r>
+      <w:r>
+        <w:rPr>
+          <w:rFonts w:ascii="Century Gothic" w:hAnsi="Century Gothic" w:cs="Courier New"/>
+          <w:sz w:val="22"/>
+          <w:szCs w:val="22"/>
+        </w:rPr>
+        <w:t xml:space="preserve"> del percorso, distanza e tempi di percorrenza in bici</w:t>
+      </w:r>
+      <w:r>
+        <w:rPr>
+          <w:rFonts w:ascii="Century Gothic" w:hAnsi="Century Gothic" w:cs="Courier New"/>
+          <w:sz w:val="22"/>
+          <w:szCs w:val="22"/>
+        </w:rPr>
+        <w:t xml:space="preserve"> verso il Campus</w:t>
+      </w:r>
+      <w:r>
+        <w:rPr>
+          <w:rFonts w:ascii="Century Gothic" w:hAnsi="Century Gothic" w:cs="Courier New"/>
+          <w:sz w:val="22"/>
+          <w:szCs w:val="22"/>
         </w:rPr>
         <w:t>.</w:t>
       </w:r>
-      <w:r>
-        <w:rPr>
-          <w:rFonts w:ascii="Century Gothic" w:hAnsi="Century Gothic" w:cs="Courier New"/>
-        </w:rPr>
-        <w:t xml:space="preserve"> Troviamo altre pagine che completano il sito come News sempre aggiornate in cui si trovano anche promozioni, una guida dettagliata di come trovare il miglior alloggio</w:t>
-      </w:r>
-      <w:r>
-        <w:rPr>
-          <w:rFonts w:ascii="Century Gothic" w:hAnsi="Century Gothic" w:cs="Courier New"/>
-        </w:rPr>
-        <w:t xml:space="preserve"> per chi è alle prime esperienze ma anche per chi sentisse il bisogno di avere un consiglio da amici</w:t>
-      </w:r>
-      <w:r>
-        <w:rPr>
-          <w:rFonts w:ascii="Century Gothic" w:hAnsi="Century Gothic" w:cs="Courier New"/>
-        </w:rPr>
-        <w:t>, una pagina Chi siamo</w:t>
-      </w:r>
-      <w:r>
-        <w:rPr>
-          <w:rFonts w:ascii="Century Gothic" w:hAnsi="Century Gothic" w:cs="Courier New"/>
-        </w:rPr>
-        <w:t>,</w:t>
-      </w:r>
-      <w:r>
-        <w:rPr>
-          <w:rFonts w:ascii="Century Gothic" w:hAnsi="Century Gothic" w:cs="Courier New"/>
-        </w:rPr>
-        <w:t xml:space="preserve"> una pagina con i contatti dei gestori del sito per domande e per eventuali segnalazioni su annunci</w:t>
-      </w:r>
-      <w:r>
-        <w:rPr>
-          <w:rFonts w:ascii="Century Gothic" w:hAnsi="Century Gothic" w:cs="Courier New"/>
-        </w:rPr>
-        <w:t xml:space="preserve"> e una sezione per l’autenticazione</w:t>
-      </w:r>
-      <w:r>
-        <w:rPr>
-          <w:rFonts w:ascii="Century Gothic" w:hAnsi="Century Gothic" w:cs="Courier New"/>
-        </w:rPr>
-        <w:t>.</w:t>
-      </w:r>
-    </w:p>
-    <w:p>
-      <w:pPr>
-        <w:pStyle w:val="Testonormale"/>
-        <w:rPr>
-          <w:rFonts w:ascii="Century Gothic" w:hAnsi="Century Gothic" w:cs="Courier New"/>
-        </w:rPr>
-      </w:pPr>
-    </w:p>
-    <w:p>
-      <w:pPr>
-        <w:pStyle w:val="Testonormale"/>
+    </w:p>
+    <w:p>
+      <w:pPr>
+        <w:pStyle w:val="Testonormale"/>
+        <w:numPr>
+          <w:ilvl w:val="0"/>
+          <w:numId w:val="10"/>
+        </w:numPr>
+        <w:jc w:val="both"/>
+        <w:rPr>
+          <w:rFonts w:ascii="Century Gothic" w:hAnsi="Century Gothic" w:cs="Courier New"/>
+          <w:sz w:val="22"/>
+          <w:szCs w:val="22"/>
+        </w:rPr>
+      </w:pPr>
+      <w:r>
+        <w:rPr>
+          <w:rFonts w:ascii="Century Gothic" w:hAnsi="Century Gothic" w:cs="Courier New"/>
+          <w:sz w:val="22"/>
+          <w:szCs w:val="22"/>
+        </w:rPr>
+        <w:t>Si può effettuare una registrazione per accedere a funzioni speciali.</w:t>
+      </w:r>
+    </w:p>
+    <w:p>
+      <w:pPr>
+        <w:pStyle w:val="Testonormale"/>
+        <w:numPr>
+          <w:ilvl w:val="0"/>
+          <w:numId w:val="10"/>
+        </w:numPr>
+        <w:jc w:val="both"/>
+        <w:rPr>
+          <w:rFonts w:ascii="Century Gothic" w:hAnsi="Century Gothic" w:cs="Courier New"/>
+          <w:sz w:val="22"/>
+          <w:szCs w:val="22"/>
+        </w:rPr>
+      </w:pPr>
+      <w:r>
+        <w:rPr>
+          <w:rFonts w:ascii="Century Gothic" w:hAnsi="Century Gothic" w:cs="Courier New"/>
+          <w:sz w:val="22"/>
+          <w:szCs w:val="22"/>
+        </w:rPr>
+        <w:t>Effettua</w:t>
+      </w:r>
+      <w:r>
+        <w:rPr>
+          <w:rFonts w:ascii="Century Gothic" w:hAnsi="Century Gothic" w:cs="Courier New"/>
+          <w:sz w:val="22"/>
+          <w:szCs w:val="22"/>
+        </w:rPr>
+        <w:t>ndo</w:t>
+      </w:r>
+      <w:r>
+        <w:rPr>
+          <w:rFonts w:ascii="Century Gothic" w:hAnsi="Century Gothic" w:cs="Courier New"/>
+          <w:sz w:val="22"/>
+          <w:szCs w:val="22"/>
+        </w:rPr>
+        <w:t xml:space="preserve"> il login nella sezione </w:t>
+      </w:r>
+      <w:r>
+        <w:rPr>
+          <w:rFonts w:ascii="Century Gothic" w:hAnsi="Century Gothic" w:cs="Courier New"/>
+          <w:sz w:val="22"/>
+          <w:szCs w:val="22"/>
+        </w:rPr>
+        <w:t>dedicata</w:t>
+      </w:r>
+      <w:r>
+        <w:rPr>
+          <w:rFonts w:ascii="Century Gothic" w:hAnsi="Century Gothic" w:cs="Courier New"/>
+          <w:sz w:val="22"/>
+          <w:szCs w:val="22"/>
+        </w:rPr>
+        <w:t xml:space="preserve"> si p</w:t>
+      </w:r>
+      <w:r>
+        <w:rPr>
+          <w:rFonts w:ascii="Century Gothic" w:hAnsi="Century Gothic" w:cs="Courier New"/>
+          <w:sz w:val="22"/>
+          <w:szCs w:val="22"/>
+        </w:rPr>
+        <w:t>otrà</w:t>
+      </w:r>
+      <w:r>
+        <w:rPr>
+          <w:rFonts w:ascii="Century Gothic" w:hAnsi="Century Gothic" w:cs="Courier New"/>
+          <w:sz w:val="22"/>
+          <w:szCs w:val="22"/>
+        </w:rPr>
+        <w:t>:</w:t>
+      </w:r>
+    </w:p>
+    <w:p>
+      <w:pPr>
+        <w:pStyle w:val="Testonormale"/>
+        <w:numPr>
+          <w:ilvl w:val="1"/>
+          <w:numId w:val="10"/>
+        </w:numPr>
+        <w:jc w:val="both"/>
+        <w:rPr>
+          <w:rFonts w:ascii="Century Gothic" w:hAnsi="Century Gothic" w:cs="Courier New"/>
+          <w:sz w:val="22"/>
+          <w:szCs w:val="22"/>
+        </w:rPr>
+      </w:pPr>
+      <w:r>
+        <w:rPr>
+          <w:rFonts w:ascii="Century Gothic" w:hAnsi="Century Gothic" w:cs="Courier New"/>
+          <w:sz w:val="22"/>
+          <w:szCs w:val="22"/>
+        </w:rPr>
+        <w:t>inserire un'inserzione</w:t>
+      </w:r>
+    </w:p>
+    <w:p>
+      <w:pPr>
+        <w:pStyle w:val="Testonormale"/>
+        <w:numPr>
+          <w:ilvl w:val="1"/>
+          <w:numId w:val="10"/>
+        </w:numPr>
+        <w:jc w:val="both"/>
+        <w:rPr>
+          <w:rFonts w:ascii="Century Gothic" w:hAnsi="Century Gothic" w:cs="Courier New"/>
+          <w:sz w:val="22"/>
+          <w:szCs w:val="22"/>
+        </w:rPr>
+      </w:pPr>
+      <w:r>
+        <w:rPr>
+          <w:rFonts w:ascii="Century Gothic" w:hAnsi="Century Gothic" w:cs="Courier New"/>
+          <w:sz w:val="22"/>
+          <w:szCs w:val="22"/>
+        </w:rPr>
+        <w:t>modificare la propria inserzione</w:t>
+      </w:r>
+    </w:p>
+    <w:p>
+      <w:pPr>
+        <w:pStyle w:val="Testonormale"/>
+        <w:numPr>
+          <w:ilvl w:val="1"/>
+          <w:numId w:val="10"/>
+        </w:numPr>
+        <w:jc w:val="both"/>
+        <w:rPr>
+          <w:rFonts w:ascii="Century Gothic" w:hAnsi="Century Gothic" w:cs="Courier New"/>
+          <w:sz w:val="22"/>
+          <w:szCs w:val="22"/>
+        </w:rPr>
+      </w:pPr>
+      <w:r>
+        <w:rPr>
+          <w:rFonts w:ascii="Century Gothic" w:hAnsi="Century Gothic" w:cs="Courier New"/>
+          <w:sz w:val="22"/>
+          <w:szCs w:val="22"/>
+        </w:rPr>
+        <w:t>eliminare la propria inserzione</w:t>
+      </w:r>
+    </w:p>
+    <w:p>
+      <w:pPr>
+        <w:pStyle w:val="Testonormale"/>
+        <w:numPr>
+          <w:ilvl w:val="1"/>
+          <w:numId w:val="10"/>
+        </w:numPr>
+        <w:jc w:val="both"/>
+        <w:rPr>
+          <w:rFonts w:ascii="Century Gothic" w:hAnsi="Century Gothic" w:cs="Courier New"/>
+          <w:sz w:val="22"/>
+          <w:szCs w:val="22"/>
+        </w:rPr>
+      </w:pPr>
+      <w:r>
+        <w:rPr>
+          <w:rFonts w:ascii="Century Gothic" w:hAnsi="Century Gothic" w:cs="Courier New"/>
+          <w:sz w:val="22"/>
+          <w:szCs w:val="22"/>
+        </w:rPr>
+        <w:t>mettere tra i preferiti le inserzioni</w:t>
+      </w:r>
+    </w:p>
+    <w:p>
+      <w:pPr>
+        <w:pStyle w:val="Testonormale"/>
+        <w:numPr>
+          <w:ilvl w:val="1"/>
+          <w:numId w:val="10"/>
+        </w:numPr>
+        <w:jc w:val="both"/>
+        <w:rPr>
+          <w:rFonts w:ascii="Century Gothic" w:hAnsi="Century Gothic" w:cs="Courier New"/>
+          <w:sz w:val="22"/>
+          <w:szCs w:val="22"/>
+        </w:rPr>
+      </w:pPr>
+      <w:r>
+        <w:rPr>
+          <w:rFonts w:ascii="Century Gothic" w:hAnsi="Century Gothic" w:cs="Courier New"/>
+          <w:sz w:val="22"/>
+          <w:szCs w:val="22"/>
+        </w:rPr>
+        <w:t>visualizzare i contatti dell'inserzionista</w:t>
+      </w:r>
+    </w:p>
+    <w:p>
+      <w:pPr>
+        <w:pStyle w:val="Testonormale"/>
+        <w:rPr>
+          <w:rFonts w:ascii="Century Gothic" w:hAnsi="Century Gothic" w:cs="Courier New"/>
+        </w:rPr>
+      </w:pPr>
+      <w:r>
+        <w:rPr>
+          <w:rFonts w:ascii="Century Gothic" w:hAnsi="Century Gothic" w:cs="Courier New"/>
+        </w:rPr>
+        <w:t xml:space="preserve"> </w:t>
+      </w:r>
+    </w:p>
+    <w:p>
+      <w:pPr>
+        <w:pStyle w:val="Testonormale"/>
+        <w:spacing w:after="240"/>
         <w:rPr>
           <w:rFonts w:ascii="Century Gothic" w:hAnsi="Century Gothic" w:cs="Courier New"/>
           <w:b/>
+          <w:sz w:val="28"/>
+          <w:szCs w:val="28"/>
         </w:rPr>
       </w:pPr>
       <w:r>
         <w:rPr>
           <w:rFonts w:ascii="Century Gothic" w:hAnsi="Century Gothic" w:cs="Courier New"/>
           <w:b/>
-        </w:rPr>
-        <w:t>Feature per utenti</w:t>
-      </w:r>
-    </w:p>
-    <w:p>
-      <w:pPr>
-        <w:pStyle w:val="Testonormale"/>
-        <w:rPr>
-          <w:rFonts w:ascii="Century Gothic" w:hAnsi="Century Gothic" w:cs="Courier New"/>
-        </w:rPr>
-      </w:pPr>
-      <w:r>
-        <w:rPr>
-          <w:rFonts w:ascii="Century Gothic" w:hAnsi="Century Gothic" w:cs="Courier New"/>
-        </w:rPr>
-        <w:t>• Esplora gli annunci più recenti o filtra per tipologia, zona e prezzo massimo.</w:t>
-      </w:r>
-    </w:p>
-    <w:p>
-      <w:pPr>
-        <w:pStyle w:val="Testonormale"/>
-        <w:rPr>
-          <w:rFonts w:ascii="Century Gothic" w:hAnsi="Century Gothic" w:cs="Courier New"/>
-        </w:rPr>
-      </w:pPr>
-      <w:r>
-        <w:rPr>
-          <w:rFonts w:ascii="Century Gothic" w:hAnsi="Century Gothic" w:cs="Courier New"/>
-        </w:rPr>
-        <w:t xml:space="preserve">• Un utente può visualizzare gli annunci e i dettagli in cui trova anche un link a </w:t>
-      </w:r>
-      <w:r>
-        <w:rPr>
-          <w:rFonts w:ascii="Century Gothic" w:hAnsi="Century Gothic" w:cs="Courier New"/>
-        </w:rPr>
-        <w:t>Google</w:t>
-      </w:r>
-      <w:r>
-        <w:rPr>
-          <w:rFonts w:ascii="Century Gothic" w:hAnsi="Century Gothic" w:cs="Courier New"/>
-        </w:rPr>
-        <w:t xml:space="preserve"> </w:t>
-      </w:r>
-      <w:r>
-        <w:rPr>
-          <w:rFonts w:ascii="Century Gothic" w:hAnsi="Century Gothic" w:cs="Courier New"/>
-        </w:rPr>
-        <w:t>Maps</w:t>
-      </w:r>
-      <w:r>
-        <w:rPr>
-          <w:rFonts w:ascii="Century Gothic" w:hAnsi="Century Gothic" w:cs="Courier New"/>
-        </w:rPr>
-        <w:t xml:space="preserve"> del percorso, distanza e tempi di percorrenza in bici</w:t>
-      </w:r>
-      <w:r>
-        <w:rPr>
-          <w:rFonts w:ascii="Century Gothic" w:hAnsi="Century Gothic" w:cs="Courier New"/>
-        </w:rPr>
-        <w:t xml:space="preserve"> verso il Campus</w:t>
-      </w:r>
-      <w:r>
-        <w:rPr>
-          <w:rFonts w:ascii="Century Gothic" w:hAnsi="Century Gothic" w:cs="Courier New"/>
-        </w:rPr>
-        <w:t>.</w:t>
-      </w:r>
-    </w:p>
-    <w:p>
-      <w:pPr>
-        <w:pStyle w:val="Testonormale"/>
-        <w:rPr>
-          <w:rFonts w:ascii="Century Gothic" w:hAnsi="Century Gothic" w:cs="Courier New"/>
-        </w:rPr>
-      </w:pPr>
-      <w:r>
-        <w:rPr>
-          <w:rFonts w:ascii="Century Gothic" w:hAnsi="Century Gothic" w:cs="Courier New"/>
-        </w:rPr>
-        <w:t>• Si può effettuare una registrazione per accedere a funzioni speciali.</w:t>
-      </w:r>
-    </w:p>
-    <w:p>
-      <w:pPr>
-        <w:pStyle w:val="Testonormale"/>
-        <w:rPr>
-          <w:rFonts w:ascii="Century Gothic" w:hAnsi="Century Gothic" w:cs="Courier New"/>
-        </w:rPr>
-      </w:pPr>
-      <w:r>
-        <w:rPr>
-          <w:rFonts w:ascii="Century Gothic" w:hAnsi="Century Gothic" w:cs="Courier New"/>
-        </w:rPr>
-        <w:t>• Effettua</w:t>
-      </w:r>
-      <w:r>
-        <w:rPr>
-          <w:rFonts w:ascii="Century Gothic" w:hAnsi="Century Gothic" w:cs="Courier New"/>
-        </w:rPr>
-        <w:t>ndo</w:t>
-      </w:r>
-      <w:r>
-        <w:rPr>
-          <w:rFonts w:ascii="Century Gothic" w:hAnsi="Century Gothic" w:cs="Courier New"/>
-        </w:rPr>
-        <w:t xml:space="preserve"> il login nella sezione </w:t>
-      </w:r>
-      <w:r>
-        <w:rPr>
-          <w:rFonts w:ascii="Century Gothic" w:hAnsi="Century Gothic" w:cs="Courier New"/>
+          <w:sz w:val="28"/>
+          <w:szCs w:val="28"/>
+        </w:rPr>
+        <w:t>Feature per amministratori</w:t>
+      </w:r>
+    </w:p>
+    <w:p>
+      <w:pPr>
+        <w:pStyle w:val="Testonormale"/>
+        <w:numPr>
+          <w:ilvl w:val="0"/>
+          <w:numId w:val="11"/>
+        </w:numPr>
+        <w:jc w:val="both"/>
+        <w:rPr>
+          <w:rFonts w:ascii="Century Gothic" w:hAnsi="Century Gothic" w:cs="Courier New"/>
+          <w:sz w:val="22"/>
+          <w:szCs w:val="22"/>
+        </w:rPr>
+      </w:pPr>
+      <w:r>
+        <w:rPr>
+          <w:rFonts w:ascii="Century Gothic" w:hAnsi="Century Gothic" w:cs="Courier New"/>
+        </w:rPr>
+        <w:t>Effett</w:t>
+      </w:r>
+      <w:r>
+        <w:rPr>
+          <w:rFonts w:ascii="Century Gothic" w:hAnsi="Century Gothic" w:cs="Courier New"/>
+          <w:sz w:val="22"/>
+          <w:szCs w:val="22"/>
+        </w:rPr>
+        <w:t xml:space="preserve">uare il login nella sezione </w:t>
+      </w:r>
+      <w:r>
+        <w:rPr>
+          <w:rFonts w:ascii="Century Gothic" w:hAnsi="Century Gothic" w:cs="Courier New"/>
+          <w:sz w:val="22"/>
+          <w:szCs w:val="22"/>
         </w:rPr>
         <w:t>dedicata</w:t>
       </w:r>
-      <w:r>
-        <w:rPr>
-          <w:rFonts w:ascii="Century Gothic" w:hAnsi="Century Gothic" w:cs="Courier New"/>
-        </w:rPr>
-        <w:t xml:space="preserve"> si p</w:t>
-      </w:r>
-      <w:r>
-        <w:rPr>
-          <w:rFonts w:ascii="Century Gothic" w:hAnsi="Century Gothic" w:cs="Courier New"/>
-        </w:rPr>
-        <w:t>otrà</w:t>
-      </w:r>
-      <w:r>
-        <w:rPr>
-          <w:rFonts w:ascii="Century Gothic" w:hAnsi="Century Gothic" w:cs="Courier New"/>
-        </w:rPr>
-        <w:t>:</w:t>
-      </w:r>
-    </w:p>
-    <w:p>
-      <w:pPr>
-        <w:pStyle w:val="Testonormale"/>
-        <w:ind w:left="708"/>
-        <w:rPr>
-          <w:rFonts w:ascii="Century Gothic" w:hAnsi="Century Gothic" w:cs="Courier New"/>
-        </w:rPr>
-      </w:pPr>
-      <w:r>
-        <w:rPr>
-          <w:rFonts w:ascii="Century Gothic" w:hAnsi="Century Gothic" w:cs="Courier New"/>
-        </w:rPr>
-        <w:t>• inserire un'inserzione</w:t>
-      </w:r>
-    </w:p>
-    <w:p>
-      <w:pPr>
-        <w:pStyle w:val="Testonormale"/>
-        <w:ind w:left="708"/>
-        <w:rPr>
-          <w:rFonts w:ascii="Century Gothic" w:hAnsi="Century Gothic" w:cs="Courier New"/>
-        </w:rPr>
-      </w:pPr>
-      <w:r>
-        <w:rPr>
-          <w:rFonts w:ascii="Century Gothic" w:hAnsi="Century Gothic" w:cs="Courier New"/>
-        </w:rPr>
-        <w:t>• modificare la propria inserzione</w:t>
-      </w:r>
-    </w:p>
-    <w:p>
-      <w:pPr>
-        <w:pStyle w:val="Testonormale"/>
-        <w:ind w:left="708"/>
-        <w:rPr>
-          <w:rFonts w:ascii="Century Gothic" w:hAnsi="Century Gothic" w:cs="Courier New"/>
-        </w:rPr>
-      </w:pPr>
-      <w:r>
-        <w:rPr>
-          <w:rFonts w:ascii="Century Gothic" w:hAnsi="Century Gothic" w:cs="Courier New"/>
-        </w:rPr>
-        <w:t>• eliminare la propria inserzione</w:t>
-      </w:r>
-    </w:p>
-    <w:p>
-      <w:pPr>
-        <w:pStyle w:val="Testonormale"/>
-        <w:ind w:left="708"/>
-        <w:rPr>
-          <w:rFonts w:ascii="Century Gothic" w:hAnsi="Century Gothic" w:cs="Courier New"/>
-        </w:rPr>
-      </w:pPr>
-      <w:r>
-        <w:rPr>
-          <w:rFonts w:ascii="Century Gothic" w:hAnsi="Century Gothic" w:cs="Courier New"/>
-        </w:rPr>
-        <w:t>• mettere tra i preferiti le inserzioni</w:t>
-      </w:r>
-    </w:p>
-    <w:p>
-      <w:pPr>
-        <w:pStyle w:val="Testonormale"/>
-        <w:ind w:left="708"/>
-        <w:rPr>
-          <w:rFonts w:ascii="Century Gothic" w:hAnsi="Century Gothic" w:cs="Courier New"/>
-        </w:rPr>
-      </w:pPr>
-      <w:r>
-        <w:rPr>
-          <w:rFonts w:ascii="Century Gothic" w:hAnsi="Century Gothic" w:cs="Courier New"/>
-        </w:rPr>
-        <w:t>• visualizzare i contatti dell'inserzionista</w:t>
-      </w:r>
-    </w:p>
-    <w:p>
-      <w:pPr>
-        <w:pStyle w:val="Testonormale"/>
-        <w:rPr>
-          <w:rFonts w:ascii="Century Gothic" w:hAnsi="Century Gothic" w:cs="Courier New"/>
-        </w:rPr>
-      </w:pPr>
-      <w:r>
-        <w:rPr>
-          <w:rFonts w:ascii="Century Gothic" w:hAnsi="Century Gothic" w:cs="Courier New"/>
-        </w:rPr>
-        <w:t xml:space="preserve"> </w:t>
-      </w:r>
-    </w:p>
-    <w:p>
-      <w:pPr>
-        <w:pStyle w:val="Testonormale"/>
+    </w:p>
+    <w:p>
+      <w:pPr>
+        <w:pStyle w:val="Testonormale"/>
+        <w:numPr>
+          <w:ilvl w:val="0"/>
+          <w:numId w:val="11"/>
+        </w:numPr>
+        <w:jc w:val="both"/>
+        <w:rPr>
+          <w:rFonts w:ascii="Century Gothic" w:hAnsi="Century Gothic" w:cs="Courier New"/>
+        </w:rPr>
+      </w:pPr>
+      <w:r>
+        <w:rPr>
+          <w:rFonts w:ascii="Century Gothic" w:hAnsi="Century Gothic" w:cs="Courier New"/>
+          <w:sz w:val="22"/>
+          <w:szCs w:val="22"/>
+        </w:rPr>
+        <w:t>Eliminare</w:t>
+      </w:r>
+      <w:r>
+        <w:rPr>
+          <w:rFonts w:ascii="Century Gothic" w:hAnsi="Century Gothic" w:cs="Courier New"/>
+        </w:rPr>
+        <w:t xml:space="preserve"> qualsiasi annuncio.</w:t>
+      </w:r>
+    </w:p>
+    <w:p>
+      <w:pPr>
+        <w:pStyle w:val="Testonormale"/>
+        <w:rPr>
+          <w:rFonts w:ascii="Century Gothic" w:hAnsi="Century Gothic" w:cs="Courier New"/>
+        </w:rPr>
+      </w:pPr>
+    </w:p>
+    <w:p>
+      <w:pPr>
+        <w:pStyle w:val="Testonormale"/>
+        <w:spacing w:after="240"/>
         <w:rPr>
           <w:rFonts w:ascii="Century Gothic" w:hAnsi="Century Gothic" w:cs="Courier New"/>
           <w:b/>
+          <w:sz w:val="28"/>
+          <w:szCs w:val="28"/>
         </w:rPr>
       </w:pPr>
       <w:r>
         <w:rPr>
           <w:rFonts w:ascii="Century Gothic" w:hAnsi="Century Gothic" w:cs="Courier New"/>
           <w:b/>
-        </w:rPr>
-        <w:t>Feature per amministratori</w:t>
-      </w:r>
-    </w:p>
-    <w:p>
-      <w:pPr>
-        <w:pStyle w:val="Testonormale"/>
-        <w:rPr>
-          <w:rFonts w:ascii="Century Gothic" w:hAnsi="Century Gothic" w:cs="Courier New"/>
-        </w:rPr>
-      </w:pPr>
-      <w:r>
-        <w:rPr>
-          <w:rFonts w:ascii="Century Gothic" w:hAnsi="Century Gothic" w:cs="Courier New"/>
-        </w:rPr>
-        <w:t xml:space="preserve">- Effettuare il login nella sezione </w:t>
-      </w:r>
-      <w:r>
-        <w:rPr>
-          <w:rFonts w:ascii="Century Gothic" w:hAnsi="Century Gothic" w:cs="Courier New"/>
-        </w:rPr>
-        <w:t>dedicata</w:t>
-      </w:r>
-    </w:p>
-    <w:p>
-      <w:pPr>
-        <w:pStyle w:val="Testonormale"/>
-        <w:rPr>
-          <w:rFonts w:ascii="Century Gothic" w:hAnsi="Century Gothic" w:cs="Courier New"/>
-        </w:rPr>
-      </w:pPr>
-      <w:r>
-        <w:rPr>
-          <w:rFonts w:ascii="Century Gothic" w:hAnsi="Century Gothic" w:cs="Courier New"/>
-        </w:rPr>
-        <w:t>- Eliminare qualsiasi annuncio.</w:t>
-      </w:r>
-    </w:p>
-    <w:p>
-      <w:pPr>
-        <w:pStyle w:val="Testonormale"/>
-        <w:rPr>
-          <w:rFonts w:ascii="Century Gothic" w:hAnsi="Century Gothic" w:cs="Courier New"/>
-        </w:rPr>
-      </w:pPr>
-    </w:p>
-    <w:p>
-      <w:pPr>
-        <w:pStyle w:val="Testonormale"/>
+          <w:sz w:val="28"/>
+          <w:szCs w:val="28"/>
+        </w:rPr>
+        <w:t>Tecnologie usate</w:t>
+      </w:r>
+    </w:p>
+    <w:p>
+      <w:pPr>
+        <w:pStyle w:val="Testonormale"/>
+        <w:numPr>
+          <w:ilvl w:val="0"/>
+          <w:numId w:val="12"/>
+        </w:numPr>
+        <w:rPr>
+          <w:rFonts w:ascii="Century Gothic" w:hAnsi="Century Gothic" w:cs="Courier New"/>
+          <w:sz w:val="22"/>
+          <w:szCs w:val="22"/>
+        </w:rPr>
+      </w:pPr>
+      <w:r>
+        <w:rPr>
+          <w:rFonts w:ascii="Century Gothic" w:hAnsi="Century Gothic" w:cs="Courier New"/>
+          <w:sz w:val="22"/>
+          <w:szCs w:val="22"/>
+        </w:rPr>
+        <w:t xml:space="preserve">XAMPP per avviare il server </w:t>
+      </w:r>
+      <w:proofErr w:type="spellStart"/>
+      <w:r>
+        <w:rPr>
+          <w:rFonts w:ascii="Century Gothic" w:hAnsi="Century Gothic" w:cs="Courier New"/>
+          <w:sz w:val="22"/>
+          <w:szCs w:val="22"/>
+        </w:rPr>
+        <w:t>mysql</w:t>
+      </w:r>
+      <w:proofErr w:type="spellEnd"/>
+    </w:p>
+    <w:p>
+      <w:pPr>
+        <w:pStyle w:val="Testonormale"/>
+        <w:numPr>
+          <w:ilvl w:val="0"/>
+          <w:numId w:val="12"/>
+        </w:numPr>
+        <w:rPr>
+          <w:rFonts w:ascii="Century Gothic" w:hAnsi="Century Gothic" w:cs="Courier New"/>
+          <w:sz w:val="22"/>
+          <w:szCs w:val="22"/>
+          <w:lang w:val="en-US"/>
+        </w:rPr>
+      </w:pPr>
+      <w:r>
+        <w:rPr>
+          <w:rFonts w:ascii="Century Gothic" w:hAnsi="Century Gothic" w:cs="Courier New"/>
+          <w:sz w:val="22"/>
+          <w:szCs w:val="22"/>
+          <w:lang w:val="en-US"/>
+        </w:rPr>
+        <w:t>Node.js per backend</w:t>
+      </w:r>
+    </w:p>
+    <w:p>
+      <w:pPr>
+        <w:pStyle w:val="Testonormale"/>
+        <w:numPr>
+          <w:ilvl w:val="0"/>
+          <w:numId w:val="12"/>
+        </w:numPr>
+        <w:rPr>
+          <w:rFonts w:ascii="Century Gothic" w:hAnsi="Century Gothic" w:cs="Courier New"/>
+          <w:sz w:val="22"/>
+          <w:szCs w:val="22"/>
+          <w:lang w:val="en-US"/>
+        </w:rPr>
+      </w:pPr>
+      <w:r>
+        <w:rPr>
+          <w:rFonts w:ascii="Century Gothic" w:hAnsi="Century Gothic" w:cs="Courier New"/>
+          <w:sz w:val="22"/>
+          <w:szCs w:val="22"/>
+          <w:lang w:val="en-US"/>
+        </w:rPr>
+        <w:t>Express per backend e API</w:t>
+      </w:r>
+    </w:p>
+    <w:p>
+      <w:pPr>
+        <w:pStyle w:val="Testonormale"/>
+        <w:numPr>
+          <w:ilvl w:val="0"/>
+          <w:numId w:val="12"/>
+        </w:numPr>
+        <w:rPr>
+          <w:rFonts w:ascii="Century Gothic" w:hAnsi="Century Gothic" w:cs="Courier New"/>
+          <w:sz w:val="22"/>
+          <w:szCs w:val="22"/>
+        </w:rPr>
+      </w:pPr>
+      <w:proofErr w:type="spellStart"/>
+      <w:r>
+        <w:rPr>
+          <w:rFonts w:ascii="Century Gothic" w:hAnsi="Century Gothic" w:cs="Courier New"/>
+          <w:sz w:val="22"/>
+          <w:szCs w:val="22"/>
+        </w:rPr>
+        <w:t>npm</w:t>
+      </w:r>
+      <w:proofErr w:type="spellEnd"/>
+      <w:r>
+        <w:rPr>
+          <w:rFonts w:ascii="Century Gothic" w:hAnsi="Century Gothic" w:cs="Courier New"/>
+          <w:sz w:val="22"/>
+          <w:szCs w:val="22"/>
+        </w:rPr>
+        <w:t xml:space="preserve"> per installazione di packages e avviare il server</w:t>
+      </w:r>
+    </w:p>
+    <w:p>
+      <w:pPr>
+        <w:pStyle w:val="Testonormale"/>
+        <w:numPr>
+          <w:ilvl w:val="0"/>
+          <w:numId w:val="12"/>
+        </w:numPr>
+        <w:rPr>
+          <w:rFonts w:ascii="Century Gothic" w:hAnsi="Century Gothic" w:cs="Courier New"/>
+          <w:sz w:val="22"/>
+          <w:szCs w:val="22"/>
+          <w:lang w:val="en-US"/>
+        </w:rPr>
+      </w:pPr>
+      <w:r>
+        <w:rPr>
+          <w:rFonts w:ascii="Century Gothic" w:hAnsi="Century Gothic" w:cs="Courier New"/>
+          <w:sz w:val="22"/>
+          <w:szCs w:val="22"/>
+          <w:lang w:val="en-US"/>
+        </w:rPr>
+        <w:t>Vue.js per frontend</w:t>
+      </w:r>
+    </w:p>
+    <w:p>
+      <w:pPr>
+        <w:pStyle w:val="Testonormale"/>
+        <w:numPr>
+          <w:ilvl w:val="0"/>
+          <w:numId w:val="12"/>
+        </w:numPr>
+        <w:rPr>
+          <w:rFonts w:ascii="Century Gothic" w:hAnsi="Century Gothic" w:cs="Courier New"/>
+          <w:sz w:val="22"/>
+          <w:szCs w:val="22"/>
+          <w:lang w:val="en-US"/>
+        </w:rPr>
+      </w:pPr>
+      <w:r>
+        <w:rPr>
+          <w:rFonts w:ascii="Century Gothic" w:hAnsi="Century Gothic" w:cs="Courier New"/>
+          <w:sz w:val="22"/>
+          <w:szCs w:val="22"/>
+          <w:lang w:val="en-US"/>
+        </w:rPr>
+        <w:t>TypeScript</w:t>
+      </w:r>
+    </w:p>
+    <w:p>
+      <w:pPr>
+        <w:pStyle w:val="Testonormale"/>
+        <w:numPr>
+          <w:ilvl w:val="0"/>
+          <w:numId w:val="12"/>
+        </w:numPr>
+        <w:rPr>
+          <w:rFonts w:ascii="Century Gothic" w:hAnsi="Century Gothic" w:cs="Courier New"/>
+          <w:sz w:val="22"/>
+          <w:szCs w:val="22"/>
+          <w:lang w:val="en-US"/>
+        </w:rPr>
+      </w:pPr>
+      <w:r>
+        <w:rPr>
+          <w:rFonts w:ascii="Century Gothic" w:hAnsi="Century Gothic" w:cs="Courier New"/>
+          <w:sz w:val="22"/>
+          <w:szCs w:val="22"/>
+          <w:lang w:val="en-US"/>
+        </w:rPr>
+        <w:t>Vue Router</w:t>
+      </w:r>
+    </w:p>
+    <w:p>
+      <w:pPr>
+        <w:pStyle w:val="Testonormale"/>
+        <w:numPr>
+          <w:ilvl w:val="0"/>
+          <w:numId w:val="12"/>
+        </w:numPr>
+        <w:rPr>
+          <w:rFonts w:ascii="Century Gothic" w:hAnsi="Century Gothic" w:cs="Courier New"/>
+          <w:sz w:val="22"/>
+          <w:szCs w:val="22"/>
+          <w:lang w:val="en-US"/>
+        </w:rPr>
+      </w:pPr>
+      <w:r>
+        <w:rPr>
+          <w:rFonts w:ascii="Century Gothic" w:hAnsi="Century Gothic" w:cs="Courier New"/>
+          <w:sz w:val="22"/>
+          <w:szCs w:val="22"/>
+          <w:lang w:val="en-US"/>
+        </w:rPr>
+        <w:t>Vite</w:t>
+      </w:r>
+    </w:p>
+    <w:p>
+      <w:pPr>
+        <w:pStyle w:val="Testonormale"/>
+        <w:numPr>
+          <w:ilvl w:val="0"/>
+          <w:numId w:val="12"/>
+        </w:numPr>
+        <w:rPr>
+          <w:rFonts w:ascii="Century Gothic" w:hAnsi="Century Gothic" w:cs="Courier New"/>
+          <w:sz w:val="22"/>
+          <w:szCs w:val="22"/>
+          <w:lang w:val="en-US"/>
+        </w:rPr>
+      </w:pPr>
+      <w:r>
+        <w:rPr>
+          <w:rFonts w:ascii="Century Gothic" w:hAnsi="Century Gothic" w:cs="Courier New"/>
+          <w:sz w:val="22"/>
+          <w:szCs w:val="22"/>
+          <w:lang w:val="en-US"/>
+        </w:rPr>
+        <w:t>Axios</w:t>
+      </w:r>
+    </w:p>
+    <w:p>
+      <w:pPr>
+        <w:pStyle w:val="Testonormale"/>
+        <w:numPr>
+          <w:ilvl w:val="0"/>
+          <w:numId w:val="12"/>
+        </w:numPr>
+        <w:rPr>
+          <w:rFonts w:ascii="Century Gothic" w:hAnsi="Century Gothic" w:cs="Courier New"/>
+          <w:sz w:val="22"/>
+          <w:szCs w:val="22"/>
+          <w:lang w:val="en-US"/>
+        </w:rPr>
+      </w:pPr>
+      <w:r>
+        <w:rPr>
+          <w:rFonts w:ascii="Century Gothic" w:hAnsi="Century Gothic" w:cs="Courier New"/>
+          <w:sz w:val="22"/>
+          <w:szCs w:val="22"/>
+          <w:lang w:val="en-US"/>
+        </w:rPr>
+        <w:t xml:space="preserve">Bootstrap per </w:t>
+      </w:r>
+      <w:proofErr w:type="spellStart"/>
+      <w:r>
+        <w:rPr>
+          <w:rFonts w:ascii="Century Gothic" w:hAnsi="Century Gothic" w:cs="Courier New"/>
+          <w:sz w:val="22"/>
+          <w:szCs w:val="22"/>
+          <w:lang w:val="en-US"/>
+        </w:rPr>
+        <w:t>css</w:t>
+      </w:r>
+      <w:proofErr w:type="spellEnd"/>
+    </w:p>
+    <w:p>
+      <w:pPr>
+        <w:pStyle w:val="Testonormale"/>
+        <w:numPr>
+          <w:ilvl w:val="0"/>
+          <w:numId w:val="12"/>
+        </w:numPr>
+        <w:rPr>
+          <w:rFonts w:ascii="Century Gothic" w:hAnsi="Century Gothic" w:cs="Courier New"/>
+          <w:sz w:val="22"/>
+          <w:szCs w:val="22"/>
+        </w:rPr>
+      </w:pPr>
+      <w:r>
+        <w:rPr>
+          <w:rFonts w:ascii="Century Gothic" w:hAnsi="Century Gothic" w:cs="Courier New"/>
+          <w:sz w:val="22"/>
+          <w:szCs w:val="22"/>
+        </w:rPr>
+        <w:t>LA TUA FUNZIONE PER IL CALCOLO DEL PERCORSO</w:t>
+      </w:r>
+    </w:p>
+    <w:p>
+      <w:pPr>
+        <w:pStyle w:val="Testonormale"/>
+        <w:rPr>
+          <w:rFonts w:ascii="Century Gothic" w:hAnsi="Century Gothic" w:cs="Courier New"/>
+        </w:rPr>
+      </w:pPr>
+    </w:p>
+    <w:p>
+      <w:pPr>
+        <w:pStyle w:val="Testonormale"/>
+        <w:spacing w:after="240"/>
         <w:rPr>
           <w:rFonts w:ascii="Century Gothic" w:hAnsi="Century Gothic" w:cs="Courier New"/>
           <w:b/>
+          <w:sz w:val="28"/>
+          <w:szCs w:val="28"/>
         </w:rPr>
       </w:pPr>
       <w:r>
         <w:rPr>
           <w:rFonts w:ascii="Century Gothic" w:hAnsi="Century Gothic" w:cs="Courier New"/>
           <w:b/>
-        </w:rPr>
-        <w:t>Tecnologie usate</w:t>
-      </w:r>
-    </w:p>
-    <w:p>
-      <w:pPr>
-        <w:pStyle w:val="Testonormale"/>
-        <w:rPr>
-          <w:rFonts w:ascii="Century Gothic" w:hAnsi="Century Gothic" w:cs="Courier New"/>
-        </w:rPr>
-      </w:pPr>
-      <w:r>
-        <w:rPr>
-          <w:rFonts w:ascii="Century Gothic" w:hAnsi="Century Gothic" w:cs="Courier New"/>
-        </w:rPr>
-        <w:t>XAMPP per avviare il server mysql</w:t>
-      </w:r>
-    </w:p>
-    <w:p>
-      <w:pPr>
-        <w:pStyle w:val="Testonormale"/>
-        <w:rPr>
-          <w:rFonts w:ascii="Century Gothic" w:hAnsi="Century Gothic" w:cs="Courier New"/>
-          <w:lang w:val="en-US"/>
-        </w:rPr>
-      </w:pPr>
-      <w:r>
-        <w:rPr>
-          <w:rFonts w:ascii="Century Gothic" w:hAnsi="Century Gothic" w:cs="Courier New"/>
-          <w:lang w:val="en-US"/>
-        </w:rPr>
-        <w:t>Node.js per backend</w:t>
-      </w:r>
-    </w:p>
-    <w:p>
-      <w:pPr>
-        <w:pStyle w:val="Testonormale"/>
-        <w:rPr>
-          <w:rFonts w:ascii="Century Gothic" w:hAnsi="Century Gothic" w:cs="Courier New"/>
-          <w:lang w:val="en-US"/>
-        </w:rPr>
-      </w:pPr>
-      <w:r>
-        <w:rPr>
-          <w:rFonts w:ascii="Century Gothic" w:hAnsi="Century Gothic" w:cs="Courier New"/>
-          <w:lang w:val="en-US"/>
-        </w:rPr>
-        <w:t>Express per backend e API</w:t>
-      </w:r>
-    </w:p>
-    <w:p>
-      <w:pPr>
-        <w:pStyle w:val="Testonormale"/>
-        <w:rPr>
-          <w:rFonts w:ascii="Century Gothic" w:hAnsi="Century Gothic" w:cs="Courier New"/>
-        </w:rPr>
-      </w:pPr>
-      <w:r>
-        <w:rPr>
-          <w:rFonts w:ascii="Century Gothic" w:hAnsi="Century Gothic" w:cs="Courier New"/>
-        </w:rPr>
-        <w:t>npm per installazione di packages e avviare il server</w:t>
-      </w:r>
-    </w:p>
-    <w:p>
-      <w:pPr>
-        <w:pStyle w:val="Testonormale"/>
-        <w:rPr>
-          <w:rFonts w:ascii="Century Gothic" w:hAnsi="Century Gothic" w:cs="Courier New"/>
-          <w:lang w:val="en-US"/>
-        </w:rPr>
-      </w:pPr>
-      <w:r>
-        <w:rPr>
-          <w:rFonts w:ascii="Century Gothic" w:hAnsi="Century Gothic" w:cs="Courier New"/>
-          <w:lang w:val="en-US"/>
-        </w:rPr>
-        <w:t>Vue.js per frontend</w:t>
-      </w:r>
-    </w:p>
-    <w:p>
-      <w:pPr>
-        <w:pStyle w:val="Testonormale"/>
-        <w:rPr>
-          <w:rFonts w:ascii="Century Gothic" w:hAnsi="Century Gothic" w:cs="Courier New"/>
-          <w:lang w:val="en-US"/>
-        </w:rPr>
-      </w:pPr>
-      <w:r>
-        <w:rPr>
-          <w:rFonts w:ascii="Century Gothic" w:hAnsi="Century Gothic" w:cs="Courier New"/>
-          <w:lang w:val="en-US"/>
-        </w:rPr>
-        <w:t>TypeScript</w:t>
-      </w:r>
-    </w:p>
-    <w:p>
-      <w:pPr>
-        <w:pStyle w:val="Testonormale"/>
-        <w:rPr>
-          <w:rFonts w:ascii="Century Gothic" w:hAnsi="Century Gothic" w:cs="Courier New"/>
-          <w:lang w:val="en-US"/>
-        </w:rPr>
-      </w:pPr>
-      <w:r>
-        <w:rPr>
-          <w:rFonts w:ascii="Century Gothic" w:hAnsi="Century Gothic" w:cs="Courier New"/>
-          <w:lang w:val="en-US"/>
-        </w:rPr>
-        <w:t>Vue Router</w:t>
-      </w:r>
-    </w:p>
-    <w:p>
-      <w:pPr>
-        <w:pStyle w:val="Testonormale"/>
-        <w:rPr>
-          <w:rFonts w:ascii="Century Gothic" w:hAnsi="Century Gothic" w:cs="Courier New"/>
-          <w:lang w:val="en-US"/>
-        </w:rPr>
-      </w:pPr>
-      <w:r>
-        <w:rPr>
-          <w:rFonts w:ascii="Century Gothic" w:hAnsi="Century Gothic" w:cs="Courier New"/>
-          <w:lang w:val="en-US"/>
-        </w:rPr>
-        <w:t>Vite</w:t>
-      </w:r>
-    </w:p>
-    <w:p>
-      <w:pPr>
-        <w:pStyle w:val="Testonormale"/>
-        <w:rPr>
-          <w:rFonts w:ascii="Century Gothic" w:hAnsi="Century Gothic" w:cs="Courier New"/>
-          <w:lang w:val="en-US"/>
-        </w:rPr>
-      </w:pPr>
-      <w:r>
-        <w:rPr>
-          <w:rFonts w:ascii="Century Gothic" w:hAnsi="Century Gothic" w:cs="Courier New"/>
-          <w:lang w:val="en-US"/>
-        </w:rPr>
-        <w:t>Axios</w:t>
-      </w:r>
-    </w:p>
-    <w:p>
-      <w:pPr>
-        <w:pStyle w:val="Testonormale"/>
-        <w:rPr>
-          <w:rFonts w:ascii="Century Gothic" w:hAnsi="Century Gothic" w:cs="Courier New"/>
-          <w:lang w:val="en-US"/>
-        </w:rPr>
-      </w:pPr>
-      <w:r>
-        <w:rPr>
-          <w:rFonts w:ascii="Century Gothic" w:hAnsi="Century Gothic" w:cs="Courier New"/>
-          <w:lang w:val="en-US"/>
-        </w:rPr>
-        <w:t>Bootstrap per css</w:t>
-      </w:r>
-    </w:p>
-    <w:p>
-      <w:pPr>
-        <w:pStyle w:val="Testonormale"/>
-        <w:rPr>
-          <w:rFonts w:ascii="Century Gothic" w:hAnsi="Century Gothic" w:cs="Courier New"/>
-          <w:lang w:val="en-US"/>
-        </w:rPr>
-      </w:pPr>
-    </w:p>
-    <w:p>
-      <w:pPr>
-        <w:pStyle w:val="Testonormale"/>
+          <w:sz w:val="28"/>
+          <w:szCs w:val="28"/>
+        </w:rPr>
+        <w:t xml:space="preserve">Packages </w:t>
+      </w:r>
+      <w:proofErr w:type="spellStart"/>
+      <w:r>
         <w:rPr>
           <w:rFonts w:ascii="Century Gothic" w:hAnsi="Century Gothic" w:cs="Courier New"/>
           <w:b/>
-          <w:lang w:val="en-US"/>
-        </w:rPr>
-      </w:pPr>
-      <w:r>
-        <w:rPr>
-          <w:rFonts w:ascii="Century Gothic" w:hAnsi="Century Gothic" w:cs="Courier New"/>
-          <w:b/>
-          <w:lang w:val="en-US"/>
-        </w:rPr>
-        <w:t>Packages installati</w:t>
-      </w:r>
+          <w:sz w:val="28"/>
+          <w:szCs w:val="28"/>
+        </w:rPr>
+        <w:t>installati</w:t>
+      </w:r>
+      <w:proofErr w:type="spellEnd"/>
     </w:p>
     <w:p>
       <w:pPr>
@@ -671,22 +1056,50 @@
           <w:ilvl w:val="0"/>
           <w:numId w:val="6"/>
         </w:numPr>
-        <w:rPr>
-          <w:rFonts w:ascii="Century Gothic" w:hAnsi="Century Gothic" w:cs="Courier New"/>
-        </w:rPr>
-      </w:pPr>
-      <w:r>
-        <w:rPr>
-          <w:rFonts w:ascii="Century Gothic" w:hAnsi="Century Gothic" w:cs="Courier New"/>
-        </w:rPr>
+        <w:jc w:val="both"/>
+        <w:rPr>
+          <w:rFonts w:ascii="Century Gothic" w:hAnsi="Century Gothic" w:cs="Courier New"/>
+          <w:sz w:val="22"/>
+          <w:szCs w:val="22"/>
+        </w:rPr>
+      </w:pPr>
+      <w:proofErr w:type="spellStart"/>
+      <w:r>
+        <w:rPr>
+          <w:rFonts w:ascii="Century Gothic" w:hAnsi="Century Gothic" w:cs="Courier New"/>
+          <w:sz w:val="22"/>
+          <w:szCs w:val="22"/>
+        </w:rPr>
+        <w:lastRenderedPageBreak/>
         <w:t>c</w:t>
       </w:r>
       <w:r>
         <w:rPr>
           <w:rFonts w:ascii="Century Gothic" w:hAnsi="Century Gothic" w:cs="Courier New"/>
-        </w:rPr>
-        <w:t>onnect-history-api-fallback</w:t>
-      </w:r>
+          <w:sz w:val="22"/>
+          <w:szCs w:val="22"/>
+        </w:rPr>
+        <w:t>onnect</w:t>
+      </w:r>
+      <w:proofErr w:type="spellEnd"/>
+      <w:r>
+        <w:rPr>
+          <w:rFonts w:ascii="Century Gothic" w:hAnsi="Century Gothic" w:cs="Courier New"/>
+          <w:sz w:val="22"/>
+          <w:szCs w:val="22"/>
+        </w:rPr>
+        <w:t>-history-api-</w:t>
+      </w:r>
+      <w:proofErr w:type="spellStart"/>
+      <w:r>
+        <w:rPr>
+          <w:rFonts w:ascii="Century Gothic" w:hAnsi="Century Gothic" w:cs="Courier New"/>
+          <w:sz w:val="22"/>
+          <w:szCs w:val="22"/>
+        </w:rPr>
+        <w:t>fallback</w:t>
+      </w:r>
+      <w:proofErr w:type="spellEnd"/>
     </w:p>
     <w:p>
       <w:pPr>
@@ -695,27 +1108,72 @@
           <w:ilvl w:val="0"/>
           <w:numId w:val="6"/>
         </w:numPr>
-        <w:rPr>
-          <w:rFonts w:ascii="Century Gothic" w:hAnsi="Century Gothic" w:cs="Courier New"/>
-        </w:rPr>
-      </w:pPr>
-      <w:r>
-        <w:rPr>
-          <w:rFonts w:ascii="Century Gothic" w:hAnsi="Century Gothic" w:cs="Courier New"/>
+        <w:jc w:val="both"/>
+        <w:rPr>
+          <w:rFonts w:ascii="Century Gothic" w:hAnsi="Century Gothic" w:cs="Courier New"/>
+          <w:sz w:val="22"/>
+          <w:szCs w:val="22"/>
+        </w:rPr>
+      </w:pPr>
+      <w:r>
+        <w:rPr>
+          <w:rFonts w:ascii="Century Gothic" w:hAnsi="Century Gothic" w:cs="Courier New"/>
+          <w:sz w:val="22"/>
+          <w:szCs w:val="22"/>
         </w:rPr>
         <w:t>mysql2</w:t>
       </w:r>
       <w:r>
         <w:rPr>
           <w:rFonts w:ascii="Century Gothic" w:hAnsi="Century Gothic" w:cs="Courier New"/>
-        </w:rPr>
-        <w:t>: o</w:t>
-      </w:r>
-      <w:r>
-        <w:rPr>
-          <w:rFonts w:ascii="Century Gothic" w:hAnsi="Century Gothic" w:cs="Courier New"/>
-        </w:rPr>
-        <w:t>timizzato e compatibile con Promises, ideale per eseguire query asincrone in applicazioni Node.js</w:t>
+          <w:sz w:val="22"/>
+          <w:szCs w:val="22"/>
+        </w:rPr>
+        <w:t xml:space="preserve">: </w:t>
+      </w:r>
+      <w:proofErr w:type="spellStart"/>
+      <w:r>
+        <w:rPr>
+          <w:rFonts w:ascii="Century Gothic" w:hAnsi="Century Gothic" w:cs="Courier New"/>
+          <w:sz w:val="22"/>
+          <w:szCs w:val="22"/>
+        </w:rPr>
+        <w:t>o</w:t>
+      </w:r>
+      <w:r>
+        <w:rPr>
+          <w:rFonts w:ascii="Century Gothic" w:hAnsi="Century Gothic" w:cs="Courier New"/>
+          <w:sz w:val="22"/>
+          <w:szCs w:val="22"/>
+        </w:rPr>
+        <w:t>timizzato</w:t>
+      </w:r>
+      <w:proofErr w:type="spellEnd"/>
+      <w:r>
+        <w:rPr>
+          <w:rFonts w:ascii="Century Gothic" w:hAnsi="Century Gothic" w:cs="Courier New"/>
+          <w:sz w:val="22"/>
+          <w:szCs w:val="22"/>
+        </w:rPr>
+        <w:t xml:space="preserve"> e compatibile con </w:t>
+      </w:r>
+      <w:proofErr w:type="spellStart"/>
+      <w:r>
+        <w:rPr>
+          <w:rFonts w:ascii="Century Gothic" w:hAnsi="Century Gothic" w:cs="Courier New"/>
+          <w:sz w:val="22"/>
+          <w:szCs w:val="22"/>
+        </w:rPr>
+        <w:t>Promises</w:t>
+      </w:r>
+      <w:proofErr w:type="spellEnd"/>
+      <w:r>
+        <w:rPr>
+          <w:rFonts w:ascii="Century Gothic" w:hAnsi="Century Gothic" w:cs="Courier New"/>
+          <w:sz w:val="22"/>
+          <w:szCs w:val="22"/>
+        </w:rPr>
+        <w:t>, ideale per eseguire query asincrone in applicazioni Node.js</w:t>
       </w:r>
     </w:p>
     <w:p>
@@ -725,63 +1183,116 @@
           <w:ilvl w:val="0"/>
           <w:numId w:val="6"/>
         </w:numPr>
-        <w:rPr>
-          <w:rFonts w:ascii="Century Gothic" w:hAnsi="Century Gothic" w:cs="Courier New"/>
-        </w:rPr>
-      </w:pPr>
-      <w:r>
-        <w:rPr>
-          <w:rFonts w:ascii="Century Gothic" w:hAnsi="Century Gothic" w:cs="Courier New"/>
+        <w:jc w:val="both"/>
+        <w:rPr>
+          <w:rFonts w:ascii="Century Gothic" w:hAnsi="Century Gothic" w:cs="Courier New"/>
+          <w:sz w:val="22"/>
+          <w:szCs w:val="22"/>
+        </w:rPr>
+      </w:pPr>
+      <w:r>
+        <w:rPr>
+          <w:rFonts w:ascii="Century Gothic" w:hAnsi="Century Gothic" w:cs="Courier New"/>
+          <w:sz w:val="22"/>
+          <w:szCs w:val="22"/>
         </w:rPr>
         <w:t>cookie-parser</w:t>
       </w:r>
       <w:r>
         <w:rPr>
           <w:rFonts w:ascii="Century Gothic" w:hAnsi="Century Gothic" w:cs="Courier New"/>
+          <w:sz w:val="22"/>
+          <w:szCs w:val="22"/>
         </w:rPr>
         <w:t xml:space="preserve">, </w:t>
       </w:r>
-      <w:r>
-        <w:rPr>
-          <w:rFonts w:ascii="Century Gothic" w:hAnsi="Century Gothic" w:cs="Courier New"/>
+      <w:proofErr w:type="spellStart"/>
+      <w:r>
+        <w:rPr>
+          <w:rFonts w:ascii="Century Gothic" w:hAnsi="Century Gothic" w:cs="Courier New"/>
+          <w:sz w:val="22"/>
+          <w:szCs w:val="22"/>
         </w:rPr>
         <w:t>jsonwebtoken</w:t>
       </w:r>
-      <w:r>
-        <w:rPr>
-          <w:rFonts w:ascii="Century Gothic" w:hAnsi="Century Gothic" w:cs="Courier New"/>
+      <w:proofErr w:type="spellEnd"/>
+      <w:r>
+        <w:rPr>
+          <w:rFonts w:ascii="Century Gothic" w:hAnsi="Century Gothic" w:cs="Courier New"/>
+          <w:sz w:val="22"/>
+          <w:szCs w:val="22"/>
         </w:rPr>
         <w:t xml:space="preserve"> e </w:t>
       </w:r>
-      <w:r>
-        <w:rPr>
-          <w:rFonts w:ascii="Century Gothic" w:hAnsi="Century Gothic" w:cs="Courier New"/>
+      <w:proofErr w:type="spellStart"/>
+      <w:r>
+        <w:rPr>
+          <w:rFonts w:ascii="Century Gothic" w:hAnsi="Century Gothic" w:cs="Courier New"/>
+          <w:sz w:val="22"/>
+          <w:szCs w:val="22"/>
         </w:rPr>
         <w:t>bcrypt</w:t>
       </w:r>
-      <w:r>
-        <w:rPr>
-          <w:rFonts w:ascii="Century Gothic" w:hAnsi="Century Gothic" w:cs="Courier New"/>
-        </w:rPr>
-        <w:t>: utilizzati</w:t>
-      </w:r>
-      <w:r>
-        <w:rPr>
-          <w:rFonts w:ascii="Century Gothic" w:hAnsi="Century Gothic" w:cs="Courier New"/>
-        </w:rPr>
-        <w:t xml:space="preserve"> per la parte di autenticazione. Grazie a questi pacchetti è possibile realizzare una crittografia delle password</w:t>
-      </w:r>
-      <w:r>
-        <w:rPr>
-          <w:rFonts w:ascii="Century Gothic" w:hAnsi="Century Gothic" w:cs="Courier New"/>
-        </w:rPr>
-        <w:t>, gestire i JWT e il parsing dei cookie</w:t>
-      </w:r>
-      <w:r>
-        <w:rPr>
-          <w:rFonts w:ascii="Century Gothic" w:hAnsi="Century Gothic" w:cs="Courier New"/>
-        </w:rPr>
-        <w:t>. Sono stati installati anche i tipi per TypeScript.</w:t>
+      <w:proofErr w:type="spellEnd"/>
+      <w:r>
+        <w:rPr>
+          <w:rFonts w:ascii="Century Gothic" w:hAnsi="Century Gothic" w:cs="Courier New"/>
+          <w:sz w:val="22"/>
+          <w:szCs w:val="22"/>
+        </w:rPr>
+        <w:t>: utilizzati per la parte di autenticazione. Grazie a questi pacchetti è possibile realizzare una crittografia delle password</w:t>
+      </w:r>
+      <w:r>
+        <w:rPr>
+          <w:rFonts w:ascii="Century Gothic" w:hAnsi="Century Gothic" w:cs="Courier New"/>
+          <w:sz w:val="22"/>
+          <w:szCs w:val="22"/>
+        </w:rPr>
+        <w:t xml:space="preserve">, gestire i JWT e il </w:t>
+      </w:r>
+      <w:proofErr w:type="spellStart"/>
+      <w:r>
+        <w:rPr>
+          <w:rFonts w:ascii="Century Gothic" w:hAnsi="Century Gothic" w:cs="Courier New"/>
+          <w:sz w:val="22"/>
+          <w:szCs w:val="22"/>
+        </w:rPr>
+        <w:t>parsing</w:t>
+      </w:r>
+      <w:proofErr w:type="spellEnd"/>
+      <w:r>
+        <w:rPr>
+          <w:rFonts w:ascii="Century Gothic" w:hAnsi="Century Gothic" w:cs="Courier New"/>
+          <w:sz w:val="22"/>
+          <w:szCs w:val="22"/>
+        </w:rPr>
+        <w:t xml:space="preserve"> dei cookie</w:t>
+      </w:r>
+      <w:r>
+        <w:rPr>
+          <w:rFonts w:ascii="Century Gothic" w:hAnsi="Century Gothic" w:cs="Courier New"/>
+          <w:sz w:val="22"/>
+          <w:szCs w:val="22"/>
+        </w:rPr>
+        <w:t xml:space="preserve">. Sono stati installati anche i tipi per </w:t>
+      </w:r>
+      <w:proofErr w:type="spellStart"/>
+      <w:r>
+        <w:rPr>
+          <w:rFonts w:ascii="Century Gothic" w:hAnsi="Century Gothic" w:cs="Courier New"/>
+          <w:sz w:val="22"/>
+          <w:szCs w:val="22"/>
+        </w:rPr>
+        <w:t>TypeScript</w:t>
+      </w:r>
+      <w:proofErr w:type="spellEnd"/>
+      <w:r>
+        <w:rPr>
+          <w:rFonts w:ascii="Century Gothic" w:hAnsi="Century Gothic" w:cs="Courier New"/>
+          <w:sz w:val="22"/>
+          <w:szCs w:val="22"/>
+        </w:rPr>
+        <w:t>.</w:t>
       </w:r>
     </w:p>
     <w:p>
@@ -791,55 +1302,127 @@
           <w:ilvl w:val="0"/>
           <w:numId w:val="6"/>
         </w:numPr>
-        <w:rPr>
-          <w:rFonts w:ascii="Century Gothic" w:hAnsi="Century Gothic" w:cs="Courier New"/>
-        </w:rPr>
-      </w:pPr>
-      <w:r>
-        <w:rPr>
-          <w:rFonts w:ascii="Century Gothic" w:hAnsi="Century Gothic" w:cs="Courier New"/>
+        <w:jc w:val="both"/>
+        <w:rPr>
+          <w:rFonts w:ascii="Century Gothic" w:hAnsi="Century Gothic" w:cs="Courier New"/>
+          <w:sz w:val="22"/>
+          <w:szCs w:val="22"/>
+        </w:rPr>
+      </w:pPr>
+      <w:proofErr w:type="spellStart"/>
+      <w:r>
+        <w:rPr>
+          <w:rFonts w:ascii="Century Gothic" w:hAnsi="Century Gothic" w:cs="Courier New"/>
+          <w:sz w:val="22"/>
+          <w:szCs w:val="22"/>
         </w:rPr>
         <w:t>m</w:t>
       </w:r>
       <w:r>
         <w:rPr>
           <w:rFonts w:ascii="Century Gothic" w:hAnsi="Century Gothic" w:cs="Courier New"/>
+          <w:sz w:val="22"/>
+          <w:szCs w:val="22"/>
         </w:rPr>
         <w:t>ulter</w:t>
       </w:r>
-      <w:r>
-        <w:rPr>
-          <w:rFonts w:ascii="Century Gothic" w:hAnsi="Century Gothic" w:cs="Courier New"/>
+      <w:proofErr w:type="spellEnd"/>
+      <w:r>
+        <w:rPr>
+          <w:rFonts w:ascii="Century Gothic" w:hAnsi="Century Gothic" w:cs="Courier New"/>
+          <w:sz w:val="22"/>
+          <w:szCs w:val="22"/>
         </w:rPr>
         <w:t>: m</w:t>
       </w:r>
       <w:r>
         <w:rPr>
           <w:rFonts w:ascii="Century Gothic" w:hAnsi="Century Gothic" w:cs="Courier New"/>
-        </w:rPr>
-        <w:t>iddleware per gestire l'upload di file in Node.js, particolarmente utile per elaborare form multipart/form-data.</w:t>
-      </w:r>
-    </w:p>
-    <w:p>
-      <w:pPr>
-        <w:pStyle w:val="Testonormale"/>
-        <w:rPr>
-          <w:rFonts w:ascii="Century Gothic" w:hAnsi="Century Gothic" w:cs="Courier New"/>
-        </w:rPr>
-      </w:pPr>
-    </w:p>
-    <w:p>
-      <w:pPr>
-        <w:pStyle w:val="Testonormale"/>
+          <w:sz w:val="22"/>
+          <w:szCs w:val="22"/>
+        </w:rPr>
+        <w:t xml:space="preserve">iddleware per gestire l'upload di file in Node.js, particolarmente utile per elaborare </w:t>
+      </w:r>
+      <w:proofErr w:type="spellStart"/>
+      <w:r>
+        <w:rPr>
+          <w:rFonts w:ascii="Century Gothic" w:hAnsi="Century Gothic" w:cs="Courier New"/>
+          <w:sz w:val="22"/>
+          <w:szCs w:val="22"/>
+        </w:rPr>
+        <w:t>form</w:t>
+      </w:r>
+      <w:proofErr w:type="spellEnd"/>
+      <w:r>
+        <w:rPr>
+          <w:rFonts w:ascii="Century Gothic" w:hAnsi="Century Gothic" w:cs="Courier New"/>
+          <w:sz w:val="22"/>
+          <w:szCs w:val="22"/>
+        </w:rPr>
+        <w:t xml:space="preserve"> </w:t>
+      </w:r>
+      <w:proofErr w:type="spellStart"/>
+      <w:r>
+        <w:rPr>
+          <w:rFonts w:ascii="Century Gothic" w:hAnsi="Century Gothic" w:cs="Courier New"/>
+          <w:sz w:val="22"/>
+          <w:szCs w:val="22"/>
+        </w:rPr>
+        <w:t>multipart</w:t>
+      </w:r>
+      <w:proofErr w:type="spellEnd"/>
+      <w:r>
+        <w:rPr>
+          <w:rFonts w:ascii="Century Gothic" w:hAnsi="Century Gothic" w:cs="Courier New"/>
+          <w:sz w:val="22"/>
+          <w:szCs w:val="22"/>
+        </w:rPr>
+        <w:t>/</w:t>
+      </w:r>
+      <w:proofErr w:type="spellStart"/>
+      <w:r>
+        <w:rPr>
+          <w:rFonts w:ascii="Century Gothic" w:hAnsi="Century Gothic" w:cs="Courier New"/>
+          <w:sz w:val="22"/>
+          <w:szCs w:val="22"/>
+        </w:rPr>
+        <w:t>form</w:t>
+      </w:r>
+      <w:proofErr w:type="spellEnd"/>
+      <w:r>
+        <w:rPr>
+          <w:rFonts w:ascii="Century Gothic" w:hAnsi="Century Gothic" w:cs="Courier New"/>
+          <w:sz w:val="22"/>
+          <w:szCs w:val="22"/>
+        </w:rPr>
+        <w:t>-data.</w:t>
+      </w:r>
+    </w:p>
+    <w:p>
+      <w:pPr>
+        <w:pStyle w:val="Testonormale"/>
+        <w:rPr>
+          <w:rFonts w:ascii="Century Gothic" w:hAnsi="Century Gothic" w:cs="Courier New"/>
+        </w:rPr>
+      </w:pPr>
+    </w:p>
+    <w:p>
+      <w:pPr>
+        <w:pStyle w:val="Testonormale"/>
+        <w:spacing w:after="240"/>
         <w:rPr>
           <w:rFonts w:ascii="Century Gothic" w:hAnsi="Century Gothic" w:cs="Courier New"/>
           <w:b/>
+          <w:sz w:val="28"/>
+          <w:szCs w:val="28"/>
         </w:rPr>
       </w:pPr>
       <w:r>
         <w:rPr>
           <w:rFonts w:ascii="Century Gothic" w:hAnsi="Century Gothic" w:cs="Courier New"/>
           <w:b/>
+          <w:sz w:val="28"/>
+          <w:szCs w:val="28"/>
         </w:rPr>
         <w:t>Struttura progetto</w:t>
       </w:r>
@@ -847,57 +1430,111 @@
     <w:p>
       <w:pPr>
         <w:pStyle w:val="Testonormale"/>
-        <w:rPr>
-          <w:rFonts w:ascii="Century Gothic" w:hAnsi="Century Gothic" w:cs="Courier New"/>
-        </w:rPr>
-      </w:pPr>
-      <w:r>
-        <w:rPr>
-          <w:rFonts w:ascii="Century Gothic" w:hAnsi="Century Gothic" w:cs="Courier New"/>
+        <w:jc w:val="both"/>
+        <w:rPr>
+          <w:rFonts w:ascii="Century Gothic" w:hAnsi="Century Gothic" w:cs="Courier New"/>
+          <w:sz w:val="22"/>
+          <w:szCs w:val="22"/>
+        </w:rPr>
+      </w:pPr>
+      <w:r>
+        <w:rPr>
+          <w:rFonts w:ascii="Century Gothic" w:hAnsi="Century Gothic" w:cs="Courier New"/>
+          <w:sz w:val="22"/>
+          <w:szCs w:val="22"/>
         </w:rPr>
         <w:t>S</w:t>
       </w:r>
       <w:r>
         <w:rPr>
           <w:rFonts w:ascii="Century Gothic" w:hAnsi="Century Gothic" w:cs="Courier New"/>
+          <w:sz w:val="22"/>
+          <w:szCs w:val="22"/>
         </w:rPr>
         <w:t>udd</w:t>
       </w:r>
       <w:r>
         <w:rPr>
           <w:rFonts w:ascii="Century Gothic" w:hAnsi="Century Gothic" w:cs="Courier New"/>
+          <w:sz w:val="22"/>
+          <w:szCs w:val="22"/>
         </w:rPr>
         <w:t>i</w:t>
       </w:r>
       <w:r>
         <w:rPr>
           <w:rFonts w:ascii="Century Gothic" w:hAnsi="Century Gothic" w:cs="Courier New"/>
-        </w:rPr>
-        <w:t>viso in frontend e backend realizzati rispettivamente con Vue.js e Express</w:t>
-      </w:r>
-    </w:p>
-    <w:p>
-      <w:pPr>
-        <w:pStyle w:val="Testonormale"/>
-        <w:rPr>
-          <w:rFonts w:ascii="Century Gothic" w:hAnsi="Century Gothic" w:cs="Courier New"/>
-        </w:rPr>
-      </w:pPr>
-    </w:p>
-    <w:p>
-      <w:pPr>
-        <w:pStyle w:val="Testonormale"/>
+          <w:sz w:val="22"/>
+          <w:szCs w:val="22"/>
+        </w:rPr>
+        <w:t xml:space="preserve">viso in </w:t>
+      </w:r>
+      <w:proofErr w:type="spellStart"/>
+      <w:r>
+        <w:rPr>
+          <w:rFonts w:ascii="Century Gothic" w:hAnsi="Century Gothic" w:cs="Courier New"/>
+          <w:sz w:val="22"/>
+          <w:szCs w:val="22"/>
+        </w:rPr>
+        <w:t>frontend</w:t>
+      </w:r>
+      <w:proofErr w:type="spellEnd"/>
+      <w:r>
+        <w:rPr>
+          <w:rFonts w:ascii="Century Gothic" w:hAnsi="Century Gothic" w:cs="Courier New"/>
+          <w:sz w:val="22"/>
+          <w:szCs w:val="22"/>
+        </w:rPr>
+        <w:t xml:space="preserve"> e backend realizzati rispettivamente con Vue.js </w:t>
+      </w:r>
+      <w:proofErr w:type="gramStart"/>
+      <w:r>
+        <w:rPr>
+          <w:rFonts w:ascii="Century Gothic" w:hAnsi="Century Gothic" w:cs="Courier New"/>
+          <w:sz w:val="22"/>
+          <w:szCs w:val="22"/>
+        </w:rPr>
+        <w:t>e</w:t>
+      </w:r>
+      <w:proofErr w:type="gramEnd"/>
+      <w:r>
+        <w:rPr>
+          <w:rFonts w:ascii="Century Gothic" w:hAnsi="Century Gothic" w:cs="Courier New"/>
+          <w:sz w:val="22"/>
+          <w:szCs w:val="22"/>
+        </w:rPr>
+        <w:t xml:space="preserve"> Express</w:t>
+      </w:r>
+    </w:p>
+    <w:p>
+      <w:pPr>
+        <w:pStyle w:val="Testonormale"/>
+        <w:jc w:val="both"/>
+        <w:rPr>
+          <w:rFonts w:ascii="Century Gothic" w:hAnsi="Century Gothic" w:cs="Courier New"/>
+          <w:sz w:val="22"/>
+          <w:szCs w:val="22"/>
+        </w:rPr>
+      </w:pPr>
+    </w:p>
+    <w:p>
+      <w:pPr>
+        <w:pStyle w:val="Testonormale"/>
+        <w:spacing w:after="240"/>
         <w:rPr>
           <w:rFonts w:ascii="Century Gothic" w:hAnsi="Century Gothic" w:cs="Courier New"/>
           <w:b/>
+          <w:sz w:val="28"/>
+          <w:szCs w:val="28"/>
         </w:rPr>
       </w:pPr>
       <w:r>
         <w:rPr>
           <w:rFonts w:ascii="Century Gothic" w:hAnsi="Century Gothic" w:cs="Courier New"/>
           <w:b/>
-        </w:rPr>
-        <w:lastRenderedPageBreak/>
+          <w:sz w:val="28"/>
+          <w:szCs w:val="28"/>
+        </w:rPr>
         <w:t>API endpoint</w:t>
       </w:r>
     </w:p>
@@ -912,15 +1549,22 @@
     <w:p>
       <w:pPr>
         <w:pStyle w:val="Testonormale"/>
+        <w:spacing w:after="240"/>
         <w:rPr>
           <w:rFonts w:ascii="Century Gothic" w:hAnsi="Century Gothic" w:cs="Courier New"/>
           <w:b/>
+          <w:sz w:val="22"/>
+          <w:szCs w:val="22"/>
+          <w:u w:val="single"/>
         </w:rPr>
       </w:pPr>
       <w:r>
         <w:rPr>
           <w:rFonts w:ascii="Century Gothic" w:hAnsi="Century Gothic" w:cs="Courier New"/>
           <w:b/>
+          <w:sz w:val="22"/>
+          <w:szCs w:val="22"/>
+          <w:u w:val="single"/>
         </w:rPr>
         <w:t>GET</w:t>
       </w:r>
@@ -934,11 +1578,15 @@
         </w:numPr>
         <w:rPr>
           <w:rFonts w:ascii="Century Gothic" w:hAnsi="Century Gothic" w:cs="Courier New"/>
-        </w:rPr>
-      </w:pPr>
-      <w:r>
-        <w:rPr>
-          <w:rFonts w:ascii="Century Gothic" w:hAnsi="Century Gothic" w:cs="Courier New"/>
+          <w:sz w:val="22"/>
+          <w:szCs w:val="22"/>
+        </w:rPr>
+      </w:pPr>
+      <w:r>
+        <w:rPr>
+          <w:rFonts w:ascii="Century Gothic" w:hAnsi="Century Gothic" w:cs="Courier New"/>
+          <w:sz w:val="22"/>
+          <w:szCs w:val="22"/>
         </w:rPr>
         <w:t>/api/news</w:t>
       </w:r>
@@ -952,11 +1600,15 @@
         </w:numPr>
         <w:rPr>
           <w:rFonts w:ascii="Century Gothic" w:hAnsi="Century Gothic" w:cs="Courier New"/>
-        </w:rPr>
-      </w:pPr>
-      <w:r>
-        <w:rPr>
-          <w:rFonts w:ascii="Century Gothic" w:hAnsi="Century Gothic" w:cs="Courier New"/>
+          <w:sz w:val="22"/>
+          <w:szCs w:val="22"/>
+        </w:rPr>
+      </w:pPr>
+      <w:r>
+        <w:rPr>
+          <w:rFonts w:ascii="Century Gothic" w:hAnsi="Century Gothic" w:cs="Courier New"/>
+          <w:sz w:val="22"/>
+          <w:szCs w:val="22"/>
         </w:rPr>
         <w:t>/api/news/:id</w:t>
       </w:r>
@@ -970,14 +1622,46 @@
         </w:numPr>
         <w:rPr>
           <w:rFonts w:ascii="Century Gothic" w:hAnsi="Century Gothic" w:cs="Courier New"/>
-        </w:rPr>
-      </w:pPr>
-      <w:r>
-        <w:rPr>
-          <w:rFonts w:ascii="Century Gothic" w:hAnsi="Century Gothic" w:cs="Courier New"/>
-        </w:rPr>
-        <w:t>/api/auth/profile</w:t>
-      </w:r>
+          <w:sz w:val="22"/>
+          <w:szCs w:val="22"/>
+        </w:rPr>
+      </w:pPr>
+      <w:r>
+        <w:rPr>
+          <w:rFonts w:ascii="Century Gothic" w:hAnsi="Century Gothic" w:cs="Courier New"/>
+          <w:sz w:val="22"/>
+          <w:szCs w:val="22"/>
+        </w:rPr>
+        <w:t>/api/</w:t>
+      </w:r>
+      <w:proofErr w:type="spellStart"/>
+      <w:r>
+        <w:rPr>
+          <w:rFonts w:ascii="Century Gothic" w:hAnsi="Century Gothic" w:cs="Courier New"/>
+          <w:sz w:val="22"/>
+          <w:szCs w:val="22"/>
+        </w:rPr>
+        <w:t>auth</w:t>
+      </w:r>
+      <w:proofErr w:type="spellEnd"/>
+      <w:r>
+        <w:rPr>
+          <w:rFonts w:ascii="Century Gothic" w:hAnsi="Century Gothic" w:cs="Courier New"/>
+          <w:sz w:val="22"/>
+          <w:szCs w:val="22"/>
+        </w:rPr>
+        <w:t>/</w:t>
+      </w:r>
+      <w:proofErr w:type="spellStart"/>
+      <w:r>
+        <w:rPr>
+          <w:rFonts w:ascii="Century Gothic" w:hAnsi="Century Gothic" w:cs="Courier New"/>
+          <w:sz w:val="22"/>
+          <w:szCs w:val="22"/>
+        </w:rPr>
+        <w:t>profile</w:t>
+      </w:r>
+      <w:proofErr w:type="spellEnd"/>
     </w:p>
     <w:p>
       <w:pPr>
@@ -988,11 +1672,15 @@
         </w:numPr>
         <w:rPr>
           <w:rFonts w:ascii="Century Gothic" w:hAnsi="Century Gothic" w:cs="Courier New"/>
-        </w:rPr>
-      </w:pPr>
-      <w:r>
-        <w:rPr>
-          <w:rFonts w:ascii="Century Gothic" w:hAnsi="Century Gothic" w:cs="Courier New"/>
+          <w:sz w:val="22"/>
+          <w:szCs w:val="22"/>
+        </w:rPr>
+      </w:pPr>
+      <w:r>
+        <w:rPr>
+          <w:rFonts w:ascii="Century Gothic" w:hAnsi="Century Gothic" w:cs="Courier New"/>
+          <w:sz w:val="22"/>
+          <w:szCs w:val="22"/>
         </w:rPr>
         <w:t>/api/annunci</w:t>
       </w:r>
@@ -1006,14 +1694,28 @@
         </w:numPr>
         <w:rPr>
           <w:rFonts w:ascii="Century Gothic" w:hAnsi="Century Gothic" w:cs="Courier New"/>
-        </w:rPr>
-      </w:pPr>
-      <w:r>
-        <w:rPr>
-          <w:rFonts w:ascii="Century Gothic" w:hAnsi="Century Gothic" w:cs="Courier New"/>
-        </w:rPr>
-        <w:t>/api/lastannunci</w:t>
-      </w:r>
+          <w:sz w:val="22"/>
+          <w:szCs w:val="22"/>
+        </w:rPr>
+      </w:pPr>
+      <w:r>
+        <w:rPr>
+          <w:rFonts w:ascii="Century Gothic" w:hAnsi="Century Gothic" w:cs="Courier New"/>
+          <w:sz w:val="22"/>
+          <w:szCs w:val="22"/>
+        </w:rPr>
+        <w:t>/api/</w:t>
+      </w:r>
+      <w:proofErr w:type="spellStart"/>
+      <w:r>
+        <w:rPr>
+          <w:rFonts w:ascii="Century Gothic" w:hAnsi="Century Gothic" w:cs="Courier New"/>
+          <w:sz w:val="22"/>
+          <w:szCs w:val="22"/>
+        </w:rPr>
+        <w:t>lastannunci</w:t>
+      </w:r>
+      <w:proofErr w:type="spellEnd"/>
     </w:p>
     <w:p>
       <w:pPr>
@@ -1024,11 +1726,15 @@
         </w:numPr>
         <w:rPr>
           <w:rFonts w:ascii="Century Gothic" w:hAnsi="Century Gothic" w:cs="Courier New"/>
-        </w:rPr>
-      </w:pPr>
-      <w:r>
-        <w:rPr>
-          <w:rFonts w:ascii="Century Gothic" w:hAnsi="Century Gothic" w:cs="Courier New"/>
+          <w:sz w:val="22"/>
+          <w:szCs w:val="22"/>
+        </w:rPr>
+      </w:pPr>
+      <w:r>
+        <w:rPr>
+          <w:rFonts w:ascii="Century Gothic" w:hAnsi="Century Gothic" w:cs="Courier New"/>
+          <w:sz w:val="22"/>
+          <w:szCs w:val="22"/>
         </w:rPr>
         <w:t>/api/annunci/:id</w:t>
       </w:r>
@@ -1042,14 +1748,28 @@
         </w:numPr>
         <w:rPr>
           <w:rFonts w:ascii="Century Gothic" w:hAnsi="Century Gothic" w:cs="Courier New"/>
-        </w:rPr>
-      </w:pPr>
-      <w:r>
-        <w:rPr>
-          <w:rFonts w:ascii="Century Gothic" w:hAnsi="Century Gothic" w:cs="Courier New"/>
-        </w:rPr>
-        <w:t>/api/annuncinoattivi</w:t>
-      </w:r>
+          <w:sz w:val="22"/>
+          <w:szCs w:val="22"/>
+        </w:rPr>
+      </w:pPr>
+      <w:r>
+        <w:rPr>
+          <w:rFonts w:ascii="Century Gothic" w:hAnsi="Century Gothic" w:cs="Courier New"/>
+          <w:sz w:val="22"/>
+          <w:szCs w:val="22"/>
+        </w:rPr>
+        <w:t>/api/</w:t>
+      </w:r>
+      <w:proofErr w:type="spellStart"/>
+      <w:r>
+        <w:rPr>
+          <w:rFonts w:ascii="Century Gothic" w:hAnsi="Century Gothic" w:cs="Courier New"/>
+          <w:sz w:val="22"/>
+          <w:szCs w:val="22"/>
+        </w:rPr>
+        <w:t>annuncinoattivi</w:t>
+      </w:r>
+      <w:proofErr w:type="spellEnd"/>
     </w:p>
     <w:p>
       <w:pPr>
@@ -1060,14 +1780,28 @@
         </w:numPr>
         <w:rPr>
           <w:rFonts w:ascii="Century Gothic" w:hAnsi="Century Gothic" w:cs="Courier New"/>
-        </w:rPr>
-      </w:pPr>
-      <w:r>
-        <w:rPr>
-          <w:rFonts w:ascii="Century Gothic" w:hAnsi="Century Gothic" w:cs="Courier New"/>
-        </w:rPr>
-        <w:t>/api/annunci/prezzo/:prezzomax</w:t>
-      </w:r>
+          <w:sz w:val="22"/>
+          <w:szCs w:val="22"/>
+        </w:rPr>
+      </w:pPr>
+      <w:r>
+        <w:rPr>
+          <w:rFonts w:ascii="Century Gothic" w:hAnsi="Century Gothic" w:cs="Courier New"/>
+          <w:sz w:val="22"/>
+          <w:szCs w:val="22"/>
+        </w:rPr>
+        <w:t>/api/annunci/prezzo/:</w:t>
+      </w:r>
+      <w:proofErr w:type="spellStart"/>
+      <w:r>
+        <w:rPr>
+          <w:rFonts w:ascii="Century Gothic" w:hAnsi="Century Gothic" w:cs="Courier New"/>
+          <w:sz w:val="22"/>
+          <w:szCs w:val="22"/>
+        </w:rPr>
+        <w:t>prezzomax</w:t>
+      </w:r>
+      <w:proofErr w:type="spellEnd"/>
     </w:p>
     <w:p>
       <w:pPr>
@@ -1078,14 +1812,28 @@
         </w:numPr>
         <w:rPr>
           <w:rFonts w:ascii="Century Gothic" w:hAnsi="Century Gothic" w:cs="Courier New"/>
-        </w:rPr>
-      </w:pPr>
-      <w:r>
-        <w:rPr>
-          <w:rFonts w:ascii="Century Gothic" w:hAnsi="Century Gothic" w:cs="Courier New"/>
-        </w:rPr>
-        <w:t>/api/annunci/tipo/:tipo/:prezzomax</w:t>
-      </w:r>
+          <w:sz w:val="22"/>
+          <w:szCs w:val="22"/>
+        </w:rPr>
+      </w:pPr>
+      <w:r>
+        <w:rPr>
+          <w:rFonts w:ascii="Century Gothic" w:hAnsi="Century Gothic" w:cs="Courier New"/>
+          <w:sz w:val="22"/>
+          <w:szCs w:val="22"/>
+        </w:rPr>
+        <w:t>/api/annunci/tipo/:tipo/:</w:t>
+      </w:r>
+      <w:proofErr w:type="spellStart"/>
+      <w:r>
+        <w:rPr>
+          <w:rFonts w:ascii="Century Gothic" w:hAnsi="Century Gothic" w:cs="Courier New"/>
+          <w:sz w:val="22"/>
+          <w:szCs w:val="22"/>
+        </w:rPr>
+        <w:t>prezzomax</w:t>
+      </w:r>
+      <w:proofErr w:type="spellEnd"/>
     </w:p>
     <w:p>
       <w:pPr>
@@ -1096,14 +1844,28 @@
         </w:numPr>
         <w:rPr>
           <w:rFonts w:ascii="Century Gothic" w:hAnsi="Century Gothic" w:cs="Courier New"/>
-        </w:rPr>
-      </w:pPr>
-      <w:r>
-        <w:rPr>
-          <w:rFonts w:ascii="Century Gothic" w:hAnsi="Century Gothic" w:cs="Courier New"/>
-        </w:rPr>
-        <w:t>/api/annunci/quartiere/:id/:prezzomax</w:t>
-      </w:r>
+          <w:sz w:val="22"/>
+          <w:szCs w:val="22"/>
+        </w:rPr>
+      </w:pPr>
+      <w:r>
+        <w:rPr>
+          <w:rFonts w:ascii="Century Gothic" w:hAnsi="Century Gothic" w:cs="Courier New"/>
+          <w:sz w:val="22"/>
+          <w:szCs w:val="22"/>
+        </w:rPr>
+        <w:t>/api/annunci/quartiere/:id/:</w:t>
+      </w:r>
+      <w:proofErr w:type="spellStart"/>
+      <w:r>
+        <w:rPr>
+          <w:rFonts w:ascii="Century Gothic" w:hAnsi="Century Gothic" w:cs="Courier New"/>
+          <w:sz w:val="22"/>
+          <w:szCs w:val="22"/>
+        </w:rPr>
+        <w:t>prezzomax</w:t>
+      </w:r>
+      <w:proofErr w:type="spellEnd"/>
     </w:p>
     <w:p>
       <w:pPr>
@@ -1114,14 +1876,28 @@
         </w:numPr>
         <w:rPr>
           <w:rFonts w:ascii="Century Gothic" w:hAnsi="Century Gothic" w:cs="Courier New"/>
-        </w:rPr>
-      </w:pPr>
-      <w:r>
-        <w:rPr>
-          <w:rFonts w:ascii="Century Gothic" w:hAnsi="Century Gothic" w:cs="Courier New"/>
-        </w:rPr>
-        <w:t>/api/annunci/filter/:tipo/:quartiere/:prezzomax</w:t>
-      </w:r>
+          <w:sz w:val="22"/>
+          <w:szCs w:val="22"/>
+        </w:rPr>
+      </w:pPr>
+      <w:r>
+        <w:rPr>
+          <w:rFonts w:ascii="Century Gothic" w:hAnsi="Century Gothic" w:cs="Courier New"/>
+          <w:sz w:val="22"/>
+          <w:szCs w:val="22"/>
+        </w:rPr>
+        <w:t>/api/annunci/filter/:tipo/:quartiere/:</w:t>
+      </w:r>
+      <w:proofErr w:type="spellStart"/>
+      <w:r>
+        <w:rPr>
+          <w:rFonts w:ascii="Century Gothic" w:hAnsi="Century Gothic" w:cs="Courier New"/>
+          <w:sz w:val="22"/>
+          <w:szCs w:val="22"/>
+        </w:rPr>
+        <w:t>prezzomax</w:t>
+      </w:r>
+      <w:proofErr w:type="spellEnd"/>
     </w:p>
     <w:p>
       <w:pPr>
@@ -1132,11 +1908,15 @@
         </w:numPr>
         <w:rPr>
           <w:rFonts w:ascii="Century Gothic" w:hAnsi="Century Gothic" w:cs="Courier New"/>
-        </w:rPr>
-      </w:pPr>
-      <w:r>
-        <w:rPr>
-          <w:rFonts w:ascii="Century Gothic" w:hAnsi="Century Gothic" w:cs="Courier New"/>
+          <w:sz w:val="22"/>
+          <w:szCs w:val="22"/>
+        </w:rPr>
+      </w:pPr>
+      <w:r>
+        <w:rPr>
+          <w:rFonts w:ascii="Century Gothic" w:hAnsi="Century Gothic" w:cs="Courier New"/>
+          <w:sz w:val="22"/>
+          <w:szCs w:val="22"/>
         </w:rPr>
         <w:t>/api/annunci/utente/:mail</w:t>
       </w:r>
@@ -1150,11 +1930,15 @@
         </w:numPr>
         <w:rPr>
           <w:rFonts w:ascii="Century Gothic" w:hAnsi="Century Gothic" w:cs="Courier New"/>
-        </w:rPr>
-      </w:pPr>
-      <w:r>
-        <w:rPr>
-          <w:rFonts w:ascii="Century Gothic" w:hAnsi="Century Gothic" w:cs="Courier New"/>
+          <w:sz w:val="22"/>
+          <w:szCs w:val="22"/>
+        </w:rPr>
+      </w:pPr>
+      <w:r>
+        <w:rPr>
+          <w:rFonts w:ascii="Century Gothic" w:hAnsi="Century Gothic" w:cs="Courier New"/>
+          <w:sz w:val="22"/>
+          <w:szCs w:val="22"/>
         </w:rPr>
         <w:t>/api/tipi-annuncio</w:t>
       </w:r>
@@ -1168,11 +1952,15 @@
         </w:numPr>
         <w:rPr>
           <w:rFonts w:ascii="Century Gothic" w:hAnsi="Century Gothic" w:cs="Courier New"/>
-        </w:rPr>
-      </w:pPr>
-      <w:r>
-        <w:rPr>
-          <w:rFonts w:ascii="Century Gothic" w:hAnsi="Century Gothic" w:cs="Courier New"/>
+          <w:sz w:val="22"/>
+          <w:szCs w:val="22"/>
+        </w:rPr>
+      </w:pPr>
+      <w:r>
+        <w:rPr>
+          <w:rFonts w:ascii="Century Gothic" w:hAnsi="Century Gothic" w:cs="Courier New"/>
+          <w:sz w:val="22"/>
+          <w:szCs w:val="22"/>
         </w:rPr>
         <w:t>/api/servizi</w:t>
       </w:r>
@@ -1186,11 +1974,15 @@
         </w:numPr>
         <w:rPr>
           <w:rFonts w:ascii="Century Gothic" w:hAnsi="Century Gothic" w:cs="Courier New"/>
-        </w:rPr>
-      </w:pPr>
-      <w:r>
-        <w:rPr>
-          <w:rFonts w:ascii="Century Gothic" w:hAnsi="Century Gothic" w:cs="Courier New"/>
+          <w:sz w:val="22"/>
+          <w:szCs w:val="22"/>
+        </w:rPr>
+      </w:pPr>
+      <w:r>
+        <w:rPr>
+          <w:rFonts w:ascii="Century Gothic" w:hAnsi="Century Gothic" w:cs="Courier New"/>
+          <w:sz w:val="22"/>
+          <w:szCs w:val="22"/>
         </w:rPr>
         <w:t>/api/quartieri</w:t>
       </w:r>
@@ -1204,11 +1996,15 @@
         </w:numPr>
         <w:rPr>
           <w:rFonts w:ascii="Century Gothic" w:hAnsi="Century Gothic" w:cs="Courier New"/>
-        </w:rPr>
-      </w:pPr>
-      <w:r>
-        <w:rPr>
-          <w:rFonts w:ascii="Century Gothic" w:hAnsi="Century Gothic" w:cs="Courier New"/>
+          <w:sz w:val="22"/>
+          <w:szCs w:val="22"/>
+        </w:rPr>
+      </w:pPr>
+      <w:r>
+        <w:rPr>
+          <w:rFonts w:ascii="Century Gothic" w:hAnsi="Century Gothic" w:cs="Courier New"/>
+          <w:sz w:val="22"/>
+          <w:szCs w:val="22"/>
         </w:rPr>
         <w:t>/api/preferiti</w:t>
       </w:r>
@@ -1224,15 +2020,22 @@
     <w:p>
       <w:pPr>
         <w:pStyle w:val="Testonormale"/>
+        <w:spacing w:after="240"/>
         <w:rPr>
           <w:rFonts w:ascii="Century Gothic" w:hAnsi="Century Gothic" w:cs="Courier New"/>
           <w:b/>
+          <w:sz w:val="22"/>
+          <w:szCs w:val="22"/>
+          <w:u w:val="single"/>
         </w:rPr>
       </w:pPr>
       <w:r>
         <w:rPr>
           <w:rFonts w:ascii="Century Gothic" w:hAnsi="Century Gothic" w:cs="Courier New"/>
           <w:b/>
+          <w:sz w:val="22"/>
+          <w:szCs w:val="22"/>
+          <w:u w:val="single"/>
         </w:rPr>
         <w:t>POST</w:t>
       </w:r>
@@ -1246,15 +2049,35 @@
         </w:numPr>
         <w:rPr>
           <w:rFonts w:ascii="Century Gothic" w:hAnsi="Century Gothic" w:cs="Courier New"/>
-          <w:lang w:val="en-US"/>
-        </w:rPr>
-      </w:pPr>
-      <w:r>
-        <w:rPr>
-          <w:rFonts w:ascii="Century Gothic" w:hAnsi="Century Gothic" w:cs="Courier New"/>
-          <w:lang w:val="en-US"/>
-        </w:rPr>
-        <w:t>/api/auth/register</w:t>
+          <w:sz w:val="22"/>
+          <w:szCs w:val="22"/>
+        </w:rPr>
+      </w:pPr>
+      <w:r>
+        <w:rPr>
+          <w:rFonts w:ascii="Century Gothic" w:hAnsi="Century Gothic" w:cs="Courier New"/>
+          <w:sz w:val="22"/>
+          <w:szCs w:val="22"/>
+        </w:rPr>
+        <w:t>/</w:t>
+      </w:r>
+      <w:proofErr w:type="spellStart"/>
+      <w:r>
+        <w:rPr>
+          <w:rFonts w:ascii="Century Gothic" w:hAnsi="Century Gothic" w:cs="Courier New"/>
+          <w:sz w:val="22"/>
+          <w:szCs w:val="22"/>
+        </w:rPr>
+        <w:t>api</w:t>
+      </w:r>
+      <w:proofErr w:type="spellEnd"/>
+      <w:r>
+        <w:rPr>
+          <w:rFonts w:ascii="Century Gothic" w:hAnsi="Century Gothic" w:cs="Courier New"/>
+          <w:sz w:val="22"/>
+          <w:szCs w:val="22"/>
+        </w:rPr>
+        <w:t>/auth/register</w:t>
       </w:r>
     </w:p>
     <w:p>
@@ -1266,15 +2089,35 @@
         </w:numPr>
         <w:rPr>
           <w:rFonts w:ascii="Century Gothic" w:hAnsi="Century Gothic" w:cs="Courier New"/>
-          <w:lang w:val="en-US"/>
-        </w:rPr>
-      </w:pPr>
-      <w:r>
-        <w:rPr>
-          <w:rFonts w:ascii="Century Gothic" w:hAnsi="Century Gothic" w:cs="Courier New"/>
-          <w:lang w:val="en-US"/>
-        </w:rPr>
-        <w:t>/api/auth/login</w:t>
+          <w:sz w:val="22"/>
+          <w:szCs w:val="22"/>
+        </w:rPr>
+      </w:pPr>
+      <w:r>
+        <w:rPr>
+          <w:rFonts w:ascii="Century Gothic" w:hAnsi="Century Gothic" w:cs="Courier New"/>
+          <w:sz w:val="22"/>
+          <w:szCs w:val="22"/>
+        </w:rPr>
+        <w:t>/</w:t>
+      </w:r>
+      <w:proofErr w:type="spellStart"/>
+      <w:r>
+        <w:rPr>
+          <w:rFonts w:ascii="Century Gothic" w:hAnsi="Century Gothic" w:cs="Courier New"/>
+          <w:sz w:val="22"/>
+          <w:szCs w:val="22"/>
+        </w:rPr>
+        <w:t>api</w:t>
+      </w:r>
+      <w:proofErr w:type="spellEnd"/>
+      <w:r>
+        <w:rPr>
+          <w:rFonts w:ascii="Century Gothic" w:hAnsi="Century Gothic" w:cs="Courier New"/>
+          <w:sz w:val="22"/>
+          <w:szCs w:val="22"/>
+        </w:rPr>
+        <w:t>/auth/login</w:t>
       </w:r>
     </w:p>
     <w:p>
@@ -1286,13 +2129,35 @@
         </w:numPr>
         <w:rPr>
           <w:rFonts w:ascii="Century Gothic" w:hAnsi="Century Gothic" w:cs="Courier New"/>
-        </w:rPr>
-      </w:pPr>
-      <w:r>
-        <w:rPr>
-          <w:rFonts w:ascii="Century Gothic" w:hAnsi="Century Gothic" w:cs="Courier New"/>
-        </w:rPr>
-        <w:t>/api/auth/logout</w:t>
+          <w:sz w:val="22"/>
+          <w:szCs w:val="22"/>
+        </w:rPr>
+      </w:pPr>
+      <w:r>
+        <w:rPr>
+          <w:rFonts w:ascii="Century Gothic" w:hAnsi="Century Gothic" w:cs="Courier New"/>
+          <w:sz w:val="22"/>
+          <w:szCs w:val="22"/>
+        </w:rPr>
+        <w:t>/api/</w:t>
+      </w:r>
+      <w:proofErr w:type="spellStart"/>
+      <w:r>
+        <w:rPr>
+          <w:rFonts w:ascii="Century Gothic" w:hAnsi="Century Gothic" w:cs="Courier New"/>
+          <w:sz w:val="22"/>
+          <w:szCs w:val="22"/>
+        </w:rPr>
+        <w:t>auth</w:t>
+      </w:r>
+      <w:proofErr w:type="spellEnd"/>
+      <w:r>
+        <w:rPr>
+          <w:rFonts w:ascii="Century Gothic" w:hAnsi="Century Gothic" w:cs="Courier New"/>
+          <w:sz w:val="22"/>
+          <w:szCs w:val="22"/>
+        </w:rPr>
+        <w:t>/logout</w:t>
       </w:r>
     </w:p>
     <w:p>
@@ -1304,11 +2169,15 @@
         </w:numPr>
         <w:rPr>
           <w:rFonts w:ascii="Century Gothic" w:hAnsi="Century Gothic" w:cs="Courier New"/>
-        </w:rPr>
-      </w:pPr>
-      <w:r>
-        <w:rPr>
-          <w:rFonts w:ascii="Century Gothic" w:hAnsi="Century Gothic" w:cs="Courier New"/>
+          <w:sz w:val="22"/>
+          <w:szCs w:val="22"/>
+        </w:rPr>
+      </w:pPr>
+      <w:r>
+        <w:rPr>
+          <w:rFonts w:ascii="Century Gothic" w:hAnsi="Century Gothic" w:cs="Courier New"/>
+          <w:sz w:val="22"/>
+          <w:szCs w:val="22"/>
         </w:rPr>
         <w:t>/api/preferiti</w:t>
       </w:r>
@@ -1322,11 +2191,15 @@
         </w:numPr>
         <w:rPr>
           <w:rFonts w:ascii="Century Gothic" w:hAnsi="Century Gothic" w:cs="Courier New"/>
-        </w:rPr>
-      </w:pPr>
-      <w:r>
-        <w:rPr>
-          <w:rFonts w:ascii="Century Gothic" w:hAnsi="Century Gothic" w:cs="Courier New"/>
+          <w:sz w:val="22"/>
+          <w:szCs w:val="22"/>
+        </w:rPr>
+      </w:pPr>
+      <w:r>
+        <w:rPr>
+          <w:rFonts w:ascii="Century Gothic" w:hAnsi="Century Gothic" w:cs="Courier New"/>
+          <w:sz w:val="22"/>
+          <w:szCs w:val="22"/>
         </w:rPr>
         <w:t>/api/annunci/create</w:t>
       </w:r>
@@ -1340,11 +2213,15 @@
         </w:numPr>
         <w:rPr>
           <w:rFonts w:ascii="Century Gothic" w:hAnsi="Century Gothic" w:cs="Courier New"/>
-        </w:rPr>
-      </w:pPr>
-      <w:r>
-        <w:rPr>
-          <w:rFonts w:ascii="Century Gothic" w:hAnsi="Century Gothic" w:cs="Courier New"/>
+          <w:sz w:val="22"/>
+          <w:szCs w:val="22"/>
+        </w:rPr>
+      </w:pPr>
+      <w:r>
+        <w:rPr>
+          <w:rFonts w:ascii="Century Gothic" w:hAnsi="Century Gothic" w:cs="Courier New"/>
+          <w:sz w:val="22"/>
+          <w:szCs w:val="22"/>
         </w:rPr>
         <w:t>/api/annunci/update/:id</w:t>
       </w:r>
@@ -1358,11 +2235,15 @@
         </w:numPr>
         <w:rPr>
           <w:rFonts w:ascii="Century Gothic" w:hAnsi="Century Gothic" w:cs="Courier New"/>
-        </w:rPr>
-      </w:pPr>
-      <w:r>
-        <w:rPr>
-          <w:rFonts w:ascii="Century Gothic" w:hAnsi="Century Gothic" w:cs="Courier New"/>
+          <w:sz w:val="22"/>
+          <w:szCs w:val="22"/>
+        </w:rPr>
+      </w:pPr>
+      <w:r>
+        <w:rPr>
+          <w:rFonts w:ascii="Century Gothic" w:hAnsi="Century Gothic" w:cs="Courier New"/>
+          <w:sz w:val="22"/>
+          <w:szCs w:val="22"/>
         </w:rPr>
         <w:t>/api/annunci/modifica/:id</w:t>
       </w:r>
@@ -1378,15 +2259,22 @@
     <w:p>
       <w:pPr>
         <w:pStyle w:val="Testonormale"/>
+        <w:spacing w:after="240"/>
         <w:rPr>
           <w:rFonts w:ascii="Century Gothic" w:hAnsi="Century Gothic" w:cs="Courier New"/>
           <w:b/>
+          <w:sz w:val="22"/>
+          <w:szCs w:val="22"/>
+          <w:u w:val="single"/>
         </w:rPr>
       </w:pPr>
       <w:r>
         <w:rPr>
           <w:rFonts w:ascii="Century Gothic" w:hAnsi="Century Gothic" w:cs="Courier New"/>
           <w:b/>
+          <w:sz w:val="22"/>
+          <w:szCs w:val="22"/>
+          <w:u w:val="single"/>
         </w:rPr>
         <w:t>DELETE</w:t>
       </w:r>
@@ -1400,14 +2288,28 @@
         </w:numPr>
         <w:rPr>
           <w:rFonts w:ascii="Century Gothic" w:hAnsi="Century Gothic" w:cs="Courier New"/>
-        </w:rPr>
-      </w:pPr>
-      <w:r>
-        <w:rPr>
-          <w:rFonts w:ascii="Century Gothic" w:hAnsi="Century Gothic" w:cs="Courier New"/>
-        </w:rPr>
-        <w:t>/api/preferiti/:annuncio_id</w:t>
-      </w:r>
+          <w:sz w:val="22"/>
+          <w:szCs w:val="22"/>
+        </w:rPr>
+      </w:pPr>
+      <w:r>
+        <w:rPr>
+          <w:rFonts w:ascii="Century Gothic" w:hAnsi="Century Gothic" w:cs="Courier New"/>
+          <w:sz w:val="22"/>
+          <w:szCs w:val="22"/>
+        </w:rPr>
+        <w:t>/api/preferiti/:</w:t>
+      </w:r>
+      <w:proofErr w:type="spellStart"/>
+      <w:r>
+        <w:rPr>
+          <w:rFonts w:ascii="Century Gothic" w:hAnsi="Century Gothic" w:cs="Courier New"/>
+          <w:sz w:val="22"/>
+          <w:szCs w:val="22"/>
+        </w:rPr>
+        <w:t>annuncio_id</w:t>
+      </w:r>
+      <w:proofErr w:type="spellEnd"/>
     </w:p>
     <w:p>
       <w:pPr>
@@ -1418,11 +2320,15 @@
         </w:numPr>
         <w:rPr>
           <w:rFonts w:ascii="Century Gothic" w:hAnsi="Century Gothic" w:cs="Courier New"/>
-        </w:rPr>
-      </w:pPr>
-      <w:r>
-        <w:rPr>
-          <w:rFonts w:ascii="Century Gothic" w:hAnsi="Century Gothic" w:cs="Courier New"/>
+          <w:sz w:val="22"/>
+          <w:szCs w:val="22"/>
+        </w:rPr>
+      </w:pPr>
+      <w:r>
+        <w:rPr>
+          <w:rFonts w:ascii="Century Gothic" w:hAnsi="Century Gothic" w:cs="Courier New"/>
+          <w:sz w:val="22"/>
+          <w:szCs w:val="22"/>
         </w:rPr>
         <w:t>/api/annunci/delete/:id</w:t>
       </w:r>
@@ -1438,15 +2344,20 @@
     <w:p>
       <w:pPr>
         <w:pStyle w:val="Testonormale"/>
+        <w:spacing w:after="240"/>
         <w:rPr>
           <w:rFonts w:ascii="Century Gothic" w:hAnsi="Century Gothic" w:cs="Courier New"/>
           <w:b/>
+          <w:sz w:val="28"/>
+          <w:szCs w:val="28"/>
         </w:rPr>
       </w:pPr>
       <w:r>
         <w:rPr>
           <w:rFonts w:ascii="Century Gothic" w:hAnsi="Century Gothic" w:cs="Courier New"/>
           <w:b/>
+          <w:sz w:val="28"/>
+          <w:szCs w:val="28"/>
         </w:rPr>
         <w:t>DATABASE</w:t>
       </w:r>
@@ -1454,54 +2365,629 @@
     <w:p>
       <w:pPr>
         <w:pStyle w:val="Testonormale"/>
-        <w:rPr>
-          <w:rFonts w:ascii="Century Gothic" w:hAnsi="Century Gothic" w:cs="Courier New"/>
-        </w:rPr>
-      </w:pPr>
-      <w:r>
-        <w:rPr>
-          <w:rFonts w:ascii="Century Gothic" w:hAnsi="Century Gothic" w:cs="Courier New"/>
-        </w:rPr>
-        <w:t>per la creazione dell'applicazione abbiamo creato un database mysql denominato "studenthome".</w:t>
-      </w:r>
-    </w:p>
-    <w:p>
-      <w:pPr>
-        <w:pStyle w:val="Testonormale"/>
-        <w:rPr>
-          <w:rFonts w:ascii="Century Gothic" w:hAnsi="Century Gothic" w:cs="Courier New"/>
-        </w:rPr>
-      </w:pPr>
-      <w:r>
-        <w:rPr>
-          <w:rFonts w:ascii="Century Gothic" w:hAnsi="Century Gothic" w:cs="Courier New"/>
-        </w:rPr>
-        <w:t xml:space="preserve">Sono memorizzati tutti i dati in nove tabelle collegate tra loro con le ForeignKeys. La tabella che memorizza i dati dell'utente contiene le password crittografate quindi per una elevata sicurezza. Il file che contiene le direttive per il collegamento al database denominato db.ts è collocato nella backend\scr\utils\ </w:t>
-      </w:r>
-    </w:p>
-    <w:p>
-      <w:pPr>
-        <w:pStyle w:val="Testonormale"/>
-        <w:rPr>
-          <w:rFonts w:ascii="Century Gothic" w:hAnsi="Century Gothic" w:cs="Courier New"/>
-        </w:rPr>
-      </w:pPr>
-    </w:p>
-    <w:p>
-      <w:pPr>
-        <w:pStyle w:val="Testonormale"/>
-        <w:rPr>
-          <w:rFonts w:ascii="Century Gothic" w:hAnsi="Century Gothic" w:cs="Courier New"/>
-        </w:rPr>
-      </w:pPr>
-      <w:r>
-        <w:rPr>
-          <w:rFonts w:ascii="Century Gothic" w:hAnsi="Century Gothic" w:cs="Courier New"/>
-        </w:rPr>
-        <w:t xml:space="preserve">        </w:t>
-      </w:r>
+        <w:jc w:val="both"/>
+        <w:rPr>
+          <w:rFonts w:ascii="Century Gothic" w:hAnsi="Century Gothic" w:cs="Courier New"/>
+          <w:sz w:val="22"/>
+          <w:szCs w:val="22"/>
+        </w:rPr>
+      </w:pPr>
+      <w:r>
+        <w:rPr>
+          <w:rFonts w:ascii="Century Gothic" w:hAnsi="Century Gothic" w:cs="Courier New"/>
+          <w:sz w:val="22"/>
+          <w:szCs w:val="22"/>
+        </w:rPr>
+        <w:lastRenderedPageBreak/>
+        <w:t>P</w:t>
+      </w:r>
+      <w:r>
+        <w:rPr>
+          <w:rFonts w:ascii="Century Gothic" w:hAnsi="Century Gothic" w:cs="Courier New"/>
+          <w:sz w:val="22"/>
+          <w:szCs w:val="22"/>
+        </w:rPr>
+        <w:t xml:space="preserve">er la creazione dell'applicazione abbiamo creato un database </w:t>
+      </w:r>
+      <w:r>
+        <w:rPr>
+          <w:rFonts w:ascii="Century Gothic" w:hAnsi="Century Gothic" w:cs="Courier New"/>
+          <w:sz w:val="22"/>
+          <w:szCs w:val="22"/>
+        </w:rPr>
+        <w:t>MySQL</w:t>
+      </w:r>
+      <w:r>
+        <w:rPr>
+          <w:rFonts w:ascii="Century Gothic" w:hAnsi="Century Gothic" w:cs="Courier New"/>
+          <w:sz w:val="22"/>
+          <w:szCs w:val="22"/>
+        </w:rPr>
+        <w:t xml:space="preserve"> denominato "</w:t>
+      </w:r>
+      <w:proofErr w:type="spellStart"/>
+      <w:r>
+        <w:rPr>
+          <w:rFonts w:ascii="Century Gothic" w:hAnsi="Century Gothic" w:cs="Courier New"/>
+          <w:sz w:val="22"/>
+          <w:szCs w:val="22"/>
+        </w:rPr>
+        <w:t>studenthome</w:t>
+      </w:r>
+      <w:proofErr w:type="spellEnd"/>
+      <w:r>
+        <w:rPr>
+          <w:rFonts w:ascii="Century Gothic" w:hAnsi="Century Gothic" w:cs="Courier New"/>
+          <w:sz w:val="22"/>
+          <w:szCs w:val="22"/>
+        </w:rPr>
+        <w:t>".</w:t>
+      </w:r>
+    </w:p>
+    <w:p>
+      <w:pPr>
+        <w:pStyle w:val="Testonormale"/>
+        <w:jc w:val="both"/>
+        <w:rPr>
+          <w:rFonts w:ascii="Century Gothic" w:hAnsi="Century Gothic" w:cs="Courier New"/>
+          <w:sz w:val="22"/>
+          <w:szCs w:val="22"/>
+        </w:rPr>
+      </w:pPr>
+      <w:r>
+        <w:rPr>
+          <w:rFonts w:ascii="Century Gothic" w:hAnsi="Century Gothic" w:cs="Courier New"/>
+          <w:sz w:val="22"/>
+          <w:szCs w:val="22"/>
+        </w:rPr>
+        <w:t xml:space="preserve">Sono memorizzati tutti i dati in nove tabelle collegate tra loro con le </w:t>
+      </w:r>
+      <w:proofErr w:type="spellStart"/>
+      <w:r>
+        <w:rPr>
+          <w:rFonts w:ascii="Century Gothic" w:hAnsi="Century Gothic" w:cs="Courier New"/>
+          <w:sz w:val="22"/>
+          <w:szCs w:val="22"/>
+        </w:rPr>
+        <w:t>ForeignKeys</w:t>
+      </w:r>
+      <w:proofErr w:type="spellEnd"/>
+      <w:r>
+        <w:rPr>
+          <w:rFonts w:ascii="Century Gothic" w:hAnsi="Century Gothic" w:cs="Courier New"/>
+          <w:sz w:val="22"/>
+          <w:szCs w:val="22"/>
+        </w:rPr>
+        <w:t xml:space="preserve">. La tabella che memorizza i dati dell'utente contiene le password crittografate per una elevata sicurezza. Il file che contiene le direttive per il collegamento al database denominato </w:t>
+      </w:r>
+      <w:proofErr w:type="spellStart"/>
+      <w:r>
+        <w:rPr>
+          <w:rFonts w:ascii="Century Gothic" w:hAnsi="Century Gothic" w:cs="Courier New"/>
+          <w:sz w:val="22"/>
+          <w:szCs w:val="22"/>
+        </w:rPr>
+        <w:t>db.ts</w:t>
+      </w:r>
+      <w:proofErr w:type="spellEnd"/>
+      <w:r>
+        <w:rPr>
+          <w:rFonts w:ascii="Century Gothic" w:hAnsi="Century Gothic" w:cs="Courier New"/>
+          <w:sz w:val="22"/>
+          <w:szCs w:val="22"/>
+        </w:rPr>
+        <w:t xml:space="preserve"> è collocato nella </w:t>
+      </w:r>
+      <w:proofErr w:type="spellStart"/>
+      <w:r>
+        <w:rPr>
+          <w:rFonts w:ascii="Century Gothic" w:hAnsi="Century Gothic" w:cs="Courier New"/>
+          <w:sz w:val="22"/>
+          <w:szCs w:val="22"/>
+        </w:rPr>
+        <w:t>backend</w:t>
+      </w:r>
+      <w:proofErr w:type="spellEnd"/>
+      <w:r>
+        <w:rPr>
+          <w:rFonts w:ascii="Century Gothic" w:hAnsi="Century Gothic" w:cs="Courier New"/>
+          <w:sz w:val="22"/>
+          <w:szCs w:val="22"/>
+        </w:rPr>
+        <w:t>\</w:t>
+      </w:r>
+      <w:proofErr w:type="spellStart"/>
+      <w:r>
+        <w:rPr>
+          <w:rFonts w:ascii="Century Gothic" w:hAnsi="Century Gothic" w:cs="Courier New"/>
+          <w:sz w:val="22"/>
+          <w:szCs w:val="22"/>
+        </w:rPr>
+        <w:t>scr</w:t>
+      </w:r>
+      <w:proofErr w:type="spellEnd"/>
+      <w:r>
+        <w:rPr>
+          <w:rFonts w:ascii="Century Gothic" w:hAnsi="Century Gothic" w:cs="Courier New"/>
+          <w:sz w:val="22"/>
+          <w:szCs w:val="22"/>
+        </w:rPr>
+        <w:t>\</w:t>
+      </w:r>
+      <w:proofErr w:type="spellStart"/>
+      <w:r>
+        <w:rPr>
+          <w:rFonts w:ascii="Century Gothic" w:hAnsi="Century Gothic" w:cs="Courier New"/>
+          <w:sz w:val="22"/>
+          <w:szCs w:val="22"/>
+        </w:rPr>
+        <w:t>utils</w:t>
+      </w:r>
+      <w:proofErr w:type="spellEnd"/>
+      <w:r>
+        <w:rPr>
+          <w:rFonts w:ascii="Century Gothic" w:hAnsi="Century Gothic" w:cs="Courier New"/>
+          <w:sz w:val="22"/>
+          <w:szCs w:val="22"/>
+        </w:rPr>
+        <w:t xml:space="preserve">\ </w:t>
+      </w:r>
+    </w:p>
+    <w:p>
+      <w:pPr>
+        <w:pStyle w:val="Testonormale"/>
+        <w:rPr>
+          <w:rFonts w:ascii="Century Gothic" w:hAnsi="Century Gothic" w:cs="Courier New"/>
+        </w:rPr>
+      </w:pPr>
+    </w:p>
+    <w:p>
+      <w:pPr>
+        <w:pStyle w:val="Testonormale"/>
+        <w:spacing w:after="240"/>
+        <w:rPr>
+          <w:rFonts w:ascii="Century Gothic" w:hAnsi="Century Gothic" w:cs="Courier New"/>
+        </w:rPr>
+      </w:pPr>
+      <w:r>
+        <w:rPr>
+          <w:rFonts w:ascii="Century Gothic" w:hAnsi="Century Gothic" w:cs="Courier New"/>
+          <w:b/>
+          <w:sz w:val="28"/>
+          <w:szCs w:val="28"/>
+        </w:rPr>
+        <w:t>Installazione</w:t>
+      </w:r>
+    </w:p>
+    <w:p>
+      <w:pPr>
+        <w:pStyle w:val="Testonormale"/>
+        <w:numPr>
+          <w:ilvl w:val="0"/>
+          <w:numId w:val="7"/>
+        </w:numPr>
+        <w:rPr>
+          <w:rFonts w:ascii="Century Gothic" w:hAnsi="Century Gothic" w:cs="Courier New"/>
+          <w:sz w:val="22"/>
+          <w:szCs w:val="22"/>
+        </w:rPr>
+      </w:pPr>
+      <w:r>
+        <w:rPr>
+          <w:rFonts w:ascii="Century Gothic" w:hAnsi="Century Gothic" w:cs="Courier New"/>
+          <w:sz w:val="22"/>
+          <w:szCs w:val="22"/>
+        </w:rPr>
+        <w:t xml:space="preserve">Clona il repository di </w:t>
+      </w:r>
+      <w:proofErr w:type="spellStart"/>
+      <w:r>
+        <w:rPr>
+          <w:rFonts w:ascii="Century Gothic" w:hAnsi="Century Gothic" w:cs="Courier New"/>
+          <w:sz w:val="22"/>
+          <w:szCs w:val="22"/>
+        </w:rPr>
+        <w:t>github</w:t>
+      </w:r>
+      <w:proofErr w:type="spellEnd"/>
+      <w:r>
+        <w:rPr>
+          <w:rFonts w:ascii="Century Gothic" w:hAnsi="Century Gothic" w:cs="Courier New"/>
+          <w:sz w:val="22"/>
+          <w:szCs w:val="22"/>
+        </w:rPr>
+        <w:t xml:space="preserve"> da: </w:t>
+      </w:r>
+      <w:hyperlink r:id="rId7" w:history="1">
+        <w:r>
+          <w:rPr>
+            <w:rStyle w:val="Collegamentoipertestuale"/>
+            <w:rFonts w:ascii="Century Gothic" w:hAnsi="Century Gothic" w:cs="Courier New"/>
+            <w:sz w:val="22"/>
+            <w:szCs w:val="22"/>
+          </w:rPr>
+          <w:t>https://github.com/aleerambo/Progetto_ISW</w:t>
+        </w:r>
+      </w:hyperlink>
+    </w:p>
+    <w:p>
+      <w:pPr>
+        <w:pStyle w:val="Testonormale"/>
+        <w:numPr>
+          <w:ilvl w:val="0"/>
+          <w:numId w:val="7"/>
+        </w:numPr>
+        <w:rPr>
+          <w:rFonts w:ascii="Century Gothic" w:hAnsi="Century Gothic" w:cs="Courier New"/>
+          <w:sz w:val="22"/>
+          <w:szCs w:val="22"/>
+        </w:rPr>
+      </w:pPr>
+      <w:r>
+        <w:rPr>
+          <w:rFonts w:ascii="Century Gothic" w:hAnsi="Century Gothic" w:cs="Courier New"/>
+          <w:sz w:val="22"/>
+          <w:szCs w:val="22"/>
+        </w:rPr>
+        <w:t>Eseguire il comando “</w:t>
+      </w:r>
+      <w:proofErr w:type="spellStart"/>
+      <w:r>
+        <w:rPr>
+          <w:rFonts w:ascii="Century Gothic" w:hAnsi="Century Gothic" w:cs="Courier New"/>
+          <w:sz w:val="22"/>
+          <w:szCs w:val="22"/>
+        </w:rPr>
+        <w:t>npm</w:t>
+      </w:r>
+      <w:proofErr w:type="spellEnd"/>
+      <w:r>
+        <w:rPr>
+          <w:rFonts w:ascii="Century Gothic" w:hAnsi="Century Gothic" w:cs="Courier New"/>
+          <w:sz w:val="22"/>
+          <w:szCs w:val="22"/>
+        </w:rPr>
+        <w:t xml:space="preserve"> i” in entrambe le cartelle </w:t>
+      </w:r>
+      <w:proofErr w:type="spellStart"/>
+      <w:r>
+        <w:rPr>
+          <w:rFonts w:ascii="Century Gothic" w:hAnsi="Century Gothic" w:cs="Courier New"/>
+          <w:sz w:val="22"/>
+          <w:szCs w:val="22"/>
+        </w:rPr>
+        <w:t>backend</w:t>
+      </w:r>
+      <w:proofErr w:type="spellEnd"/>
+      <w:r>
+        <w:rPr>
+          <w:rFonts w:ascii="Century Gothic" w:hAnsi="Century Gothic" w:cs="Courier New"/>
+          <w:sz w:val="22"/>
+          <w:szCs w:val="22"/>
+        </w:rPr>
+        <w:t xml:space="preserve"> e </w:t>
+      </w:r>
+      <w:proofErr w:type="spellStart"/>
+      <w:r>
+        <w:rPr>
+          <w:rFonts w:ascii="Century Gothic" w:hAnsi="Century Gothic" w:cs="Courier New"/>
+          <w:sz w:val="22"/>
+          <w:szCs w:val="22"/>
+        </w:rPr>
+        <w:t>frontend</w:t>
+      </w:r>
+      <w:proofErr w:type="spellEnd"/>
+      <w:r>
+        <w:rPr>
+          <w:rFonts w:ascii="Century Gothic" w:hAnsi="Century Gothic" w:cs="Courier New"/>
+          <w:sz w:val="22"/>
+          <w:szCs w:val="22"/>
+        </w:rPr>
+        <w:t xml:space="preserve"> per installare tutte le dipendenze e pacchetti</w:t>
+      </w:r>
+    </w:p>
+    <w:p>
+      <w:pPr>
+        <w:pStyle w:val="Testonormale"/>
+        <w:numPr>
+          <w:ilvl w:val="0"/>
+          <w:numId w:val="7"/>
+        </w:numPr>
+        <w:rPr>
+          <w:rFonts w:ascii="Century Gothic" w:hAnsi="Century Gothic" w:cs="Courier New"/>
+          <w:sz w:val="22"/>
+          <w:szCs w:val="22"/>
+        </w:rPr>
+      </w:pPr>
+      <w:r>
+        <w:rPr>
+          <w:rFonts w:ascii="Century Gothic" w:hAnsi="Century Gothic" w:cs="Courier New"/>
+          <w:sz w:val="22"/>
+          <w:szCs w:val="22"/>
+        </w:rPr>
+        <w:t xml:space="preserve">Aprire XAMPP </w:t>
+      </w:r>
+      <w:proofErr w:type="gramStart"/>
+      <w:r>
+        <w:rPr>
+          <w:rFonts w:ascii="Century Gothic" w:hAnsi="Century Gothic" w:cs="Courier New"/>
+          <w:sz w:val="22"/>
+          <w:szCs w:val="22"/>
+        </w:rPr>
+        <w:t>e</w:t>
+      </w:r>
+      <w:proofErr w:type="gramEnd"/>
+      <w:r>
+        <w:rPr>
+          <w:rFonts w:ascii="Century Gothic" w:hAnsi="Century Gothic" w:cs="Courier New"/>
+          <w:sz w:val="22"/>
+          <w:szCs w:val="22"/>
+        </w:rPr>
+        <w:t xml:space="preserve"> </w:t>
+      </w:r>
+      <w:r>
+        <w:rPr>
+          <w:rFonts w:ascii="Century Gothic" w:hAnsi="Century Gothic" w:cs="Courier New"/>
+          <w:sz w:val="22"/>
+          <w:szCs w:val="22"/>
+        </w:rPr>
+        <w:t xml:space="preserve">eseguire il server MySQL, creare il DB con il file contenuto nella cartella </w:t>
+      </w:r>
+      <w:proofErr w:type="spellStart"/>
+      <w:r>
+        <w:rPr>
+          <w:rFonts w:ascii="Century Gothic" w:hAnsi="Century Gothic" w:cs="Courier New"/>
+          <w:sz w:val="22"/>
+          <w:szCs w:val="22"/>
+        </w:rPr>
+        <w:t>backend</w:t>
+      </w:r>
+      <w:proofErr w:type="spellEnd"/>
+      <w:r>
+        <w:rPr>
+          <w:rFonts w:ascii="Century Gothic" w:hAnsi="Century Gothic" w:cs="Courier New"/>
+          <w:sz w:val="22"/>
+          <w:szCs w:val="22"/>
+        </w:rPr>
+        <w:t>-&gt;</w:t>
+      </w:r>
+      <w:proofErr w:type="spellStart"/>
+      <w:r>
+        <w:rPr>
+          <w:rFonts w:ascii="Century Gothic" w:hAnsi="Century Gothic" w:cs="Courier New"/>
+          <w:sz w:val="22"/>
+          <w:szCs w:val="22"/>
+        </w:rPr>
+        <w:t>db</w:t>
+      </w:r>
+      <w:proofErr w:type="spellEnd"/>
+    </w:p>
+    <w:p>
+      <w:pPr>
+        <w:pStyle w:val="Testonormale"/>
+        <w:numPr>
+          <w:ilvl w:val="0"/>
+          <w:numId w:val="7"/>
+        </w:numPr>
+        <w:rPr>
+          <w:rFonts w:ascii="Century Gothic" w:hAnsi="Century Gothic" w:cs="Courier New"/>
+          <w:sz w:val="22"/>
+          <w:szCs w:val="22"/>
+        </w:rPr>
+      </w:pPr>
+      <w:r>
+        <w:rPr>
+          <w:rFonts w:ascii="Century Gothic" w:hAnsi="Century Gothic" w:cs="Courier New"/>
+          <w:sz w:val="22"/>
+          <w:szCs w:val="22"/>
+        </w:rPr>
+        <w:t>Eseguire l’applicazione web con il comando “</w:t>
+      </w:r>
+      <w:proofErr w:type="spellStart"/>
+      <w:r>
+        <w:rPr>
+          <w:rFonts w:ascii="Century Gothic" w:hAnsi="Century Gothic" w:cs="Courier New"/>
+          <w:sz w:val="22"/>
+          <w:szCs w:val="22"/>
+        </w:rPr>
+        <w:t>npm</w:t>
+      </w:r>
+      <w:proofErr w:type="spellEnd"/>
+      <w:r>
+        <w:rPr>
+          <w:rFonts w:ascii="Century Gothic" w:hAnsi="Century Gothic" w:cs="Courier New"/>
+          <w:sz w:val="22"/>
+          <w:szCs w:val="22"/>
+        </w:rPr>
+        <w:t xml:space="preserve"> </w:t>
+      </w:r>
+      <w:proofErr w:type="spellStart"/>
+      <w:r>
+        <w:rPr>
+          <w:rFonts w:ascii="Century Gothic" w:hAnsi="Century Gothic" w:cs="Courier New"/>
+          <w:sz w:val="22"/>
+          <w:szCs w:val="22"/>
+        </w:rPr>
+        <w:t>run</w:t>
+      </w:r>
+      <w:proofErr w:type="spellEnd"/>
+      <w:r>
+        <w:rPr>
+          <w:rFonts w:ascii="Century Gothic" w:hAnsi="Century Gothic" w:cs="Courier New"/>
+          <w:sz w:val="22"/>
+          <w:szCs w:val="22"/>
+        </w:rPr>
+        <w:t xml:space="preserve"> </w:t>
+      </w:r>
+      <w:proofErr w:type="spellStart"/>
+      <w:r>
+        <w:rPr>
+          <w:rFonts w:ascii="Century Gothic" w:hAnsi="Century Gothic" w:cs="Courier New"/>
+          <w:sz w:val="22"/>
+          <w:szCs w:val="22"/>
+        </w:rPr>
+        <w:t>dev</w:t>
+      </w:r>
+      <w:proofErr w:type="spellEnd"/>
+      <w:r>
+        <w:rPr>
+          <w:rFonts w:ascii="Century Gothic" w:hAnsi="Century Gothic" w:cs="Courier New"/>
+          <w:sz w:val="22"/>
+          <w:szCs w:val="22"/>
+        </w:rPr>
+        <w:t xml:space="preserve">” da eseguire in entrambe le cartelle </w:t>
+      </w:r>
+      <w:proofErr w:type="spellStart"/>
+      <w:r>
+        <w:rPr>
+          <w:rFonts w:ascii="Century Gothic" w:hAnsi="Century Gothic" w:cs="Courier New"/>
+          <w:sz w:val="22"/>
+          <w:szCs w:val="22"/>
+        </w:rPr>
+        <w:t>frontend</w:t>
+      </w:r>
+      <w:proofErr w:type="spellEnd"/>
+      <w:r>
+        <w:rPr>
+          <w:rFonts w:ascii="Century Gothic" w:hAnsi="Century Gothic" w:cs="Courier New"/>
+          <w:sz w:val="22"/>
+          <w:szCs w:val="22"/>
+        </w:rPr>
+        <w:t xml:space="preserve"> e </w:t>
+      </w:r>
+      <w:proofErr w:type="spellStart"/>
+      <w:r>
+        <w:rPr>
+          <w:rFonts w:ascii="Century Gothic" w:hAnsi="Century Gothic" w:cs="Courier New"/>
+          <w:sz w:val="22"/>
+          <w:szCs w:val="22"/>
+        </w:rPr>
+        <w:t>backend</w:t>
+      </w:r>
+      <w:proofErr w:type="spellEnd"/>
+      <w:r>
+        <w:rPr>
+          <w:rFonts w:ascii="Century Gothic" w:hAnsi="Century Gothic" w:cs="Courier New"/>
+          <w:sz w:val="22"/>
+          <w:szCs w:val="22"/>
+        </w:rPr>
+        <w:t>. Utilizzare il link di vite per visitare l’app.</w:t>
+      </w:r>
+    </w:p>
+    <w:p>
+      <w:pPr>
+        <w:pStyle w:val="Testonormale"/>
+        <w:spacing w:after="240"/>
+        <w:rPr>
+          <w:rFonts w:ascii="Century Gothic" w:hAnsi="Century Gothic" w:cs="Courier New"/>
+          <w:b/>
+          <w:sz w:val="28"/>
+          <w:szCs w:val="28"/>
+        </w:rPr>
+      </w:pPr>
+      <w:r>
+        <w:rPr>
+          <w:rFonts w:ascii="Century Gothic" w:hAnsi="Century Gothic" w:cs="Courier New"/>
+          <w:b/>
+          <w:sz w:val="28"/>
+          <w:szCs w:val="28"/>
+        </w:rPr>
+        <w:t>Documentazione</w:t>
+      </w:r>
+    </w:p>
+    <w:p>
+      <w:pPr>
+        <w:pStyle w:val="Testonormale"/>
+        <w:numPr>
+          <w:ilvl w:val="0"/>
+          <w:numId w:val="8"/>
+        </w:numPr>
+        <w:rPr>
+          <w:rFonts w:ascii="Century Gothic" w:hAnsi="Century Gothic" w:cs="Courier New"/>
+          <w:sz w:val="22"/>
+          <w:szCs w:val="22"/>
+        </w:rPr>
+      </w:pPr>
+      <w:r>
+        <w:rPr>
+          <w:rFonts w:ascii="Century Gothic" w:hAnsi="Century Gothic" w:cs="Courier New"/>
+          <w:sz w:val="22"/>
+          <w:szCs w:val="22"/>
+        </w:rPr>
+        <w:t>Materiale didattico universitario</w:t>
+      </w:r>
+    </w:p>
+    <w:p>
+      <w:pPr>
+        <w:pStyle w:val="Testonormale"/>
+        <w:numPr>
+          <w:ilvl w:val="0"/>
+          <w:numId w:val="8"/>
+        </w:numPr>
+        <w:rPr>
+          <w:rFonts w:ascii="Century Gothic" w:hAnsi="Century Gothic" w:cs="Courier New"/>
+          <w:sz w:val="22"/>
+          <w:szCs w:val="22"/>
+          <w:lang w:val="en-US"/>
+        </w:rPr>
+      </w:pPr>
+      <w:r>
+        <w:rPr>
+          <w:rFonts w:ascii="Century Gothic" w:hAnsi="Century Gothic" w:cs="Courier New"/>
+          <w:sz w:val="22"/>
+          <w:szCs w:val="22"/>
+          <w:lang w:val="en-US"/>
+        </w:rPr>
+        <w:t xml:space="preserve">Bootstrap: </w:t>
+      </w:r>
+      <w:hyperlink r:id="rId8" w:history="1">
+        <w:r>
+          <w:rPr>
+            <w:rStyle w:val="Collegamentoipertestuale"/>
+            <w:rFonts w:ascii="Century Gothic" w:hAnsi="Century Gothic" w:cs="Courier New"/>
+            <w:sz w:val="22"/>
+            <w:szCs w:val="22"/>
+            <w:lang w:val="en-US"/>
+          </w:rPr>
+          <w:t>https://getbootstrap.com/docs/5.3/getting-started/introduction/</w:t>
+        </w:r>
+      </w:hyperlink>
+    </w:p>
+    <w:p>
+      <w:pPr>
+        <w:pStyle w:val="Testonormale"/>
+        <w:numPr>
+          <w:ilvl w:val="0"/>
+          <w:numId w:val="8"/>
+        </w:numPr>
+        <w:rPr>
+          <w:rFonts w:ascii="Century Gothic" w:hAnsi="Century Gothic" w:cs="Courier New"/>
+          <w:sz w:val="22"/>
+          <w:szCs w:val="22"/>
+        </w:rPr>
+      </w:pPr>
+      <w:r>
+        <w:rPr>
+          <w:rFonts w:ascii="Century Gothic" w:hAnsi="Century Gothic" w:cs="Courier New"/>
+          <w:sz w:val="22"/>
+          <w:szCs w:val="22"/>
+        </w:rPr>
+        <w:t xml:space="preserve">NPM: ricerca dei pacchetti installati nel Progetto </w:t>
+      </w:r>
+      <w:hyperlink r:id="rId9" w:history="1">
+        <w:r>
+          <w:rPr>
+            <w:rStyle w:val="Collegamentoipertestuale"/>
+            <w:rFonts w:ascii="Century Gothic" w:hAnsi="Century Gothic" w:cs="Courier New"/>
+            <w:sz w:val="22"/>
+            <w:szCs w:val="22"/>
+          </w:rPr>
+          <w:t>https://www.npmjs.com/</w:t>
+        </w:r>
+      </w:hyperlink>
     </w:p>
     <w:sectPr>
+      <w:headerReference w:type="default" r:id="rId10"/>
       <w:pgSz w:w="11906" w:h="16838"/>
       <w:pgMar w:top="1417" w:right="1335" w:bottom="1134" w:left="1334" w:header="708" w:footer="708" w:gutter="0"/>
       <w:cols w:space="708"/>
@@ -1511,6 +2997,69 @@
 </w:document>
 </file>
 
+<file path=word/endnotes.xml><?xml version="1.0" encoding="utf-8"?>
+<w:endnotes xmlns:wpc="http://schemas.microsoft.com/office/word/2010/wordprocessingCanvas" xmlns:cx="http://schemas.microsoft.com/office/drawing/2014/chartex" xmlns:cx1="http://schemas.microsoft.com/office/drawing/2015/9/8/chartex" xmlns:cx2="http://schemas.microsoft.com/office/drawing/2015/10/21/chartex" xmlns:cx3="http://schemas.microsoft.com/office/drawing/2016/5/9/chartex" xmlns:cx4="http://schemas.microsoft.com/office/drawing/2016/5/10/chartex" xmlns:cx5="http://schemas.microsoft.com/office/drawing/2016/5/11/chartex" xmlns:cx6="http://schemas.microsoft.com/office/drawing/2016/5/12/chartex" xmlns:cx7="http://schemas.microsoft.com/office/drawing/2016/5/13/chartex" xmlns:cx8="http://schemas.microsoft.com/office/drawing/2016/5/14/chartex" xmlns:mc="http://schemas.openxmlformats.org/markup-compatibility/2006" xmlns:aink="http://schemas.microsoft.com/office/drawing/2016/ink" xmlns:am3d="http://schemas.microsoft.com/office/drawing/2017/model3d" xmlns:o="urn:schemas-microsoft-com:office:office" xmlns:oel="http://schemas.microsoft.com/office/2019/extlst" xmlns:r="http://schemas.openxmlformats.org/officeDocument/2006/relationships" xmlns:m="http://schemas.openxmlformats.org/officeDocument/2006/math" xmlns:v="urn:schemas-microsoft-com:vml" xmlns:wp14="http://schemas.microsoft.com/office/word/2010/wordprocessingDrawing" xmlns:wp="http://schemas.openxmlformats.org/drawingml/2006/wordprocessingDrawing" xmlns:w10="urn:schemas-microsoft-com:office:word" xmlns:w="http://schemas.openxmlformats.org/wordprocessingml/2006/main" xmlns:w14="http://schemas.microsoft.com/office/word/2010/wordml" xmlns:w15="http://schemas.microsoft.com/office/word/2012/wordml" xmlns:w16cex="http://schemas.microsoft.com/office/word/2018/wordml/cex" xmlns:w16cid="http://schemas.microsoft.com/office/word/2016/wordml/cid" xmlns:w16="http://schemas.microsoft.com/office/word/2018/wordml" xmlns:w16du="http://schemas.microsoft.com/office/word/2023/wordml/word16du" xmlns:w16sdtdh="http://schemas.microsoft.com/office/word/2020/wordml/sdtdatahash" xmlns:w16sdtfl="http://schemas.microsoft.com/office/word/2024/wordml/sdtformatlock" xmlns:w16se="http://schemas.microsoft.com/office/word/2015/wordml/symex" xmlns:wpg="http://schemas.microsoft.com/office/word/2010/wordprocessingGroup" xmlns:wpi="http://schemas.microsoft.com/office/word/2010/wordprocessingInk" xmlns:wne="http://schemas.microsoft.com/office/word/2006/wordml" xmlns:wps="http://schemas.microsoft.com/office/word/2010/wordprocessingShape" mc:Ignorable="w14 w15 w16se w16cid w16 w16cex w16sdtdh w16sdtfl w16du wp14">
+  <w:endnote w:type="separator" w:id="-1">
+    <w:p>
+      <w:pPr>
+        <w:spacing w:after="0" w:line="240" w:lineRule="auto"/>
+      </w:pPr>
+      <w:r>
+        <w:separator/>
+      </w:r>
+    </w:p>
+  </w:endnote>
+  <w:endnote w:type="continuationSeparator" w:id="0">
+    <w:p>
+      <w:pPr>
+        <w:spacing w:after="0" w:line="240" w:lineRule="auto"/>
+      </w:pPr>
+      <w:r>
+        <w:continuationSeparator/>
+      </w:r>
+    </w:p>
+  </w:endnote>
+</w:endnotes>
+</file>
+
+<file path=word/footnotes.xml><?xml version="1.0" encoding="utf-8"?>
+<w:footnotes xmlns:wpc="http://schemas.microsoft.com/office/word/2010/wordprocessingCanvas" xmlns:cx="http://schemas.microsoft.com/office/drawing/2014/chartex" xmlns:cx1="http://schemas.microsoft.com/office/drawing/2015/9/8/chartex" xmlns:cx2="http://schemas.microsoft.com/office/drawing/2015/10/21/chartex" xmlns:cx3="http://schemas.microsoft.com/office/drawing/2016/5/9/chartex" xmlns:cx4="http://schemas.microsoft.com/office/drawing/2016/5/10/chartex" xmlns:cx5="http://schemas.microsoft.com/office/drawing/2016/5/11/chartex" xmlns:cx6="http://schemas.microsoft.com/office/drawing/2016/5/12/chartex" xmlns:cx7="http://schemas.microsoft.com/office/drawing/2016/5/13/chartex" xmlns:cx8="http://schemas.microsoft.com/office/drawing/2016/5/14/chartex" xmlns:mc="http://schemas.openxmlformats.org/markup-compatibility/2006" xmlns:aink="http://schemas.microsoft.com/office/drawing/2016/ink" xmlns:am3d="http://schemas.microsoft.com/office/drawing/2017/model3d" xmlns:o="urn:schemas-microsoft-com:office:office" xmlns:oel="http://schemas.microsoft.com/office/2019/extlst" xmlns:r="http://schemas.openxmlformats.org/officeDocument/2006/relationships" xmlns:m="http://schemas.openxmlformats.org/officeDocument/2006/math" xmlns:v="urn:schemas-microsoft-com:vml" xmlns:wp14="http://schemas.microsoft.com/office/word/2010/wordprocessingDrawing" xmlns:wp="http://schemas.openxmlformats.org/drawingml/2006/wordprocessingDrawing" xmlns:w10="urn:schemas-microsoft-com:office:word" xmlns:w="http://schemas.openxmlformats.org/wordprocessingml/2006/main" xmlns:w14="http://schemas.microsoft.com/office/word/2010/wordml" xmlns:w15="http://schemas.microsoft.com/office/word/2012/wordml" xmlns:w16cex="http://schemas.microsoft.com/office/word/2018/wordml/cex" xmlns:w16cid="http://schemas.microsoft.com/office/word/2016/wordml/cid" xmlns:w16="http://schemas.microsoft.com/office/word/2018/wordml" xmlns:w16du="http://schemas.microsoft.com/office/word/2023/wordml/word16du" xmlns:w16sdtdh="http://schemas.microsoft.com/office/word/2020/wordml/sdtdatahash" xmlns:w16sdtfl="http://schemas.microsoft.com/office/word/2024/wordml/sdtformatlock" xmlns:w16se="http://schemas.microsoft.com/office/word/2015/wordml/symex" xmlns:wpg="http://schemas.microsoft.com/office/word/2010/wordprocessingGroup" xmlns:wpi="http://schemas.microsoft.com/office/word/2010/wordprocessingInk" xmlns:wne="http://schemas.microsoft.com/office/word/2006/wordml" xmlns:wps="http://schemas.microsoft.com/office/word/2010/wordprocessingShape" mc:Ignorable="w14 w15 w16se w16cid w16 w16cex w16sdtdh w16sdtfl w16du wp14">
+  <w:footnote w:type="separator" w:id="-1">
+    <w:p>
+      <w:pPr>
+        <w:spacing w:after="0" w:line="240" w:lineRule="auto"/>
+      </w:pPr>
+      <w:r>
+        <w:separator/>
+      </w:r>
+    </w:p>
+  </w:footnote>
+  <w:footnote w:type="continuationSeparator" w:id="0">
+    <w:p>
+      <w:pPr>
+        <w:spacing w:after="0" w:line="240" w:lineRule="auto"/>
+      </w:pPr>
+      <w:r>
+        <w:continuationSeparator/>
+      </w:r>
+    </w:p>
+  </w:footnote>
+</w:footnotes>
+</file>
+
+<file path=word/header1.xml><?xml version="1.0" encoding="utf-8"?>
+<w:hdr xmlns:wpc="http://schemas.microsoft.com/office/word/2010/wordprocessingCanvas" xmlns:cx="http://schemas.microsoft.com/office/drawing/2014/chartex" xmlns:cx1="http://schemas.microsoft.com/office/drawing/2015/9/8/chartex" xmlns:cx2="http://schemas.microsoft.com/office/drawing/2015/10/21/chartex" xmlns:cx3="http://schemas.microsoft.com/office/drawing/2016/5/9/chartex" xmlns:cx4="http://schemas.microsoft.com/office/drawing/2016/5/10/chartex" xmlns:cx5="http://schemas.microsoft.com/office/drawing/2016/5/11/chartex" xmlns:cx6="http://schemas.microsoft.com/office/drawing/2016/5/12/chartex" xmlns:cx7="http://schemas.microsoft.com/office/drawing/2016/5/13/chartex" xmlns:cx8="http://schemas.microsoft.com/office/drawing/2016/5/14/chartex" xmlns:mc="http://schemas.openxmlformats.org/markup-compatibility/2006" xmlns:aink="http://schemas.microsoft.com/office/drawing/2016/ink" xmlns:am3d="http://schemas.microsoft.com/office/drawing/2017/model3d" xmlns:o="urn:schemas-microsoft-com:office:office" xmlns:oel="http://schemas.microsoft.com/office/2019/extlst" xmlns:r="http://schemas.openxmlformats.org/officeDocument/2006/relationships" xmlns:m="http://schemas.openxmlformats.org/officeDocument/2006/math" xmlns:v="urn:schemas-microsoft-com:vml" xmlns:wp14="http://schemas.microsoft.com/office/word/2010/wordprocessingDrawing" xmlns:wp="http://schemas.openxmlformats.org/drawingml/2006/wordprocessingDrawing" xmlns:w10="urn:schemas-microsoft-com:office:word" xmlns:w="http://schemas.openxmlformats.org/wordprocessingml/2006/main" xmlns:w14="http://schemas.microsoft.com/office/word/2010/wordml" xmlns:w15="http://schemas.microsoft.com/office/word/2012/wordml" xmlns:w16cex="http://schemas.microsoft.com/office/word/2018/wordml/cex" xmlns:w16cid="http://schemas.microsoft.com/office/word/2016/wordml/cid" xmlns:w16="http://schemas.microsoft.com/office/word/2018/wordml" xmlns:w16du="http://schemas.microsoft.com/office/word/2023/wordml/word16du" xmlns:w16sdtdh="http://schemas.microsoft.com/office/word/2020/wordml/sdtdatahash" xmlns:w16sdtfl="http://schemas.microsoft.com/office/word/2024/wordml/sdtformatlock" xmlns:w16se="http://schemas.microsoft.com/office/word/2015/wordml/symex" xmlns:wpg="http://schemas.microsoft.com/office/word/2010/wordprocessingGroup" xmlns:wpi="http://schemas.microsoft.com/office/word/2010/wordprocessingInk" xmlns:wne="http://schemas.microsoft.com/office/word/2006/wordml" xmlns:wps="http://schemas.microsoft.com/office/word/2010/wordprocessingShape" mc:Ignorable="w14 w15 w16se w16cid w16 w16cex w16sdtdh w16sdtfl w16du wp14">
+  <w:p>
+    <w:pPr>
+      <w:pStyle w:val="Intestazione"/>
+    </w:pPr>
+    <w:r>
+      <w:t>Progetto ISW 2024-2025 – Antonino Cardillo e Alessandro Rambaldi</w:t>
+    </w:r>
+  </w:p>
+</w:hdr>
+</file>
+
 <file path=word/numbering.xml><?xml version="1.0" encoding="utf-8"?>
 <w:numbering xmlns:wpc="http://schemas.microsoft.com/office/word/2010/wordprocessingCanvas" xmlns:cx="http://schemas.microsoft.com/office/drawing/2014/chartex" xmlns:cx1="http://schemas.microsoft.com/office/drawing/2015/9/8/chartex" xmlns:cx2="http://schemas.microsoft.com/office/drawing/2015/10/21/chartex" xmlns:cx3="http://schemas.microsoft.com/office/drawing/2016/5/9/chartex" xmlns:cx4="http://schemas.microsoft.com/office/drawing/2016/5/10/chartex" xmlns:cx5="http://schemas.microsoft.com/office/drawing/2016/5/11/chartex" xmlns:cx6="http://schemas.microsoft.com/office/drawing/2016/5/12/chartex" xmlns:cx7="http://schemas.microsoft.com/office/drawing/2016/5/13/chartex" xmlns:cx8="http://schemas.microsoft.com/office/drawing/2016/5/14/chartex" xmlns:mc="http://schemas.openxmlformats.org/markup-compatibility/2006" xmlns:aink="http://schemas.microsoft.com/office/drawing/2016/ink" xmlns:am3d="http://schemas.microsoft.com/office/drawing/2017/model3d" xmlns:o="urn:schemas-microsoft-com:office:office" xmlns:oel="http://schemas.microsoft.com/office/2019/extlst" xmlns:r="http://schemas.openxmlformats.org/officeDocument/2006/relationships" xmlns:m="http://schemas.openxmlformats.org/officeDocument/2006/math" xmlns:v="urn:schemas-microsoft-com:vml" xmlns:wp14="http://schemas.microsoft.com/office/word/2010/wordprocessingDrawing" xmlns:wp="http://schemas.openxmlformats.org/drawingml/2006/wordprocessingDrawing" xmlns:w10="urn:schemas-microsoft-com:office:word" xmlns:w="http://schemas.openxmlformats.org/wordprocessingml/2006/main" xmlns:w14="http://schemas.microsoft.com/office/word/2010/wordml" xmlns:w15="http://schemas.microsoft.com/office/word/2012/wordml" xmlns:w16cex="http://schemas.microsoft.com/office/word/2018/wordml/cex" xmlns:w16cid="http://schemas.microsoft.com/office/word/2016/wordml/cid" xmlns:w16="http://schemas.microsoft.com/office/word/2018/wordml" xmlns:w16du="http://schemas.microsoft.com/office/word/2023/wordml/word16du" xmlns:w16sdtdh="http://schemas.microsoft.com/office/word/2020/wordml/sdtdatahash" xmlns:w16sdtfl="http://schemas.microsoft.com/office/word/2024/wordml/sdtformatlock" xmlns:w16se="http://schemas.microsoft.com/office/word/2015/wordml/symex" xmlns:wpg="http://schemas.microsoft.com/office/word/2010/wordprocessingGroup" xmlns:wpi="http://schemas.microsoft.com/office/word/2010/wordprocessingInk" xmlns:wne="http://schemas.microsoft.com/office/word/2006/wordml" xmlns:wps="http://schemas.microsoft.com/office/word/2010/wordprocessingShape" mc:Ignorable="w14 w15 w16se w16cid w16 w16cex w16sdtdh w16sdtfl w16du wp14">
   <w:abstractNum w:abstractNumId="0" w15:restartNumberingAfterBreak="0">
@@ -1627,6 +3176,118 @@
     </w:lvl>
   </w:abstractNum>
   <w:abstractNum w:abstractNumId="1" w15:restartNumberingAfterBreak="0">
+    <w:nsid w:val="10E553C0"/>
+    <w:multiLevelType w:val="hybridMultilevel"/>
+    <w:tmpl w:val="6E8A0EF6"/>
+    <w:lvl w:ilvl="0" w:tplc="1CEE5CD6">
+      <w:numFmt w:val="bullet"/>
+      <w:lvlText w:val="-"/>
+      <w:lvlJc w:val="left"/>
+      <w:pPr>
+        <w:ind w:left="492" w:hanging="360"/>
+      </w:pPr>
+      <w:rPr>
+        <w:rFonts w:ascii="Courier New" w:eastAsiaTheme="minorHAnsi" w:hAnsi="Courier New" w:cs="Courier New" w:hint="default"/>
+      </w:rPr>
+    </w:lvl>
+    <w:lvl w:ilvl="1" w:tplc="04100003" w:tentative="1">
+      <w:start w:val="1"/>
+      <w:numFmt w:val="bullet"/>
+      <w:lvlText w:val="o"/>
+      <w:lvlJc w:val="left"/>
+      <w:pPr>
+        <w:ind w:left="1440" w:hanging="360"/>
+      </w:pPr>
+      <w:rPr>
+        <w:rFonts w:ascii="Courier New" w:hAnsi="Courier New" w:cs="Courier New" w:hint="default"/>
+      </w:rPr>
+    </w:lvl>
+    <w:lvl w:ilvl="2" w:tplc="04100005" w:tentative="1">
+      <w:start w:val="1"/>
+      <w:numFmt w:val="bullet"/>
+      <w:lvlText w:val=""/>
+      <w:lvlJc w:val="left"/>
+      <w:pPr>
+        <w:ind w:left="2160" w:hanging="360"/>
+      </w:pPr>
+      <w:rPr>
+        <w:rFonts w:ascii="Wingdings" w:hAnsi="Wingdings" w:hint="default"/>
+      </w:rPr>
+    </w:lvl>
+    <w:lvl w:ilvl="3" w:tplc="04100001" w:tentative="1">
+      <w:start w:val="1"/>
+      <w:numFmt w:val="bullet"/>
+      <w:lvlText w:val=""/>
+      <w:lvlJc w:val="left"/>
+      <w:pPr>
+        <w:ind w:left="2880" w:hanging="360"/>
+      </w:pPr>
+      <w:rPr>
+        <w:rFonts w:ascii="Symbol" w:hAnsi="Symbol" w:hint="default"/>
+      </w:rPr>
+    </w:lvl>
+    <w:lvl w:ilvl="4" w:tplc="04100003" w:tentative="1">
+      <w:start w:val="1"/>
+      <w:numFmt w:val="bullet"/>
+      <w:lvlText w:val="o"/>
+      <w:lvlJc w:val="left"/>
+      <w:pPr>
+        <w:ind w:left="3600" w:hanging="360"/>
+      </w:pPr>
+      <w:rPr>
+        <w:rFonts w:ascii="Courier New" w:hAnsi="Courier New" w:cs="Courier New" w:hint="default"/>
+      </w:rPr>
+    </w:lvl>
+    <w:lvl w:ilvl="5" w:tplc="04100005" w:tentative="1">
+      <w:start w:val="1"/>
+      <w:numFmt w:val="bullet"/>
+      <w:lvlText w:val=""/>
+      <w:lvlJc w:val="left"/>
+      <w:pPr>
+        <w:ind w:left="4320" w:hanging="360"/>
+      </w:pPr>
+      <w:rPr>
+        <w:rFonts w:ascii="Wingdings" w:hAnsi="Wingdings" w:hint="default"/>
+      </w:rPr>
+    </w:lvl>
+    <w:lvl w:ilvl="6" w:tplc="04100001" w:tentative="1">
+      <w:start w:val="1"/>
+      <w:numFmt w:val="bullet"/>
+      <w:lvlText w:val=""/>
+      <w:lvlJc w:val="left"/>
+      <w:pPr>
+        <w:ind w:left="5040" w:hanging="360"/>
+      </w:pPr>
+      <w:rPr>
+        <w:rFonts w:ascii="Symbol" w:hAnsi="Symbol" w:hint="default"/>
+      </w:rPr>
+    </w:lvl>
+    <w:lvl w:ilvl="7" w:tplc="04100003" w:tentative="1">
+      <w:start w:val="1"/>
+      <w:numFmt w:val="bullet"/>
+      <w:lvlText w:val="o"/>
+      <w:lvlJc w:val="left"/>
+      <w:pPr>
+        <w:ind w:left="5760" w:hanging="360"/>
+      </w:pPr>
+      <w:rPr>
+        <w:rFonts w:ascii="Courier New" w:hAnsi="Courier New" w:cs="Courier New" w:hint="default"/>
+      </w:rPr>
+    </w:lvl>
+    <w:lvl w:ilvl="8" w:tplc="04100005" w:tentative="1">
+      <w:start w:val="1"/>
+      <w:numFmt w:val="bullet"/>
+      <w:lvlText w:val=""/>
+      <w:lvlJc w:val="left"/>
+      <w:pPr>
+        <w:ind w:left="6480" w:hanging="360"/>
+      </w:pPr>
+      <w:rPr>
+        <w:rFonts w:ascii="Wingdings" w:hAnsi="Wingdings" w:hint="default"/>
+      </w:rPr>
+    </w:lvl>
+  </w:abstractNum>
+  <w:abstractNum w:abstractNumId="2" w15:restartNumberingAfterBreak="0">
     <w:nsid w:val="164C160A"/>
     <w:multiLevelType w:val="hybridMultilevel"/>
     <w:tmpl w:val="547CB170"/>
@@ -1738,7 +3399,120 @@
       </w:rPr>
     </w:lvl>
   </w:abstractNum>
-  <w:abstractNum w:abstractNumId="2" w15:restartNumberingAfterBreak="0">
+  <w:abstractNum w:abstractNumId="3" w15:restartNumberingAfterBreak="0">
+    <w:nsid w:val="2301089E"/>
+    <w:multiLevelType w:val="hybridMultilevel"/>
+    <w:tmpl w:val="8952A6B2"/>
+    <w:lvl w:ilvl="0" w:tplc="04100001">
+      <w:start w:val="1"/>
+      <w:numFmt w:val="bullet"/>
+      <w:lvlText w:val=""/>
+      <w:lvlJc w:val="left"/>
+      <w:pPr>
+        <w:ind w:left="720" w:hanging="360"/>
+      </w:pPr>
+      <w:rPr>
+        <w:rFonts w:ascii="Symbol" w:hAnsi="Symbol" w:hint="default"/>
+      </w:rPr>
+    </w:lvl>
+    <w:lvl w:ilvl="1" w:tplc="04100003" w:tentative="1">
+      <w:start w:val="1"/>
+      <w:numFmt w:val="bullet"/>
+      <w:lvlText w:val="o"/>
+      <w:lvlJc w:val="left"/>
+      <w:pPr>
+        <w:ind w:left="1440" w:hanging="360"/>
+      </w:pPr>
+      <w:rPr>
+        <w:rFonts w:ascii="Courier New" w:hAnsi="Courier New" w:cs="Courier New" w:hint="default"/>
+      </w:rPr>
+    </w:lvl>
+    <w:lvl w:ilvl="2" w:tplc="04100005" w:tentative="1">
+      <w:start w:val="1"/>
+      <w:numFmt w:val="bullet"/>
+      <w:lvlText w:val=""/>
+      <w:lvlJc w:val="left"/>
+      <w:pPr>
+        <w:ind w:left="2160" w:hanging="360"/>
+      </w:pPr>
+      <w:rPr>
+        <w:rFonts w:ascii="Wingdings" w:hAnsi="Wingdings" w:hint="default"/>
+      </w:rPr>
+    </w:lvl>
+    <w:lvl w:ilvl="3" w:tplc="04100001" w:tentative="1">
+      <w:start w:val="1"/>
+      <w:numFmt w:val="bullet"/>
+      <w:lvlText w:val=""/>
+      <w:lvlJc w:val="left"/>
+      <w:pPr>
+        <w:ind w:left="2880" w:hanging="360"/>
+      </w:pPr>
+      <w:rPr>
+        <w:rFonts w:ascii="Symbol" w:hAnsi="Symbol" w:hint="default"/>
+      </w:rPr>
+    </w:lvl>
+    <w:lvl w:ilvl="4" w:tplc="04100003" w:tentative="1">
+      <w:start w:val="1"/>
+      <w:numFmt w:val="bullet"/>
+      <w:lvlText w:val="o"/>
+      <w:lvlJc w:val="left"/>
+      <w:pPr>
+        <w:ind w:left="3600" w:hanging="360"/>
+      </w:pPr>
+      <w:rPr>
+        <w:rFonts w:ascii="Courier New" w:hAnsi="Courier New" w:cs="Courier New" w:hint="default"/>
+      </w:rPr>
+    </w:lvl>
+    <w:lvl w:ilvl="5" w:tplc="04100005" w:tentative="1">
+      <w:start w:val="1"/>
+      <w:numFmt w:val="bullet"/>
+      <w:lvlText w:val=""/>
+      <w:lvlJc w:val="left"/>
+      <w:pPr>
+        <w:ind w:left="4320" w:hanging="360"/>
+      </w:pPr>
+      <w:rPr>
+        <w:rFonts w:ascii="Wingdings" w:hAnsi="Wingdings" w:hint="default"/>
+      </w:rPr>
+    </w:lvl>
+    <w:lvl w:ilvl="6" w:tplc="04100001" w:tentative="1">
+      <w:start w:val="1"/>
+      <w:numFmt w:val="bullet"/>
+      <w:lvlText w:val=""/>
+      <w:lvlJc w:val="left"/>
+      <w:pPr>
+        <w:ind w:left="5040" w:hanging="360"/>
+      </w:pPr>
+      <w:rPr>
+        <w:rFonts w:ascii="Symbol" w:hAnsi="Symbol" w:hint="default"/>
+      </w:rPr>
+    </w:lvl>
+    <w:lvl w:ilvl="7" w:tplc="04100003" w:tentative="1">
+      <w:start w:val="1"/>
+      <w:numFmt w:val="bullet"/>
+      <w:lvlText w:val="o"/>
+      <w:lvlJc w:val="left"/>
+      <w:pPr>
+        <w:ind w:left="5760" w:hanging="360"/>
+      </w:pPr>
+      <w:rPr>
+        <w:rFonts w:ascii="Courier New" w:hAnsi="Courier New" w:cs="Courier New" w:hint="default"/>
+      </w:rPr>
+    </w:lvl>
+    <w:lvl w:ilvl="8" w:tplc="04100005" w:tentative="1">
+      <w:start w:val="1"/>
+      <w:numFmt w:val="bullet"/>
+      <w:lvlText w:val=""/>
+      <w:lvlJc w:val="left"/>
+      <w:pPr>
+        <w:ind w:left="6480" w:hanging="360"/>
+      </w:pPr>
+      <w:rPr>
+        <w:rFonts w:ascii="Wingdings" w:hAnsi="Wingdings" w:hint="default"/>
+      </w:rPr>
+    </w:lvl>
+  </w:abstractNum>
+  <w:abstractNum w:abstractNumId="4" w15:restartNumberingAfterBreak="0">
     <w:nsid w:val="25990F9F"/>
     <w:multiLevelType w:val="hybridMultilevel"/>
     <w:tmpl w:val="D2327754"/>
@@ -1850,7 +3624,120 @@
       </w:rPr>
     </w:lvl>
   </w:abstractNum>
-  <w:abstractNum w:abstractNumId="3" w15:restartNumberingAfterBreak="0">
+  <w:abstractNum w:abstractNumId="5" w15:restartNumberingAfterBreak="0">
+    <w:nsid w:val="37920A86"/>
+    <w:multiLevelType w:val="hybridMultilevel"/>
+    <w:tmpl w:val="B9487244"/>
+    <w:lvl w:ilvl="0" w:tplc="04100001">
+      <w:start w:val="1"/>
+      <w:numFmt w:val="bullet"/>
+      <w:lvlText w:val=""/>
+      <w:lvlJc w:val="left"/>
+      <w:pPr>
+        <w:ind w:left="720" w:hanging="360"/>
+      </w:pPr>
+      <w:rPr>
+        <w:rFonts w:ascii="Symbol" w:hAnsi="Symbol" w:hint="default"/>
+      </w:rPr>
+    </w:lvl>
+    <w:lvl w:ilvl="1" w:tplc="04100003">
+      <w:start w:val="1"/>
+      <w:numFmt w:val="bullet"/>
+      <w:lvlText w:val="o"/>
+      <w:lvlJc w:val="left"/>
+      <w:pPr>
+        <w:ind w:left="1440" w:hanging="360"/>
+      </w:pPr>
+      <w:rPr>
+        <w:rFonts w:ascii="Courier New" w:hAnsi="Courier New" w:cs="Courier New" w:hint="default"/>
+      </w:rPr>
+    </w:lvl>
+    <w:lvl w:ilvl="2" w:tplc="04100005" w:tentative="1">
+      <w:start w:val="1"/>
+      <w:numFmt w:val="bullet"/>
+      <w:lvlText w:val=""/>
+      <w:lvlJc w:val="left"/>
+      <w:pPr>
+        <w:ind w:left="2160" w:hanging="360"/>
+      </w:pPr>
+      <w:rPr>
+        <w:rFonts w:ascii="Wingdings" w:hAnsi="Wingdings" w:hint="default"/>
+      </w:rPr>
+    </w:lvl>
+    <w:lvl w:ilvl="3" w:tplc="04100001" w:tentative="1">
+      <w:start w:val="1"/>
+      <w:numFmt w:val="bullet"/>
+      <w:lvlText w:val=""/>
+      <w:lvlJc w:val="left"/>
+      <w:pPr>
+        <w:ind w:left="2880" w:hanging="360"/>
+      </w:pPr>
+      <w:rPr>
+        <w:rFonts w:ascii="Symbol" w:hAnsi="Symbol" w:hint="default"/>
+      </w:rPr>
+    </w:lvl>
+    <w:lvl w:ilvl="4" w:tplc="04100003" w:tentative="1">
+      <w:start w:val="1"/>
+      <w:numFmt w:val="bullet"/>
+      <w:lvlText w:val="o"/>
+      <w:lvlJc w:val="left"/>
+      <w:pPr>
+        <w:ind w:left="3600" w:hanging="360"/>
+      </w:pPr>
+      <w:rPr>
+        <w:rFonts w:ascii="Courier New" w:hAnsi="Courier New" w:cs="Courier New" w:hint="default"/>
+      </w:rPr>
+    </w:lvl>
+    <w:lvl w:ilvl="5" w:tplc="04100005" w:tentative="1">
+      <w:start w:val="1"/>
+      <w:numFmt w:val="bullet"/>
+      <w:lvlText w:val=""/>
+      <w:lvlJc w:val="left"/>
+      <w:pPr>
+        <w:ind w:left="4320" w:hanging="360"/>
+      </w:pPr>
+      <w:rPr>
+        <w:rFonts w:ascii="Wingdings" w:hAnsi="Wingdings" w:hint="default"/>
+      </w:rPr>
+    </w:lvl>
+    <w:lvl w:ilvl="6" w:tplc="04100001" w:tentative="1">
+      <w:start w:val="1"/>
+      <w:numFmt w:val="bullet"/>
+      <w:lvlText w:val=""/>
+      <w:lvlJc w:val="left"/>
+      <w:pPr>
+        <w:ind w:left="5040" w:hanging="360"/>
+      </w:pPr>
+      <w:rPr>
+        <w:rFonts w:ascii="Symbol" w:hAnsi="Symbol" w:hint="default"/>
+      </w:rPr>
+    </w:lvl>
+    <w:lvl w:ilvl="7" w:tplc="04100003" w:tentative="1">
+      <w:start w:val="1"/>
+      <w:numFmt w:val="bullet"/>
+      <w:lvlText w:val="o"/>
+      <w:lvlJc w:val="left"/>
+      <w:pPr>
+        <w:ind w:left="5760" w:hanging="360"/>
+      </w:pPr>
+      <w:rPr>
+        <w:rFonts w:ascii="Courier New" w:hAnsi="Courier New" w:cs="Courier New" w:hint="default"/>
+      </w:rPr>
+    </w:lvl>
+    <w:lvl w:ilvl="8" w:tplc="04100005" w:tentative="1">
+      <w:start w:val="1"/>
+      <w:numFmt w:val="bullet"/>
+      <w:lvlText w:val=""/>
+      <w:lvlJc w:val="left"/>
+      <w:pPr>
+        <w:ind w:left="6480" w:hanging="360"/>
+      </w:pPr>
+      <w:rPr>
+        <w:rFonts w:ascii="Wingdings" w:hAnsi="Wingdings" w:hint="default"/>
+      </w:rPr>
+    </w:lvl>
+  </w:abstractNum>
+  <w:abstractNum w:abstractNumId="6" w15:restartNumberingAfterBreak="0">
     <w:nsid w:val="3CB52D1F"/>
     <w:multiLevelType w:val="hybridMultilevel"/>
     <w:tmpl w:val="8228BE14"/>
@@ -1962,7 +3849,7 @@
       </w:rPr>
     </w:lvl>
   </w:abstractNum>
-  <w:abstractNum w:abstractNumId="4" w15:restartNumberingAfterBreak="0">
+  <w:abstractNum w:abstractNumId="7" w15:restartNumberingAfterBreak="0">
     <w:nsid w:val="3E074689"/>
     <w:multiLevelType w:val="hybridMultilevel"/>
     <w:tmpl w:val="4E04862C"/>
@@ -2074,7 +3961,206 @@
       </w:rPr>
     </w:lvl>
   </w:abstractNum>
-  <w:abstractNum w:abstractNumId="5" w15:restartNumberingAfterBreak="0">
+  <w:abstractNum w:abstractNumId="8" w15:restartNumberingAfterBreak="0">
+    <w:nsid w:val="55170C59"/>
+    <w:multiLevelType w:val="hybridMultilevel"/>
+    <w:tmpl w:val="C4D804F6"/>
+    <w:lvl w:ilvl="0" w:tplc="04100001">
+      <w:start w:val="1"/>
+      <w:numFmt w:val="bullet"/>
+      <w:lvlText w:val=""/>
+      <w:lvlJc w:val="left"/>
+      <w:pPr>
+        <w:ind w:left="720" w:hanging="360"/>
+      </w:pPr>
+      <w:rPr>
+        <w:rFonts w:ascii="Symbol" w:hAnsi="Symbol" w:hint="default"/>
+      </w:rPr>
+    </w:lvl>
+    <w:lvl w:ilvl="1" w:tplc="04100003" w:tentative="1">
+      <w:start w:val="1"/>
+      <w:numFmt w:val="bullet"/>
+      <w:lvlText w:val="o"/>
+      <w:lvlJc w:val="left"/>
+      <w:pPr>
+        <w:ind w:left="1440" w:hanging="360"/>
+      </w:pPr>
+      <w:rPr>
+        <w:rFonts w:ascii="Courier New" w:hAnsi="Courier New" w:cs="Courier New" w:hint="default"/>
+      </w:rPr>
+    </w:lvl>
+    <w:lvl w:ilvl="2" w:tplc="04100005" w:tentative="1">
+      <w:start w:val="1"/>
+      <w:numFmt w:val="bullet"/>
+      <w:lvlText w:val=""/>
+      <w:lvlJc w:val="left"/>
+      <w:pPr>
+        <w:ind w:left="2160" w:hanging="360"/>
+      </w:pPr>
+      <w:rPr>
+        <w:rFonts w:ascii="Wingdings" w:hAnsi="Wingdings" w:hint="default"/>
+      </w:rPr>
+    </w:lvl>
+    <w:lvl w:ilvl="3" w:tplc="04100001" w:tentative="1">
+      <w:start w:val="1"/>
+      <w:numFmt w:val="bullet"/>
+      <w:lvlText w:val=""/>
+      <w:lvlJc w:val="left"/>
+      <w:pPr>
+        <w:ind w:left="2880" w:hanging="360"/>
+      </w:pPr>
+      <w:rPr>
+        <w:rFonts w:ascii="Symbol" w:hAnsi="Symbol" w:hint="default"/>
+      </w:rPr>
+    </w:lvl>
+    <w:lvl w:ilvl="4" w:tplc="04100003" w:tentative="1">
+      <w:start w:val="1"/>
+      <w:numFmt w:val="bullet"/>
+      <w:lvlText w:val="o"/>
+      <w:lvlJc w:val="left"/>
+      <w:pPr>
+        <w:ind w:left="3600" w:hanging="360"/>
+      </w:pPr>
+      <w:rPr>
+        <w:rFonts w:ascii="Courier New" w:hAnsi="Courier New" w:cs="Courier New" w:hint="default"/>
+      </w:rPr>
+    </w:lvl>
+    <w:lvl w:ilvl="5" w:tplc="04100005" w:tentative="1">
+      <w:start w:val="1"/>
+      <w:numFmt w:val="bullet"/>
+      <w:lvlText w:val=""/>
+      <w:lvlJc w:val="left"/>
+      <w:pPr>
+        <w:ind w:left="4320" w:hanging="360"/>
+      </w:pPr>
+      <w:rPr>
+        <w:rFonts w:ascii="Wingdings" w:hAnsi="Wingdings" w:hint="default"/>
+      </w:rPr>
+    </w:lvl>
+    <w:lvl w:ilvl="6" w:tplc="04100001" w:tentative="1">
+      <w:start w:val="1"/>
+      <w:numFmt w:val="bullet"/>
+      <w:lvlText w:val=""/>
+      <w:lvlJc w:val="left"/>
+      <w:pPr>
+        <w:ind w:left="5040" w:hanging="360"/>
+      </w:pPr>
+      <w:rPr>
+        <w:rFonts w:ascii="Symbol" w:hAnsi="Symbol" w:hint="default"/>
+      </w:rPr>
+    </w:lvl>
+    <w:lvl w:ilvl="7" w:tplc="04100003" w:tentative="1">
+      <w:start w:val="1"/>
+      <w:numFmt w:val="bullet"/>
+      <w:lvlText w:val="o"/>
+      <w:lvlJc w:val="left"/>
+      <w:pPr>
+        <w:ind w:left="5760" w:hanging="360"/>
+      </w:pPr>
+      <w:rPr>
+        <w:rFonts w:ascii="Courier New" w:hAnsi="Courier New" w:cs="Courier New" w:hint="default"/>
+      </w:rPr>
+    </w:lvl>
+    <w:lvl w:ilvl="8" w:tplc="04100005" w:tentative="1">
+      <w:start w:val="1"/>
+      <w:numFmt w:val="bullet"/>
+      <w:lvlText w:val=""/>
+      <w:lvlJc w:val="left"/>
+      <w:pPr>
+        <w:ind w:left="6480" w:hanging="360"/>
+      </w:pPr>
+      <w:rPr>
+        <w:rFonts w:ascii="Wingdings" w:hAnsi="Wingdings" w:hint="default"/>
+      </w:rPr>
+    </w:lvl>
+  </w:abstractNum>
+  <w:abstractNum w:abstractNumId="9" w15:restartNumberingAfterBreak="0">
+    <w:nsid w:val="56361D9F"/>
+    <w:multiLevelType w:val="hybridMultilevel"/>
+    <w:tmpl w:val="2C529826"/>
+    <w:lvl w:ilvl="0" w:tplc="0410000F">
+      <w:start w:val="1"/>
+      <w:numFmt w:val="decimal"/>
+      <w:lvlText w:val="%1."/>
+      <w:lvlJc w:val="left"/>
+      <w:pPr>
+        <w:ind w:left="720" w:hanging="360"/>
+      </w:pPr>
+    </w:lvl>
+    <w:lvl w:ilvl="1" w:tplc="04100019" w:tentative="1">
+      <w:start w:val="1"/>
+      <w:numFmt w:val="lowerLetter"/>
+      <w:lvlText w:val="%2."/>
+      <w:lvlJc w:val="left"/>
+      <w:pPr>
+        <w:ind w:left="1440" w:hanging="360"/>
+      </w:pPr>
+    </w:lvl>
+    <w:lvl w:ilvl="2" w:tplc="0410001B" w:tentative="1">
+      <w:start w:val="1"/>
+      <w:numFmt w:val="lowerRoman"/>
+      <w:lvlText w:val="%3."/>
+      <w:lvlJc w:val="right"/>
+      <w:pPr>
+        <w:ind w:left="2160" w:hanging="180"/>
+      </w:pPr>
+    </w:lvl>
+    <w:lvl w:ilvl="3" w:tplc="0410000F" w:tentative="1">
+      <w:start w:val="1"/>
+      <w:numFmt w:val="decimal"/>
+      <w:lvlText w:val="%4."/>
+      <w:lvlJc w:val="left"/>
+      <w:pPr>
+        <w:ind w:left="2880" w:hanging="360"/>
+      </w:pPr>
+    </w:lvl>
+    <w:lvl w:ilvl="4" w:tplc="04100019" w:tentative="1">
+      <w:start w:val="1"/>
+      <w:numFmt w:val="lowerLetter"/>
+      <w:lvlText w:val="%5."/>
+      <w:lvlJc w:val="left"/>
+      <w:pPr>
+        <w:ind w:left="3600" w:hanging="360"/>
+      </w:pPr>
+    </w:lvl>
+    <w:lvl w:ilvl="5" w:tplc="0410001B" w:tentative="1">
+      <w:start w:val="1"/>
+      <w:numFmt w:val="lowerRoman"/>
+      <w:lvlText w:val="%6."/>
+      <w:lvlJc w:val="right"/>
+      <w:pPr>
+        <w:ind w:left="4320" w:hanging="180"/>
+      </w:pPr>
+    </w:lvl>
+    <w:lvl w:ilvl="6" w:tplc="0410000F" w:tentative="1">
+      <w:start w:val="1"/>
+      <w:numFmt w:val="decimal"/>
+      <w:lvlText w:val="%7."/>
+      <w:lvlJc w:val="left"/>
+      <w:pPr>
+        <w:ind w:left="5040" w:hanging="360"/>
+      </w:pPr>
+    </w:lvl>
+    <w:lvl w:ilvl="7" w:tplc="04100019" w:tentative="1">
+      <w:start w:val="1"/>
+      <w:numFmt w:val="lowerLetter"/>
+      <w:lvlText w:val="%8."/>
+      <w:lvlJc w:val="left"/>
+      <w:pPr>
+        <w:ind w:left="5760" w:hanging="360"/>
+      </w:pPr>
+    </w:lvl>
+    <w:lvl w:ilvl="8" w:tplc="0410001B" w:tentative="1">
+      <w:start w:val="1"/>
+      <w:numFmt w:val="lowerRoman"/>
+      <w:lvlText w:val="%9."/>
+      <w:lvlJc w:val="right"/>
+      <w:pPr>
+        <w:ind w:left="6480" w:hanging="180"/>
+      </w:pPr>
+    </w:lvl>
+  </w:abstractNum>
+  <w:abstractNum w:abstractNumId="10" w15:restartNumberingAfterBreak="0">
     <w:nsid w:val="56C2269E"/>
     <w:multiLevelType w:val="hybridMultilevel"/>
     <w:tmpl w:val="84088E9C"/>
@@ -2180,6 +4266,118 @@
       <w:lvlJc w:val="left"/>
       <w:pPr>
         <w:ind w:left="6612" w:hanging="360"/>
+      </w:pPr>
+      <w:rPr>
+        <w:rFonts w:ascii="Wingdings" w:hAnsi="Wingdings" w:hint="default"/>
+      </w:rPr>
+    </w:lvl>
+  </w:abstractNum>
+  <w:abstractNum w:abstractNumId="11" w15:restartNumberingAfterBreak="0">
+    <w:nsid w:val="6A964817"/>
+    <w:multiLevelType w:val="hybridMultilevel"/>
+    <w:tmpl w:val="960CCAE8"/>
+    <w:lvl w:ilvl="0" w:tplc="1CEE5CD6">
+      <w:numFmt w:val="bullet"/>
+      <w:lvlText w:val="-"/>
+      <w:lvlJc w:val="left"/>
+      <w:pPr>
+        <w:ind w:left="492" w:hanging="360"/>
+      </w:pPr>
+      <w:rPr>
+        <w:rFonts w:ascii="Courier New" w:eastAsiaTheme="minorHAnsi" w:hAnsi="Courier New" w:cs="Courier New" w:hint="default"/>
+      </w:rPr>
+    </w:lvl>
+    <w:lvl w:ilvl="1" w:tplc="04100003">
+      <w:start w:val="1"/>
+      <w:numFmt w:val="bullet"/>
+      <w:lvlText w:val="o"/>
+      <w:lvlJc w:val="left"/>
+      <w:pPr>
+        <w:ind w:left="1440" w:hanging="360"/>
+      </w:pPr>
+      <w:rPr>
+        <w:rFonts w:ascii="Courier New" w:hAnsi="Courier New" w:cs="Courier New" w:hint="default"/>
+      </w:rPr>
+    </w:lvl>
+    <w:lvl w:ilvl="2" w:tplc="04100005" w:tentative="1">
+      <w:start w:val="1"/>
+      <w:numFmt w:val="bullet"/>
+      <w:lvlText w:val=""/>
+      <w:lvlJc w:val="left"/>
+      <w:pPr>
+        <w:ind w:left="2160" w:hanging="360"/>
+      </w:pPr>
+      <w:rPr>
+        <w:rFonts w:ascii="Wingdings" w:hAnsi="Wingdings" w:hint="default"/>
+      </w:rPr>
+    </w:lvl>
+    <w:lvl w:ilvl="3" w:tplc="04100001" w:tentative="1">
+      <w:start w:val="1"/>
+      <w:numFmt w:val="bullet"/>
+      <w:lvlText w:val=""/>
+      <w:lvlJc w:val="left"/>
+      <w:pPr>
+        <w:ind w:left="2880" w:hanging="360"/>
+      </w:pPr>
+      <w:rPr>
+        <w:rFonts w:ascii="Symbol" w:hAnsi="Symbol" w:hint="default"/>
+      </w:rPr>
+    </w:lvl>
+    <w:lvl w:ilvl="4" w:tplc="04100003" w:tentative="1">
+      <w:start w:val="1"/>
+      <w:numFmt w:val="bullet"/>
+      <w:lvlText w:val="o"/>
+      <w:lvlJc w:val="left"/>
+      <w:pPr>
+        <w:ind w:left="3600" w:hanging="360"/>
+      </w:pPr>
+      <w:rPr>
+        <w:rFonts w:ascii="Courier New" w:hAnsi="Courier New" w:cs="Courier New" w:hint="default"/>
+      </w:rPr>
+    </w:lvl>
+    <w:lvl w:ilvl="5" w:tplc="04100005" w:tentative="1">
+      <w:start w:val="1"/>
+      <w:numFmt w:val="bullet"/>
+      <w:lvlText w:val=""/>
+      <w:lvlJc w:val="left"/>
+      <w:pPr>
+        <w:ind w:left="4320" w:hanging="360"/>
+      </w:pPr>
+      <w:rPr>
+        <w:rFonts w:ascii="Wingdings" w:hAnsi="Wingdings" w:hint="default"/>
+      </w:rPr>
+    </w:lvl>
+    <w:lvl w:ilvl="6" w:tplc="04100001" w:tentative="1">
+      <w:start w:val="1"/>
+      <w:numFmt w:val="bullet"/>
+      <w:lvlText w:val=""/>
+      <w:lvlJc w:val="left"/>
+      <w:pPr>
+        <w:ind w:left="5040" w:hanging="360"/>
+      </w:pPr>
+      <w:rPr>
+        <w:rFonts w:ascii="Symbol" w:hAnsi="Symbol" w:hint="default"/>
+      </w:rPr>
+    </w:lvl>
+    <w:lvl w:ilvl="7" w:tplc="04100003" w:tentative="1">
+      <w:start w:val="1"/>
+      <w:numFmt w:val="bullet"/>
+      <w:lvlText w:val="o"/>
+      <w:lvlJc w:val="left"/>
+      <w:pPr>
+        <w:ind w:left="5760" w:hanging="360"/>
+      </w:pPr>
+      <w:rPr>
+        <w:rFonts w:ascii="Courier New" w:hAnsi="Courier New" w:cs="Courier New" w:hint="default"/>
+      </w:rPr>
+    </w:lvl>
+    <w:lvl w:ilvl="8" w:tplc="04100005" w:tentative="1">
+      <w:start w:val="1"/>
+      <w:numFmt w:val="bullet"/>
+      <w:lvlText w:val=""/>
+      <w:lvlJc w:val="left"/>
+      <w:pPr>
+        <w:ind w:left="6480" w:hanging="360"/>
       </w:pPr>
       <w:rPr>
         <w:rFonts w:ascii="Wingdings" w:hAnsi="Wingdings" w:hint="default"/>
@@ -2190,19 +4388,37 @@
     <w:abstractNumId w:val="0"/>
   </w:num>
   <w:num w:numId="2" w16cid:durableId="1445687787">
+    <w:abstractNumId w:val="4"/>
+  </w:num>
+  <w:num w:numId="3" w16cid:durableId="101264031">
+    <w:abstractNumId w:val="10"/>
+  </w:num>
+  <w:num w:numId="4" w16cid:durableId="1274702189">
+    <w:abstractNumId w:val="6"/>
+  </w:num>
+  <w:num w:numId="5" w16cid:durableId="562642335">
+    <w:abstractNumId w:val="7"/>
+  </w:num>
+  <w:num w:numId="6" w16cid:durableId="1163083309">
     <w:abstractNumId w:val="2"/>
   </w:num>
-  <w:num w:numId="3" w16cid:durableId="101264031">
+  <w:num w:numId="7" w16cid:durableId="68969620">
+    <w:abstractNumId w:val="9"/>
+  </w:num>
+  <w:num w:numId="8" w16cid:durableId="1303733114">
+    <w:abstractNumId w:val="1"/>
+  </w:num>
+  <w:num w:numId="9" w16cid:durableId="711613592">
+    <w:abstractNumId w:val="11"/>
+  </w:num>
+  <w:num w:numId="10" w16cid:durableId="1168328916">
     <w:abstractNumId w:val="5"/>
   </w:num>
-  <w:num w:numId="4" w16cid:durableId="1274702189">
+  <w:num w:numId="11" w16cid:durableId="1668169499">
     <w:abstractNumId w:val="3"/>
   </w:num>
-  <w:num w:numId="5" w16cid:durableId="562642335">
-    <w:abstractNumId w:val="4"/>
-  </w:num>
-  <w:num w:numId="6" w16cid:durableId="1163083309">
-    <w:abstractNumId w:val="1"/>
+  <w:num w:numId="12" w16cid:durableId="31273608">
+    <w:abstractNumId w:val="8"/>
   </w:num>
 </w:numbering>
 </file>
@@ -2660,6 +4876,73 @@
       <w:szCs w:val="21"/>
     </w:rPr>
   </w:style>
+  <w:style w:type="character" w:styleId="Collegamentoipertestuale">
+    <w:name w:val="Hyperlink"/>
+    <w:basedOn w:val="Carpredefinitoparagrafo"/>
+    <w:uiPriority w:val="99"/>
+    <w:unhideWhenUsed/>
+    <w:rsid w:val="002C2154"/>
+    <w:rPr>
+      <w:color w:val="0563C1" w:themeColor="hyperlink"/>
+      <w:u w:val="single"/>
+    </w:rPr>
+  </w:style>
+  <w:style w:type="character" w:styleId="Menzionenonrisolta">
+    <w:name w:val="Unresolved Mention"/>
+    <w:basedOn w:val="Carpredefinitoparagrafo"/>
+    <w:uiPriority w:val="99"/>
+    <w:semiHidden/>
+    <w:unhideWhenUsed/>
+    <w:rsid w:val="002C2154"/>
+    <w:rPr>
+      <w:color w:val="605E5C"/>
+      <w:shd w:val="clear" w:color="auto" w:fill="E1DFDD"/>
+    </w:rPr>
+  </w:style>
+  <w:style w:type="paragraph" w:styleId="Intestazione">
+    <w:name w:val="header"/>
+    <w:basedOn w:val="Normale"/>
+    <w:link w:val="IntestazioneCarattere"/>
+    <w:uiPriority w:val="99"/>
+    <w:unhideWhenUsed/>
+    <w:rsid w:val="00155228"/>
+    <w:pPr>
+      <w:tabs>
+        <w:tab w:val="center" w:pos="4819"/>
+        <w:tab w:val="right" w:pos="9638"/>
+      </w:tabs>
+      <w:spacing w:after="0" w:line="240" w:lineRule="auto"/>
+    </w:pPr>
+  </w:style>
+  <w:style w:type="character" w:customStyle="1" w:styleId="IntestazioneCarattere">
+    <w:name w:val="Intestazione Carattere"/>
+    <w:basedOn w:val="Carpredefinitoparagrafo"/>
+    <w:link w:val="Intestazione"/>
+    <w:uiPriority w:val="99"/>
+    <w:rsid w:val="00155228"/>
+  </w:style>
+  <w:style w:type="paragraph" w:styleId="Pidipagina">
+    <w:name w:val="footer"/>
+    <w:basedOn w:val="Normale"/>
+    <w:link w:val="PidipaginaCarattere"/>
+    <w:uiPriority w:val="99"/>
+    <w:unhideWhenUsed/>
+    <w:rsid w:val="00155228"/>
+    <w:pPr>
+      <w:tabs>
+        <w:tab w:val="center" w:pos="4819"/>
+        <w:tab w:val="right" w:pos="9638"/>
+      </w:tabs>
+      <w:spacing w:after="0" w:line="240" w:lineRule="auto"/>
+    </w:pPr>
+  </w:style>
+  <w:style w:type="character" w:customStyle="1" w:styleId="PidipaginaCarattere">
+    <w:name w:val="Piè di pagina Carattere"/>
+    <w:basedOn w:val="Carpredefinitoparagrafo"/>
+    <w:link w:val="Pidipagina"/>
+    <w:uiPriority w:val="99"/>
+    <w:rsid w:val="00155228"/>
+  </w:style>
 </w:styles>
 </file>
 

</xml_diff>

<commit_message>
UPDATE - add clarification on admin features in README.md and bozza_relazione.docx regarding the ability to enable inactive announcements
</commit_message>
<xml_diff>
--- a/StudentHome/bozza_relazione.docx
+++ b/StudentHome/bozza_relazione.docx
@@ -61,25 +61,7 @@
           <w:sz w:val="22"/>
           <w:szCs w:val="22"/>
         </w:rPr>
-        <w:t xml:space="preserve">Benvenuti nel sito di </w:t>
-      </w:r>
-      <w:proofErr w:type="spellStart"/>
-      <w:r>
-        <w:rPr>
-          <w:rFonts w:ascii="Century Gothic" w:hAnsi="Century Gothic" w:cs="Courier New"/>
-          <w:sz w:val="22"/>
-          <w:szCs w:val="22"/>
-        </w:rPr>
-        <w:t>StudentHome</w:t>
-      </w:r>
-      <w:proofErr w:type="spellEnd"/>
-      <w:r>
-        <w:rPr>
-          <w:rFonts w:ascii="Century Gothic" w:hAnsi="Century Gothic" w:cs="Courier New"/>
-          <w:sz w:val="22"/>
-          <w:szCs w:val="22"/>
-        </w:rPr>
-        <w:t>. Questa applicazione web è un servizio gratuito per gli studenti</w:t>
+        <w:t>Benvenuti nel sito di StudentHome. Questa applicazione web è un servizio gratuito per gli studenti</w:t>
       </w:r>
       <w:r>
         <w:rPr>
@@ -103,55 +85,15 @@
           <w:sz w:val="22"/>
           <w:szCs w:val="22"/>
         </w:rPr>
-        <w:t xml:space="preserve">. Il tutto </w:t>
-      </w:r>
-      <w:r>
-        <w:rPr>
-          <w:rFonts w:ascii="Century Gothic" w:hAnsi="Century Gothic" w:cs="Courier New"/>
-          <w:sz w:val="22"/>
-          <w:szCs w:val="22"/>
-        </w:rPr>
-        <w:t xml:space="preserve">senza </w:t>
-      </w:r>
-      <w:r>
-        <w:rPr>
-          <w:rFonts w:ascii="Century Gothic" w:hAnsi="Century Gothic" w:cs="Courier New"/>
-          <w:sz w:val="22"/>
-          <w:szCs w:val="22"/>
-        </w:rPr>
-        <w:t xml:space="preserve">nessuna </w:t>
-      </w:r>
-      <w:r>
-        <w:rPr>
-          <w:rFonts w:ascii="Century Gothic" w:hAnsi="Century Gothic" w:cs="Courier New"/>
-          <w:sz w:val="22"/>
-          <w:szCs w:val="22"/>
-        </w:rPr>
-        <w:t xml:space="preserve">agenzia di intermediazione. </w:t>
-      </w:r>
-      <w:r>
-        <w:rPr>
-          <w:rFonts w:ascii="Century Gothic" w:hAnsi="Century Gothic" w:cs="Courier New"/>
-          <w:sz w:val="22"/>
-          <w:szCs w:val="22"/>
-        </w:rPr>
-        <w:t xml:space="preserve">Grazie al nostro sito potrete controllare la distanza </w:t>
-      </w:r>
-      <w:r>
-        <w:rPr>
-          <w:rFonts w:ascii="Century Gothic" w:hAnsi="Century Gothic" w:cs="Courier New"/>
-          <w:sz w:val="22"/>
-          <w:szCs w:val="22"/>
-        </w:rPr>
-        <w:t>dall’alloggio di vostro interesse</w:t>
-      </w:r>
-      <w:r>
-        <w:rPr>
-          <w:rFonts w:ascii="Century Gothic" w:hAnsi="Century Gothic" w:cs="Courier New"/>
-          <w:sz w:val="22"/>
-          <w:szCs w:val="22"/>
-        </w:rPr>
-        <w:t xml:space="preserve"> a</w:t>
+        <w:t xml:space="preserve">. Il tutto senza nessuna agenzia di intermediazione. Grazie al nostro sito potrete controllare la distanza </w:t>
+      </w:r>
+      <w:r>
+        <w:rPr>
+          <w:rFonts w:ascii="Century Gothic" w:hAnsi="Century Gothic" w:cs="Courier New"/>
+          <w:sz w:val="22"/>
+          <w:szCs w:val="22"/>
+        </w:rPr>
+        <w:t>dall’alloggio di vostro interesse a</w:t>
       </w:r>
       <w:r>
         <w:rPr>
@@ -207,25 +149,7 @@
           <w:sz w:val="22"/>
           <w:szCs w:val="22"/>
         </w:rPr>
-        <w:t xml:space="preserve">, una </w:t>
-      </w:r>
-      <w:proofErr w:type="gramStart"/>
-      <w:r>
-        <w:rPr>
-          <w:rFonts w:ascii="Century Gothic" w:hAnsi="Century Gothic" w:cs="Courier New"/>
-          <w:sz w:val="22"/>
-          <w:szCs w:val="22"/>
-        </w:rPr>
-        <w:t>pagina</w:t>
-      </w:r>
-      <w:proofErr w:type="gramEnd"/>
-      <w:r>
-        <w:rPr>
-          <w:rFonts w:ascii="Century Gothic" w:hAnsi="Century Gothic" w:cs="Courier New"/>
-          <w:sz w:val="22"/>
-          <w:szCs w:val="22"/>
-        </w:rPr>
-        <w:t xml:space="preserve"> Chi siamo</w:t>
+        <w:t>, una pagina Chi siamo</w:t>
       </w:r>
       <w:r>
         <w:rPr>
@@ -694,6 +618,25 @@
     <w:p>
       <w:pPr>
         <w:pStyle w:val="Testonormale"/>
+        <w:numPr>
+          <w:ilvl w:val="0"/>
+          <w:numId w:val="11"/>
+        </w:numPr>
+        <w:jc w:val="both"/>
+        <w:rPr>
+          <w:rFonts w:ascii="Century Gothic" w:hAnsi="Century Gothic" w:cs="Courier New"/>
+        </w:rPr>
+      </w:pPr>
+      <w:r>
+        <w:rPr>
+          <w:rFonts w:ascii="Century Gothic" w:hAnsi="Century Gothic" w:cs="Courier New"/>
+        </w:rPr>
+        <w:t>Attraverso il DB possono abilitare gli annunci non attivi</w:t>
+      </w:r>
+    </w:p>
+    <w:p>
+      <w:pPr>
+        <w:pStyle w:val="Testonormale"/>
         <w:rPr>
           <w:rFonts w:ascii="Century Gothic" w:hAnsi="Century Gothic" w:cs="Courier New"/>
         </w:rPr>
@@ -739,18 +682,8 @@
           <w:sz w:val="22"/>
           <w:szCs w:val="22"/>
         </w:rPr>
-        <w:t xml:space="preserve">XAMPP per avviare il server </w:t>
-      </w:r>
-      <w:proofErr w:type="spellStart"/>
-      <w:r>
-        <w:rPr>
-          <w:rFonts w:ascii="Century Gothic" w:hAnsi="Century Gothic" w:cs="Courier New"/>
-          <w:sz w:val="22"/>
-          <w:szCs w:val="22"/>
-        </w:rPr>
-        <w:t>mysql</w:t>
-      </w:r>
-      <w:proofErr w:type="spellEnd"/>
+        <w:t>XAMPP per avviare il server mysql</w:t>
+      </w:r>
     </w:p>
     <w:p>
       <w:pPr>
@@ -813,23 +746,13 @@
           <w:szCs w:val="22"/>
         </w:rPr>
       </w:pPr>
-      <w:proofErr w:type="spellStart"/>
-      <w:r>
-        <w:rPr>
-          <w:rFonts w:ascii="Century Gothic" w:hAnsi="Century Gothic" w:cs="Courier New"/>
-          <w:sz w:val="22"/>
-          <w:szCs w:val="22"/>
-        </w:rPr>
-        <w:t>npm</w:t>
-      </w:r>
-      <w:proofErr w:type="spellEnd"/>
-      <w:r>
-        <w:rPr>
-          <w:rFonts w:ascii="Century Gothic" w:hAnsi="Century Gothic" w:cs="Courier New"/>
-          <w:sz w:val="22"/>
-          <w:szCs w:val="22"/>
-        </w:rPr>
-        <w:t xml:space="preserve"> per installazione di packages e avviare il server</w:t>
+      <w:r>
+        <w:rPr>
+          <w:rFonts w:ascii="Century Gothic" w:hAnsi="Century Gothic" w:cs="Courier New"/>
+          <w:sz w:val="22"/>
+          <w:szCs w:val="22"/>
+        </w:rPr>
+        <w:t>npm per installazione di packages e avviare il server</w:t>
       </w:r>
     </w:p>
     <w:p>
@@ -973,19 +896,8 @@
           <w:szCs w:val="22"/>
           <w:lang w:val="en-US"/>
         </w:rPr>
-        <w:t xml:space="preserve">Bootstrap per </w:t>
-      </w:r>
-      <w:proofErr w:type="spellStart"/>
-      <w:r>
-        <w:rPr>
-          <w:rFonts w:ascii="Century Gothic" w:hAnsi="Century Gothic" w:cs="Courier New"/>
-          <w:sz w:val="22"/>
-          <w:szCs w:val="22"/>
-          <w:lang w:val="en-US"/>
-        </w:rPr>
-        <w:t>css</w:t>
-      </w:r>
-      <w:proofErr w:type="spellEnd"/>
+        <w:t>Bootstrap per css</w:t>
+      </w:r>
     </w:p>
     <w:p>
       <w:pPr>
@@ -1035,1322 +947,1036 @@
           <w:sz w:val="28"/>
           <w:szCs w:val="28"/>
         </w:rPr>
-        <w:t xml:space="preserve">Packages </w:t>
-      </w:r>
-      <w:proofErr w:type="spellStart"/>
-      <w:r>
+        <w:t>Packages installati</w:t>
+      </w:r>
+    </w:p>
+    <w:p>
+      <w:pPr>
+        <w:pStyle w:val="Testonormale"/>
+        <w:numPr>
+          <w:ilvl w:val="0"/>
+          <w:numId w:val="6"/>
+        </w:numPr>
+        <w:jc w:val="both"/>
+        <w:rPr>
+          <w:rFonts w:ascii="Century Gothic" w:hAnsi="Century Gothic" w:cs="Courier New"/>
+          <w:sz w:val="22"/>
+          <w:szCs w:val="22"/>
+        </w:rPr>
+      </w:pPr>
+      <w:r>
+        <w:rPr>
+          <w:rFonts w:ascii="Century Gothic" w:hAnsi="Century Gothic" w:cs="Courier New"/>
+          <w:sz w:val="22"/>
+          <w:szCs w:val="22"/>
+        </w:rPr>
+        <w:lastRenderedPageBreak/>
+        <w:t>c</w:t>
+      </w:r>
+      <w:r>
+        <w:rPr>
+          <w:rFonts w:ascii="Century Gothic" w:hAnsi="Century Gothic" w:cs="Courier New"/>
+          <w:sz w:val="22"/>
+          <w:szCs w:val="22"/>
+        </w:rPr>
+        <w:t>onnect-history-api-fallback</w:t>
+      </w:r>
+    </w:p>
+    <w:p>
+      <w:pPr>
+        <w:pStyle w:val="Testonormale"/>
+        <w:numPr>
+          <w:ilvl w:val="0"/>
+          <w:numId w:val="6"/>
+        </w:numPr>
+        <w:jc w:val="both"/>
+        <w:rPr>
+          <w:rFonts w:ascii="Century Gothic" w:hAnsi="Century Gothic" w:cs="Courier New"/>
+          <w:sz w:val="22"/>
+          <w:szCs w:val="22"/>
+        </w:rPr>
+      </w:pPr>
+      <w:r>
+        <w:rPr>
+          <w:rFonts w:ascii="Century Gothic" w:hAnsi="Century Gothic" w:cs="Courier New"/>
+          <w:sz w:val="22"/>
+          <w:szCs w:val="22"/>
+        </w:rPr>
+        <w:t>mysql2: otimizzato e compatibile con Promises, ideale per eseguire query asincrone in applicazioni Node.js</w:t>
+      </w:r>
+    </w:p>
+    <w:p>
+      <w:pPr>
+        <w:pStyle w:val="Testonormale"/>
+        <w:numPr>
+          <w:ilvl w:val="0"/>
+          <w:numId w:val="6"/>
+        </w:numPr>
+        <w:jc w:val="both"/>
+        <w:rPr>
+          <w:rFonts w:ascii="Century Gothic" w:hAnsi="Century Gothic" w:cs="Courier New"/>
+          <w:sz w:val="22"/>
+          <w:szCs w:val="22"/>
+        </w:rPr>
+      </w:pPr>
+      <w:r>
+        <w:rPr>
+          <w:rFonts w:ascii="Century Gothic" w:hAnsi="Century Gothic" w:cs="Courier New"/>
+          <w:sz w:val="22"/>
+          <w:szCs w:val="22"/>
+        </w:rPr>
+        <w:t>cookie-parser</w:t>
+      </w:r>
+      <w:r>
+        <w:rPr>
+          <w:rFonts w:ascii="Century Gothic" w:hAnsi="Century Gothic" w:cs="Courier New"/>
+          <w:sz w:val="22"/>
+          <w:szCs w:val="22"/>
+        </w:rPr>
+        <w:t xml:space="preserve">, </w:t>
+      </w:r>
+      <w:r>
+        <w:rPr>
+          <w:rFonts w:ascii="Century Gothic" w:hAnsi="Century Gothic" w:cs="Courier New"/>
+          <w:sz w:val="22"/>
+          <w:szCs w:val="22"/>
+        </w:rPr>
+        <w:t>jsonwebtoken</w:t>
+      </w:r>
+      <w:r>
+        <w:rPr>
+          <w:rFonts w:ascii="Century Gothic" w:hAnsi="Century Gothic" w:cs="Courier New"/>
+          <w:sz w:val="22"/>
+          <w:szCs w:val="22"/>
+        </w:rPr>
+        <w:t xml:space="preserve"> e </w:t>
+      </w:r>
+      <w:r>
+        <w:rPr>
+          <w:rFonts w:ascii="Century Gothic" w:hAnsi="Century Gothic" w:cs="Courier New"/>
+          <w:sz w:val="22"/>
+          <w:szCs w:val="22"/>
+        </w:rPr>
+        <w:t>bcrypt</w:t>
+      </w:r>
+      <w:r>
+        <w:rPr>
+          <w:rFonts w:ascii="Century Gothic" w:hAnsi="Century Gothic" w:cs="Courier New"/>
+          <w:sz w:val="22"/>
+          <w:szCs w:val="22"/>
+        </w:rPr>
+        <w:t>: utilizzati per la parte di autenticazione. Grazie a questi pacchetti è possibile realizzare una crittografia delle password</w:t>
+      </w:r>
+      <w:r>
+        <w:rPr>
+          <w:rFonts w:ascii="Century Gothic" w:hAnsi="Century Gothic" w:cs="Courier New"/>
+          <w:sz w:val="22"/>
+          <w:szCs w:val="22"/>
+        </w:rPr>
+        <w:t>, gestire i JWT e il parsing dei cookie</w:t>
+      </w:r>
+      <w:r>
+        <w:rPr>
+          <w:rFonts w:ascii="Century Gothic" w:hAnsi="Century Gothic" w:cs="Courier New"/>
+          <w:sz w:val="22"/>
+          <w:szCs w:val="22"/>
+        </w:rPr>
+        <w:t>. Sono stati installati anche i tipi per TypeScript.</w:t>
+      </w:r>
+    </w:p>
+    <w:p>
+      <w:pPr>
+        <w:pStyle w:val="Testonormale"/>
+        <w:numPr>
+          <w:ilvl w:val="0"/>
+          <w:numId w:val="6"/>
+        </w:numPr>
+        <w:jc w:val="both"/>
+        <w:rPr>
+          <w:rFonts w:ascii="Century Gothic" w:hAnsi="Century Gothic" w:cs="Courier New"/>
+          <w:sz w:val="22"/>
+          <w:szCs w:val="22"/>
+        </w:rPr>
+      </w:pPr>
+      <w:r>
+        <w:rPr>
+          <w:rFonts w:ascii="Century Gothic" w:hAnsi="Century Gothic" w:cs="Courier New"/>
+          <w:sz w:val="22"/>
+          <w:szCs w:val="22"/>
+        </w:rPr>
+        <w:t>m</w:t>
+      </w:r>
+      <w:r>
+        <w:rPr>
+          <w:rFonts w:ascii="Century Gothic" w:hAnsi="Century Gothic" w:cs="Courier New"/>
+          <w:sz w:val="22"/>
+          <w:szCs w:val="22"/>
+        </w:rPr>
+        <w:t>ulter</w:t>
+      </w:r>
+      <w:r>
+        <w:rPr>
+          <w:rFonts w:ascii="Century Gothic" w:hAnsi="Century Gothic" w:cs="Courier New"/>
+          <w:sz w:val="22"/>
+          <w:szCs w:val="22"/>
+        </w:rPr>
+        <w:t>: middleware per gestire l'upload di file in Node.js, particolarmente utile per elaborare form multipart/form-data.</w:t>
+      </w:r>
+    </w:p>
+    <w:p>
+      <w:pPr>
+        <w:pStyle w:val="Testonormale"/>
+        <w:rPr>
+          <w:rFonts w:ascii="Century Gothic" w:hAnsi="Century Gothic" w:cs="Courier New"/>
+        </w:rPr>
+      </w:pPr>
+    </w:p>
+    <w:p>
+      <w:pPr>
+        <w:pStyle w:val="Testonormale"/>
+        <w:spacing w:after="240"/>
         <w:rPr>
           <w:rFonts w:ascii="Century Gothic" w:hAnsi="Century Gothic" w:cs="Courier New"/>
           <w:b/>
           <w:sz w:val="28"/>
           <w:szCs w:val="28"/>
         </w:rPr>
-        <w:t>installati</w:t>
-      </w:r>
-      <w:proofErr w:type="spellEnd"/>
-    </w:p>
-    <w:p>
-      <w:pPr>
-        <w:pStyle w:val="Testonormale"/>
-        <w:numPr>
-          <w:ilvl w:val="0"/>
-          <w:numId w:val="6"/>
-        </w:numPr>
-        <w:jc w:val="both"/>
-        <w:rPr>
-          <w:rFonts w:ascii="Century Gothic" w:hAnsi="Century Gothic" w:cs="Courier New"/>
-          <w:sz w:val="22"/>
-          <w:szCs w:val="22"/>
-        </w:rPr>
-      </w:pPr>
-      <w:proofErr w:type="spellStart"/>
-      <w:r>
-        <w:rPr>
-          <w:rFonts w:ascii="Century Gothic" w:hAnsi="Century Gothic" w:cs="Courier New"/>
-          <w:sz w:val="22"/>
-          <w:szCs w:val="22"/>
-        </w:rPr>
-        <w:lastRenderedPageBreak/>
-        <w:t>c</w:t>
-      </w:r>
-      <w:r>
-        <w:rPr>
-          <w:rFonts w:ascii="Century Gothic" w:hAnsi="Century Gothic" w:cs="Courier New"/>
-          <w:sz w:val="22"/>
-          <w:szCs w:val="22"/>
-        </w:rPr>
-        <w:t>onnect</w:t>
-      </w:r>
-      <w:proofErr w:type="spellEnd"/>
-      <w:r>
-        <w:rPr>
-          <w:rFonts w:ascii="Century Gothic" w:hAnsi="Century Gothic" w:cs="Courier New"/>
-          <w:sz w:val="22"/>
-          <w:szCs w:val="22"/>
-        </w:rPr>
-        <w:t>-history-api-</w:t>
-      </w:r>
-      <w:proofErr w:type="spellStart"/>
-      <w:r>
-        <w:rPr>
-          <w:rFonts w:ascii="Century Gothic" w:hAnsi="Century Gothic" w:cs="Courier New"/>
-          <w:sz w:val="22"/>
-          <w:szCs w:val="22"/>
-        </w:rPr>
-        <w:t>fallback</w:t>
-      </w:r>
-      <w:proofErr w:type="spellEnd"/>
-    </w:p>
-    <w:p>
-      <w:pPr>
-        <w:pStyle w:val="Testonormale"/>
-        <w:numPr>
-          <w:ilvl w:val="0"/>
-          <w:numId w:val="6"/>
-        </w:numPr>
-        <w:jc w:val="both"/>
-        <w:rPr>
-          <w:rFonts w:ascii="Century Gothic" w:hAnsi="Century Gothic" w:cs="Courier New"/>
-          <w:sz w:val="22"/>
-          <w:szCs w:val="22"/>
-        </w:rPr>
-      </w:pPr>
-      <w:r>
-        <w:rPr>
-          <w:rFonts w:ascii="Century Gothic" w:hAnsi="Century Gothic" w:cs="Courier New"/>
-          <w:sz w:val="22"/>
-          <w:szCs w:val="22"/>
-        </w:rPr>
-        <w:t>mysql2</w:t>
-      </w:r>
-      <w:r>
-        <w:rPr>
-          <w:rFonts w:ascii="Century Gothic" w:hAnsi="Century Gothic" w:cs="Courier New"/>
-          <w:sz w:val="22"/>
-          <w:szCs w:val="22"/>
-        </w:rPr>
-        <w:t xml:space="preserve">: </w:t>
-      </w:r>
-      <w:proofErr w:type="spellStart"/>
-      <w:r>
-        <w:rPr>
-          <w:rFonts w:ascii="Century Gothic" w:hAnsi="Century Gothic" w:cs="Courier New"/>
-          <w:sz w:val="22"/>
-          <w:szCs w:val="22"/>
-        </w:rPr>
-        <w:t>o</w:t>
-      </w:r>
-      <w:r>
-        <w:rPr>
-          <w:rFonts w:ascii="Century Gothic" w:hAnsi="Century Gothic" w:cs="Courier New"/>
-          <w:sz w:val="22"/>
-          <w:szCs w:val="22"/>
-        </w:rPr>
-        <w:t>timizzato</w:t>
-      </w:r>
-      <w:proofErr w:type="spellEnd"/>
-      <w:r>
-        <w:rPr>
-          <w:rFonts w:ascii="Century Gothic" w:hAnsi="Century Gothic" w:cs="Courier New"/>
-          <w:sz w:val="22"/>
-          <w:szCs w:val="22"/>
-        </w:rPr>
-        <w:t xml:space="preserve"> e compatibile con </w:t>
-      </w:r>
-      <w:proofErr w:type="spellStart"/>
-      <w:r>
-        <w:rPr>
-          <w:rFonts w:ascii="Century Gothic" w:hAnsi="Century Gothic" w:cs="Courier New"/>
-          <w:sz w:val="22"/>
-          <w:szCs w:val="22"/>
-        </w:rPr>
-        <w:t>Promises</w:t>
-      </w:r>
-      <w:proofErr w:type="spellEnd"/>
-      <w:r>
-        <w:rPr>
-          <w:rFonts w:ascii="Century Gothic" w:hAnsi="Century Gothic" w:cs="Courier New"/>
-          <w:sz w:val="22"/>
-          <w:szCs w:val="22"/>
-        </w:rPr>
-        <w:t>, ideale per eseguire query asincrone in applicazioni Node.js</w:t>
-      </w:r>
-    </w:p>
-    <w:p>
-      <w:pPr>
-        <w:pStyle w:val="Testonormale"/>
-        <w:numPr>
-          <w:ilvl w:val="0"/>
-          <w:numId w:val="6"/>
-        </w:numPr>
-        <w:jc w:val="both"/>
-        <w:rPr>
-          <w:rFonts w:ascii="Century Gothic" w:hAnsi="Century Gothic" w:cs="Courier New"/>
-          <w:sz w:val="22"/>
-          <w:szCs w:val="22"/>
-        </w:rPr>
-      </w:pPr>
-      <w:r>
-        <w:rPr>
-          <w:rFonts w:ascii="Century Gothic" w:hAnsi="Century Gothic" w:cs="Courier New"/>
-          <w:sz w:val="22"/>
-          <w:szCs w:val="22"/>
-        </w:rPr>
-        <w:t>cookie-parser</w:t>
-      </w:r>
-      <w:r>
-        <w:rPr>
-          <w:rFonts w:ascii="Century Gothic" w:hAnsi="Century Gothic" w:cs="Courier New"/>
-          <w:sz w:val="22"/>
-          <w:szCs w:val="22"/>
-        </w:rPr>
-        <w:t xml:space="preserve">, </w:t>
-      </w:r>
-      <w:proofErr w:type="spellStart"/>
-      <w:r>
-        <w:rPr>
-          <w:rFonts w:ascii="Century Gothic" w:hAnsi="Century Gothic" w:cs="Courier New"/>
-          <w:sz w:val="22"/>
-          <w:szCs w:val="22"/>
-        </w:rPr>
-        <w:t>jsonwebtoken</w:t>
-      </w:r>
-      <w:proofErr w:type="spellEnd"/>
-      <w:r>
-        <w:rPr>
-          <w:rFonts w:ascii="Century Gothic" w:hAnsi="Century Gothic" w:cs="Courier New"/>
-          <w:sz w:val="22"/>
-          <w:szCs w:val="22"/>
-        </w:rPr>
-        <w:t xml:space="preserve"> e </w:t>
-      </w:r>
-      <w:proofErr w:type="spellStart"/>
-      <w:r>
-        <w:rPr>
-          <w:rFonts w:ascii="Century Gothic" w:hAnsi="Century Gothic" w:cs="Courier New"/>
-          <w:sz w:val="22"/>
-          <w:szCs w:val="22"/>
-        </w:rPr>
-        <w:t>bcrypt</w:t>
-      </w:r>
-      <w:proofErr w:type="spellEnd"/>
-      <w:r>
-        <w:rPr>
-          <w:rFonts w:ascii="Century Gothic" w:hAnsi="Century Gothic" w:cs="Courier New"/>
-          <w:sz w:val="22"/>
-          <w:szCs w:val="22"/>
-        </w:rPr>
-        <w:t>: utilizzati per la parte di autenticazione. Grazie a questi pacchetti è possibile realizzare una crittografia delle password</w:t>
-      </w:r>
-      <w:r>
-        <w:rPr>
-          <w:rFonts w:ascii="Century Gothic" w:hAnsi="Century Gothic" w:cs="Courier New"/>
-          <w:sz w:val="22"/>
-          <w:szCs w:val="22"/>
-        </w:rPr>
-        <w:t xml:space="preserve">, gestire i JWT e il </w:t>
-      </w:r>
-      <w:proofErr w:type="spellStart"/>
-      <w:r>
-        <w:rPr>
-          <w:rFonts w:ascii="Century Gothic" w:hAnsi="Century Gothic" w:cs="Courier New"/>
-          <w:sz w:val="22"/>
-          <w:szCs w:val="22"/>
-        </w:rPr>
-        <w:t>parsing</w:t>
-      </w:r>
-      <w:proofErr w:type="spellEnd"/>
-      <w:r>
-        <w:rPr>
-          <w:rFonts w:ascii="Century Gothic" w:hAnsi="Century Gothic" w:cs="Courier New"/>
-          <w:sz w:val="22"/>
-          <w:szCs w:val="22"/>
-        </w:rPr>
-        <w:t xml:space="preserve"> dei cookie</w:t>
-      </w:r>
-      <w:r>
-        <w:rPr>
-          <w:rFonts w:ascii="Century Gothic" w:hAnsi="Century Gothic" w:cs="Courier New"/>
-          <w:sz w:val="22"/>
-          <w:szCs w:val="22"/>
-        </w:rPr>
-        <w:t xml:space="preserve">. Sono stati installati anche i tipi per </w:t>
-      </w:r>
-      <w:proofErr w:type="spellStart"/>
-      <w:r>
-        <w:rPr>
-          <w:rFonts w:ascii="Century Gothic" w:hAnsi="Century Gothic" w:cs="Courier New"/>
-          <w:sz w:val="22"/>
-          <w:szCs w:val="22"/>
-        </w:rPr>
-        <w:t>TypeScript</w:t>
-      </w:r>
-      <w:proofErr w:type="spellEnd"/>
-      <w:r>
-        <w:rPr>
-          <w:rFonts w:ascii="Century Gothic" w:hAnsi="Century Gothic" w:cs="Courier New"/>
-          <w:sz w:val="22"/>
-          <w:szCs w:val="22"/>
-        </w:rPr>
-        <w:t>.</w:t>
-      </w:r>
-    </w:p>
-    <w:p>
-      <w:pPr>
-        <w:pStyle w:val="Testonormale"/>
-        <w:numPr>
-          <w:ilvl w:val="0"/>
-          <w:numId w:val="6"/>
-        </w:numPr>
-        <w:jc w:val="both"/>
-        <w:rPr>
-          <w:rFonts w:ascii="Century Gothic" w:hAnsi="Century Gothic" w:cs="Courier New"/>
-          <w:sz w:val="22"/>
-          <w:szCs w:val="22"/>
-        </w:rPr>
-      </w:pPr>
-      <w:proofErr w:type="spellStart"/>
-      <w:r>
-        <w:rPr>
-          <w:rFonts w:ascii="Century Gothic" w:hAnsi="Century Gothic" w:cs="Courier New"/>
-          <w:sz w:val="22"/>
-          <w:szCs w:val="22"/>
-        </w:rPr>
-        <w:t>m</w:t>
-      </w:r>
-      <w:r>
-        <w:rPr>
-          <w:rFonts w:ascii="Century Gothic" w:hAnsi="Century Gothic" w:cs="Courier New"/>
-          <w:sz w:val="22"/>
-          <w:szCs w:val="22"/>
-        </w:rPr>
-        <w:t>ulter</w:t>
-      </w:r>
-      <w:proofErr w:type="spellEnd"/>
-      <w:r>
-        <w:rPr>
-          <w:rFonts w:ascii="Century Gothic" w:hAnsi="Century Gothic" w:cs="Courier New"/>
-          <w:sz w:val="22"/>
-          <w:szCs w:val="22"/>
-        </w:rPr>
-        <w:t>: m</w:t>
-      </w:r>
-      <w:r>
-        <w:rPr>
-          <w:rFonts w:ascii="Century Gothic" w:hAnsi="Century Gothic" w:cs="Courier New"/>
-          <w:sz w:val="22"/>
-          <w:szCs w:val="22"/>
-        </w:rPr>
-        <w:t xml:space="preserve">iddleware per gestire l'upload di file in Node.js, particolarmente utile per elaborare </w:t>
-      </w:r>
-      <w:proofErr w:type="spellStart"/>
-      <w:r>
-        <w:rPr>
-          <w:rFonts w:ascii="Century Gothic" w:hAnsi="Century Gothic" w:cs="Courier New"/>
-          <w:sz w:val="22"/>
-          <w:szCs w:val="22"/>
-        </w:rPr>
-        <w:t>form</w:t>
-      </w:r>
-      <w:proofErr w:type="spellEnd"/>
-      <w:r>
-        <w:rPr>
-          <w:rFonts w:ascii="Century Gothic" w:hAnsi="Century Gothic" w:cs="Courier New"/>
-          <w:sz w:val="22"/>
-          <w:szCs w:val="22"/>
-        </w:rPr>
-        <w:t xml:space="preserve"> </w:t>
-      </w:r>
-      <w:proofErr w:type="spellStart"/>
-      <w:r>
-        <w:rPr>
-          <w:rFonts w:ascii="Century Gothic" w:hAnsi="Century Gothic" w:cs="Courier New"/>
-          <w:sz w:val="22"/>
-          <w:szCs w:val="22"/>
-        </w:rPr>
-        <w:t>multipart</w:t>
-      </w:r>
-      <w:proofErr w:type="spellEnd"/>
-      <w:r>
-        <w:rPr>
-          <w:rFonts w:ascii="Century Gothic" w:hAnsi="Century Gothic" w:cs="Courier New"/>
-          <w:sz w:val="22"/>
-          <w:szCs w:val="22"/>
-        </w:rPr>
-        <w:t>/</w:t>
-      </w:r>
-      <w:proofErr w:type="spellStart"/>
-      <w:r>
-        <w:rPr>
-          <w:rFonts w:ascii="Century Gothic" w:hAnsi="Century Gothic" w:cs="Courier New"/>
-          <w:sz w:val="22"/>
-          <w:szCs w:val="22"/>
-        </w:rPr>
-        <w:t>form</w:t>
-      </w:r>
-      <w:proofErr w:type="spellEnd"/>
-      <w:r>
-        <w:rPr>
-          <w:rFonts w:ascii="Century Gothic" w:hAnsi="Century Gothic" w:cs="Courier New"/>
-          <w:sz w:val="22"/>
-          <w:szCs w:val="22"/>
-        </w:rPr>
-        <w:t>-data.</w:t>
-      </w:r>
-    </w:p>
-    <w:p>
-      <w:pPr>
-        <w:pStyle w:val="Testonormale"/>
-        <w:rPr>
-          <w:rFonts w:ascii="Century Gothic" w:hAnsi="Century Gothic" w:cs="Courier New"/>
-        </w:rPr>
-      </w:pPr>
-    </w:p>
-    <w:p>
-      <w:pPr>
-        <w:pStyle w:val="Testonormale"/>
-        <w:spacing w:after="240"/>
+      </w:pPr>
+      <w:r>
         <w:rPr>
           <w:rFonts w:ascii="Century Gothic" w:hAnsi="Century Gothic" w:cs="Courier New"/>
           <w:b/>
           <w:sz w:val="28"/>
           <w:szCs w:val="28"/>
         </w:rPr>
-      </w:pPr>
-      <w:r>
+        <w:t>Struttura progetto</w:t>
+      </w:r>
+    </w:p>
+    <w:p>
+      <w:pPr>
+        <w:pStyle w:val="Testonormale"/>
+        <w:jc w:val="both"/>
+        <w:rPr>
+          <w:rFonts w:ascii="Century Gothic" w:hAnsi="Century Gothic" w:cs="Courier New"/>
+          <w:sz w:val="22"/>
+          <w:szCs w:val="22"/>
+        </w:rPr>
+      </w:pPr>
+      <w:r>
+        <w:rPr>
+          <w:rFonts w:ascii="Century Gothic" w:hAnsi="Century Gothic" w:cs="Courier New"/>
+          <w:sz w:val="22"/>
+          <w:szCs w:val="22"/>
+        </w:rPr>
+        <w:t>S</w:t>
+      </w:r>
+      <w:r>
+        <w:rPr>
+          <w:rFonts w:ascii="Century Gothic" w:hAnsi="Century Gothic" w:cs="Courier New"/>
+          <w:sz w:val="22"/>
+          <w:szCs w:val="22"/>
+        </w:rPr>
+        <w:t>udd</w:t>
+      </w:r>
+      <w:r>
+        <w:rPr>
+          <w:rFonts w:ascii="Century Gothic" w:hAnsi="Century Gothic" w:cs="Courier New"/>
+          <w:sz w:val="22"/>
+          <w:szCs w:val="22"/>
+        </w:rPr>
+        <w:t>i</w:t>
+      </w:r>
+      <w:r>
+        <w:rPr>
+          <w:rFonts w:ascii="Century Gothic" w:hAnsi="Century Gothic" w:cs="Courier New"/>
+          <w:sz w:val="22"/>
+          <w:szCs w:val="22"/>
+        </w:rPr>
+        <w:t>viso in frontend e backend realizzati rispettivamente con Vue.js e Express</w:t>
+      </w:r>
+    </w:p>
+    <w:p>
+      <w:pPr>
+        <w:pStyle w:val="Testonormale"/>
+        <w:jc w:val="both"/>
+        <w:rPr>
+          <w:rFonts w:ascii="Century Gothic" w:hAnsi="Century Gothic" w:cs="Courier New"/>
+          <w:sz w:val="22"/>
+          <w:szCs w:val="22"/>
+        </w:rPr>
+      </w:pPr>
+    </w:p>
+    <w:p>
+      <w:pPr>
+        <w:pStyle w:val="Testonormale"/>
+        <w:spacing w:after="240"/>
         <w:rPr>
           <w:rFonts w:ascii="Century Gothic" w:hAnsi="Century Gothic" w:cs="Courier New"/>
           <w:b/>
           <w:sz w:val="28"/>
           <w:szCs w:val="28"/>
         </w:rPr>
-        <w:t>Struttura progetto</w:t>
-      </w:r>
-    </w:p>
-    <w:p>
-      <w:pPr>
-        <w:pStyle w:val="Testonormale"/>
-        <w:jc w:val="both"/>
-        <w:rPr>
-          <w:rFonts w:ascii="Century Gothic" w:hAnsi="Century Gothic" w:cs="Courier New"/>
-          <w:sz w:val="22"/>
-          <w:szCs w:val="22"/>
-        </w:rPr>
-      </w:pPr>
-      <w:r>
-        <w:rPr>
-          <w:rFonts w:ascii="Century Gothic" w:hAnsi="Century Gothic" w:cs="Courier New"/>
-          <w:sz w:val="22"/>
-          <w:szCs w:val="22"/>
-        </w:rPr>
-        <w:t>S</w:t>
-      </w:r>
-      <w:r>
-        <w:rPr>
-          <w:rFonts w:ascii="Century Gothic" w:hAnsi="Century Gothic" w:cs="Courier New"/>
-          <w:sz w:val="22"/>
-          <w:szCs w:val="22"/>
-        </w:rPr>
-        <w:t>udd</w:t>
-      </w:r>
-      <w:r>
-        <w:rPr>
-          <w:rFonts w:ascii="Century Gothic" w:hAnsi="Century Gothic" w:cs="Courier New"/>
-          <w:sz w:val="22"/>
-          <w:szCs w:val="22"/>
-        </w:rPr>
-        <w:t>i</w:t>
-      </w:r>
-      <w:r>
-        <w:rPr>
-          <w:rFonts w:ascii="Century Gothic" w:hAnsi="Century Gothic" w:cs="Courier New"/>
-          <w:sz w:val="22"/>
-          <w:szCs w:val="22"/>
-        </w:rPr>
-        <w:t xml:space="preserve">viso in </w:t>
-      </w:r>
-      <w:proofErr w:type="spellStart"/>
-      <w:r>
-        <w:rPr>
-          <w:rFonts w:ascii="Century Gothic" w:hAnsi="Century Gothic" w:cs="Courier New"/>
-          <w:sz w:val="22"/>
-          <w:szCs w:val="22"/>
-        </w:rPr>
-        <w:t>frontend</w:t>
-      </w:r>
-      <w:proofErr w:type="spellEnd"/>
-      <w:r>
-        <w:rPr>
-          <w:rFonts w:ascii="Century Gothic" w:hAnsi="Century Gothic" w:cs="Courier New"/>
-          <w:sz w:val="22"/>
-          <w:szCs w:val="22"/>
-        </w:rPr>
-        <w:t xml:space="preserve"> e backend realizzati rispettivamente con Vue.js </w:t>
-      </w:r>
-      <w:proofErr w:type="gramStart"/>
-      <w:r>
-        <w:rPr>
-          <w:rFonts w:ascii="Century Gothic" w:hAnsi="Century Gothic" w:cs="Courier New"/>
-          <w:sz w:val="22"/>
-          <w:szCs w:val="22"/>
-        </w:rPr>
-        <w:t>e</w:t>
-      </w:r>
-      <w:proofErr w:type="gramEnd"/>
-      <w:r>
-        <w:rPr>
-          <w:rFonts w:ascii="Century Gothic" w:hAnsi="Century Gothic" w:cs="Courier New"/>
-          <w:sz w:val="22"/>
-          <w:szCs w:val="22"/>
-        </w:rPr>
-        <w:t xml:space="preserve"> Express</w:t>
-      </w:r>
-    </w:p>
-    <w:p>
-      <w:pPr>
-        <w:pStyle w:val="Testonormale"/>
-        <w:jc w:val="both"/>
-        <w:rPr>
-          <w:rFonts w:ascii="Century Gothic" w:hAnsi="Century Gothic" w:cs="Courier New"/>
-          <w:sz w:val="22"/>
-          <w:szCs w:val="22"/>
-        </w:rPr>
-      </w:pPr>
-    </w:p>
-    <w:p>
-      <w:pPr>
-        <w:pStyle w:val="Testonormale"/>
-        <w:spacing w:after="240"/>
+      </w:pPr>
+      <w:r>
         <w:rPr>
           <w:rFonts w:ascii="Century Gothic" w:hAnsi="Century Gothic" w:cs="Courier New"/>
           <w:b/>
           <w:sz w:val="28"/>
           <w:szCs w:val="28"/>
         </w:rPr>
-      </w:pPr>
-      <w:r>
+        <w:t>API endpoint</w:t>
+      </w:r>
+    </w:p>
+    <w:p>
+      <w:pPr>
+        <w:pStyle w:val="Testonormale"/>
+        <w:rPr>
+          <w:rFonts w:ascii="Century Gothic" w:hAnsi="Century Gothic" w:cs="Courier New"/>
+        </w:rPr>
+      </w:pPr>
+    </w:p>
+    <w:p>
+      <w:pPr>
+        <w:pStyle w:val="Testonormale"/>
+        <w:spacing w:after="240"/>
+        <w:rPr>
+          <w:rFonts w:ascii="Century Gothic" w:hAnsi="Century Gothic" w:cs="Courier New"/>
+          <w:b/>
+          <w:sz w:val="22"/>
+          <w:szCs w:val="22"/>
+          <w:u w:val="single"/>
+        </w:rPr>
+      </w:pPr>
+      <w:r>
+        <w:rPr>
+          <w:rFonts w:ascii="Century Gothic" w:hAnsi="Century Gothic" w:cs="Courier New"/>
+          <w:b/>
+          <w:sz w:val="22"/>
+          <w:szCs w:val="22"/>
+          <w:u w:val="single"/>
+        </w:rPr>
+        <w:t>GET</w:t>
+      </w:r>
+    </w:p>
+    <w:p>
+      <w:pPr>
+        <w:pStyle w:val="Testonormale"/>
+        <w:numPr>
+          <w:ilvl w:val="0"/>
+          <w:numId w:val="3"/>
+        </w:numPr>
+        <w:rPr>
+          <w:rFonts w:ascii="Century Gothic" w:hAnsi="Century Gothic" w:cs="Courier New"/>
+          <w:sz w:val="22"/>
+          <w:szCs w:val="22"/>
+        </w:rPr>
+      </w:pPr>
+      <w:r>
+        <w:rPr>
+          <w:rFonts w:ascii="Century Gothic" w:hAnsi="Century Gothic" w:cs="Courier New"/>
+          <w:sz w:val="22"/>
+          <w:szCs w:val="22"/>
+        </w:rPr>
+        <w:t>/api/news</w:t>
+      </w:r>
+    </w:p>
+    <w:p>
+      <w:pPr>
+        <w:pStyle w:val="Testonormale"/>
+        <w:numPr>
+          <w:ilvl w:val="0"/>
+          <w:numId w:val="3"/>
+        </w:numPr>
+        <w:rPr>
+          <w:rFonts w:ascii="Century Gothic" w:hAnsi="Century Gothic" w:cs="Courier New"/>
+          <w:sz w:val="22"/>
+          <w:szCs w:val="22"/>
+        </w:rPr>
+      </w:pPr>
+      <w:r>
+        <w:rPr>
+          <w:rFonts w:ascii="Century Gothic" w:hAnsi="Century Gothic" w:cs="Courier New"/>
+          <w:sz w:val="22"/>
+          <w:szCs w:val="22"/>
+        </w:rPr>
+        <w:t>/api/news/:id</w:t>
+      </w:r>
+    </w:p>
+    <w:p>
+      <w:pPr>
+        <w:pStyle w:val="Testonormale"/>
+        <w:numPr>
+          <w:ilvl w:val="0"/>
+          <w:numId w:val="3"/>
+        </w:numPr>
+        <w:rPr>
+          <w:rFonts w:ascii="Century Gothic" w:hAnsi="Century Gothic" w:cs="Courier New"/>
+          <w:sz w:val="22"/>
+          <w:szCs w:val="22"/>
+        </w:rPr>
+      </w:pPr>
+      <w:r>
+        <w:rPr>
+          <w:rFonts w:ascii="Century Gothic" w:hAnsi="Century Gothic" w:cs="Courier New"/>
+          <w:sz w:val="22"/>
+          <w:szCs w:val="22"/>
+        </w:rPr>
+        <w:t>/api/auth/profile</w:t>
+      </w:r>
+    </w:p>
+    <w:p>
+      <w:pPr>
+        <w:pStyle w:val="Testonormale"/>
+        <w:numPr>
+          <w:ilvl w:val="0"/>
+          <w:numId w:val="3"/>
+        </w:numPr>
+        <w:rPr>
+          <w:rFonts w:ascii="Century Gothic" w:hAnsi="Century Gothic" w:cs="Courier New"/>
+          <w:sz w:val="22"/>
+          <w:szCs w:val="22"/>
+        </w:rPr>
+      </w:pPr>
+      <w:r>
+        <w:rPr>
+          <w:rFonts w:ascii="Century Gothic" w:hAnsi="Century Gothic" w:cs="Courier New"/>
+          <w:sz w:val="22"/>
+          <w:szCs w:val="22"/>
+        </w:rPr>
+        <w:t>/api/annunci</w:t>
+      </w:r>
+    </w:p>
+    <w:p>
+      <w:pPr>
+        <w:pStyle w:val="Testonormale"/>
+        <w:numPr>
+          <w:ilvl w:val="0"/>
+          <w:numId w:val="3"/>
+        </w:numPr>
+        <w:rPr>
+          <w:rFonts w:ascii="Century Gothic" w:hAnsi="Century Gothic" w:cs="Courier New"/>
+          <w:sz w:val="22"/>
+          <w:szCs w:val="22"/>
+        </w:rPr>
+      </w:pPr>
+      <w:r>
+        <w:rPr>
+          <w:rFonts w:ascii="Century Gothic" w:hAnsi="Century Gothic" w:cs="Courier New"/>
+          <w:sz w:val="22"/>
+          <w:szCs w:val="22"/>
+        </w:rPr>
+        <w:t>/api/lastannunci</w:t>
+      </w:r>
+    </w:p>
+    <w:p>
+      <w:pPr>
+        <w:pStyle w:val="Testonormale"/>
+        <w:numPr>
+          <w:ilvl w:val="0"/>
+          <w:numId w:val="3"/>
+        </w:numPr>
+        <w:rPr>
+          <w:rFonts w:ascii="Century Gothic" w:hAnsi="Century Gothic" w:cs="Courier New"/>
+          <w:sz w:val="22"/>
+          <w:szCs w:val="22"/>
+        </w:rPr>
+      </w:pPr>
+      <w:r>
+        <w:rPr>
+          <w:rFonts w:ascii="Century Gothic" w:hAnsi="Century Gothic" w:cs="Courier New"/>
+          <w:sz w:val="22"/>
+          <w:szCs w:val="22"/>
+        </w:rPr>
+        <w:t>/api/annunci/:id</w:t>
+      </w:r>
+    </w:p>
+    <w:p>
+      <w:pPr>
+        <w:pStyle w:val="Testonormale"/>
+        <w:numPr>
+          <w:ilvl w:val="0"/>
+          <w:numId w:val="3"/>
+        </w:numPr>
+        <w:rPr>
+          <w:rFonts w:ascii="Century Gothic" w:hAnsi="Century Gothic" w:cs="Courier New"/>
+          <w:sz w:val="22"/>
+          <w:szCs w:val="22"/>
+        </w:rPr>
+      </w:pPr>
+      <w:r>
+        <w:rPr>
+          <w:rFonts w:ascii="Century Gothic" w:hAnsi="Century Gothic" w:cs="Courier New"/>
+          <w:sz w:val="22"/>
+          <w:szCs w:val="22"/>
+        </w:rPr>
+        <w:t>/api/annuncinoattivi</w:t>
+      </w:r>
+    </w:p>
+    <w:p>
+      <w:pPr>
+        <w:pStyle w:val="Testonormale"/>
+        <w:numPr>
+          <w:ilvl w:val="0"/>
+          <w:numId w:val="3"/>
+        </w:numPr>
+        <w:rPr>
+          <w:rFonts w:ascii="Century Gothic" w:hAnsi="Century Gothic" w:cs="Courier New"/>
+          <w:sz w:val="22"/>
+          <w:szCs w:val="22"/>
+        </w:rPr>
+      </w:pPr>
+      <w:r>
+        <w:rPr>
+          <w:rFonts w:ascii="Century Gothic" w:hAnsi="Century Gothic" w:cs="Courier New"/>
+          <w:sz w:val="22"/>
+          <w:szCs w:val="22"/>
+        </w:rPr>
+        <w:t>/api/annunci/prezzo/:prezzomax</w:t>
+      </w:r>
+    </w:p>
+    <w:p>
+      <w:pPr>
+        <w:pStyle w:val="Testonormale"/>
+        <w:numPr>
+          <w:ilvl w:val="0"/>
+          <w:numId w:val="3"/>
+        </w:numPr>
+        <w:rPr>
+          <w:rFonts w:ascii="Century Gothic" w:hAnsi="Century Gothic" w:cs="Courier New"/>
+          <w:sz w:val="22"/>
+          <w:szCs w:val="22"/>
+        </w:rPr>
+      </w:pPr>
+      <w:r>
+        <w:rPr>
+          <w:rFonts w:ascii="Century Gothic" w:hAnsi="Century Gothic" w:cs="Courier New"/>
+          <w:sz w:val="22"/>
+          <w:szCs w:val="22"/>
+        </w:rPr>
+        <w:t>/api/annunci/tipo/:tipo/:prezzomax</w:t>
+      </w:r>
+    </w:p>
+    <w:p>
+      <w:pPr>
+        <w:pStyle w:val="Testonormale"/>
+        <w:numPr>
+          <w:ilvl w:val="0"/>
+          <w:numId w:val="3"/>
+        </w:numPr>
+        <w:rPr>
+          <w:rFonts w:ascii="Century Gothic" w:hAnsi="Century Gothic" w:cs="Courier New"/>
+          <w:sz w:val="22"/>
+          <w:szCs w:val="22"/>
+        </w:rPr>
+      </w:pPr>
+      <w:r>
+        <w:rPr>
+          <w:rFonts w:ascii="Century Gothic" w:hAnsi="Century Gothic" w:cs="Courier New"/>
+          <w:sz w:val="22"/>
+          <w:szCs w:val="22"/>
+        </w:rPr>
+        <w:t>/api/annunci/quartiere/:id/:prezzomax</w:t>
+      </w:r>
+    </w:p>
+    <w:p>
+      <w:pPr>
+        <w:pStyle w:val="Testonormale"/>
+        <w:numPr>
+          <w:ilvl w:val="0"/>
+          <w:numId w:val="3"/>
+        </w:numPr>
+        <w:rPr>
+          <w:rFonts w:ascii="Century Gothic" w:hAnsi="Century Gothic" w:cs="Courier New"/>
+          <w:sz w:val="22"/>
+          <w:szCs w:val="22"/>
+        </w:rPr>
+      </w:pPr>
+      <w:r>
+        <w:rPr>
+          <w:rFonts w:ascii="Century Gothic" w:hAnsi="Century Gothic" w:cs="Courier New"/>
+          <w:sz w:val="22"/>
+          <w:szCs w:val="22"/>
+        </w:rPr>
+        <w:t>/api/annunci/filter/:tipo/:quartiere/:prezzomax</w:t>
+      </w:r>
+    </w:p>
+    <w:p>
+      <w:pPr>
+        <w:pStyle w:val="Testonormale"/>
+        <w:numPr>
+          <w:ilvl w:val="0"/>
+          <w:numId w:val="3"/>
+        </w:numPr>
+        <w:rPr>
+          <w:rFonts w:ascii="Century Gothic" w:hAnsi="Century Gothic" w:cs="Courier New"/>
+          <w:sz w:val="22"/>
+          <w:szCs w:val="22"/>
+        </w:rPr>
+      </w:pPr>
+      <w:r>
+        <w:rPr>
+          <w:rFonts w:ascii="Century Gothic" w:hAnsi="Century Gothic" w:cs="Courier New"/>
+          <w:sz w:val="22"/>
+          <w:szCs w:val="22"/>
+        </w:rPr>
+        <w:t>/api/annunci/utente/:mail</w:t>
+      </w:r>
+    </w:p>
+    <w:p>
+      <w:pPr>
+        <w:pStyle w:val="Testonormale"/>
+        <w:numPr>
+          <w:ilvl w:val="0"/>
+          <w:numId w:val="3"/>
+        </w:numPr>
+        <w:rPr>
+          <w:rFonts w:ascii="Century Gothic" w:hAnsi="Century Gothic" w:cs="Courier New"/>
+          <w:sz w:val="22"/>
+          <w:szCs w:val="22"/>
+        </w:rPr>
+      </w:pPr>
+      <w:r>
+        <w:rPr>
+          <w:rFonts w:ascii="Century Gothic" w:hAnsi="Century Gothic" w:cs="Courier New"/>
+          <w:sz w:val="22"/>
+          <w:szCs w:val="22"/>
+        </w:rPr>
+        <w:t>/api/tipi-annuncio</w:t>
+      </w:r>
+    </w:p>
+    <w:p>
+      <w:pPr>
+        <w:pStyle w:val="Testonormale"/>
+        <w:numPr>
+          <w:ilvl w:val="0"/>
+          <w:numId w:val="3"/>
+        </w:numPr>
+        <w:rPr>
+          <w:rFonts w:ascii="Century Gothic" w:hAnsi="Century Gothic" w:cs="Courier New"/>
+          <w:sz w:val="22"/>
+          <w:szCs w:val="22"/>
+        </w:rPr>
+      </w:pPr>
+      <w:r>
+        <w:rPr>
+          <w:rFonts w:ascii="Century Gothic" w:hAnsi="Century Gothic" w:cs="Courier New"/>
+          <w:sz w:val="22"/>
+          <w:szCs w:val="22"/>
+        </w:rPr>
+        <w:t>/api/servizi</w:t>
+      </w:r>
+    </w:p>
+    <w:p>
+      <w:pPr>
+        <w:pStyle w:val="Testonormale"/>
+        <w:numPr>
+          <w:ilvl w:val="0"/>
+          <w:numId w:val="3"/>
+        </w:numPr>
+        <w:rPr>
+          <w:rFonts w:ascii="Century Gothic" w:hAnsi="Century Gothic" w:cs="Courier New"/>
+          <w:sz w:val="22"/>
+          <w:szCs w:val="22"/>
+        </w:rPr>
+      </w:pPr>
+      <w:r>
+        <w:rPr>
+          <w:rFonts w:ascii="Century Gothic" w:hAnsi="Century Gothic" w:cs="Courier New"/>
+          <w:sz w:val="22"/>
+          <w:szCs w:val="22"/>
+        </w:rPr>
+        <w:t>/api/quartieri</w:t>
+      </w:r>
+    </w:p>
+    <w:p>
+      <w:pPr>
+        <w:pStyle w:val="Testonormale"/>
+        <w:numPr>
+          <w:ilvl w:val="0"/>
+          <w:numId w:val="3"/>
+        </w:numPr>
+        <w:rPr>
+          <w:rFonts w:ascii="Century Gothic" w:hAnsi="Century Gothic" w:cs="Courier New"/>
+          <w:sz w:val="22"/>
+          <w:szCs w:val="22"/>
+        </w:rPr>
+      </w:pPr>
+      <w:r>
+        <w:rPr>
+          <w:rFonts w:ascii="Century Gothic" w:hAnsi="Century Gothic" w:cs="Courier New"/>
+          <w:sz w:val="22"/>
+          <w:szCs w:val="22"/>
+        </w:rPr>
+        <w:t>/api/preferiti</w:t>
+      </w:r>
+    </w:p>
+    <w:p>
+      <w:pPr>
+        <w:pStyle w:val="Testonormale"/>
+        <w:rPr>
+          <w:rFonts w:ascii="Century Gothic" w:hAnsi="Century Gothic" w:cs="Courier New"/>
+        </w:rPr>
+      </w:pPr>
+    </w:p>
+    <w:p>
+      <w:pPr>
+        <w:pStyle w:val="Testonormale"/>
+        <w:spacing w:after="240"/>
+        <w:rPr>
+          <w:rFonts w:ascii="Century Gothic" w:hAnsi="Century Gothic" w:cs="Courier New"/>
+          <w:b/>
+          <w:sz w:val="22"/>
+          <w:szCs w:val="22"/>
+          <w:u w:val="single"/>
+        </w:rPr>
+      </w:pPr>
+      <w:r>
+        <w:rPr>
+          <w:rFonts w:ascii="Century Gothic" w:hAnsi="Century Gothic" w:cs="Courier New"/>
+          <w:b/>
+          <w:sz w:val="22"/>
+          <w:szCs w:val="22"/>
+          <w:u w:val="single"/>
+        </w:rPr>
+        <w:t>POST</w:t>
+      </w:r>
+    </w:p>
+    <w:p>
+      <w:pPr>
+        <w:pStyle w:val="Testonormale"/>
+        <w:numPr>
+          <w:ilvl w:val="0"/>
+          <w:numId w:val="3"/>
+        </w:numPr>
+        <w:rPr>
+          <w:rFonts w:ascii="Century Gothic" w:hAnsi="Century Gothic" w:cs="Courier New"/>
+          <w:sz w:val="22"/>
+          <w:szCs w:val="22"/>
+        </w:rPr>
+      </w:pPr>
+      <w:r>
+        <w:rPr>
+          <w:rFonts w:ascii="Century Gothic" w:hAnsi="Century Gothic" w:cs="Courier New"/>
+          <w:sz w:val="22"/>
+          <w:szCs w:val="22"/>
+        </w:rPr>
+        <w:t>/api/auth/register</w:t>
+      </w:r>
+    </w:p>
+    <w:p>
+      <w:pPr>
+        <w:pStyle w:val="Testonormale"/>
+        <w:numPr>
+          <w:ilvl w:val="0"/>
+          <w:numId w:val="3"/>
+        </w:numPr>
+        <w:rPr>
+          <w:rFonts w:ascii="Century Gothic" w:hAnsi="Century Gothic" w:cs="Courier New"/>
+          <w:sz w:val="22"/>
+          <w:szCs w:val="22"/>
+        </w:rPr>
+      </w:pPr>
+      <w:r>
+        <w:rPr>
+          <w:rFonts w:ascii="Century Gothic" w:hAnsi="Century Gothic" w:cs="Courier New"/>
+          <w:sz w:val="22"/>
+          <w:szCs w:val="22"/>
+        </w:rPr>
+        <w:t>/api/auth/login</w:t>
+      </w:r>
+    </w:p>
+    <w:p>
+      <w:pPr>
+        <w:pStyle w:val="Testonormale"/>
+        <w:numPr>
+          <w:ilvl w:val="0"/>
+          <w:numId w:val="3"/>
+        </w:numPr>
+        <w:rPr>
+          <w:rFonts w:ascii="Century Gothic" w:hAnsi="Century Gothic" w:cs="Courier New"/>
+          <w:sz w:val="22"/>
+          <w:szCs w:val="22"/>
+        </w:rPr>
+      </w:pPr>
+      <w:r>
+        <w:rPr>
+          <w:rFonts w:ascii="Century Gothic" w:hAnsi="Century Gothic" w:cs="Courier New"/>
+          <w:sz w:val="22"/>
+          <w:szCs w:val="22"/>
+        </w:rPr>
+        <w:t>/api/auth/logout</w:t>
+      </w:r>
+    </w:p>
+    <w:p>
+      <w:pPr>
+        <w:pStyle w:val="Testonormale"/>
+        <w:numPr>
+          <w:ilvl w:val="0"/>
+          <w:numId w:val="3"/>
+        </w:numPr>
+        <w:rPr>
+          <w:rFonts w:ascii="Century Gothic" w:hAnsi="Century Gothic" w:cs="Courier New"/>
+          <w:sz w:val="22"/>
+          <w:szCs w:val="22"/>
+        </w:rPr>
+      </w:pPr>
+      <w:r>
+        <w:rPr>
+          <w:rFonts w:ascii="Century Gothic" w:hAnsi="Century Gothic" w:cs="Courier New"/>
+          <w:sz w:val="22"/>
+          <w:szCs w:val="22"/>
+        </w:rPr>
+        <w:t>/api/preferiti</w:t>
+      </w:r>
+    </w:p>
+    <w:p>
+      <w:pPr>
+        <w:pStyle w:val="Testonormale"/>
+        <w:numPr>
+          <w:ilvl w:val="0"/>
+          <w:numId w:val="3"/>
+        </w:numPr>
+        <w:rPr>
+          <w:rFonts w:ascii="Century Gothic" w:hAnsi="Century Gothic" w:cs="Courier New"/>
+          <w:sz w:val="22"/>
+          <w:szCs w:val="22"/>
+        </w:rPr>
+      </w:pPr>
+      <w:r>
+        <w:rPr>
+          <w:rFonts w:ascii="Century Gothic" w:hAnsi="Century Gothic" w:cs="Courier New"/>
+          <w:sz w:val="22"/>
+          <w:szCs w:val="22"/>
+        </w:rPr>
+        <w:t>/api/annunci/create</w:t>
+      </w:r>
+    </w:p>
+    <w:p>
+      <w:pPr>
+        <w:pStyle w:val="Testonormale"/>
+        <w:numPr>
+          <w:ilvl w:val="0"/>
+          <w:numId w:val="3"/>
+        </w:numPr>
+        <w:rPr>
+          <w:rFonts w:ascii="Century Gothic" w:hAnsi="Century Gothic" w:cs="Courier New"/>
+          <w:sz w:val="22"/>
+          <w:szCs w:val="22"/>
+        </w:rPr>
+      </w:pPr>
+      <w:r>
+        <w:rPr>
+          <w:rFonts w:ascii="Century Gothic" w:hAnsi="Century Gothic" w:cs="Courier New"/>
+          <w:sz w:val="22"/>
+          <w:szCs w:val="22"/>
+        </w:rPr>
+        <w:t>/api/annunci/update/:id</w:t>
+      </w:r>
+    </w:p>
+    <w:p>
+      <w:pPr>
+        <w:pStyle w:val="Testonormale"/>
+        <w:numPr>
+          <w:ilvl w:val="0"/>
+          <w:numId w:val="3"/>
+        </w:numPr>
+        <w:rPr>
+          <w:rFonts w:ascii="Century Gothic" w:hAnsi="Century Gothic" w:cs="Courier New"/>
+          <w:sz w:val="22"/>
+          <w:szCs w:val="22"/>
+        </w:rPr>
+      </w:pPr>
+      <w:r>
+        <w:rPr>
+          <w:rFonts w:ascii="Century Gothic" w:hAnsi="Century Gothic" w:cs="Courier New"/>
+          <w:sz w:val="22"/>
+          <w:szCs w:val="22"/>
+        </w:rPr>
+        <w:t>/api/annunci/modifica/:id</w:t>
+      </w:r>
+    </w:p>
+    <w:p>
+      <w:pPr>
+        <w:pStyle w:val="Testonormale"/>
+        <w:rPr>
+          <w:rFonts w:ascii="Century Gothic" w:hAnsi="Century Gothic" w:cs="Courier New"/>
+        </w:rPr>
+      </w:pPr>
+    </w:p>
+    <w:p>
+      <w:pPr>
+        <w:pStyle w:val="Testonormale"/>
+        <w:spacing w:after="240"/>
+        <w:rPr>
+          <w:rFonts w:ascii="Century Gothic" w:hAnsi="Century Gothic" w:cs="Courier New"/>
+          <w:b/>
+          <w:sz w:val="22"/>
+          <w:szCs w:val="22"/>
+          <w:u w:val="single"/>
+        </w:rPr>
+      </w:pPr>
+      <w:r>
+        <w:rPr>
+          <w:rFonts w:ascii="Century Gothic" w:hAnsi="Century Gothic" w:cs="Courier New"/>
+          <w:b/>
+          <w:sz w:val="22"/>
+          <w:szCs w:val="22"/>
+          <w:u w:val="single"/>
+        </w:rPr>
+        <w:t>DELETE</w:t>
+      </w:r>
+    </w:p>
+    <w:p>
+      <w:pPr>
+        <w:pStyle w:val="Testonormale"/>
+        <w:numPr>
+          <w:ilvl w:val="0"/>
+          <w:numId w:val="3"/>
+        </w:numPr>
+        <w:rPr>
+          <w:rFonts w:ascii="Century Gothic" w:hAnsi="Century Gothic" w:cs="Courier New"/>
+          <w:sz w:val="22"/>
+          <w:szCs w:val="22"/>
+        </w:rPr>
+      </w:pPr>
+      <w:r>
+        <w:rPr>
+          <w:rFonts w:ascii="Century Gothic" w:hAnsi="Century Gothic" w:cs="Courier New"/>
+          <w:sz w:val="22"/>
+          <w:szCs w:val="22"/>
+        </w:rPr>
+        <w:t>/api/preferiti/:annuncio_id</w:t>
+      </w:r>
+    </w:p>
+    <w:p>
+      <w:pPr>
+        <w:pStyle w:val="Testonormale"/>
+        <w:numPr>
+          <w:ilvl w:val="0"/>
+          <w:numId w:val="3"/>
+        </w:numPr>
+        <w:rPr>
+          <w:rFonts w:ascii="Century Gothic" w:hAnsi="Century Gothic" w:cs="Courier New"/>
+          <w:sz w:val="22"/>
+          <w:szCs w:val="22"/>
+        </w:rPr>
+      </w:pPr>
+      <w:r>
+        <w:rPr>
+          <w:rFonts w:ascii="Century Gothic" w:hAnsi="Century Gothic" w:cs="Courier New"/>
+          <w:sz w:val="22"/>
+          <w:szCs w:val="22"/>
+        </w:rPr>
+        <w:t>/api/annunci/delete/:id</w:t>
+      </w:r>
+    </w:p>
+    <w:p>
+      <w:pPr>
+        <w:pStyle w:val="Testonormale"/>
+        <w:rPr>
+          <w:rFonts w:ascii="Century Gothic" w:hAnsi="Century Gothic" w:cs="Courier New"/>
+        </w:rPr>
+      </w:pPr>
+    </w:p>
+    <w:p>
+      <w:pPr>
+        <w:pStyle w:val="Testonormale"/>
+        <w:spacing w:after="240"/>
         <w:rPr>
           <w:rFonts w:ascii="Century Gothic" w:hAnsi="Century Gothic" w:cs="Courier New"/>
           <w:b/>
           <w:sz w:val="28"/>
           <w:szCs w:val="28"/>
         </w:rPr>
-        <w:t>API endpoint</w:t>
-      </w:r>
-    </w:p>
-    <w:p>
-      <w:pPr>
-        <w:pStyle w:val="Testonormale"/>
-        <w:rPr>
-          <w:rFonts w:ascii="Century Gothic" w:hAnsi="Century Gothic" w:cs="Courier New"/>
-        </w:rPr>
-      </w:pPr>
-    </w:p>
-    <w:p>
-      <w:pPr>
-        <w:pStyle w:val="Testonormale"/>
-        <w:spacing w:after="240"/>
-        <w:rPr>
-          <w:rFonts w:ascii="Century Gothic" w:hAnsi="Century Gothic" w:cs="Courier New"/>
-          <w:b/>
-          <w:sz w:val="22"/>
-          <w:szCs w:val="22"/>
-          <w:u w:val="single"/>
-        </w:rPr>
-      </w:pPr>
-      <w:r>
-        <w:rPr>
-          <w:rFonts w:ascii="Century Gothic" w:hAnsi="Century Gothic" w:cs="Courier New"/>
-          <w:b/>
-          <w:sz w:val="22"/>
-          <w:szCs w:val="22"/>
-          <w:u w:val="single"/>
-        </w:rPr>
-        <w:t>GET</w:t>
-      </w:r>
-    </w:p>
-    <w:p>
-      <w:pPr>
-        <w:pStyle w:val="Testonormale"/>
-        <w:numPr>
-          <w:ilvl w:val="0"/>
-          <w:numId w:val="3"/>
-        </w:numPr>
-        <w:rPr>
-          <w:rFonts w:ascii="Century Gothic" w:hAnsi="Century Gothic" w:cs="Courier New"/>
-          <w:sz w:val="22"/>
-          <w:szCs w:val="22"/>
-        </w:rPr>
-      </w:pPr>
-      <w:r>
-        <w:rPr>
-          <w:rFonts w:ascii="Century Gothic" w:hAnsi="Century Gothic" w:cs="Courier New"/>
-          <w:sz w:val="22"/>
-          <w:szCs w:val="22"/>
-        </w:rPr>
-        <w:t>/api/news</w:t>
-      </w:r>
-    </w:p>
-    <w:p>
-      <w:pPr>
-        <w:pStyle w:val="Testonormale"/>
-        <w:numPr>
-          <w:ilvl w:val="0"/>
-          <w:numId w:val="3"/>
-        </w:numPr>
-        <w:rPr>
-          <w:rFonts w:ascii="Century Gothic" w:hAnsi="Century Gothic" w:cs="Courier New"/>
-          <w:sz w:val="22"/>
-          <w:szCs w:val="22"/>
-        </w:rPr>
-      </w:pPr>
-      <w:r>
-        <w:rPr>
-          <w:rFonts w:ascii="Century Gothic" w:hAnsi="Century Gothic" w:cs="Courier New"/>
-          <w:sz w:val="22"/>
-          <w:szCs w:val="22"/>
-        </w:rPr>
-        <w:t>/api/news/:id</w:t>
-      </w:r>
-    </w:p>
-    <w:p>
-      <w:pPr>
-        <w:pStyle w:val="Testonormale"/>
-        <w:numPr>
-          <w:ilvl w:val="0"/>
-          <w:numId w:val="3"/>
-        </w:numPr>
-        <w:rPr>
-          <w:rFonts w:ascii="Century Gothic" w:hAnsi="Century Gothic" w:cs="Courier New"/>
-          <w:sz w:val="22"/>
-          <w:szCs w:val="22"/>
-        </w:rPr>
-      </w:pPr>
-      <w:r>
-        <w:rPr>
-          <w:rFonts w:ascii="Century Gothic" w:hAnsi="Century Gothic" w:cs="Courier New"/>
-          <w:sz w:val="22"/>
-          <w:szCs w:val="22"/>
-        </w:rPr>
-        <w:t>/api/</w:t>
-      </w:r>
-      <w:proofErr w:type="spellStart"/>
-      <w:r>
-        <w:rPr>
-          <w:rFonts w:ascii="Century Gothic" w:hAnsi="Century Gothic" w:cs="Courier New"/>
-          <w:sz w:val="22"/>
-          <w:szCs w:val="22"/>
-        </w:rPr>
-        <w:t>auth</w:t>
-      </w:r>
-      <w:proofErr w:type="spellEnd"/>
-      <w:r>
-        <w:rPr>
-          <w:rFonts w:ascii="Century Gothic" w:hAnsi="Century Gothic" w:cs="Courier New"/>
-          <w:sz w:val="22"/>
-          <w:szCs w:val="22"/>
-        </w:rPr>
-        <w:t>/</w:t>
-      </w:r>
-      <w:proofErr w:type="spellStart"/>
-      <w:r>
-        <w:rPr>
-          <w:rFonts w:ascii="Century Gothic" w:hAnsi="Century Gothic" w:cs="Courier New"/>
-          <w:sz w:val="22"/>
-          <w:szCs w:val="22"/>
-        </w:rPr>
-        <w:t>profile</w:t>
-      </w:r>
-      <w:proofErr w:type="spellEnd"/>
-    </w:p>
-    <w:p>
-      <w:pPr>
-        <w:pStyle w:val="Testonormale"/>
-        <w:numPr>
-          <w:ilvl w:val="0"/>
-          <w:numId w:val="3"/>
-        </w:numPr>
-        <w:rPr>
-          <w:rFonts w:ascii="Century Gothic" w:hAnsi="Century Gothic" w:cs="Courier New"/>
-          <w:sz w:val="22"/>
-          <w:szCs w:val="22"/>
-        </w:rPr>
-      </w:pPr>
-      <w:r>
-        <w:rPr>
-          <w:rFonts w:ascii="Century Gothic" w:hAnsi="Century Gothic" w:cs="Courier New"/>
-          <w:sz w:val="22"/>
-          <w:szCs w:val="22"/>
-        </w:rPr>
-        <w:t>/api/annunci</w:t>
-      </w:r>
-    </w:p>
-    <w:p>
-      <w:pPr>
-        <w:pStyle w:val="Testonormale"/>
-        <w:numPr>
-          <w:ilvl w:val="0"/>
-          <w:numId w:val="3"/>
-        </w:numPr>
-        <w:rPr>
-          <w:rFonts w:ascii="Century Gothic" w:hAnsi="Century Gothic" w:cs="Courier New"/>
-          <w:sz w:val="22"/>
-          <w:szCs w:val="22"/>
-        </w:rPr>
-      </w:pPr>
-      <w:r>
-        <w:rPr>
-          <w:rFonts w:ascii="Century Gothic" w:hAnsi="Century Gothic" w:cs="Courier New"/>
-          <w:sz w:val="22"/>
-          <w:szCs w:val="22"/>
-        </w:rPr>
-        <w:t>/api/</w:t>
-      </w:r>
-      <w:proofErr w:type="spellStart"/>
-      <w:r>
-        <w:rPr>
-          <w:rFonts w:ascii="Century Gothic" w:hAnsi="Century Gothic" w:cs="Courier New"/>
-          <w:sz w:val="22"/>
-          <w:szCs w:val="22"/>
-        </w:rPr>
-        <w:t>lastannunci</w:t>
-      </w:r>
-      <w:proofErr w:type="spellEnd"/>
-    </w:p>
-    <w:p>
-      <w:pPr>
-        <w:pStyle w:val="Testonormale"/>
-        <w:numPr>
-          <w:ilvl w:val="0"/>
-          <w:numId w:val="3"/>
-        </w:numPr>
-        <w:rPr>
-          <w:rFonts w:ascii="Century Gothic" w:hAnsi="Century Gothic" w:cs="Courier New"/>
-          <w:sz w:val="22"/>
-          <w:szCs w:val="22"/>
-        </w:rPr>
-      </w:pPr>
-      <w:r>
-        <w:rPr>
-          <w:rFonts w:ascii="Century Gothic" w:hAnsi="Century Gothic" w:cs="Courier New"/>
-          <w:sz w:val="22"/>
-          <w:szCs w:val="22"/>
-        </w:rPr>
-        <w:t>/api/annunci/:id</w:t>
-      </w:r>
-    </w:p>
-    <w:p>
-      <w:pPr>
-        <w:pStyle w:val="Testonormale"/>
-        <w:numPr>
-          <w:ilvl w:val="0"/>
-          <w:numId w:val="3"/>
-        </w:numPr>
-        <w:rPr>
-          <w:rFonts w:ascii="Century Gothic" w:hAnsi="Century Gothic" w:cs="Courier New"/>
-          <w:sz w:val="22"/>
-          <w:szCs w:val="22"/>
-        </w:rPr>
-      </w:pPr>
-      <w:r>
-        <w:rPr>
-          <w:rFonts w:ascii="Century Gothic" w:hAnsi="Century Gothic" w:cs="Courier New"/>
-          <w:sz w:val="22"/>
-          <w:szCs w:val="22"/>
-        </w:rPr>
-        <w:t>/api/</w:t>
-      </w:r>
-      <w:proofErr w:type="spellStart"/>
-      <w:r>
-        <w:rPr>
-          <w:rFonts w:ascii="Century Gothic" w:hAnsi="Century Gothic" w:cs="Courier New"/>
-          <w:sz w:val="22"/>
-          <w:szCs w:val="22"/>
-        </w:rPr>
-        <w:t>annuncinoattivi</w:t>
-      </w:r>
-      <w:proofErr w:type="spellEnd"/>
-    </w:p>
-    <w:p>
-      <w:pPr>
-        <w:pStyle w:val="Testonormale"/>
-        <w:numPr>
-          <w:ilvl w:val="0"/>
-          <w:numId w:val="3"/>
-        </w:numPr>
-        <w:rPr>
-          <w:rFonts w:ascii="Century Gothic" w:hAnsi="Century Gothic" w:cs="Courier New"/>
-          <w:sz w:val="22"/>
-          <w:szCs w:val="22"/>
-        </w:rPr>
-      </w:pPr>
-      <w:r>
-        <w:rPr>
-          <w:rFonts w:ascii="Century Gothic" w:hAnsi="Century Gothic" w:cs="Courier New"/>
-          <w:sz w:val="22"/>
-          <w:szCs w:val="22"/>
-        </w:rPr>
-        <w:t>/api/annunci/prezzo/:</w:t>
-      </w:r>
-      <w:proofErr w:type="spellStart"/>
-      <w:r>
-        <w:rPr>
-          <w:rFonts w:ascii="Century Gothic" w:hAnsi="Century Gothic" w:cs="Courier New"/>
-          <w:sz w:val="22"/>
-          <w:szCs w:val="22"/>
-        </w:rPr>
-        <w:t>prezzomax</w:t>
-      </w:r>
-      <w:proofErr w:type="spellEnd"/>
-    </w:p>
-    <w:p>
-      <w:pPr>
-        <w:pStyle w:val="Testonormale"/>
-        <w:numPr>
-          <w:ilvl w:val="0"/>
-          <w:numId w:val="3"/>
-        </w:numPr>
-        <w:rPr>
-          <w:rFonts w:ascii="Century Gothic" w:hAnsi="Century Gothic" w:cs="Courier New"/>
-          <w:sz w:val="22"/>
-          <w:szCs w:val="22"/>
-        </w:rPr>
-      </w:pPr>
-      <w:r>
-        <w:rPr>
-          <w:rFonts w:ascii="Century Gothic" w:hAnsi="Century Gothic" w:cs="Courier New"/>
-          <w:sz w:val="22"/>
-          <w:szCs w:val="22"/>
-        </w:rPr>
-        <w:t>/api/annunci/tipo/:tipo/:</w:t>
-      </w:r>
-      <w:proofErr w:type="spellStart"/>
-      <w:r>
-        <w:rPr>
-          <w:rFonts w:ascii="Century Gothic" w:hAnsi="Century Gothic" w:cs="Courier New"/>
-          <w:sz w:val="22"/>
-          <w:szCs w:val="22"/>
-        </w:rPr>
-        <w:t>prezzomax</w:t>
-      </w:r>
-      <w:proofErr w:type="spellEnd"/>
-    </w:p>
-    <w:p>
-      <w:pPr>
-        <w:pStyle w:val="Testonormale"/>
-        <w:numPr>
-          <w:ilvl w:val="0"/>
-          <w:numId w:val="3"/>
-        </w:numPr>
-        <w:rPr>
-          <w:rFonts w:ascii="Century Gothic" w:hAnsi="Century Gothic" w:cs="Courier New"/>
-          <w:sz w:val="22"/>
-          <w:szCs w:val="22"/>
-        </w:rPr>
-      </w:pPr>
-      <w:r>
-        <w:rPr>
-          <w:rFonts w:ascii="Century Gothic" w:hAnsi="Century Gothic" w:cs="Courier New"/>
-          <w:sz w:val="22"/>
-          <w:szCs w:val="22"/>
-        </w:rPr>
-        <w:t>/api/annunci/quartiere/:id/:</w:t>
-      </w:r>
-      <w:proofErr w:type="spellStart"/>
-      <w:r>
-        <w:rPr>
-          <w:rFonts w:ascii="Century Gothic" w:hAnsi="Century Gothic" w:cs="Courier New"/>
-          <w:sz w:val="22"/>
-          <w:szCs w:val="22"/>
-        </w:rPr>
-        <w:t>prezzomax</w:t>
-      </w:r>
-      <w:proofErr w:type="spellEnd"/>
-    </w:p>
-    <w:p>
-      <w:pPr>
-        <w:pStyle w:val="Testonormale"/>
-        <w:numPr>
-          <w:ilvl w:val="0"/>
-          <w:numId w:val="3"/>
-        </w:numPr>
-        <w:rPr>
-          <w:rFonts w:ascii="Century Gothic" w:hAnsi="Century Gothic" w:cs="Courier New"/>
-          <w:sz w:val="22"/>
-          <w:szCs w:val="22"/>
-        </w:rPr>
-      </w:pPr>
-      <w:r>
-        <w:rPr>
-          <w:rFonts w:ascii="Century Gothic" w:hAnsi="Century Gothic" w:cs="Courier New"/>
-          <w:sz w:val="22"/>
-          <w:szCs w:val="22"/>
-        </w:rPr>
-        <w:t>/api/annunci/filter/:tipo/:quartiere/:</w:t>
-      </w:r>
-      <w:proofErr w:type="spellStart"/>
-      <w:r>
-        <w:rPr>
-          <w:rFonts w:ascii="Century Gothic" w:hAnsi="Century Gothic" w:cs="Courier New"/>
-          <w:sz w:val="22"/>
-          <w:szCs w:val="22"/>
-        </w:rPr>
-        <w:t>prezzomax</w:t>
-      </w:r>
-      <w:proofErr w:type="spellEnd"/>
-    </w:p>
-    <w:p>
-      <w:pPr>
-        <w:pStyle w:val="Testonormale"/>
-        <w:numPr>
-          <w:ilvl w:val="0"/>
-          <w:numId w:val="3"/>
-        </w:numPr>
-        <w:rPr>
-          <w:rFonts w:ascii="Century Gothic" w:hAnsi="Century Gothic" w:cs="Courier New"/>
-          <w:sz w:val="22"/>
-          <w:szCs w:val="22"/>
-        </w:rPr>
-      </w:pPr>
-      <w:r>
-        <w:rPr>
-          <w:rFonts w:ascii="Century Gothic" w:hAnsi="Century Gothic" w:cs="Courier New"/>
-          <w:sz w:val="22"/>
-          <w:szCs w:val="22"/>
-        </w:rPr>
-        <w:t>/api/annunci/utente/:mail</w:t>
-      </w:r>
-    </w:p>
-    <w:p>
-      <w:pPr>
-        <w:pStyle w:val="Testonormale"/>
-        <w:numPr>
-          <w:ilvl w:val="0"/>
-          <w:numId w:val="3"/>
-        </w:numPr>
-        <w:rPr>
-          <w:rFonts w:ascii="Century Gothic" w:hAnsi="Century Gothic" w:cs="Courier New"/>
-          <w:sz w:val="22"/>
-          <w:szCs w:val="22"/>
-        </w:rPr>
-      </w:pPr>
-      <w:r>
-        <w:rPr>
-          <w:rFonts w:ascii="Century Gothic" w:hAnsi="Century Gothic" w:cs="Courier New"/>
-          <w:sz w:val="22"/>
-          <w:szCs w:val="22"/>
-        </w:rPr>
-        <w:t>/api/tipi-annuncio</w:t>
-      </w:r>
-    </w:p>
-    <w:p>
-      <w:pPr>
-        <w:pStyle w:val="Testonormale"/>
-        <w:numPr>
-          <w:ilvl w:val="0"/>
-          <w:numId w:val="3"/>
-        </w:numPr>
-        <w:rPr>
-          <w:rFonts w:ascii="Century Gothic" w:hAnsi="Century Gothic" w:cs="Courier New"/>
-          <w:sz w:val="22"/>
-          <w:szCs w:val="22"/>
-        </w:rPr>
-      </w:pPr>
-      <w:r>
-        <w:rPr>
-          <w:rFonts w:ascii="Century Gothic" w:hAnsi="Century Gothic" w:cs="Courier New"/>
-          <w:sz w:val="22"/>
-          <w:szCs w:val="22"/>
-        </w:rPr>
-        <w:t>/api/servizi</w:t>
-      </w:r>
-    </w:p>
-    <w:p>
-      <w:pPr>
-        <w:pStyle w:val="Testonormale"/>
-        <w:numPr>
-          <w:ilvl w:val="0"/>
-          <w:numId w:val="3"/>
-        </w:numPr>
-        <w:rPr>
-          <w:rFonts w:ascii="Century Gothic" w:hAnsi="Century Gothic" w:cs="Courier New"/>
-          <w:sz w:val="22"/>
-          <w:szCs w:val="22"/>
-        </w:rPr>
-      </w:pPr>
-      <w:r>
-        <w:rPr>
-          <w:rFonts w:ascii="Century Gothic" w:hAnsi="Century Gothic" w:cs="Courier New"/>
-          <w:sz w:val="22"/>
-          <w:szCs w:val="22"/>
-        </w:rPr>
-        <w:t>/api/quartieri</w:t>
-      </w:r>
-    </w:p>
-    <w:p>
-      <w:pPr>
-        <w:pStyle w:val="Testonormale"/>
-        <w:numPr>
-          <w:ilvl w:val="0"/>
-          <w:numId w:val="3"/>
-        </w:numPr>
-        <w:rPr>
-          <w:rFonts w:ascii="Century Gothic" w:hAnsi="Century Gothic" w:cs="Courier New"/>
-          <w:sz w:val="22"/>
-          <w:szCs w:val="22"/>
-        </w:rPr>
-      </w:pPr>
-      <w:r>
-        <w:rPr>
-          <w:rFonts w:ascii="Century Gothic" w:hAnsi="Century Gothic" w:cs="Courier New"/>
-          <w:sz w:val="22"/>
-          <w:szCs w:val="22"/>
-        </w:rPr>
-        <w:t>/api/preferiti</w:t>
-      </w:r>
-    </w:p>
-    <w:p>
-      <w:pPr>
-        <w:pStyle w:val="Testonormale"/>
-        <w:rPr>
-          <w:rFonts w:ascii="Century Gothic" w:hAnsi="Century Gothic" w:cs="Courier New"/>
-        </w:rPr>
-      </w:pPr>
-    </w:p>
-    <w:p>
-      <w:pPr>
-        <w:pStyle w:val="Testonormale"/>
-        <w:spacing w:after="240"/>
-        <w:rPr>
-          <w:rFonts w:ascii="Century Gothic" w:hAnsi="Century Gothic" w:cs="Courier New"/>
-          <w:b/>
-          <w:sz w:val="22"/>
-          <w:szCs w:val="22"/>
-          <w:u w:val="single"/>
-        </w:rPr>
-      </w:pPr>
-      <w:r>
-        <w:rPr>
-          <w:rFonts w:ascii="Century Gothic" w:hAnsi="Century Gothic" w:cs="Courier New"/>
-          <w:b/>
-          <w:sz w:val="22"/>
-          <w:szCs w:val="22"/>
-          <w:u w:val="single"/>
-        </w:rPr>
-        <w:t>POST</w:t>
-      </w:r>
-    </w:p>
-    <w:p>
-      <w:pPr>
-        <w:pStyle w:val="Testonormale"/>
-        <w:numPr>
-          <w:ilvl w:val="0"/>
-          <w:numId w:val="3"/>
-        </w:numPr>
-        <w:rPr>
-          <w:rFonts w:ascii="Century Gothic" w:hAnsi="Century Gothic" w:cs="Courier New"/>
-          <w:sz w:val="22"/>
-          <w:szCs w:val="22"/>
-        </w:rPr>
-      </w:pPr>
-      <w:r>
-        <w:rPr>
-          <w:rFonts w:ascii="Century Gothic" w:hAnsi="Century Gothic" w:cs="Courier New"/>
-          <w:sz w:val="22"/>
-          <w:szCs w:val="22"/>
-        </w:rPr>
-        <w:t>/</w:t>
-      </w:r>
-      <w:proofErr w:type="spellStart"/>
-      <w:r>
-        <w:rPr>
-          <w:rFonts w:ascii="Century Gothic" w:hAnsi="Century Gothic" w:cs="Courier New"/>
-          <w:sz w:val="22"/>
-          <w:szCs w:val="22"/>
-        </w:rPr>
-        <w:t>api</w:t>
-      </w:r>
-      <w:proofErr w:type="spellEnd"/>
-      <w:r>
-        <w:rPr>
-          <w:rFonts w:ascii="Century Gothic" w:hAnsi="Century Gothic" w:cs="Courier New"/>
-          <w:sz w:val="22"/>
-          <w:szCs w:val="22"/>
-        </w:rPr>
-        <w:t>/auth/register</w:t>
-      </w:r>
-    </w:p>
-    <w:p>
-      <w:pPr>
-        <w:pStyle w:val="Testonormale"/>
-        <w:numPr>
-          <w:ilvl w:val="0"/>
-          <w:numId w:val="3"/>
-        </w:numPr>
-        <w:rPr>
-          <w:rFonts w:ascii="Century Gothic" w:hAnsi="Century Gothic" w:cs="Courier New"/>
-          <w:sz w:val="22"/>
-          <w:szCs w:val="22"/>
-        </w:rPr>
-      </w:pPr>
-      <w:r>
-        <w:rPr>
-          <w:rFonts w:ascii="Century Gothic" w:hAnsi="Century Gothic" w:cs="Courier New"/>
-          <w:sz w:val="22"/>
-          <w:szCs w:val="22"/>
-        </w:rPr>
-        <w:t>/</w:t>
-      </w:r>
-      <w:proofErr w:type="spellStart"/>
-      <w:r>
-        <w:rPr>
-          <w:rFonts w:ascii="Century Gothic" w:hAnsi="Century Gothic" w:cs="Courier New"/>
-          <w:sz w:val="22"/>
-          <w:szCs w:val="22"/>
-        </w:rPr>
-        <w:t>api</w:t>
-      </w:r>
-      <w:proofErr w:type="spellEnd"/>
-      <w:r>
-        <w:rPr>
-          <w:rFonts w:ascii="Century Gothic" w:hAnsi="Century Gothic" w:cs="Courier New"/>
-          <w:sz w:val="22"/>
-          <w:szCs w:val="22"/>
-        </w:rPr>
-        <w:t>/auth/login</w:t>
-      </w:r>
-    </w:p>
-    <w:p>
-      <w:pPr>
-        <w:pStyle w:val="Testonormale"/>
-        <w:numPr>
-          <w:ilvl w:val="0"/>
-          <w:numId w:val="3"/>
-        </w:numPr>
-        <w:rPr>
-          <w:rFonts w:ascii="Century Gothic" w:hAnsi="Century Gothic" w:cs="Courier New"/>
-          <w:sz w:val="22"/>
-          <w:szCs w:val="22"/>
-        </w:rPr>
-      </w:pPr>
-      <w:r>
-        <w:rPr>
-          <w:rFonts w:ascii="Century Gothic" w:hAnsi="Century Gothic" w:cs="Courier New"/>
-          <w:sz w:val="22"/>
-          <w:szCs w:val="22"/>
-        </w:rPr>
-        <w:t>/api/</w:t>
-      </w:r>
-      <w:proofErr w:type="spellStart"/>
-      <w:r>
-        <w:rPr>
-          <w:rFonts w:ascii="Century Gothic" w:hAnsi="Century Gothic" w:cs="Courier New"/>
-          <w:sz w:val="22"/>
-          <w:szCs w:val="22"/>
-        </w:rPr>
-        <w:t>auth</w:t>
-      </w:r>
-      <w:proofErr w:type="spellEnd"/>
-      <w:r>
-        <w:rPr>
-          <w:rFonts w:ascii="Century Gothic" w:hAnsi="Century Gothic" w:cs="Courier New"/>
-          <w:sz w:val="22"/>
-          <w:szCs w:val="22"/>
-        </w:rPr>
-        <w:t>/logout</w:t>
-      </w:r>
-    </w:p>
-    <w:p>
-      <w:pPr>
-        <w:pStyle w:val="Testonormale"/>
-        <w:numPr>
-          <w:ilvl w:val="0"/>
-          <w:numId w:val="3"/>
-        </w:numPr>
-        <w:rPr>
-          <w:rFonts w:ascii="Century Gothic" w:hAnsi="Century Gothic" w:cs="Courier New"/>
-          <w:sz w:val="22"/>
-          <w:szCs w:val="22"/>
-        </w:rPr>
-      </w:pPr>
-      <w:r>
-        <w:rPr>
-          <w:rFonts w:ascii="Century Gothic" w:hAnsi="Century Gothic" w:cs="Courier New"/>
-          <w:sz w:val="22"/>
-          <w:szCs w:val="22"/>
-        </w:rPr>
-        <w:t>/api/preferiti</w:t>
-      </w:r>
-    </w:p>
-    <w:p>
-      <w:pPr>
-        <w:pStyle w:val="Testonormale"/>
-        <w:numPr>
-          <w:ilvl w:val="0"/>
-          <w:numId w:val="3"/>
-        </w:numPr>
-        <w:rPr>
-          <w:rFonts w:ascii="Century Gothic" w:hAnsi="Century Gothic" w:cs="Courier New"/>
-          <w:sz w:val="22"/>
-          <w:szCs w:val="22"/>
-        </w:rPr>
-      </w:pPr>
-      <w:r>
-        <w:rPr>
-          <w:rFonts w:ascii="Century Gothic" w:hAnsi="Century Gothic" w:cs="Courier New"/>
-          <w:sz w:val="22"/>
-          <w:szCs w:val="22"/>
-        </w:rPr>
-        <w:t>/api/annunci/create</w:t>
-      </w:r>
-    </w:p>
-    <w:p>
-      <w:pPr>
-        <w:pStyle w:val="Testonormale"/>
-        <w:numPr>
-          <w:ilvl w:val="0"/>
-          <w:numId w:val="3"/>
-        </w:numPr>
-        <w:rPr>
-          <w:rFonts w:ascii="Century Gothic" w:hAnsi="Century Gothic" w:cs="Courier New"/>
-          <w:sz w:val="22"/>
-          <w:szCs w:val="22"/>
-        </w:rPr>
-      </w:pPr>
-      <w:r>
-        <w:rPr>
-          <w:rFonts w:ascii="Century Gothic" w:hAnsi="Century Gothic" w:cs="Courier New"/>
-          <w:sz w:val="22"/>
-          <w:szCs w:val="22"/>
-        </w:rPr>
-        <w:t>/api/annunci/update/:id</w:t>
-      </w:r>
-    </w:p>
-    <w:p>
-      <w:pPr>
-        <w:pStyle w:val="Testonormale"/>
-        <w:numPr>
-          <w:ilvl w:val="0"/>
-          <w:numId w:val="3"/>
-        </w:numPr>
-        <w:rPr>
-          <w:rFonts w:ascii="Century Gothic" w:hAnsi="Century Gothic" w:cs="Courier New"/>
-          <w:sz w:val="22"/>
-          <w:szCs w:val="22"/>
-        </w:rPr>
-      </w:pPr>
-      <w:r>
-        <w:rPr>
-          <w:rFonts w:ascii="Century Gothic" w:hAnsi="Century Gothic" w:cs="Courier New"/>
-          <w:sz w:val="22"/>
-          <w:szCs w:val="22"/>
-        </w:rPr>
-        <w:t>/api/annunci/modifica/:id</w:t>
-      </w:r>
-    </w:p>
-    <w:p>
-      <w:pPr>
-        <w:pStyle w:val="Testonormale"/>
-        <w:rPr>
-          <w:rFonts w:ascii="Century Gothic" w:hAnsi="Century Gothic" w:cs="Courier New"/>
-        </w:rPr>
-      </w:pPr>
-    </w:p>
-    <w:p>
-      <w:pPr>
-        <w:pStyle w:val="Testonormale"/>
-        <w:spacing w:after="240"/>
-        <w:rPr>
-          <w:rFonts w:ascii="Century Gothic" w:hAnsi="Century Gothic" w:cs="Courier New"/>
-          <w:b/>
-          <w:sz w:val="22"/>
-          <w:szCs w:val="22"/>
-          <w:u w:val="single"/>
-        </w:rPr>
-      </w:pPr>
-      <w:r>
-        <w:rPr>
-          <w:rFonts w:ascii="Century Gothic" w:hAnsi="Century Gothic" w:cs="Courier New"/>
-          <w:b/>
-          <w:sz w:val="22"/>
-          <w:szCs w:val="22"/>
-          <w:u w:val="single"/>
-        </w:rPr>
-        <w:t>DELETE</w:t>
-      </w:r>
-    </w:p>
-    <w:p>
-      <w:pPr>
-        <w:pStyle w:val="Testonormale"/>
-        <w:numPr>
-          <w:ilvl w:val="0"/>
-          <w:numId w:val="3"/>
-        </w:numPr>
-        <w:rPr>
-          <w:rFonts w:ascii="Century Gothic" w:hAnsi="Century Gothic" w:cs="Courier New"/>
-          <w:sz w:val="22"/>
-          <w:szCs w:val="22"/>
-        </w:rPr>
-      </w:pPr>
-      <w:r>
-        <w:rPr>
-          <w:rFonts w:ascii="Century Gothic" w:hAnsi="Century Gothic" w:cs="Courier New"/>
-          <w:sz w:val="22"/>
-          <w:szCs w:val="22"/>
-        </w:rPr>
-        <w:t>/api/preferiti/:</w:t>
-      </w:r>
-      <w:proofErr w:type="spellStart"/>
-      <w:r>
-        <w:rPr>
-          <w:rFonts w:ascii="Century Gothic" w:hAnsi="Century Gothic" w:cs="Courier New"/>
-          <w:sz w:val="22"/>
-          <w:szCs w:val="22"/>
-        </w:rPr>
-        <w:t>annuncio_id</w:t>
-      </w:r>
-      <w:proofErr w:type="spellEnd"/>
-    </w:p>
-    <w:p>
-      <w:pPr>
-        <w:pStyle w:val="Testonormale"/>
-        <w:numPr>
-          <w:ilvl w:val="0"/>
-          <w:numId w:val="3"/>
-        </w:numPr>
-        <w:rPr>
-          <w:rFonts w:ascii="Century Gothic" w:hAnsi="Century Gothic" w:cs="Courier New"/>
-          <w:sz w:val="22"/>
-          <w:szCs w:val="22"/>
-        </w:rPr>
-      </w:pPr>
-      <w:r>
-        <w:rPr>
-          <w:rFonts w:ascii="Century Gothic" w:hAnsi="Century Gothic" w:cs="Courier New"/>
-          <w:sz w:val="22"/>
-          <w:szCs w:val="22"/>
-        </w:rPr>
-        <w:t>/api/annunci/delete/:id</w:t>
-      </w:r>
-    </w:p>
-    <w:p>
-      <w:pPr>
-        <w:pStyle w:val="Testonormale"/>
-        <w:rPr>
-          <w:rFonts w:ascii="Century Gothic" w:hAnsi="Century Gothic" w:cs="Courier New"/>
-        </w:rPr>
-      </w:pPr>
-    </w:p>
-    <w:p>
-      <w:pPr>
-        <w:pStyle w:val="Testonormale"/>
-        <w:spacing w:after="240"/>
+      </w:pPr>
+      <w:r>
         <w:rPr>
           <w:rFonts w:ascii="Century Gothic" w:hAnsi="Century Gothic" w:cs="Courier New"/>
           <w:b/>
           <w:sz w:val="28"/>
           <w:szCs w:val="28"/>
         </w:rPr>
+        <w:t>DATABASE</w:t>
+      </w:r>
+    </w:p>
+    <w:p>
+      <w:pPr>
+        <w:pStyle w:val="Testonormale"/>
+        <w:jc w:val="both"/>
+        <w:rPr>
+          <w:rFonts w:ascii="Century Gothic" w:hAnsi="Century Gothic" w:cs="Courier New"/>
+          <w:sz w:val="22"/>
+          <w:szCs w:val="22"/>
+        </w:rPr>
+      </w:pPr>
+      <w:r>
+        <w:rPr>
+          <w:rFonts w:ascii="Century Gothic" w:hAnsi="Century Gothic" w:cs="Courier New"/>
+          <w:sz w:val="22"/>
+          <w:szCs w:val="22"/>
+        </w:rPr>
+        <w:lastRenderedPageBreak/>
+        <w:t>P</w:t>
+      </w:r>
+      <w:r>
+        <w:rPr>
+          <w:rFonts w:ascii="Century Gothic" w:hAnsi="Century Gothic" w:cs="Courier New"/>
+          <w:sz w:val="22"/>
+          <w:szCs w:val="22"/>
+        </w:rPr>
+        <w:t xml:space="preserve">er la creazione dell'applicazione abbiamo creato un database </w:t>
+      </w:r>
+      <w:r>
+        <w:rPr>
+          <w:rFonts w:ascii="Century Gothic" w:hAnsi="Century Gothic" w:cs="Courier New"/>
+          <w:sz w:val="22"/>
+          <w:szCs w:val="22"/>
+        </w:rPr>
+        <w:t>MySQL</w:t>
+      </w:r>
+      <w:r>
+        <w:rPr>
+          <w:rFonts w:ascii="Century Gothic" w:hAnsi="Century Gothic" w:cs="Courier New"/>
+          <w:sz w:val="22"/>
+          <w:szCs w:val="22"/>
+        </w:rPr>
+        <w:t xml:space="preserve"> denominato "studenthome".</w:t>
+      </w:r>
+    </w:p>
+    <w:p>
+      <w:pPr>
+        <w:pStyle w:val="Testonormale"/>
+        <w:jc w:val="both"/>
+        <w:rPr>
+          <w:rFonts w:ascii="Century Gothic" w:hAnsi="Century Gothic" w:cs="Courier New"/>
+          <w:sz w:val="22"/>
+          <w:szCs w:val="22"/>
+        </w:rPr>
+      </w:pPr>
+      <w:r>
+        <w:rPr>
+          <w:rFonts w:ascii="Century Gothic" w:hAnsi="Century Gothic" w:cs="Courier New"/>
+          <w:sz w:val="22"/>
+          <w:szCs w:val="22"/>
+        </w:rPr>
+        <w:t xml:space="preserve">Sono memorizzati tutti i dati in nove tabelle collegate tra loro con le ForeignKeys. La tabella che memorizza i dati dell'utente contiene le password crittografate per una elevata sicurezza. Il file che contiene le direttive per il collegamento al database denominato db.ts è collocato nella backend\scr\utils\ </w:t>
+      </w:r>
+    </w:p>
+    <w:p>
+      <w:pPr>
+        <w:pStyle w:val="Testonormale"/>
+        <w:rPr>
+          <w:rFonts w:ascii="Century Gothic" w:hAnsi="Century Gothic" w:cs="Courier New"/>
+        </w:rPr>
+      </w:pPr>
+    </w:p>
+    <w:p>
+      <w:pPr>
+        <w:pStyle w:val="Testonormale"/>
+        <w:spacing w:after="240"/>
+        <w:rPr>
+          <w:rFonts w:ascii="Century Gothic" w:hAnsi="Century Gothic" w:cs="Courier New"/>
+        </w:rPr>
       </w:pPr>
       <w:r>
         <w:rPr>
@@ -2359,203 +1985,6 @@
           <w:sz w:val="28"/>
           <w:szCs w:val="28"/>
         </w:rPr>
-        <w:t>DATABASE</w:t>
-      </w:r>
-    </w:p>
-    <w:p>
-      <w:pPr>
-        <w:pStyle w:val="Testonormale"/>
-        <w:jc w:val="both"/>
-        <w:rPr>
-          <w:rFonts w:ascii="Century Gothic" w:hAnsi="Century Gothic" w:cs="Courier New"/>
-          <w:sz w:val="22"/>
-          <w:szCs w:val="22"/>
-        </w:rPr>
-      </w:pPr>
-      <w:r>
-        <w:rPr>
-          <w:rFonts w:ascii="Century Gothic" w:hAnsi="Century Gothic" w:cs="Courier New"/>
-          <w:sz w:val="22"/>
-          <w:szCs w:val="22"/>
-        </w:rPr>
-        <w:lastRenderedPageBreak/>
-        <w:t>P</w:t>
-      </w:r>
-      <w:r>
-        <w:rPr>
-          <w:rFonts w:ascii="Century Gothic" w:hAnsi="Century Gothic" w:cs="Courier New"/>
-          <w:sz w:val="22"/>
-          <w:szCs w:val="22"/>
-        </w:rPr>
-        <w:t xml:space="preserve">er la creazione dell'applicazione abbiamo creato un database </w:t>
-      </w:r>
-      <w:r>
-        <w:rPr>
-          <w:rFonts w:ascii="Century Gothic" w:hAnsi="Century Gothic" w:cs="Courier New"/>
-          <w:sz w:val="22"/>
-          <w:szCs w:val="22"/>
-        </w:rPr>
-        <w:t>MySQL</w:t>
-      </w:r>
-      <w:r>
-        <w:rPr>
-          <w:rFonts w:ascii="Century Gothic" w:hAnsi="Century Gothic" w:cs="Courier New"/>
-          <w:sz w:val="22"/>
-          <w:szCs w:val="22"/>
-        </w:rPr>
-        <w:t xml:space="preserve"> denominato "</w:t>
-      </w:r>
-      <w:proofErr w:type="spellStart"/>
-      <w:r>
-        <w:rPr>
-          <w:rFonts w:ascii="Century Gothic" w:hAnsi="Century Gothic" w:cs="Courier New"/>
-          <w:sz w:val="22"/>
-          <w:szCs w:val="22"/>
-        </w:rPr>
-        <w:t>studenthome</w:t>
-      </w:r>
-      <w:proofErr w:type="spellEnd"/>
-      <w:r>
-        <w:rPr>
-          <w:rFonts w:ascii="Century Gothic" w:hAnsi="Century Gothic" w:cs="Courier New"/>
-          <w:sz w:val="22"/>
-          <w:szCs w:val="22"/>
-        </w:rPr>
-        <w:t>".</w:t>
-      </w:r>
-    </w:p>
-    <w:p>
-      <w:pPr>
-        <w:pStyle w:val="Testonormale"/>
-        <w:jc w:val="both"/>
-        <w:rPr>
-          <w:rFonts w:ascii="Century Gothic" w:hAnsi="Century Gothic" w:cs="Courier New"/>
-          <w:sz w:val="22"/>
-          <w:szCs w:val="22"/>
-        </w:rPr>
-      </w:pPr>
-      <w:r>
-        <w:rPr>
-          <w:rFonts w:ascii="Century Gothic" w:hAnsi="Century Gothic" w:cs="Courier New"/>
-          <w:sz w:val="22"/>
-          <w:szCs w:val="22"/>
-        </w:rPr>
-        <w:t xml:space="preserve">Sono memorizzati tutti i dati in nove tabelle collegate tra loro con le </w:t>
-      </w:r>
-      <w:proofErr w:type="spellStart"/>
-      <w:r>
-        <w:rPr>
-          <w:rFonts w:ascii="Century Gothic" w:hAnsi="Century Gothic" w:cs="Courier New"/>
-          <w:sz w:val="22"/>
-          <w:szCs w:val="22"/>
-        </w:rPr>
-        <w:t>ForeignKeys</w:t>
-      </w:r>
-      <w:proofErr w:type="spellEnd"/>
-      <w:r>
-        <w:rPr>
-          <w:rFonts w:ascii="Century Gothic" w:hAnsi="Century Gothic" w:cs="Courier New"/>
-          <w:sz w:val="22"/>
-          <w:szCs w:val="22"/>
-        </w:rPr>
-        <w:t xml:space="preserve">. La tabella che memorizza i dati dell'utente contiene le password crittografate per una elevata sicurezza. Il file che contiene le direttive per il collegamento al database denominato </w:t>
-      </w:r>
-      <w:proofErr w:type="spellStart"/>
-      <w:r>
-        <w:rPr>
-          <w:rFonts w:ascii="Century Gothic" w:hAnsi="Century Gothic" w:cs="Courier New"/>
-          <w:sz w:val="22"/>
-          <w:szCs w:val="22"/>
-        </w:rPr>
-        <w:t>db.ts</w:t>
-      </w:r>
-      <w:proofErr w:type="spellEnd"/>
-      <w:r>
-        <w:rPr>
-          <w:rFonts w:ascii="Century Gothic" w:hAnsi="Century Gothic" w:cs="Courier New"/>
-          <w:sz w:val="22"/>
-          <w:szCs w:val="22"/>
-        </w:rPr>
-        <w:t xml:space="preserve"> è collocato nella </w:t>
-      </w:r>
-      <w:proofErr w:type="spellStart"/>
-      <w:r>
-        <w:rPr>
-          <w:rFonts w:ascii="Century Gothic" w:hAnsi="Century Gothic" w:cs="Courier New"/>
-          <w:sz w:val="22"/>
-          <w:szCs w:val="22"/>
-        </w:rPr>
-        <w:t>backend</w:t>
-      </w:r>
-      <w:proofErr w:type="spellEnd"/>
-      <w:r>
-        <w:rPr>
-          <w:rFonts w:ascii="Century Gothic" w:hAnsi="Century Gothic" w:cs="Courier New"/>
-          <w:sz w:val="22"/>
-          <w:szCs w:val="22"/>
-        </w:rPr>
-        <w:t>\</w:t>
-      </w:r>
-      <w:proofErr w:type="spellStart"/>
-      <w:r>
-        <w:rPr>
-          <w:rFonts w:ascii="Century Gothic" w:hAnsi="Century Gothic" w:cs="Courier New"/>
-          <w:sz w:val="22"/>
-          <w:szCs w:val="22"/>
-        </w:rPr>
-        <w:t>scr</w:t>
-      </w:r>
-      <w:proofErr w:type="spellEnd"/>
-      <w:r>
-        <w:rPr>
-          <w:rFonts w:ascii="Century Gothic" w:hAnsi="Century Gothic" w:cs="Courier New"/>
-          <w:sz w:val="22"/>
-          <w:szCs w:val="22"/>
-        </w:rPr>
-        <w:t>\</w:t>
-      </w:r>
-      <w:proofErr w:type="spellStart"/>
-      <w:r>
-        <w:rPr>
-          <w:rFonts w:ascii="Century Gothic" w:hAnsi="Century Gothic" w:cs="Courier New"/>
-          <w:sz w:val="22"/>
-          <w:szCs w:val="22"/>
-        </w:rPr>
-        <w:t>utils</w:t>
-      </w:r>
-      <w:proofErr w:type="spellEnd"/>
-      <w:r>
-        <w:rPr>
-          <w:rFonts w:ascii="Century Gothic" w:hAnsi="Century Gothic" w:cs="Courier New"/>
-          <w:sz w:val="22"/>
-          <w:szCs w:val="22"/>
-        </w:rPr>
-        <w:t xml:space="preserve">\ </w:t>
-      </w:r>
-    </w:p>
-    <w:p>
-      <w:pPr>
-        <w:pStyle w:val="Testonormale"/>
-        <w:rPr>
-          <w:rFonts w:ascii="Century Gothic" w:hAnsi="Century Gothic" w:cs="Courier New"/>
-        </w:rPr>
-      </w:pPr>
-    </w:p>
-    <w:p>
-      <w:pPr>
-        <w:pStyle w:val="Testonormale"/>
-        <w:spacing w:after="240"/>
-        <w:rPr>
-          <w:rFonts w:ascii="Century Gothic" w:hAnsi="Century Gothic" w:cs="Courier New"/>
-        </w:rPr>
-      </w:pPr>
-      <w:r>
-        <w:rPr>
-          <w:rFonts w:ascii="Century Gothic" w:hAnsi="Century Gothic" w:cs="Courier New"/>
-          <w:b/>
-          <w:sz w:val="28"/>
-          <w:szCs w:val="28"/>
-        </w:rPr>
         <w:t>Installazione</w:t>
       </w:r>
     </w:p>
@@ -2578,25 +2007,7 @@
           <w:sz w:val="22"/>
           <w:szCs w:val="22"/>
         </w:rPr>
-        <w:t xml:space="preserve">Clona il repository di </w:t>
-      </w:r>
-      <w:proofErr w:type="spellStart"/>
-      <w:r>
-        <w:rPr>
-          <w:rFonts w:ascii="Century Gothic" w:hAnsi="Century Gothic" w:cs="Courier New"/>
-          <w:sz w:val="22"/>
-          <w:szCs w:val="22"/>
-        </w:rPr>
-        <w:t>github</w:t>
-      </w:r>
-      <w:proofErr w:type="spellEnd"/>
-      <w:r>
-        <w:rPr>
-          <w:rFonts w:ascii="Century Gothic" w:hAnsi="Century Gothic" w:cs="Courier New"/>
-          <w:sz w:val="22"/>
-          <w:szCs w:val="22"/>
-        </w:rPr>
-        <w:t xml:space="preserve"> da: </w:t>
+        <w:t xml:space="preserve">Clona il repository di github da: </w:t>
       </w:r>
       <w:hyperlink r:id="rId7" w:history="1">
         <w:r>
@@ -2629,61 +2040,7 @@
           <w:sz w:val="22"/>
           <w:szCs w:val="22"/>
         </w:rPr>
-        <w:t>Eseguire il comando “</w:t>
-      </w:r>
-      <w:proofErr w:type="spellStart"/>
-      <w:r>
-        <w:rPr>
-          <w:rFonts w:ascii="Century Gothic" w:hAnsi="Century Gothic" w:cs="Courier New"/>
-          <w:sz w:val="22"/>
-          <w:szCs w:val="22"/>
-        </w:rPr>
-        <w:t>npm</w:t>
-      </w:r>
-      <w:proofErr w:type="spellEnd"/>
-      <w:r>
-        <w:rPr>
-          <w:rFonts w:ascii="Century Gothic" w:hAnsi="Century Gothic" w:cs="Courier New"/>
-          <w:sz w:val="22"/>
-          <w:szCs w:val="22"/>
-        </w:rPr>
-        <w:t xml:space="preserve"> i” in entrambe le cartelle </w:t>
-      </w:r>
-      <w:proofErr w:type="spellStart"/>
-      <w:r>
-        <w:rPr>
-          <w:rFonts w:ascii="Century Gothic" w:hAnsi="Century Gothic" w:cs="Courier New"/>
-          <w:sz w:val="22"/>
-          <w:szCs w:val="22"/>
-        </w:rPr>
-        <w:t>backend</w:t>
-      </w:r>
-      <w:proofErr w:type="spellEnd"/>
-      <w:r>
-        <w:rPr>
-          <w:rFonts w:ascii="Century Gothic" w:hAnsi="Century Gothic" w:cs="Courier New"/>
-          <w:sz w:val="22"/>
-          <w:szCs w:val="22"/>
-        </w:rPr>
-        <w:t xml:space="preserve"> e </w:t>
-      </w:r>
-      <w:proofErr w:type="spellStart"/>
-      <w:r>
-        <w:rPr>
-          <w:rFonts w:ascii="Century Gothic" w:hAnsi="Century Gothic" w:cs="Courier New"/>
-          <w:sz w:val="22"/>
-          <w:szCs w:val="22"/>
-        </w:rPr>
-        <w:t>frontend</w:t>
-      </w:r>
-      <w:proofErr w:type="spellEnd"/>
-      <w:r>
-        <w:rPr>
-          <w:rFonts w:ascii="Century Gothic" w:hAnsi="Century Gothic" w:cs="Courier New"/>
-          <w:sz w:val="22"/>
-          <w:szCs w:val="22"/>
-        </w:rPr>
-        <w:t xml:space="preserve"> per installare tutte le dipendenze e pacchetti</w:t>
+        <w:t>Eseguire il comando “npm i” in entrambe le cartelle backend e frontend per installare tutte le dipendenze e pacchetti</w:t>
       </w:r>
     </w:p>
     <w:p>
@@ -2705,18 +2062,8 @@
           <w:sz w:val="22"/>
           <w:szCs w:val="22"/>
         </w:rPr>
-        <w:t xml:space="preserve">Aprire XAMPP </w:t>
-      </w:r>
-      <w:proofErr w:type="gramStart"/>
-      <w:r>
-        <w:rPr>
-          <w:rFonts w:ascii="Century Gothic" w:hAnsi="Century Gothic" w:cs="Courier New"/>
-          <w:sz w:val="22"/>
-          <w:szCs w:val="22"/>
-        </w:rPr>
-        <w:t>e</w:t>
-      </w:r>
-      <w:proofErr w:type="gramEnd"/>
+        <w:t>Aprire XAMPP e</w:t>
+      </w:r>
       <w:r>
         <w:rPr>
           <w:rFonts w:ascii="Century Gothic" w:hAnsi="Century Gothic" w:cs="Courier New"/>
@@ -2731,36 +2078,8 @@
           <w:sz w:val="22"/>
           <w:szCs w:val="22"/>
         </w:rPr>
-        <w:t xml:space="preserve">eseguire il server MySQL, creare il DB con il file contenuto nella cartella </w:t>
-      </w:r>
-      <w:proofErr w:type="spellStart"/>
-      <w:r>
-        <w:rPr>
-          <w:rFonts w:ascii="Century Gothic" w:hAnsi="Century Gothic" w:cs="Courier New"/>
-          <w:sz w:val="22"/>
-          <w:szCs w:val="22"/>
-        </w:rPr>
-        <w:t>backend</w:t>
-      </w:r>
-      <w:proofErr w:type="spellEnd"/>
-      <w:r>
-        <w:rPr>
-          <w:rFonts w:ascii="Century Gothic" w:hAnsi="Century Gothic" w:cs="Courier New"/>
-          <w:sz w:val="22"/>
-          <w:szCs w:val="22"/>
-        </w:rPr>
-        <w:t>-&gt;</w:t>
-      </w:r>
-      <w:proofErr w:type="spellStart"/>
-      <w:r>
-        <w:rPr>
-          <w:rFonts w:ascii="Century Gothic" w:hAnsi="Century Gothic" w:cs="Courier New"/>
-          <w:sz w:val="22"/>
-          <w:szCs w:val="22"/>
-        </w:rPr>
-        <w:t>db</w:t>
-      </w:r>
-      <w:proofErr w:type="spellEnd"/>
+        <w:t>eseguire il server MySQL, creare il DB con il file contenuto nella cartella backend-&gt;db</w:t>
+      </w:r>
     </w:p>
     <w:p>
       <w:pPr>
@@ -2781,97 +2100,7 @@
           <w:sz w:val="22"/>
           <w:szCs w:val="22"/>
         </w:rPr>
-        <w:t>Eseguire l’applicazione web con il comando “</w:t>
-      </w:r>
-      <w:proofErr w:type="spellStart"/>
-      <w:r>
-        <w:rPr>
-          <w:rFonts w:ascii="Century Gothic" w:hAnsi="Century Gothic" w:cs="Courier New"/>
-          <w:sz w:val="22"/>
-          <w:szCs w:val="22"/>
-        </w:rPr>
-        <w:t>npm</w:t>
-      </w:r>
-      <w:proofErr w:type="spellEnd"/>
-      <w:r>
-        <w:rPr>
-          <w:rFonts w:ascii="Century Gothic" w:hAnsi="Century Gothic" w:cs="Courier New"/>
-          <w:sz w:val="22"/>
-          <w:szCs w:val="22"/>
-        </w:rPr>
-        <w:t xml:space="preserve"> </w:t>
-      </w:r>
-      <w:proofErr w:type="spellStart"/>
-      <w:r>
-        <w:rPr>
-          <w:rFonts w:ascii="Century Gothic" w:hAnsi="Century Gothic" w:cs="Courier New"/>
-          <w:sz w:val="22"/>
-          <w:szCs w:val="22"/>
-        </w:rPr>
-        <w:t>run</w:t>
-      </w:r>
-      <w:proofErr w:type="spellEnd"/>
-      <w:r>
-        <w:rPr>
-          <w:rFonts w:ascii="Century Gothic" w:hAnsi="Century Gothic" w:cs="Courier New"/>
-          <w:sz w:val="22"/>
-          <w:szCs w:val="22"/>
-        </w:rPr>
-        <w:t xml:space="preserve"> </w:t>
-      </w:r>
-      <w:proofErr w:type="spellStart"/>
-      <w:r>
-        <w:rPr>
-          <w:rFonts w:ascii="Century Gothic" w:hAnsi="Century Gothic" w:cs="Courier New"/>
-          <w:sz w:val="22"/>
-          <w:szCs w:val="22"/>
-        </w:rPr>
-        <w:t>dev</w:t>
-      </w:r>
-      <w:proofErr w:type="spellEnd"/>
-      <w:r>
-        <w:rPr>
-          <w:rFonts w:ascii="Century Gothic" w:hAnsi="Century Gothic" w:cs="Courier New"/>
-          <w:sz w:val="22"/>
-          <w:szCs w:val="22"/>
-        </w:rPr>
-        <w:t xml:space="preserve">” da eseguire in entrambe le cartelle </w:t>
-      </w:r>
-      <w:proofErr w:type="spellStart"/>
-      <w:r>
-        <w:rPr>
-          <w:rFonts w:ascii="Century Gothic" w:hAnsi="Century Gothic" w:cs="Courier New"/>
-          <w:sz w:val="22"/>
-          <w:szCs w:val="22"/>
-        </w:rPr>
-        <w:t>frontend</w:t>
-      </w:r>
-      <w:proofErr w:type="spellEnd"/>
-      <w:r>
-        <w:rPr>
-          <w:rFonts w:ascii="Century Gothic" w:hAnsi="Century Gothic" w:cs="Courier New"/>
-          <w:sz w:val="22"/>
-          <w:szCs w:val="22"/>
-        </w:rPr>
-        <w:t xml:space="preserve"> e </w:t>
-      </w:r>
-      <w:proofErr w:type="spellStart"/>
-      <w:r>
-        <w:rPr>
-          <w:rFonts w:ascii="Century Gothic" w:hAnsi="Century Gothic" w:cs="Courier New"/>
-          <w:sz w:val="22"/>
-          <w:szCs w:val="22"/>
-        </w:rPr>
-        <w:t>backend</w:t>
-      </w:r>
-      <w:proofErr w:type="spellEnd"/>
-      <w:r>
-        <w:rPr>
-          <w:rFonts w:ascii="Century Gothic" w:hAnsi="Century Gothic" w:cs="Courier New"/>
-          <w:sz w:val="22"/>
-          <w:szCs w:val="22"/>
-        </w:rPr>
-        <w:t>. Utilizzare il link di vite per visitare l’app.</w:t>
+        <w:t>Eseguire l’applicazione web con il comando “npm run dev” da eseguire in entrambe le cartelle frontend e backend. Utilizzare il link di vite per visitare l’app.</w:t>
       </w:r>
     </w:p>
     <w:p>
@@ -4825,6 +4054,7 @@
   <w:style w:type="character" w:default="1" w:styleId="Carpredefinitoparagrafo">
     <w:name w:val="Default Paragraph Font"/>
     <w:uiPriority w:val="1"/>
+    <w:semiHidden/>
     <w:unhideWhenUsed/>
   </w:style>
   <w:style w:type="table" w:default="1" w:styleId="Tabellanormale">

</xml_diff>

<commit_message>
UPDATE - revision bozza_relazione.docx
</commit_message>
<xml_diff>
--- a/StudentHome/bozza_relazione.docx
+++ b/StudentHome/bozza_relazione.docx
@@ -1,6 +1,6 @@
 
 <file path=word/document.xml><?xml version="1.0" encoding="utf-8"?>
-<w:document xmlns:wpc="http://schemas.microsoft.com/office/word/2010/wordprocessingCanvas" xmlns:cx="http://schemas.microsoft.com/office/drawing/2014/chartex" xmlns:cx1="http://schemas.microsoft.com/office/drawing/2015/9/8/chartex" xmlns:cx2="http://schemas.microsoft.com/office/drawing/2015/10/21/chartex" xmlns:cx3="http://schemas.microsoft.com/office/drawing/2016/5/9/chartex" xmlns:cx4="http://schemas.microsoft.com/office/drawing/2016/5/10/chartex" xmlns:cx5="http://schemas.microsoft.com/office/drawing/2016/5/11/chartex" xmlns:cx6="http://schemas.microsoft.com/office/drawing/2016/5/12/chartex" xmlns:cx7="http://schemas.microsoft.com/office/drawing/2016/5/13/chartex" xmlns:cx8="http://schemas.microsoft.com/office/drawing/2016/5/14/chartex" xmlns:mc="http://schemas.openxmlformats.org/markup-compatibility/2006" xmlns:aink="http://schemas.microsoft.com/office/drawing/2016/ink" xmlns:am3d="http://schemas.microsoft.com/office/drawing/2017/model3d" xmlns:o="urn:schemas-microsoft-com:office:office" xmlns:oel="http://schemas.microsoft.com/office/2019/extlst" xmlns:r="http://schemas.openxmlformats.org/officeDocument/2006/relationships" xmlns:m="http://schemas.openxmlformats.org/officeDocument/2006/math" xmlns:v="urn:schemas-microsoft-com:vml" xmlns:wp14="http://schemas.microsoft.com/office/word/2010/wordprocessingDrawing" xmlns:wp="http://schemas.openxmlformats.org/drawingml/2006/wordprocessingDrawing" xmlns:w10="urn:schemas-microsoft-com:office:word" xmlns:w="http://schemas.openxmlformats.org/wordprocessingml/2006/main" xmlns:w14="http://schemas.microsoft.com/office/word/2010/wordml" xmlns:w15="http://schemas.microsoft.com/office/word/2012/wordml" xmlns:w16cex="http://schemas.microsoft.com/office/word/2018/wordml/cex" xmlns:w16cid="http://schemas.microsoft.com/office/word/2016/wordml/cid" xmlns:w16="http://schemas.microsoft.com/office/word/2018/wordml" xmlns:w16du="http://schemas.microsoft.com/office/word/2023/wordml/word16du" xmlns:w16sdtdh="http://schemas.microsoft.com/office/word/2020/wordml/sdtdatahash" xmlns:w16sdtfl="http://schemas.microsoft.com/office/word/2024/wordml/sdtformatlock" xmlns:w16se="http://schemas.microsoft.com/office/word/2015/wordml/symex" xmlns:wpg="http://schemas.microsoft.com/office/word/2010/wordprocessingGroup" xmlns:wpi="http://schemas.microsoft.com/office/word/2010/wordprocessingInk" xmlns:wne="http://schemas.microsoft.com/office/word/2006/wordml" xmlns:wps="http://schemas.microsoft.com/office/word/2010/wordprocessingShape" mc:Ignorable="w14 w15 w16se w16cid w16 w16cex w16sdtdh w16sdtfl w16du wp14">
+<w:document xmlns:wpc="http://schemas.microsoft.com/office/word/2010/wordprocessingCanvas" xmlns:cx="http://schemas.microsoft.com/office/drawing/2014/chartex" xmlns:cx1="http://schemas.microsoft.com/office/drawing/2015/9/8/chartex" xmlns:cx2="http://schemas.microsoft.com/office/drawing/2015/10/21/chartex" xmlns:cx3="http://schemas.microsoft.com/office/drawing/2016/5/9/chartex" xmlns:cx4="http://schemas.microsoft.com/office/drawing/2016/5/10/chartex" xmlns:cx5="http://schemas.microsoft.com/office/drawing/2016/5/11/chartex" xmlns:cx6="http://schemas.microsoft.com/office/drawing/2016/5/12/chartex" xmlns:cx7="http://schemas.microsoft.com/office/drawing/2016/5/13/chartex" xmlns:cx8="http://schemas.microsoft.com/office/drawing/2016/5/14/chartex" xmlns:mc="http://schemas.openxmlformats.org/markup-compatibility/2006" xmlns:aink="http://schemas.microsoft.com/office/drawing/2016/ink" xmlns:am3d="http://schemas.microsoft.com/office/drawing/2017/model3d" xmlns:o="urn:schemas-microsoft-com:office:office" xmlns:r="http://schemas.openxmlformats.org/officeDocument/2006/relationships" xmlns:m="http://schemas.openxmlformats.org/officeDocument/2006/math" xmlns:v="urn:schemas-microsoft-com:vml" xmlns:wp14="http://schemas.microsoft.com/office/word/2010/wordprocessingDrawing" xmlns:wp="http://schemas.openxmlformats.org/drawingml/2006/wordprocessingDrawing" xmlns:w10="urn:schemas-microsoft-com:office:word" xmlns:w="http://schemas.openxmlformats.org/wordprocessingml/2006/main" xmlns:w14="http://schemas.microsoft.com/office/word/2010/wordml" xmlns:w15="http://schemas.microsoft.com/office/word/2012/wordml" xmlns:w16cid="http://schemas.microsoft.com/office/word/2016/wordml/cid" xmlns:w16se="http://schemas.microsoft.com/office/word/2015/wordml/symex" xmlns:wpg="http://schemas.microsoft.com/office/word/2010/wordprocessingGroup" xmlns:wpi="http://schemas.microsoft.com/office/word/2010/wordprocessingInk" xmlns:wne="http://schemas.microsoft.com/office/word/2006/wordml" xmlns:wps="http://schemas.microsoft.com/office/word/2010/wordprocessingShape" mc:Ignorable="w14 w15 w16se w16cid wp14">
   <w:body>
     <w:p>
       <w:pPr>
@@ -61,7 +61,25 @@
           <w:sz w:val="22"/>
           <w:szCs w:val="22"/>
         </w:rPr>
-        <w:t>Benvenuti nel sito di StudentHome. Questa applicazione web è un servizio gratuito per gli studenti</w:t>
+        <w:t xml:space="preserve">Benvenuti nel sito di </w:t>
+      </w:r>
+      <w:proofErr w:type="spellStart"/>
+      <w:r>
+        <w:rPr>
+          <w:rFonts w:ascii="Century Gothic" w:hAnsi="Century Gothic" w:cs="Courier New"/>
+          <w:sz w:val="22"/>
+          <w:szCs w:val="22"/>
+        </w:rPr>
+        <w:t>StudentHome</w:t>
+      </w:r>
+      <w:proofErr w:type="spellEnd"/>
+      <w:r>
+        <w:rPr>
+          <w:rFonts w:ascii="Century Gothic" w:hAnsi="Century Gothic" w:cs="Courier New"/>
+          <w:sz w:val="22"/>
+          <w:szCs w:val="22"/>
+        </w:rPr>
+        <w:t>. Questa applicazione web è un servizio gratuito per gli studenti</w:t>
       </w:r>
       <w:r>
         <w:rPr>
@@ -682,8 +700,18 @@
           <w:sz w:val="22"/>
           <w:szCs w:val="22"/>
         </w:rPr>
-        <w:t>XAMPP per avviare il server mysql</w:t>
-      </w:r>
+        <w:t xml:space="preserve">XAMPP per avviare il server </w:t>
+      </w:r>
+      <w:proofErr w:type="spellStart"/>
+      <w:r>
+        <w:rPr>
+          <w:rFonts w:ascii="Century Gothic" w:hAnsi="Century Gothic" w:cs="Courier New"/>
+          <w:sz w:val="22"/>
+          <w:szCs w:val="22"/>
+        </w:rPr>
+        <w:t>mysql</w:t>
+      </w:r>
+      <w:proofErr w:type="spellEnd"/>
     </w:p>
     <w:p>
       <w:pPr>
@@ -746,13 +774,41 @@
           <w:szCs w:val="22"/>
         </w:rPr>
       </w:pPr>
-      <w:r>
-        <w:rPr>
-          <w:rFonts w:ascii="Century Gothic" w:hAnsi="Century Gothic" w:cs="Courier New"/>
-          <w:sz w:val="22"/>
-          <w:szCs w:val="22"/>
-        </w:rPr>
-        <w:t>npm per installazione di packages e avviare il server</w:t>
+      <w:proofErr w:type="spellStart"/>
+      <w:r>
+        <w:rPr>
+          <w:rFonts w:ascii="Century Gothic" w:hAnsi="Century Gothic" w:cs="Courier New"/>
+          <w:sz w:val="22"/>
+          <w:szCs w:val="22"/>
+        </w:rPr>
+        <w:t>npm</w:t>
+      </w:r>
+      <w:proofErr w:type="spellEnd"/>
+      <w:r>
+        <w:rPr>
+          <w:rFonts w:ascii="Century Gothic" w:hAnsi="Century Gothic" w:cs="Courier New"/>
+          <w:sz w:val="22"/>
+          <w:szCs w:val="22"/>
+        </w:rPr>
+        <w:t xml:space="preserve"> per installazione di </w:t>
+      </w:r>
+      <w:proofErr w:type="spellStart"/>
+      <w:r>
+        <w:rPr>
+          <w:rFonts w:ascii="Century Gothic" w:hAnsi="Century Gothic" w:cs="Courier New"/>
+          <w:sz w:val="22"/>
+          <w:szCs w:val="22"/>
+        </w:rPr>
+        <w:t>packages</w:t>
+      </w:r>
+      <w:proofErr w:type="spellEnd"/>
+      <w:r>
+        <w:rPr>
+          <w:rFonts w:ascii="Century Gothic" w:hAnsi="Century Gothic" w:cs="Courier New"/>
+          <w:sz w:val="22"/>
+          <w:szCs w:val="22"/>
+        </w:rPr>
+        <w:t xml:space="preserve"> e avviare il server</w:t>
       </w:r>
     </w:p>
     <w:p>
@@ -841,6 +897,7 @@
           <w:lang w:val="en-US"/>
         </w:rPr>
       </w:pPr>
+      <w:proofErr w:type="spellStart"/>
       <w:r>
         <w:rPr>
           <w:rFonts w:ascii="Century Gothic" w:hAnsi="Century Gothic" w:cs="Courier New"/>
@@ -850,6 +907,7 @@
         </w:rPr>
         <w:t>Vite</w:t>
       </w:r>
+      <w:proofErr w:type="spellEnd"/>
     </w:p>
     <w:p>
       <w:pPr>
@@ -865,6 +923,7 @@
           <w:lang w:val="en-US"/>
         </w:rPr>
       </w:pPr>
+      <w:proofErr w:type="spellStart"/>
       <w:r>
         <w:rPr>
           <w:rFonts w:ascii="Century Gothic" w:hAnsi="Century Gothic" w:cs="Courier New"/>
@@ -874,6 +933,7 @@
         </w:rPr>
         <w:t>Axios</w:t>
       </w:r>
+      <w:proofErr w:type="spellEnd"/>
     </w:p>
     <w:p>
       <w:pPr>
@@ -896,38 +956,29 @@
           <w:szCs w:val="22"/>
           <w:lang w:val="en-US"/>
         </w:rPr>
-        <w:t>Bootstrap per css</w:t>
-      </w:r>
-    </w:p>
-    <w:p>
-      <w:pPr>
-        <w:pStyle w:val="Testonormale"/>
-        <w:numPr>
-          <w:ilvl w:val="0"/>
-          <w:numId w:val="12"/>
-        </w:numPr>
-        <w:rPr>
-          <w:rFonts w:ascii="Century Gothic" w:hAnsi="Century Gothic" w:cs="Courier New"/>
-          <w:sz w:val="22"/>
-          <w:szCs w:val="22"/>
-        </w:rPr>
-      </w:pPr>
-      <w:r>
-        <w:rPr>
-          <w:rFonts w:ascii="Century Gothic" w:hAnsi="Century Gothic" w:cs="Courier New"/>
-          <w:sz w:val="22"/>
-          <w:szCs w:val="22"/>
-        </w:rPr>
-        <w:t>LA TUA FUNZIONE PER IL CALCOLO DEL PERCORSO</w:t>
-      </w:r>
-    </w:p>
-    <w:p>
-      <w:pPr>
-        <w:pStyle w:val="Testonormale"/>
-        <w:rPr>
-          <w:rFonts w:ascii="Century Gothic" w:hAnsi="Century Gothic" w:cs="Courier New"/>
-        </w:rPr>
-      </w:pPr>
+        <w:t xml:space="preserve">Bootstrap per </w:t>
+      </w:r>
+      <w:proofErr w:type="spellStart"/>
+      <w:r>
+        <w:rPr>
+          <w:rFonts w:ascii="Century Gothic" w:hAnsi="Century Gothic" w:cs="Courier New"/>
+          <w:sz w:val="22"/>
+          <w:szCs w:val="22"/>
+          <w:lang w:val="en-US"/>
+        </w:rPr>
+        <w:t>css</w:t>
+      </w:r>
+      <w:proofErr w:type="spellEnd"/>
+    </w:p>
+    <w:p>
+      <w:pPr>
+        <w:pStyle w:val="Testonormale"/>
+        <w:rPr>
+          <w:rFonts w:ascii="Century Gothic" w:hAnsi="Century Gothic" w:cs="Courier New"/>
+        </w:rPr>
+      </w:pPr>
+      <w:bookmarkStart w:id="0" w:name="_GoBack"/>
+      <w:bookmarkEnd w:id="0"/>
     </w:p>
     <w:p>
       <w:pPr>
@@ -940,6 +991,7 @@
           <w:szCs w:val="28"/>
         </w:rPr>
       </w:pPr>
+      <w:proofErr w:type="spellStart"/>
       <w:r>
         <w:rPr>
           <w:rFonts w:ascii="Century Gothic" w:hAnsi="Century Gothic" w:cs="Courier New"/>
@@ -947,1036 +999,1401 @@
           <w:sz w:val="28"/>
           <w:szCs w:val="28"/>
         </w:rPr>
-        <w:t>Packages installati</w:t>
-      </w:r>
-    </w:p>
-    <w:p>
-      <w:pPr>
-        <w:pStyle w:val="Testonormale"/>
-        <w:numPr>
-          <w:ilvl w:val="0"/>
-          <w:numId w:val="6"/>
-        </w:numPr>
-        <w:jc w:val="both"/>
-        <w:rPr>
-          <w:rFonts w:ascii="Century Gothic" w:hAnsi="Century Gothic" w:cs="Courier New"/>
-          <w:sz w:val="22"/>
-          <w:szCs w:val="22"/>
-        </w:rPr>
-      </w:pPr>
-      <w:r>
-        <w:rPr>
-          <w:rFonts w:ascii="Century Gothic" w:hAnsi="Century Gothic" w:cs="Courier New"/>
-          <w:sz w:val="22"/>
-          <w:szCs w:val="22"/>
-        </w:rPr>
-        <w:lastRenderedPageBreak/>
-        <w:t>c</w:t>
-      </w:r>
-      <w:r>
-        <w:rPr>
-          <w:rFonts w:ascii="Century Gothic" w:hAnsi="Century Gothic" w:cs="Courier New"/>
-          <w:sz w:val="22"/>
-          <w:szCs w:val="22"/>
-        </w:rPr>
-        <w:t>onnect-history-api-fallback</w:t>
-      </w:r>
-    </w:p>
-    <w:p>
-      <w:pPr>
-        <w:pStyle w:val="Testonormale"/>
-        <w:numPr>
-          <w:ilvl w:val="0"/>
-          <w:numId w:val="6"/>
-        </w:numPr>
-        <w:jc w:val="both"/>
-        <w:rPr>
-          <w:rFonts w:ascii="Century Gothic" w:hAnsi="Century Gothic" w:cs="Courier New"/>
-          <w:sz w:val="22"/>
-          <w:szCs w:val="22"/>
-        </w:rPr>
-      </w:pPr>
-      <w:r>
-        <w:rPr>
-          <w:rFonts w:ascii="Century Gothic" w:hAnsi="Century Gothic" w:cs="Courier New"/>
-          <w:sz w:val="22"/>
-          <w:szCs w:val="22"/>
-        </w:rPr>
-        <w:t>mysql2: otimizzato e compatibile con Promises, ideale per eseguire query asincrone in applicazioni Node.js</w:t>
-      </w:r>
-    </w:p>
-    <w:p>
-      <w:pPr>
-        <w:pStyle w:val="Testonormale"/>
-        <w:numPr>
-          <w:ilvl w:val="0"/>
-          <w:numId w:val="6"/>
-        </w:numPr>
-        <w:jc w:val="both"/>
-        <w:rPr>
-          <w:rFonts w:ascii="Century Gothic" w:hAnsi="Century Gothic" w:cs="Courier New"/>
-          <w:sz w:val="22"/>
-          <w:szCs w:val="22"/>
-        </w:rPr>
-      </w:pPr>
-      <w:r>
-        <w:rPr>
-          <w:rFonts w:ascii="Century Gothic" w:hAnsi="Century Gothic" w:cs="Courier New"/>
-          <w:sz w:val="22"/>
-          <w:szCs w:val="22"/>
-        </w:rPr>
-        <w:t>cookie-parser</w:t>
-      </w:r>
-      <w:r>
-        <w:rPr>
-          <w:rFonts w:ascii="Century Gothic" w:hAnsi="Century Gothic" w:cs="Courier New"/>
-          <w:sz w:val="22"/>
-          <w:szCs w:val="22"/>
-        </w:rPr>
-        <w:t xml:space="preserve">, </w:t>
-      </w:r>
-      <w:r>
-        <w:rPr>
-          <w:rFonts w:ascii="Century Gothic" w:hAnsi="Century Gothic" w:cs="Courier New"/>
-          <w:sz w:val="22"/>
-          <w:szCs w:val="22"/>
-        </w:rPr>
-        <w:t>jsonwebtoken</w:t>
-      </w:r>
-      <w:r>
-        <w:rPr>
-          <w:rFonts w:ascii="Century Gothic" w:hAnsi="Century Gothic" w:cs="Courier New"/>
-          <w:sz w:val="22"/>
-          <w:szCs w:val="22"/>
-        </w:rPr>
-        <w:t xml:space="preserve"> e </w:t>
-      </w:r>
-      <w:r>
-        <w:rPr>
-          <w:rFonts w:ascii="Century Gothic" w:hAnsi="Century Gothic" w:cs="Courier New"/>
-          <w:sz w:val="22"/>
-          <w:szCs w:val="22"/>
-        </w:rPr>
-        <w:t>bcrypt</w:t>
-      </w:r>
-      <w:r>
-        <w:rPr>
-          <w:rFonts w:ascii="Century Gothic" w:hAnsi="Century Gothic" w:cs="Courier New"/>
-          <w:sz w:val="22"/>
-          <w:szCs w:val="22"/>
-        </w:rPr>
-        <w:t>: utilizzati per la parte di autenticazione. Grazie a questi pacchetti è possibile realizzare una crittografia delle password</w:t>
-      </w:r>
-      <w:r>
-        <w:rPr>
-          <w:rFonts w:ascii="Century Gothic" w:hAnsi="Century Gothic" w:cs="Courier New"/>
-          <w:sz w:val="22"/>
-          <w:szCs w:val="22"/>
-        </w:rPr>
-        <w:t>, gestire i JWT e il parsing dei cookie</w:t>
-      </w:r>
-      <w:r>
-        <w:rPr>
-          <w:rFonts w:ascii="Century Gothic" w:hAnsi="Century Gothic" w:cs="Courier New"/>
-          <w:sz w:val="22"/>
-          <w:szCs w:val="22"/>
-        </w:rPr>
-        <w:t>. Sono stati installati anche i tipi per TypeScript.</w:t>
-      </w:r>
-    </w:p>
-    <w:p>
-      <w:pPr>
-        <w:pStyle w:val="Testonormale"/>
-        <w:numPr>
-          <w:ilvl w:val="0"/>
-          <w:numId w:val="6"/>
-        </w:numPr>
-        <w:jc w:val="both"/>
-        <w:rPr>
-          <w:rFonts w:ascii="Century Gothic" w:hAnsi="Century Gothic" w:cs="Courier New"/>
-          <w:sz w:val="22"/>
-          <w:szCs w:val="22"/>
-        </w:rPr>
-      </w:pPr>
-      <w:r>
-        <w:rPr>
-          <w:rFonts w:ascii="Century Gothic" w:hAnsi="Century Gothic" w:cs="Courier New"/>
-          <w:sz w:val="22"/>
-          <w:szCs w:val="22"/>
-        </w:rPr>
-        <w:t>m</w:t>
-      </w:r>
-      <w:r>
-        <w:rPr>
-          <w:rFonts w:ascii="Century Gothic" w:hAnsi="Century Gothic" w:cs="Courier New"/>
-          <w:sz w:val="22"/>
-          <w:szCs w:val="22"/>
-        </w:rPr>
-        <w:t>ulter</w:t>
-      </w:r>
-      <w:r>
-        <w:rPr>
-          <w:rFonts w:ascii="Century Gothic" w:hAnsi="Century Gothic" w:cs="Courier New"/>
-          <w:sz w:val="22"/>
-          <w:szCs w:val="22"/>
-        </w:rPr>
-        <w:t>: middleware per gestire l'upload di file in Node.js, particolarmente utile per elaborare form multipart/form-data.</w:t>
-      </w:r>
-    </w:p>
-    <w:p>
-      <w:pPr>
-        <w:pStyle w:val="Testonormale"/>
-        <w:rPr>
-          <w:rFonts w:ascii="Century Gothic" w:hAnsi="Century Gothic" w:cs="Courier New"/>
-        </w:rPr>
-      </w:pPr>
-    </w:p>
-    <w:p>
-      <w:pPr>
-        <w:pStyle w:val="Testonormale"/>
-        <w:spacing w:after="240"/>
+        <w:t>Packages</w:t>
+      </w:r>
+      <w:proofErr w:type="spellEnd"/>
+      <w:r>
         <w:rPr>
           <w:rFonts w:ascii="Century Gothic" w:hAnsi="Century Gothic" w:cs="Courier New"/>
           <w:b/>
           <w:sz w:val="28"/>
           <w:szCs w:val="28"/>
         </w:rPr>
-      </w:pPr>
-      <w:r>
+        <w:t xml:space="preserve"> installati</w:t>
+      </w:r>
+    </w:p>
+    <w:p>
+      <w:pPr>
+        <w:pStyle w:val="Testonormale"/>
+        <w:numPr>
+          <w:ilvl w:val="0"/>
+          <w:numId w:val="6"/>
+        </w:numPr>
+        <w:jc w:val="both"/>
+        <w:rPr>
+          <w:rFonts w:ascii="Century Gothic" w:hAnsi="Century Gothic" w:cs="Courier New"/>
+          <w:sz w:val="22"/>
+          <w:szCs w:val="22"/>
+        </w:rPr>
+      </w:pPr>
+      <w:proofErr w:type="spellStart"/>
+      <w:r>
+        <w:rPr>
+          <w:rFonts w:ascii="Century Gothic" w:hAnsi="Century Gothic" w:cs="Courier New"/>
+          <w:sz w:val="22"/>
+          <w:szCs w:val="22"/>
+        </w:rPr>
+        <w:lastRenderedPageBreak/>
+        <w:t>c</w:t>
+      </w:r>
+      <w:r>
+        <w:rPr>
+          <w:rFonts w:ascii="Century Gothic" w:hAnsi="Century Gothic" w:cs="Courier New"/>
+          <w:sz w:val="22"/>
+          <w:szCs w:val="22"/>
+        </w:rPr>
+        <w:t>onnect</w:t>
+      </w:r>
+      <w:proofErr w:type="spellEnd"/>
+      <w:r>
+        <w:rPr>
+          <w:rFonts w:ascii="Century Gothic" w:hAnsi="Century Gothic" w:cs="Courier New"/>
+          <w:sz w:val="22"/>
+          <w:szCs w:val="22"/>
+        </w:rPr>
+        <w:t>-history-api-</w:t>
+      </w:r>
+      <w:proofErr w:type="spellStart"/>
+      <w:r>
+        <w:rPr>
+          <w:rFonts w:ascii="Century Gothic" w:hAnsi="Century Gothic" w:cs="Courier New"/>
+          <w:sz w:val="22"/>
+          <w:szCs w:val="22"/>
+        </w:rPr>
+        <w:t>fallback</w:t>
+      </w:r>
+      <w:proofErr w:type="spellEnd"/>
+    </w:p>
+    <w:p>
+      <w:pPr>
+        <w:pStyle w:val="Testonormale"/>
+        <w:numPr>
+          <w:ilvl w:val="0"/>
+          <w:numId w:val="6"/>
+        </w:numPr>
+        <w:jc w:val="both"/>
+        <w:rPr>
+          <w:rFonts w:ascii="Century Gothic" w:hAnsi="Century Gothic" w:cs="Courier New"/>
+          <w:sz w:val="22"/>
+          <w:szCs w:val="22"/>
+        </w:rPr>
+      </w:pPr>
+      <w:r>
+        <w:rPr>
+          <w:rFonts w:ascii="Century Gothic" w:hAnsi="Century Gothic" w:cs="Courier New"/>
+          <w:sz w:val="22"/>
+          <w:szCs w:val="22"/>
+        </w:rPr>
+        <w:t xml:space="preserve">mysql2: </w:t>
+      </w:r>
+      <w:proofErr w:type="spellStart"/>
+      <w:r>
+        <w:rPr>
+          <w:rFonts w:ascii="Century Gothic" w:hAnsi="Century Gothic" w:cs="Courier New"/>
+          <w:sz w:val="22"/>
+          <w:szCs w:val="22"/>
+        </w:rPr>
+        <w:t>otimizzato</w:t>
+      </w:r>
+      <w:proofErr w:type="spellEnd"/>
+      <w:r>
+        <w:rPr>
+          <w:rFonts w:ascii="Century Gothic" w:hAnsi="Century Gothic" w:cs="Courier New"/>
+          <w:sz w:val="22"/>
+          <w:szCs w:val="22"/>
+        </w:rPr>
+        <w:t xml:space="preserve"> e compatibile con </w:t>
+      </w:r>
+      <w:proofErr w:type="spellStart"/>
+      <w:r>
+        <w:rPr>
+          <w:rFonts w:ascii="Century Gothic" w:hAnsi="Century Gothic" w:cs="Courier New"/>
+          <w:sz w:val="22"/>
+          <w:szCs w:val="22"/>
+        </w:rPr>
+        <w:t>Promises</w:t>
+      </w:r>
+      <w:proofErr w:type="spellEnd"/>
+      <w:r>
+        <w:rPr>
+          <w:rFonts w:ascii="Century Gothic" w:hAnsi="Century Gothic" w:cs="Courier New"/>
+          <w:sz w:val="22"/>
+          <w:szCs w:val="22"/>
+        </w:rPr>
+        <w:t xml:space="preserve">, ideale per eseguire </w:t>
+      </w:r>
+      <w:proofErr w:type="spellStart"/>
+      <w:r>
+        <w:rPr>
+          <w:rFonts w:ascii="Century Gothic" w:hAnsi="Century Gothic" w:cs="Courier New"/>
+          <w:sz w:val="22"/>
+          <w:szCs w:val="22"/>
+        </w:rPr>
+        <w:t>query</w:t>
+      </w:r>
+      <w:proofErr w:type="spellEnd"/>
+      <w:r>
+        <w:rPr>
+          <w:rFonts w:ascii="Century Gothic" w:hAnsi="Century Gothic" w:cs="Courier New"/>
+          <w:sz w:val="22"/>
+          <w:szCs w:val="22"/>
+        </w:rPr>
+        <w:t xml:space="preserve"> asincrone in applicazioni Node.js</w:t>
+      </w:r>
+    </w:p>
+    <w:p>
+      <w:pPr>
+        <w:pStyle w:val="Testonormale"/>
+        <w:numPr>
+          <w:ilvl w:val="0"/>
+          <w:numId w:val="6"/>
+        </w:numPr>
+        <w:jc w:val="both"/>
+        <w:rPr>
+          <w:rFonts w:ascii="Century Gothic" w:hAnsi="Century Gothic" w:cs="Courier New"/>
+          <w:sz w:val="22"/>
+          <w:szCs w:val="22"/>
+        </w:rPr>
+      </w:pPr>
+      <w:r>
+        <w:rPr>
+          <w:rFonts w:ascii="Century Gothic" w:hAnsi="Century Gothic" w:cs="Courier New"/>
+          <w:sz w:val="22"/>
+          <w:szCs w:val="22"/>
+        </w:rPr>
+        <w:t>cookie-</w:t>
+      </w:r>
+      <w:proofErr w:type="spellStart"/>
+      <w:r>
+        <w:rPr>
+          <w:rFonts w:ascii="Century Gothic" w:hAnsi="Century Gothic" w:cs="Courier New"/>
+          <w:sz w:val="22"/>
+          <w:szCs w:val="22"/>
+        </w:rPr>
+        <w:t>parser</w:t>
+      </w:r>
+      <w:proofErr w:type="spellEnd"/>
+      <w:r>
+        <w:rPr>
+          <w:rFonts w:ascii="Century Gothic" w:hAnsi="Century Gothic" w:cs="Courier New"/>
+          <w:sz w:val="22"/>
+          <w:szCs w:val="22"/>
+        </w:rPr>
+        <w:t xml:space="preserve">, </w:t>
+      </w:r>
+      <w:proofErr w:type="spellStart"/>
+      <w:r>
+        <w:rPr>
+          <w:rFonts w:ascii="Century Gothic" w:hAnsi="Century Gothic" w:cs="Courier New"/>
+          <w:sz w:val="22"/>
+          <w:szCs w:val="22"/>
+        </w:rPr>
+        <w:t>jsonwebtoken</w:t>
+      </w:r>
+      <w:proofErr w:type="spellEnd"/>
+      <w:r>
+        <w:rPr>
+          <w:rFonts w:ascii="Century Gothic" w:hAnsi="Century Gothic" w:cs="Courier New"/>
+          <w:sz w:val="22"/>
+          <w:szCs w:val="22"/>
+        </w:rPr>
+        <w:t xml:space="preserve"> e </w:t>
+      </w:r>
+      <w:proofErr w:type="spellStart"/>
+      <w:r>
+        <w:rPr>
+          <w:rFonts w:ascii="Century Gothic" w:hAnsi="Century Gothic" w:cs="Courier New"/>
+          <w:sz w:val="22"/>
+          <w:szCs w:val="22"/>
+        </w:rPr>
+        <w:t>bcrypt</w:t>
+      </w:r>
+      <w:proofErr w:type="spellEnd"/>
+      <w:r>
+        <w:rPr>
+          <w:rFonts w:ascii="Century Gothic" w:hAnsi="Century Gothic" w:cs="Courier New"/>
+          <w:sz w:val="22"/>
+          <w:szCs w:val="22"/>
+        </w:rPr>
+        <w:t>: utilizzati per la parte di autenticazione. Grazie a questi pacchetti è possibile realizzare una crittografia delle password</w:t>
+      </w:r>
+      <w:r>
+        <w:rPr>
+          <w:rFonts w:ascii="Century Gothic" w:hAnsi="Century Gothic" w:cs="Courier New"/>
+          <w:sz w:val="22"/>
+          <w:szCs w:val="22"/>
+        </w:rPr>
+        <w:t xml:space="preserve">, gestire i JWT e il </w:t>
+      </w:r>
+      <w:proofErr w:type="spellStart"/>
+      <w:r>
+        <w:rPr>
+          <w:rFonts w:ascii="Century Gothic" w:hAnsi="Century Gothic" w:cs="Courier New"/>
+          <w:sz w:val="22"/>
+          <w:szCs w:val="22"/>
+        </w:rPr>
+        <w:t>parsing</w:t>
+      </w:r>
+      <w:proofErr w:type="spellEnd"/>
+      <w:r>
+        <w:rPr>
+          <w:rFonts w:ascii="Century Gothic" w:hAnsi="Century Gothic" w:cs="Courier New"/>
+          <w:sz w:val="22"/>
+          <w:szCs w:val="22"/>
+        </w:rPr>
+        <w:t xml:space="preserve"> dei cookie</w:t>
+      </w:r>
+      <w:r>
+        <w:rPr>
+          <w:rFonts w:ascii="Century Gothic" w:hAnsi="Century Gothic" w:cs="Courier New"/>
+          <w:sz w:val="22"/>
+          <w:szCs w:val="22"/>
+        </w:rPr>
+        <w:t xml:space="preserve">. Sono stati installati anche i tipi per </w:t>
+      </w:r>
+      <w:proofErr w:type="spellStart"/>
+      <w:r>
+        <w:rPr>
+          <w:rFonts w:ascii="Century Gothic" w:hAnsi="Century Gothic" w:cs="Courier New"/>
+          <w:sz w:val="22"/>
+          <w:szCs w:val="22"/>
+        </w:rPr>
+        <w:t>TypeScript</w:t>
+      </w:r>
+      <w:proofErr w:type="spellEnd"/>
+      <w:r>
+        <w:rPr>
+          <w:rFonts w:ascii="Century Gothic" w:hAnsi="Century Gothic" w:cs="Courier New"/>
+          <w:sz w:val="22"/>
+          <w:szCs w:val="22"/>
+        </w:rPr>
+        <w:t>.</w:t>
+      </w:r>
+    </w:p>
+    <w:p>
+      <w:pPr>
+        <w:pStyle w:val="Testonormale"/>
+        <w:numPr>
+          <w:ilvl w:val="0"/>
+          <w:numId w:val="6"/>
+        </w:numPr>
+        <w:jc w:val="both"/>
+        <w:rPr>
+          <w:rFonts w:ascii="Century Gothic" w:hAnsi="Century Gothic" w:cs="Courier New"/>
+          <w:sz w:val="22"/>
+          <w:szCs w:val="22"/>
+        </w:rPr>
+      </w:pPr>
+      <w:proofErr w:type="spellStart"/>
+      <w:r>
+        <w:rPr>
+          <w:rFonts w:ascii="Century Gothic" w:hAnsi="Century Gothic" w:cs="Courier New"/>
+          <w:sz w:val="22"/>
+          <w:szCs w:val="22"/>
+        </w:rPr>
+        <w:t>m</w:t>
+      </w:r>
+      <w:r>
+        <w:rPr>
+          <w:rFonts w:ascii="Century Gothic" w:hAnsi="Century Gothic" w:cs="Courier New"/>
+          <w:sz w:val="22"/>
+          <w:szCs w:val="22"/>
+        </w:rPr>
+        <w:t>ulter</w:t>
+      </w:r>
+      <w:proofErr w:type="spellEnd"/>
+      <w:r>
+        <w:rPr>
+          <w:rFonts w:ascii="Century Gothic" w:hAnsi="Century Gothic" w:cs="Courier New"/>
+          <w:sz w:val="22"/>
+          <w:szCs w:val="22"/>
+        </w:rPr>
+        <w:t xml:space="preserve">: middleware per gestire l'upload di file in Node.js, particolarmente utile per elaborare </w:t>
+      </w:r>
+      <w:proofErr w:type="spellStart"/>
+      <w:r>
+        <w:rPr>
+          <w:rFonts w:ascii="Century Gothic" w:hAnsi="Century Gothic" w:cs="Courier New"/>
+          <w:sz w:val="22"/>
+          <w:szCs w:val="22"/>
+        </w:rPr>
+        <w:t>form</w:t>
+      </w:r>
+      <w:proofErr w:type="spellEnd"/>
+      <w:r>
+        <w:rPr>
+          <w:rFonts w:ascii="Century Gothic" w:hAnsi="Century Gothic" w:cs="Courier New"/>
+          <w:sz w:val="22"/>
+          <w:szCs w:val="22"/>
+        </w:rPr>
+        <w:t xml:space="preserve"> </w:t>
+      </w:r>
+      <w:proofErr w:type="spellStart"/>
+      <w:r>
+        <w:rPr>
+          <w:rFonts w:ascii="Century Gothic" w:hAnsi="Century Gothic" w:cs="Courier New"/>
+          <w:sz w:val="22"/>
+          <w:szCs w:val="22"/>
+        </w:rPr>
+        <w:t>multipart</w:t>
+      </w:r>
+      <w:proofErr w:type="spellEnd"/>
+      <w:r>
+        <w:rPr>
+          <w:rFonts w:ascii="Century Gothic" w:hAnsi="Century Gothic" w:cs="Courier New"/>
+          <w:sz w:val="22"/>
+          <w:szCs w:val="22"/>
+        </w:rPr>
+        <w:t>/</w:t>
+      </w:r>
+      <w:proofErr w:type="spellStart"/>
+      <w:r>
+        <w:rPr>
+          <w:rFonts w:ascii="Century Gothic" w:hAnsi="Century Gothic" w:cs="Courier New"/>
+          <w:sz w:val="22"/>
+          <w:szCs w:val="22"/>
+        </w:rPr>
+        <w:t>form</w:t>
+      </w:r>
+      <w:proofErr w:type="spellEnd"/>
+      <w:r>
+        <w:rPr>
+          <w:rFonts w:ascii="Century Gothic" w:hAnsi="Century Gothic" w:cs="Courier New"/>
+          <w:sz w:val="22"/>
+          <w:szCs w:val="22"/>
+        </w:rPr>
+        <w:t>-data.</w:t>
+      </w:r>
+    </w:p>
+    <w:p>
+      <w:pPr>
+        <w:pStyle w:val="Testonormale"/>
+        <w:rPr>
+          <w:rFonts w:ascii="Century Gothic" w:hAnsi="Century Gothic" w:cs="Courier New"/>
+        </w:rPr>
+      </w:pPr>
+    </w:p>
+    <w:p>
+      <w:pPr>
+        <w:pStyle w:val="Testonormale"/>
+        <w:spacing w:after="240"/>
         <w:rPr>
           <w:rFonts w:ascii="Century Gothic" w:hAnsi="Century Gothic" w:cs="Courier New"/>
           <w:b/>
           <w:sz w:val="28"/>
           <w:szCs w:val="28"/>
         </w:rPr>
-        <w:t>Struttura progetto</w:t>
-      </w:r>
-    </w:p>
-    <w:p>
-      <w:pPr>
-        <w:pStyle w:val="Testonormale"/>
-        <w:jc w:val="both"/>
-        <w:rPr>
-          <w:rFonts w:ascii="Century Gothic" w:hAnsi="Century Gothic" w:cs="Courier New"/>
-          <w:sz w:val="22"/>
-          <w:szCs w:val="22"/>
-        </w:rPr>
-      </w:pPr>
-      <w:r>
-        <w:rPr>
-          <w:rFonts w:ascii="Century Gothic" w:hAnsi="Century Gothic" w:cs="Courier New"/>
-          <w:sz w:val="22"/>
-          <w:szCs w:val="22"/>
-        </w:rPr>
-        <w:t>S</w:t>
-      </w:r>
-      <w:r>
-        <w:rPr>
-          <w:rFonts w:ascii="Century Gothic" w:hAnsi="Century Gothic" w:cs="Courier New"/>
-          <w:sz w:val="22"/>
-          <w:szCs w:val="22"/>
-        </w:rPr>
-        <w:t>udd</w:t>
-      </w:r>
-      <w:r>
-        <w:rPr>
-          <w:rFonts w:ascii="Century Gothic" w:hAnsi="Century Gothic" w:cs="Courier New"/>
-          <w:sz w:val="22"/>
-          <w:szCs w:val="22"/>
-        </w:rPr>
-        <w:t>i</w:t>
-      </w:r>
-      <w:r>
-        <w:rPr>
-          <w:rFonts w:ascii="Century Gothic" w:hAnsi="Century Gothic" w:cs="Courier New"/>
-          <w:sz w:val="22"/>
-          <w:szCs w:val="22"/>
-        </w:rPr>
-        <w:t>viso in frontend e backend realizzati rispettivamente con Vue.js e Express</w:t>
-      </w:r>
-    </w:p>
-    <w:p>
-      <w:pPr>
-        <w:pStyle w:val="Testonormale"/>
-        <w:jc w:val="both"/>
-        <w:rPr>
-          <w:rFonts w:ascii="Century Gothic" w:hAnsi="Century Gothic" w:cs="Courier New"/>
-          <w:sz w:val="22"/>
-          <w:szCs w:val="22"/>
-        </w:rPr>
-      </w:pPr>
-    </w:p>
-    <w:p>
-      <w:pPr>
-        <w:pStyle w:val="Testonormale"/>
-        <w:spacing w:after="240"/>
+      </w:pPr>
+      <w:r>
         <w:rPr>
           <w:rFonts w:ascii="Century Gothic" w:hAnsi="Century Gothic" w:cs="Courier New"/>
           <w:b/>
           <w:sz w:val="28"/>
           <w:szCs w:val="28"/>
         </w:rPr>
-      </w:pPr>
-      <w:r>
+        <w:t>Struttura progetto</w:t>
+      </w:r>
+    </w:p>
+    <w:p>
+      <w:pPr>
+        <w:pStyle w:val="Testonormale"/>
+        <w:jc w:val="both"/>
+        <w:rPr>
+          <w:rFonts w:ascii="Century Gothic" w:hAnsi="Century Gothic" w:cs="Courier New"/>
+          <w:sz w:val="22"/>
+          <w:szCs w:val="22"/>
+        </w:rPr>
+      </w:pPr>
+      <w:r>
+        <w:rPr>
+          <w:rFonts w:ascii="Century Gothic" w:hAnsi="Century Gothic" w:cs="Courier New"/>
+          <w:sz w:val="22"/>
+          <w:szCs w:val="22"/>
+        </w:rPr>
+        <w:t>S</w:t>
+      </w:r>
+      <w:r>
+        <w:rPr>
+          <w:rFonts w:ascii="Century Gothic" w:hAnsi="Century Gothic" w:cs="Courier New"/>
+          <w:sz w:val="22"/>
+          <w:szCs w:val="22"/>
+        </w:rPr>
+        <w:t>udd</w:t>
+      </w:r>
+      <w:r>
+        <w:rPr>
+          <w:rFonts w:ascii="Century Gothic" w:hAnsi="Century Gothic" w:cs="Courier New"/>
+          <w:sz w:val="22"/>
+          <w:szCs w:val="22"/>
+        </w:rPr>
+        <w:t>i</w:t>
+      </w:r>
+      <w:r>
+        <w:rPr>
+          <w:rFonts w:ascii="Century Gothic" w:hAnsi="Century Gothic" w:cs="Courier New"/>
+          <w:sz w:val="22"/>
+          <w:szCs w:val="22"/>
+        </w:rPr>
+        <w:t xml:space="preserve">viso in </w:t>
+      </w:r>
+      <w:proofErr w:type="spellStart"/>
+      <w:r>
+        <w:rPr>
+          <w:rFonts w:ascii="Century Gothic" w:hAnsi="Century Gothic" w:cs="Courier New"/>
+          <w:sz w:val="22"/>
+          <w:szCs w:val="22"/>
+        </w:rPr>
+        <w:t>frontend</w:t>
+      </w:r>
+      <w:proofErr w:type="spellEnd"/>
+      <w:r>
+        <w:rPr>
+          <w:rFonts w:ascii="Century Gothic" w:hAnsi="Century Gothic" w:cs="Courier New"/>
+          <w:sz w:val="22"/>
+          <w:szCs w:val="22"/>
+        </w:rPr>
+        <w:t xml:space="preserve"> e backend realizzati rispettivamente con Vue.js e Express</w:t>
+      </w:r>
+    </w:p>
+    <w:p>
+      <w:pPr>
+        <w:pStyle w:val="Testonormale"/>
+        <w:jc w:val="both"/>
+        <w:rPr>
+          <w:rFonts w:ascii="Century Gothic" w:hAnsi="Century Gothic" w:cs="Courier New"/>
+          <w:sz w:val="22"/>
+          <w:szCs w:val="22"/>
+        </w:rPr>
+      </w:pPr>
+    </w:p>
+    <w:p>
+      <w:pPr>
+        <w:pStyle w:val="Testonormale"/>
+        <w:spacing w:after="240"/>
         <w:rPr>
           <w:rFonts w:ascii="Century Gothic" w:hAnsi="Century Gothic" w:cs="Courier New"/>
           <w:b/>
           <w:sz w:val="28"/>
           <w:szCs w:val="28"/>
         </w:rPr>
-        <w:t>API endpoint</w:t>
-      </w:r>
-    </w:p>
-    <w:p>
-      <w:pPr>
-        <w:pStyle w:val="Testonormale"/>
-        <w:rPr>
-          <w:rFonts w:ascii="Century Gothic" w:hAnsi="Century Gothic" w:cs="Courier New"/>
-        </w:rPr>
-      </w:pPr>
-    </w:p>
-    <w:p>
-      <w:pPr>
-        <w:pStyle w:val="Testonormale"/>
-        <w:spacing w:after="240"/>
-        <w:rPr>
-          <w:rFonts w:ascii="Century Gothic" w:hAnsi="Century Gothic" w:cs="Courier New"/>
-          <w:b/>
-          <w:sz w:val="22"/>
-          <w:szCs w:val="22"/>
-          <w:u w:val="single"/>
-        </w:rPr>
-      </w:pPr>
-      <w:r>
-        <w:rPr>
-          <w:rFonts w:ascii="Century Gothic" w:hAnsi="Century Gothic" w:cs="Courier New"/>
-          <w:b/>
-          <w:sz w:val="22"/>
-          <w:szCs w:val="22"/>
-          <w:u w:val="single"/>
-        </w:rPr>
-        <w:t>GET</w:t>
-      </w:r>
-    </w:p>
-    <w:p>
-      <w:pPr>
-        <w:pStyle w:val="Testonormale"/>
-        <w:numPr>
-          <w:ilvl w:val="0"/>
-          <w:numId w:val="3"/>
-        </w:numPr>
-        <w:rPr>
-          <w:rFonts w:ascii="Century Gothic" w:hAnsi="Century Gothic" w:cs="Courier New"/>
-          <w:sz w:val="22"/>
-          <w:szCs w:val="22"/>
-        </w:rPr>
-      </w:pPr>
-      <w:r>
-        <w:rPr>
-          <w:rFonts w:ascii="Century Gothic" w:hAnsi="Century Gothic" w:cs="Courier New"/>
-          <w:sz w:val="22"/>
-          <w:szCs w:val="22"/>
-        </w:rPr>
-        <w:t>/api/news</w:t>
-      </w:r>
-    </w:p>
-    <w:p>
-      <w:pPr>
-        <w:pStyle w:val="Testonormale"/>
-        <w:numPr>
-          <w:ilvl w:val="0"/>
-          <w:numId w:val="3"/>
-        </w:numPr>
-        <w:rPr>
-          <w:rFonts w:ascii="Century Gothic" w:hAnsi="Century Gothic" w:cs="Courier New"/>
-          <w:sz w:val="22"/>
-          <w:szCs w:val="22"/>
-        </w:rPr>
-      </w:pPr>
-      <w:r>
-        <w:rPr>
-          <w:rFonts w:ascii="Century Gothic" w:hAnsi="Century Gothic" w:cs="Courier New"/>
-          <w:sz w:val="22"/>
-          <w:szCs w:val="22"/>
-        </w:rPr>
-        <w:t>/api/news/:id</w:t>
-      </w:r>
-    </w:p>
-    <w:p>
-      <w:pPr>
-        <w:pStyle w:val="Testonormale"/>
-        <w:numPr>
-          <w:ilvl w:val="0"/>
-          <w:numId w:val="3"/>
-        </w:numPr>
-        <w:rPr>
-          <w:rFonts w:ascii="Century Gothic" w:hAnsi="Century Gothic" w:cs="Courier New"/>
-          <w:sz w:val="22"/>
-          <w:szCs w:val="22"/>
-        </w:rPr>
-      </w:pPr>
-      <w:r>
-        <w:rPr>
-          <w:rFonts w:ascii="Century Gothic" w:hAnsi="Century Gothic" w:cs="Courier New"/>
-          <w:sz w:val="22"/>
-          <w:szCs w:val="22"/>
-        </w:rPr>
-        <w:t>/api/auth/profile</w:t>
-      </w:r>
-    </w:p>
-    <w:p>
-      <w:pPr>
-        <w:pStyle w:val="Testonormale"/>
-        <w:numPr>
-          <w:ilvl w:val="0"/>
-          <w:numId w:val="3"/>
-        </w:numPr>
-        <w:rPr>
-          <w:rFonts w:ascii="Century Gothic" w:hAnsi="Century Gothic" w:cs="Courier New"/>
-          <w:sz w:val="22"/>
-          <w:szCs w:val="22"/>
-        </w:rPr>
-      </w:pPr>
-      <w:r>
-        <w:rPr>
-          <w:rFonts w:ascii="Century Gothic" w:hAnsi="Century Gothic" w:cs="Courier New"/>
-          <w:sz w:val="22"/>
-          <w:szCs w:val="22"/>
-        </w:rPr>
-        <w:t>/api/annunci</w:t>
-      </w:r>
-    </w:p>
-    <w:p>
-      <w:pPr>
-        <w:pStyle w:val="Testonormale"/>
-        <w:numPr>
-          <w:ilvl w:val="0"/>
-          <w:numId w:val="3"/>
-        </w:numPr>
-        <w:rPr>
-          <w:rFonts w:ascii="Century Gothic" w:hAnsi="Century Gothic" w:cs="Courier New"/>
-          <w:sz w:val="22"/>
-          <w:szCs w:val="22"/>
-        </w:rPr>
-      </w:pPr>
-      <w:r>
-        <w:rPr>
-          <w:rFonts w:ascii="Century Gothic" w:hAnsi="Century Gothic" w:cs="Courier New"/>
-          <w:sz w:val="22"/>
-          <w:szCs w:val="22"/>
-        </w:rPr>
-        <w:t>/api/lastannunci</w:t>
-      </w:r>
-    </w:p>
-    <w:p>
-      <w:pPr>
-        <w:pStyle w:val="Testonormale"/>
-        <w:numPr>
-          <w:ilvl w:val="0"/>
-          <w:numId w:val="3"/>
-        </w:numPr>
-        <w:rPr>
-          <w:rFonts w:ascii="Century Gothic" w:hAnsi="Century Gothic" w:cs="Courier New"/>
-          <w:sz w:val="22"/>
-          <w:szCs w:val="22"/>
-        </w:rPr>
-      </w:pPr>
-      <w:r>
-        <w:rPr>
-          <w:rFonts w:ascii="Century Gothic" w:hAnsi="Century Gothic" w:cs="Courier New"/>
-          <w:sz w:val="22"/>
-          <w:szCs w:val="22"/>
-        </w:rPr>
-        <w:t>/api/annunci/:id</w:t>
-      </w:r>
-    </w:p>
-    <w:p>
-      <w:pPr>
-        <w:pStyle w:val="Testonormale"/>
-        <w:numPr>
-          <w:ilvl w:val="0"/>
-          <w:numId w:val="3"/>
-        </w:numPr>
-        <w:rPr>
-          <w:rFonts w:ascii="Century Gothic" w:hAnsi="Century Gothic" w:cs="Courier New"/>
-          <w:sz w:val="22"/>
-          <w:szCs w:val="22"/>
-        </w:rPr>
-      </w:pPr>
-      <w:r>
-        <w:rPr>
-          <w:rFonts w:ascii="Century Gothic" w:hAnsi="Century Gothic" w:cs="Courier New"/>
-          <w:sz w:val="22"/>
-          <w:szCs w:val="22"/>
-        </w:rPr>
-        <w:t>/api/annuncinoattivi</w:t>
-      </w:r>
-    </w:p>
-    <w:p>
-      <w:pPr>
-        <w:pStyle w:val="Testonormale"/>
-        <w:numPr>
-          <w:ilvl w:val="0"/>
-          <w:numId w:val="3"/>
-        </w:numPr>
-        <w:rPr>
-          <w:rFonts w:ascii="Century Gothic" w:hAnsi="Century Gothic" w:cs="Courier New"/>
-          <w:sz w:val="22"/>
-          <w:szCs w:val="22"/>
-        </w:rPr>
-      </w:pPr>
-      <w:r>
-        <w:rPr>
-          <w:rFonts w:ascii="Century Gothic" w:hAnsi="Century Gothic" w:cs="Courier New"/>
-          <w:sz w:val="22"/>
-          <w:szCs w:val="22"/>
-        </w:rPr>
-        <w:t>/api/annunci/prezzo/:prezzomax</w:t>
-      </w:r>
-    </w:p>
-    <w:p>
-      <w:pPr>
-        <w:pStyle w:val="Testonormale"/>
-        <w:numPr>
-          <w:ilvl w:val="0"/>
-          <w:numId w:val="3"/>
-        </w:numPr>
-        <w:rPr>
-          <w:rFonts w:ascii="Century Gothic" w:hAnsi="Century Gothic" w:cs="Courier New"/>
-          <w:sz w:val="22"/>
-          <w:szCs w:val="22"/>
-        </w:rPr>
-      </w:pPr>
-      <w:r>
-        <w:rPr>
-          <w:rFonts w:ascii="Century Gothic" w:hAnsi="Century Gothic" w:cs="Courier New"/>
-          <w:sz w:val="22"/>
-          <w:szCs w:val="22"/>
-        </w:rPr>
-        <w:t>/api/annunci/tipo/:tipo/:prezzomax</w:t>
-      </w:r>
-    </w:p>
-    <w:p>
-      <w:pPr>
-        <w:pStyle w:val="Testonormale"/>
-        <w:numPr>
-          <w:ilvl w:val="0"/>
-          <w:numId w:val="3"/>
-        </w:numPr>
-        <w:rPr>
-          <w:rFonts w:ascii="Century Gothic" w:hAnsi="Century Gothic" w:cs="Courier New"/>
-          <w:sz w:val="22"/>
-          <w:szCs w:val="22"/>
-        </w:rPr>
-      </w:pPr>
-      <w:r>
-        <w:rPr>
-          <w:rFonts w:ascii="Century Gothic" w:hAnsi="Century Gothic" w:cs="Courier New"/>
-          <w:sz w:val="22"/>
-          <w:szCs w:val="22"/>
-        </w:rPr>
-        <w:t>/api/annunci/quartiere/:id/:prezzomax</w:t>
-      </w:r>
-    </w:p>
-    <w:p>
-      <w:pPr>
-        <w:pStyle w:val="Testonormale"/>
-        <w:numPr>
-          <w:ilvl w:val="0"/>
-          <w:numId w:val="3"/>
-        </w:numPr>
-        <w:rPr>
-          <w:rFonts w:ascii="Century Gothic" w:hAnsi="Century Gothic" w:cs="Courier New"/>
-          <w:sz w:val="22"/>
-          <w:szCs w:val="22"/>
-        </w:rPr>
-      </w:pPr>
-      <w:r>
-        <w:rPr>
-          <w:rFonts w:ascii="Century Gothic" w:hAnsi="Century Gothic" w:cs="Courier New"/>
-          <w:sz w:val="22"/>
-          <w:szCs w:val="22"/>
-        </w:rPr>
-        <w:t>/api/annunci/filter/:tipo/:quartiere/:prezzomax</w:t>
-      </w:r>
-    </w:p>
-    <w:p>
-      <w:pPr>
-        <w:pStyle w:val="Testonormale"/>
-        <w:numPr>
-          <w:ilvl w:val="0"/>
-          <w:numId w:val="3"/>
-        </w:numPr>
-        <w:rPr>
-          <w:rFonts w:ascii="Century Gothic" w:hAnsi="Century Gothic" w:cs="Courier New"/>
-          <w:sz w:val="22"/>
-          <w:szCs w:val="22"/>
-        </w:rPr>
-      </w:pPr>
-      <w:r>
-        <w:rPr>
-          <w:rFonts w:ascii="Century Gothic" w:hAnsi="Century Gothic" w:cs="Courier New"/>
-          <w:sz w:val="22"/>
-          <w:szCs w:val="22"/>
-        </w:rPr>
-        <w:t>/api/annunci/utente/:mail</w:t>
-      </w:r>
-    </w:p>
-    <w:p>
-      <w:pPr>
-        <w:pStyle w:val="Testonormale"/>
-        <w:numPr>
-          <w:ilvl w:val="0"/>
-          <w:numId w:val="3"/>
-        </w:numPr>
-        <w:rPr>
-          <w:rFonts w:ascii="Century Gothic" w:hAnsi="Century Gothic" w:cs="Courier New"/>
-          <w:sz w:val="22"/>
-          <w:szCs w:val="22"/>
-        </w:rPr>
-      </w:pPr>
-      <w:r>
-        <w:rPr>
-          <w:rFonts w:ascii="Century Gothic" w:hAnsi="Century Gothic" w:cs="Courier New"/>
-          <w:sz w:val="22"/>
-          <w:szCs w:val="22"/>
-        </w:rPr>
-        <w:t>/api/tipi-annuncio</w:t>
-      </w:r>
-    </w:p>
-    <w:p>
-      <w:pPr>
-        <w:pStyle w:val="Testonormale"/>
-        <w:numPr>
-          <w:ilvl w:val="0"/>
-          <w:numId w:val="3"/>
-        </w:numPr>
-        <w:rPr>
-          <w:rFonts w:ascii="Century Gothic" w:hAnsi="Century Gothic" w:cs="Courier New"/>
-          <w:sz w:val="22"/>
-          <w:szCs w:val="22"/>
-        </w:rPr>
-      </w:pPr>
-      <w:r>
-        <w:rPr>
-          <w:rFonts w:ascii="Century Gothic" w:hAnsi="Century Gothic" w:cs="Courier New"/>
-          <w:sz w:val="22"/>
-          <w:szCs w:val="22"/>
-        </w:rPr>
-        <w:t>/api/servizi</w:t>
-      </w:r>
-    </w:p>
-    <w:p>
-      <w:pPr>
-        <w:pStyle w:val="Testonormale"/>
-        <w:numPr>
-          <w:ilvl w:val="0"/>
-          <w:numId w:val="3"/>
-        </w:numPr>
-        <w:rPr>
-          <w:rFonts w:ascii="Century Gothic" w:hAnsi="Century Gothic" w:cs="Courier New"/>
-          <w:sz w:val="22"/>
-          <w:szCs w:val="22"/>
-        </w:rPr>
-      </w:pPr>
-      <w:r>
-        <w:rPr>
-          <w:rFonts w:ascii="Century Gothic" w:hAnsi="Century Gothic" w:cs="Courier New"/>
-          <w:sz w:val="22"/>
-          <w:szCs w:val="22"/>
-        </w:rPr>
-        <w:t>/api/quartieri</w:t>
-      </w:r>
-    </w:p>
-    <w:p>
-      <w:pPr>
-        <w:pStyle w:val="Testonormale"/>
-        <w:numPr>
-          <w:ilvl w:val="0"/>
-          <w:numId w:val="3"/>
-        </w:numPr>
-        <w:rPr>
-          <w:rFonts w:ascii="Century Gothic" w:hAnsi="Century Gothic" w:cs="Courier New"/>
-          <w:sz w:val="22"/>
-          <w:szCs w:val="22"/>
-        </w:rPr>
-      </w:pPr>
-      <w:r>
-        <w:rPr>
-          <w:rFonts w:ascii="Century Gothic" w:hAnsi="Century Gothic" w:cs="Courier New"/>
-          <w:sz w:val="22"/>
-          <w:szCs w:val="22"/>
-        </w:rPr>
-        <w:t>/api/preferiti</w:t>
-      </w:r>
-    </w:p>
-    <w:p>
-      <w:pPr>
-        <w:pStyle w:val="Testonormale"/>
-        <w:rPr>
-          <w:rFonts w:ascii="Century Gothic" w:hAnsi="Century Gothic" w:cs="Courier New"/>
-        </w:rPr>
-      </w:pPr>
-    </w:p>
-    <w:p>
-      <w:pPr>
-        <w:pStyle w:val="Testonormale"/>
-        <w:spacing w:after="240"/>
-        <w:rPr>
-          <w:rFonts w:ascii="Century Gothic" w:hAnsi="Century Gothic" w:cs="Courier New"/>
-          <w:b/>
-          <w:sz w:val="22"/>
-          <w:szCs w:val="22"/>
-          <w:u w:val="single"/>
-        </w:rPr>
-      </w:pPr>
-      <w:r>
-        <w:rPr>
-          <w:rFonts w:ascii="Century Gothic" w:hAnsi="Century Gothic" w:cs="Courier New"/>
-          <w:b/>
-          <w:sz w:val="22"/>
-          <w:szCs w:val="22"/>
-          <w:u w:val="single"/>
-        </w:rPr>
-        <w:t>POST</w:t>
-      </w:r>
-    </w:p>
-    <w:p>
-      <w:pPr>
-        <w:pStyle w:val="Testonormale"/>
-        <w:numPr>
-          <w:ilvl w:val="0"/>
-          <w:numId w:val="3"/>
-        </w:numPr>
-        <w:rPr>
-          <w:rFonts w:ascii="Century Gothic" w:hAnsi="Century Gothic" w:cs="Courier New"/>
-          <w:sz w:val="22"/>
-          <w:szCs w:val="22"/>
-        </w:rPr>
-      </w:pPr>
-      <w:r>
-        <w:rPr>
-          <w:rFonts w:ascii="Century Gothic" w:hAnsi="Century Gothic" w:cs="Courier New"/>
-          <w:sz w:val="22"/>
-          <w:szCs w:val="22"/>
-        </w:rPr>
-        <w:t>/api/auth/register</w:t>
-      </w:r>
-    </w:p>
-    <w:p>
-      <w:pPr>
-        <w:pStyle w:val="Testonormale"/>
-        <w:numPr>
-          <w:ilvl w:val="0"/>
-          <w:numId w:val="3"/>
-        </w:numPr>
-        <w:rPr>
-          <w:rFonts w:ascii="Century Gothic" w:hAnsi="Century Gothic" w:cs="Courier New"/>
-          <w:sz w:val="22"/>
-          <w:szCs w:val="22"/>
-        </w:rPr>
-      </w:pPr>
-      <w:r>
-        <w:rPr>
-          <w:rFonts w:ascii="Century Gothic" w:hAnsi="Century Gothic" w:cs="Courier New"/>
-          <w:sz w:val="22"/>
-          <w:szCs w:val="22"/>
-        </w:rPr>
-        <w:t>/api/auth/login</w:t>
-      </w:r>
-    </w:p>
-    <w:p>
-      <w:pPr>
-        <w:pStyle w:val="Testonormale"/>
-        <w:numPr>
-          <w:ilvl w:val="0"/>
-          <w:numId w:val="3"/>
-        </w:numPr>
-        <w:rPr>
-          <w:rFonts w:ascii="Century Gothic" w:hAnsi="Century Gothic" w:cs="Courier New"/>
-          <w:sz w:val="22"/>
-          <w:szCs w:val="22"/>
-        </w:rPr>
-      </w:pPr>
-      <w:r>
-        <w:rPr>
-          <w:rFonts w:ascii="Century Gothic" w:hAnsi="Century Gothic" w:cs="Courier New"/>
-          <w:sz w:val="22"/>
-          <w:szCs w:val="22"/>
-        </w:rPr>
-        <w:t>/api/auth/logout</w:t>
-      </w:r>
-    </w:p>
-    <w:p>
-      <w:pPr>
-        <w:pStyle w:val="Testonormale"/>
-        <w:numPr>
-          <w:ilvl w:val="0"/>
-          <w:numId w:val="3"/>
-        </w:numPr>
-        <w:rPr>
-          <w:rFonts w:ascii="Century Gothic" w:hAnsi="Century Gothic" w:cs="Courier New"/>
-          <w:sz w:val="22"/>
-          <w:szCs w:val="22"/>
-        </w:rPr>
-      </w:pPr>
-      <w:r>
-        <w:rPr>
-          <w:rFonts w:ascii="Century Gothic" w:hAnsi="Century Gothic" w:cs="Courier New"/>
-          <w:sz w:val="22"/>
-          <w:szCs w:val="22"/>
-        </w:rPr>
-        <w:t>/api/preferiti</w:t>
-      </w:r>
-    </w:p>
-    <w:p>
-      <w:pPr>
-        <w:pStyle w:val="Testonormale"/>
-        <w:numPr>
-          <w:ilvl w:val="0"/>
-          <w:numId w:val="3"/>
-        </w:numPr>
-        <w:rPr>
-          <w:rFonts w:ascii="Century Gothic" w:hAnsi="Century Gothic" w:cs="Courier New"/>
-          <w:sz w:val="22"/>
-          <w:szCs w:val="22"/>
-        </w:rPr>
-      </w:pPr>
-      <w:r>
-        <w:rPr>
-          <w:rFonts w:ascii="Century Gothic" w:hAnsi="Century Gothic" w:cs="Courier New"/>
-          <w:sz w:val="22"/>
-          <w:szCs w:val="22"/>
-        </w:rPr>
-        <w:t>/api/annunci/create</w:t>
-      </w:r>
-    </w:p>
-    <w:p>
-      <w:pPr>
-        <w:pStyle w:val="Testonormale"/>
-        <w:numPr>
-          <w:ilvl w:val="0"/>
-          <w:numId w:val="3"/>
-        </w:numPr>
-        <w:rPr>
-          <w:rFonts w:ascii="Century Gothic" w:hAnsi="Century Gothic" w:cs="Courier New"/>
-          <w:sz w:val="22"/>
-          <w:szCs w:val="22"/>
-        </w:rPr>
-      </w:pPr>
-      <w:r>
-        <w:rPr>
-          <w:rFonts w:ascii="Century Gothic" w:hAnsi="Century Gothic" w:cs="Courier New"/>
-          <w:sz w:val="22"/>
-          <w:szCs w:val="22"/>
-        </w:rPr>
-        <w:t>/api/annunci/update/:id</w:t>
-      </w:r>
-    </w:p>
-    <w:p>
-      <w:pPr>
-        <w:pStyle w:val="Testonormale"/>
-        <w:numPr>
-          <w:ilvl w:val="0"/>
-          <w:numId w:val="3"/>
-        </w:numPr>
-        <w:rPr>
-          <w:rFonts w:ascii="Century Gothic" w:hAnsi="Century Gothic" w:cs="Courier New"/>
-          <w:sz w:val="22"/>
-          <w:szCs w:val="22"/>
-        </w:rPr>
-      </w:pPr>
-      <w:r>
-        <w:rPr>
-          <w:rFonts w:ascii="Century Gothic" w:hAnsi="Century Gothic" w:cs="Courier New"/>
-          <w:sz w:val="22"/>
-          <w:szCs w:val="22"/>
-        </w:rPr>
-        <w:t>/api/annunci/modifica/:id</w:t>
-      </w:r>
-    </w:p>
-    <w:p>
-      <w:pPr>
-        <w:pStyle w:val="Testonormale"/>
-        <w:rPr>
-          <w:rFonts w:ascii="Century Gothic" w:hAnsi="Century Gothic" w:cs="Courier New"/>
-        </w:rPr>
-      </w:pPr>
-    </w:p>
-    <w:p>
-      <w:pPr>
-        <w:pStyle w:val="Testonormale"/>
-        <w:spacing w:after="240"/>
-        <w:rPr>
-          <w:rFonts w:ascii="Century Gothic" w:hAnsi="Century Gothic" w:cs="Courier New"/>
-          <w:b/>
-          <w:sz w:val="22"/>
-          <w:szCs w:val="22"/>
-          <w:u w:val="single"/>
-        </w:rPr>
-      </w:pPr>
-      <w:r>
-        <w:rPr>
-          <w:rFonts w:ascii="Century Gothic" w:hAnsi="Century Gothic" w:cs="Courier New"/>
-          <w:b/>
-          <w:sz w:val="22"/>
-          <w:szCs w:val="22"/>
-          <w:u w:val="single"/>
-        </w:rPr>
-        <w:t>DELETE</w:t>
-      </w:r>
-    </w:p>
-    <w:p>
-      <w:pPr>
-        <w:pStyle w:val="Testonormale"/>
-        <w:numPr>
-          <w:ilvl w:val="0"/>
-          <w:numId w:val="3"/>
-        </w:numPr>
-        <w:rPr>
-          <w:rFonts w:ascii="Century Gothic" w:hAnsi="Century Gothic" w:cs="Courier New"/>
-          <w:sz w:val="22"/>
-          <w:szCs w:val="22"/>
-        </w:rPr>
-      </w:pPr>
-      <w:r>
-        <w:rPr>
-          <w:rFonts w:ascii="Century Gothic" w:hAnsi="Century Gothic" w:cs="Courier New"/>
-          <w:sz w:val="22"/>
-          <w:szCs w:val="22"/>
-        </w:rPr>
-        <w:t>/api/preferiti/:annuncio_id</w:t>
-      </w:r>
-    </w:p>
-    <w:p>
-      <w:pPr>
-        <w:pStyle w:val="Testonormale"/>
-        <w:numPr>
-          <w:ilvl w:val="0"/>
-          <w:numId w:val="3"/>
-        </w:numPr>
-        <w:rPr>
-          <w:rFonts w:ascii="Century Gothic" w:hAnsi="Century Gothic" w:cs="Courier New"/>
-          <w:sz w:val="22"/>
-          <w:szCs w:val="22"/>
-        </w:rPr>
-      </w:pPr>
-      <w:r>
-        <w:rPr>
-          <w:rFonts w:ascii="Century Gothic" w:hAnsi="Century Gothic" w:cs="Courier New"/>
-          <w:sz w:val="22"/>
-          <w:szCs w:val="22"/>
-        </w:rPr>
-        <w:t>/api/annunci/delete/:id</w:t>
-      </w:r>
-    </w:p>
-    <w:p>
-      <w:pPr>
-        <w:pStyle w:val="Testonormale"/>
-        <w:rPr>
-          <w:rFonts w:ascii="Century Gothic" w:hAnsi="Century Gothic" w:cs="Courier New"/>
-        </w:rPr>
-      </w:pPr>
-    </w:p>
-    <w:p>
-      <w:pPr>
-        <w:pStyle w:val="Testonormale"/>
-        <w:spacing w:after="240"/>
+      </w:pPr>
+      <w:r>
         <w:rPr>
           <w:rFonts w:ascii="Century Gothic" w:hAnsi="Century Gothic" w:cs="Courier New"/>
           <w:b/>
           <w:sz w:val="28"/>
           <w:szCs w:val="28"/>
         </w:rPr>
-      </w:pPr>
-      <w:r>
+        <w:t>API endpoint</w:t>
+      </w:r>
+    </w:p>
+    <w:p>
+      <w:pPr>
+        <w:pStyle w:val="Testonormale"/>
+        <w:rPr>
+          <w:rFonts w:ascii="Century Gothic" w:hAnsi="Century Gothic" w:cs="Courier New"/>
+        </w:rPr>
+      </w:pPr>
+    </w:p>
+    <w:p>
+      <w:pPr>
+        <w:pStyle w:val="Testonormale"/>
+        <w:spacing w:after="240"/>
+        <w:rPr>
+          <w:rFonts w:ascii="Century Gothic" w:hAnsi="Century Gothic" w:cs="Courier New"/>
+          <w:b/>
+          <w:sz w:val="22"/>
+          <w:szCs w:val="22"/>
+          <w:u w:val="single"/>
+        </w:rPr>
+      </w:pPr>
+      <w:r>
+        <w:rPr>
+          <w:rFonts w:ascii="Century Gothic" w:hAnsi="Century Gothic" w:cs="Courier New"/>
+          <w:b/>
+          <w:sz w:val="22"/>
+          <w:szCs w:val="22"/>
+          <w:u w:val="single"/>
+        </w:rPr>
+        <w:t>GET</w:t>
+      </w:r>
+    </w:p>
+    <w:p>
+      <w:pPr>
+        <w:pStyle w:val="Testonormale"/>
+        <w:numPr>
+          <w:ilvl w:val="0"/>
+          <w:numId w:val="3"/>
+        </w:numPr>
+        <w:rPr>
+          <w:rFonts w:ascii="Century Gothic" w:hAnsi="Century Gothic" w:cs="Courier New"/>
+          <w:sz w:val="22"/>
+          <w:szCs w:val="22"/>
+        </w:rPr>
+      </w:pPr>
+      <w:r>
+        <w:rPr>
+          <w:rFonts w:ascii="Century Gothic" w:hAnsi="Century Gothic" w:cs="Courier New"/>
+          <w:sz w:val="22"/>
+          <w:szCs w:val="22"/>
+        </w:rPr>
+        <w:t>/api/news</w:t>
+      </w:r>
+    </w:p>
+    <w:p>
+      <w:pPr>
+        <w:pStyle w:val="Testonormale"/>
+        <w:numPr>
+          <w:ilvl w:val="0"/>
+          <w:numId w:val="3"/>
+        </w:numPr>
+        <w:rPr>
+          <w:rFonts w:ascii="Century Gothic" w:hAnsi="Century Gothic" w:cs="Courier New"/>
+          <w:sz w:val="22"/>
+          <w:szCs w:val="22"/>
+        </w:rPr>
+      </w:pPr>
+      <w:r>
+        <w:rPr>
+          <w:rFonts w:ascii="Century Gothic" w:hAnsi="Century Gothic" w:cs="Courier New"/>
+          <w:sz w:val="22"/>
+          <w:szCs w:val="22"/>
+        </w:rPr>
+        <w:t>/api/news/:id</w:t>
+      </w:r>
+    </w:p>
+    <w:p>
+      <w:pPr>
+        <w:pStyle w:val="Testonormale"/>
+        <w:numPr>
+          <w:ilvl w:val="0"/>
+          <w:numId w:val="3"/>
+        </w:numPr>
+        <w:rPr>
+          <w:rFonts w:ascii="Century Gothic" w:hAnsi="Century Gothic" w:cs="Courier New"/>
+          <w:sz w:val="22"/>
+          <w:szCs w:val="22"/>
+        </w:rPr>
+      </w:pPr>
+      <w:r>
+        <w:rPr>
+          <w:rFonts w:ascii="Century Gothic" w:hAnsi="Century Gothic" w:cs="Courier New"/>
+          <w:sz w:val="22"/>
+          <w:szCs w:val="22"/>
+        </w:rPr>
+        <w:t>/api/</w:t>
+      </w:r>
+      <w:proofErr w:type="spellStart"/>
+      <w:r>
+        <w:rPr>
+          <w:rFonts w:ascii="Century Gothic" w:hAnsi="Century Gothic" w:cs="Courier New"/>
+          <w:sz w:val="22"/>
+          <w:szCs w:val="22"/>
+        </w:rPr>
+        <w:t>auth</w:t>
+      </w:r>
+      <w:proofErr w:type="spellEnd"/>
+      <w:r>
+        <w:rPr>
+          <w:rFonts w:ascii="Century Gothic" w:hAnsi="Century Gothic" w:cs="Courier New"/>
+          <w:sz w:val="22"/>
+          <w:szCs w:val="22"/>
+        </w:rPr>
+        <w:t>/</w:t>
+      </w:r>
+      <w:proofErr w:type="spellStart"/>
+      <w:r>
+        <w:rPr>
+          <w:rFonts w:ascii="Century Gothic" w:hAnsi="Century Gothic" w:cs="Courier New"/>
+          <w:sz w:val="22"/>
+          <w:szCs w:val="22"/>
+        </w:rPr>
+        <w:t>profile</w:t>
+      </w:r>
+      <w:proofErr w:type="spellEnd"/>
+    </w:p>
+    <w:p>
+      <w:pPr>
+        <w:pStyle w:val="Testonormale"/>
+        <w:numPr>
+          <w:ilvl w:val="0"/>
+          <w:numId w:val="3"/>
+        </w:numPr>
+        <w:rPr>
+          <w:rFonts w:ascii="Century Gothic" w:hAnsi="Century Gothic" w:cs="Courier New"/>
+          <w:sz w:val="22"/>
+          <w:szCs w:val="22"/>
+        </w:rPr>
+      </w:pPr>
+      <w:r>
+        <w:rPr>
+          <w:rFonts w:ascii="Century Gothic" w:hAnsi="Century Gothic" w:cs="Courier New"/>
+          <w:sz w:val="22"/>
+          <w:szCs w:val="22"/>
+        </w:rPr>
+        <w:t>/api/annunci</w:t>
+      </w:r>
+    </w:p>
+    <w:p>
+      <w:pPr>
+        <w:pStyle w:val="Testonormale"/>
+        <w:numPr>
+          <w:ilvl w:val="0"/>
+          <w:numId w:val="3"/>
+        </w:numPr>
+        <w:rPr>
+          <w:rFonts w:ascii="Century Gothic" w:hAnsi="Century Gothic" w:cs="Courier New"/>
+          <w:sz w:val="22"/>
+          <w:szCs w:val="22"/>
+        </w:rPr>
+      </w:pPr>
+      <w:r>
+        <w:rPr>
+          <w:rFonts w:ascii="Century Gothic" w:hAnsi="Century Gothic" w:cs="Courier New"/>
+          <w:sz w:val="22"/>
+          <w:szCs w:val="22"/>
+        </w:rPr>
+        <w:t>/api/</w:t>
+      </w:r>
+      <w:proofErr w:type="spellStart"/>
+      <w:r>
+        <w:rPr>
+          <w:rFonts w:ascii="Century Gothic" w:hAnsi="Century Gothic" w:cs="Courier New"/>
+          <w:sz w:val="22"/>
+          <w:szCs w:val="22"/>
+        </w:rPr>
+        <w:t>lastannunci</w:t>
+      </w:r>
+      <w:proofErr w:type="spellEnd"/>
+    </w:p>
+    <w:p>
+      <w:pPr>
+        <w:pStyle w:val="Testonormale"/>
+        <w:numPr>
+          <w:ilvl w:val="0"/>
+          <w:numId w:val="3"/>
+        </w:numPr>
+        <w:rPr>
+          <w:rFonts w:ascii="Century Gothic" w:hAnsi="Century Gothic" w:cs="Courier New"/>
+          <w:sz w:val="22"/>
+          <w:szCs w:val="22"/>
+        </w:rPr>
+      </w:pPr>
+      <w:r>
+        <w:rPr>
+          <w:rFonts w:ascii="Century Gothic" w:hAnsi="Century Gothic" w:cs="Courier New"/>
+          <w:sz w:val="22"/>
+          <w:szCs w:val="22"/>
+        </w:rPr>
+        <w:t>/api/annunci/:id</w:t>
+      </w:r>
+    </w:p>
+    <w:p>
+      <w:pPr>
+        <w:pStyle w:val="Testonormale"/>
+        <w:numPr>
+          <w:ilvl w:val="0"/>
+          <w:numId w:val="3"/>
+        </w:numPr>
+        <w:rPr>
+          <w:rFonts w:ascii="Century Gothic" w:hAnsi="Century Gothic" w:cs="Courier New"/>
+          <w:sz w:val="22"/>
+          <w:szCs w:val="22"/>
+        </w:rPr>
+      </w:pPr>
+      <w:r>
+        <w:rPr>
+          <w:rFonts w:ascii="Century Gothic" w:hAnsi="Century Gothic" w:cs="Courier New"/>
+          <w:sz w:val="22"/>
+          <w:szCs w:val="22"/>
+        </w:rPr>
+        <w:t>/api/</w:t>
+      </w:r>
+      <w:proofErr w:type="spellStart"/>
+      <w:r>
+        <w:rPr>
+          <w:rFonts w:ascii="Century Gothic" w:hAnsi="Century Gothic" w:cs="Courier New"/>
+          <w:sz w:val="22"/>
+          <w:szCs w:val="22"/>
+        </w:rPr>
+        <w:t>annuncinoattivi</w:t>
+      </w:r>
+      <w:proofErr w:type="spellEnd"/>
+    </w:p>
+    <w:p>
+      <w:pPr>
+        <w:pStyle w:val="Testonormale"/>
+        <w:numPr>
+          <w:ilvl w:val="0"/>
+          <w:numId w:val="3"/>
+        </w:numPr>
+        <w:rPr>
+          <w:rFonts w:ascii="Century Gothic" w:hAnsi="Century Gothic" w:cs="Courier New"/>
+          <w:sz w:val="22"/>
+          <w:szCs w:val="22"/>
+        </w:rPr>
+      </w:pPr>
+      <w:r>
+        <w:rPr>
+          <w:rFonts w:ascii="Century Gothic" w:hAnsi="Century Gothic" w:cs="Courier New"/>
+          <w:sz w:val="22"/>
+          <w:szCs w:val="22"/>
+        </w:rPr>
+        <w:t>/api/annunci/prezzo</w:t>
+      </w:r>
+      <w:proofErr w:type="gramStart"/>
+      <w:r>
+        <w:rPr>
+          <w:rFonts w:ascii="Century Gothic" w:hAnsi="Century Gothic" w:cs="Courier New"/>
+          <w:sz w:val="22"/>
+          <w:szCs w:val="22"/>
+        </w:rPr>
+        <w:t>/:</w:t>
+      </w:r>
+      <w:proofErr w:type="spellStart"/>
+      <w:r>
+        <w:rPr>
+          <w:rFonts w:ascii="Century Gothic" w:hAnsi="Century Gothic" w:cs="Courier New"/>
+          <w:sz w:val="22"/>
+          <w:szCs w:val="22"/>
+        </w:rPr>
+        <w:t>prezzomax</w:t>
+      </w:r>
+      <w:proofErr w:type="spellEnd"/>
+      <w:proofErr w:type="gramEnd"/>
+    </w:p>
+    <w:p>
+      <w:pPr>
+        <w:pStyle w:val="Testonormale"/>
+        <w:numPr>
+          <w:ilvl w:val="0"/>
+          <w:numId w:val="3"/>
+        </w:numPr>
+        <w:rPr>
+          <w:rFonts w:ascii="Century Gothic" w:hAnsi="Century Gothic" w:cs="Courier New"/>
+          <w:sz w:val="22"/>
+          <w:szCs w:val="22"/>
+        </w:rPr>
+      </w:pPr>
+      <w:r>
+        <w:rPr>
+          <w:rFonts w:ascii="Century Gothic" w:hAnsi="Century Gothic" w:cs="Courier New"/>
+          <w:sz w:val="22"/>
+          <w:szCs w:val="22"/>
+        </w:rPr>
+        <w:t>/api/annunci/tipo</w:t>
+      </w:r>
+      <w:proofErr w:type="gramStart"/>
+      <w:r>
+        <w:rPr>
+          <w:rFonts w:ascii="Century Gothic" w:hAnsi="Century Gothic" w:cs="Courier New"/>
+          <w:sz w:val="22"/>
+          <w:szCs w:val="22"/>
+        </w:rPr>
+        <w:t>/:tipo</w:t>
+      </w:r>
+      <w:proofErr w:type="gramEnd"/>
+      <w:r>
+        <w:rPr>
+          <w:rFonts w:ascii="Century Gothic" w:hAnsi="Century Gothic" w:cs="Courier New"/>
+          <w:sz w:val="22"/>
+          <w:szCs w:val="22"/>
+        </w:rPr>
+        <w:t>/:</w:t>
+      </w:r>
+      <w:proofErr w:type="spellStart"/>
+      <w:r>
+        <w:rPr>
+          <w:rFonts w:ascii="Century Gothic" w:hAnsi="Century Gothic" w:cs="Courier New"/>
+          <w:sz w:val="22"/>
+          <w:szCs w:val="22"/>
+        </w:rPr>
+        <w:t>prezzomax</w:t>
+      </w:r>
+      <w:proofErr w:type="spellEnd"/>
+    </w:p>
+    <w:p>
+      <w:pPr>
+        <w:pStyle w:val="Testonormale"/>
+        <w:numPr>
+          <w:ilvl w:val="0"/>
+          <w:numId w:val="3"/>
+        </w:numPr>
+        <w:rPr>
+          <w:rFonts w:ascii="Century Gothic" w:hAnsi="Century Gothic" w:cs="Courier New"/>
+          <w:sz w:val="22"/>
+          <w:szCs w:val="22"/>
+        </w:rPr>
+      </w:pPr>
+      <w:r>
+        <w:rPr>
+          <w:rFonts w:ascii="Century Gothic" w:hAnsi="Century Gothic" w:cs="Courier New"/>
+          <w:sz w:val="22"/>
+          <w:szCs w:val="22"/>
+        </w:rPr>
+        <w:t>/api/annunci/quartiere/:id</w:t>
+      </w:r>
+      <w:proofErr w:type="gramStart"/>
+      <w:r>
+        <w:rPr>
+          <w:rFonts w:ascii="Century Gothic" w:hAnsi="Century Gothic" w:cs="Courier New"/>
+          <w:sz w:val="22"/>
+          <w:szCs w:val="22"/>
+        </w:rPr>
+        <w:t>/:</w:t>
+      </w:r>
+      <w:proofErr w:type="spellStart"/>
+      <w:r>
+        <w:rPr>
+          <w:rFonts w:ascii="Century Gothic" w:hAnsi="Century Gothic" w:cs="Courier New"/>
+          <w:sz w:val="22"/>
+          <w:szCs w:val="22"/>
+        </w:rPr>
+        <w:t>prezzomax</w:t>
+      </w:r>
+      <w:proofErr w:type="spellEnd"/>
+      <w:proofErr w:type="gramEnd"/>
+    </w:p>
+    <w:p>
+      <w:pPr>
+        <w:pStyle w:val="Testonormale"/>
+        <w:numPr>
+          <w:ilvl w:val="0"/>
+          <w:numId w:val="3"/>
+        </w:numPr>
+        <w:rPr>
+          <w:rFonts w:ascii="Century Gothic" w:hAnsi="Century Gothic" w:cs="Courier New"/>
+          <w:sz w:val="22"/>
+          <w:szCs w:val="22"/>
+        </w:rPr>
+      </w:pPr>
+      <w:r>
+        <w:rPr>
+          <w:rFonts w:ascii="Century Gothic" w:hAnsi="Century Gothic" w:cs="Courier New"/>
+          <w:sz w:val="22"/>
+          <w:szCs w:val="22"/>
+        </w:rPr>
+        <w:t>/api/annunci/filter</w:t>
+      </w:r>
+      <w:proofErr w:type="gramStart"/>
+      <w:r>
+        <w:rPr>
+          <w:rFonts w:ascii="Century Gothic" w:hAnsi="Century Gothic" w:cs="Courier New"/>
+          <w:sz w:val="22"/>
+          <w:szCs w:val="22"/>
+        </w:rPr>
+        <w:t>/:tipo</w:t>
+      </w:r>
+      <w:proofErr w:type="gramEnd"/>
+      <w:r>
+        <w:rPr>
+          <w:rFonts w:ascii="Century Gothic" w:hAnsi="Century Gothic" w:cs="Courier New"/>
+          <w:sz w:val="22"/>
+          <w:szCs w:val="22"/>
+        </w:rPr>
+        <w:t>/:quartiere/:</w:t>
+      </w:r>
+      <w:proofErr w:type="spellStart"/>
+      <w:r>
+        <w:rPr>
+          <w:rFonts w:ascii="Century Gothic" w:hAnsi="Century Gothic" w:cs="Courier New"/>
+          <w:sz w:val="22"/>
+          <w:szCs w:val="22"/>
+        </w:rPr>
+        <w:t>prezzomax</w:t>
+      </w:r>
+      <w:proofErr w:type="spellEnd"/>
+    </w:p>
+    <w:p>
+      <w:pPr>
+        <w:pStyle w:val="Testonormale"/>
+        <w:numPr>
+          <w:ilvl w:val="0"/>
+          <w:numId w:val="3"/>
+        </w:numPr>
+        <w:rPr>
+          <w:rFonts w:ascii="Century Gothic" w:hAnsi="Century Gothic" w:cs="Courier New"/>
+          <w:sz w:val="22"/>
+          <w:szCs w:val="22"/>
+        </w:rPr>
+      </w:pPr>
+      <w:r>
+        <w:rPr>
+          <w:rFonts w:ascii="Century Gothic" w:hAnsi="Century Gothic" w:cs="Courier New"/>
+          <w:sz w:val="22"/>
+          <w:szCs w:val="22"/>
+        </w:rPr>
+        <w:t>/api/annunci/utente</w:t>
+      </w:r>
+      <w:proofErr w:type="gramStart"/>
+      <w:r>
+        <w:rPr>
+          <w:rFonts w:ascii="Century Gothic" w:hAnsi="Century Gothic" w:cs="Courier New"/>
+          <w:sz w:val="22"/>
+          <w:szCs w:val="22"/>
+        </w:rPr>
+        <w:t>/:mail</w:t>
+      </w:r>
+      <w:proofErr w:type="gramEnd"/>
+    </w:p>
+    <w:p>
+      <w:pPr>
+        <w:pStyle w:val="Testonormale"/>
+        <w:numPr>
+          <w:ilvl w:val="0"/>
+          <w:numId w:val="3"/>
+        </w:numPr>
+        <w:rPr>
+          <w:rFonts w:ascii="Century Gothic" w:hAnsi="Century Gothic" w:cs="Courier New"/>
+          <w:sz w:val="22"/>
+          <w:szCs w:val="22"/>
+        </w:rPr>
+      </w:pPr>
+      <w:r>
+        <w:rPr>
+          <w:rFonts w:ascii="Century Gothic" w:hAnsi="Century Gothic" w:cs="Courier New"/>
+          <w:sz w:val="22"/>
+          <w:szCs w:val="22"/>
+        </w:rPr>
+        <w:t>/api/tipi-annuncio</w:t>
+      </w:r>
+    </w:p>
+    <w:p>
+      <w:pPr>
+        <w:pStyle w:val="Testonormale"/>
+        <w:numPr>
+          <w:ilvl w:val="0"/>
+          <w:numId w:val="3"/>
+        </w:numPr>
+        <w:rPr>
+          <w:rFonts w:ascii="Century Gothic" w:hAnsi="Century Gothic" w:cs="Courier New"/>
+          <w:sz w:val="22"/>
+          <w:szCs w:val="22"/>
+        </w:rPr>
+      </w:pPr>
+      <w:r>
+        <w:rPr>
+          <w:rFonts w:ascii="Century Gothic" w:hAnsi="Century Gothic" w:cs="Courier New"/>
+          <w:sz w:val="22"/>
+          <w:szCs w:val="22"/>
+        </w:rPr>
+        <w:t>/api/servizi</w:t>
+      </w:r>
+    </w:p>
+    <w:p>
+      <w:pPr>
+        <w:pStyle w:val="Testonormale"/>
+        <w:numPr>
+          <w:ilvl w:val="0"/>
+          <w:numId w:val="3"/>
+        </w:numPr>
+        <w:rPr>
+          <w:rFonts w:ascii="Century Gothic" w:hAnsi="Century Gothic" w:cs="Courier New"/>
+          <w:sz w:val="22"/>
+          <w:szCs w:val="22"/>
+        </w:rPr>
+      </w:pPr>
+      <w:r>
+        <w:rPr>
+          <w:rFonts w:ascii="Century Gothic" w:hAnsi="Century Gothic" w:cs="Courier New"/>
+          <w:sz w:val="22"/>
+          <w:szCs w:val="22"/>
+        </w:rPr>
+        <w:t>/api/quartieri</w:t>
+      </w:r>
+    </w:p>
+    <w:p>
+      <w:pPr>
+        <w:pStyle w:val="Testonormale"/>
+        <w:numPr>
+          <w:ilvl w:val="0"/>
+          <w:numId w:val="3"/>
+        </w:numPr>
+        <w:rPr>
+          <w:rFonts w:ascii="Century Gothic" w:hAnsi="Century Gothic" w:cs="Courier New"/>
+          <w:sz w:val="22"/>
+          <w:szCs w:val="22"/>
+        </w:rPr>
+      </w:pPr>
+      <w:r>
+        <w:rPr>
+          <w:rFonts w:ascii="Century Gothic" w:hAnsi="Century Gothic" w:cs="Courier New"/>
+          <w:sz w:val="22"/>
+          <w:szCs w:val="22"/>
+        </w:rPr>
+        <w:t>/api/preferiti</w:t>
+      </w:r>
+    </w:p>
+    <w:p>
+      <w:pPr>
+        <w:pStyle w:val="Testonormale"/>
+        <w:rPr>
+          <w:rFonts w:ascii="Century Gothic" w:hAnsi="Century Gothic" w:cs="Courier New"/>
+        </w:rPr>
+      </w:pPr>
+    </w:p>
+    <w:p>
+      <w:pPr>
+        <w:pStyle w:val="Testonormale"/>
+        <w:spacing w:after="240"/>
+        <w:rPr>
+          <w:rFonts w:ascii="Century Gothic" w:hAnsi="Century Gothic" w:cs="Courier New"/>
+          <w:b/>
+          <w:sz w:val="22"/>
+          <w:szCs w:val="22"/>
+          <w:u w:val="single"/>
+        </w:rPr>
+      </w:pPr>
+      <w:r>
+        <w:rPr>
+          <w:rFonts w:ascii="Century Gothic" w:hAnsi="Century Gothic" w:cs="Courier New"/>
+          <w:b/>
+          <w:sz w:val="22"/>
+          <w:szCs w:val="22"/>
+          <w:u w:val="single"/>
+        </w:rPr>
+        <w:t>POST</w:t>
+      </w:r>
+    </w:p>
+    <w:p>
+      <w:pPr>
+        <w:pStyle w:val="Testonormale"/>
+        <w:numPr>
+          <w:ilvl w:val="0"/>
+          <w:numId w:val="3"/>
+        </w:numPr>
+        <w:rPr>
+          <w:rFonts w:ascii="Century Gothic" w:hAnsi="Century Gothic" w:cs="Courier New"/>
+          <w:sz w:val="22"/>
+          <w:szCs w:val="22"/>
+        </w:rPr>
+      </w:pPr>
+      <w:r>
+        <w:rPr>
+          <w:rFonts w:ascii="Century Gothic" w:hAnsi="Century Gothic" w:cs="Courier New"/>
+          <w:sz w:val="22"/>
+          <w:szCs w:val="22"/>
+        </w:rPr>
+        <w:t>/api/</w:t>
+      </w:r>
+      <w:proofErr w:type="spellStart"/>
+      <w:r>
+        <w:rPr>
+          <w:rFonts w:ascii="Century Gothic" w:hAnsi="Century Gothic" w:cs="Courier New"/>
+          <w:sz w:val="22"/>
+          <w:szCs w:val="22"/>
+        </w:rPr>
+        <w:t>auth</w:t>
+      </w:r>
+      <w:proofErr w:type="spellEnd"/>
+      <w:r>
+        <w:rPr>
+          <w:rFonts w:ascii="Century Gothic" w:hAnsi="Century Gothic" w:cs="Courier New"/>
+          <w:sz w:val="22"/>
+          <w:szCs w:val="22"/>
+        </w:rPr>
+        <w:t>/register</w:t>
+      </w:r>
+    </w:p>
+    <w:p>
+      <w:pPr>
+        <w:pStyle w:val="Testonormale"/>
+        <w:numPr>
+          <w:ilvl w:val="0"/>
+          <w:numId w:val="3"/>
+        </w:numPr>
+        <w:rPr>
+          <w:rFonts w:ascii="Century Gothic" w:hAnsi="Century Gothic" w:cs="Courier New"/>
+          <w:sz w:val="22"/>
+          <w:szCs w:val="22"/>
+        </w:rPr>
+      </w:pPr>
+      <w:r>
+        <w:rPr>
+          <w:rFonts w:ascii="Century Gothic" w:hAnsi="Century Gothic" w:cs="Courier New"/>
+          <w:sz w:val="22"/>
+          <w:szCs w:val="22"/>
+        </w:rPr>
+        <w:t>/api/</w:t>
+      </w:r>
+      <w:proofErr w:type="spellStart"/>
+      <w:r>
+        <w:rPr>
+          <w:rFonts w:ascii="Century Gothic" w:hAnsi="Century Gothic" w:cs="Courier New"/>
+          <w:sz w:val="22"/>
+          <w:szCs w:val="22"/>
+        </w:rPr>
+        <w:t>auth</w:t>
+      </w:r>
+      <w:proofErr w:type="spellEnd"/>
+      <w:r>
+        <w:rPr>
+          <w:rFonts w:ascii="Century Gothic" w:hAnsi="Century Gothic" w:cs="Courier New"/>
+          <w:sz w:val="22"/>
+          <w:szCs w:val="22"/>
+        </w:rPr>
+        <w:t>/login</w:t>
+      </w:r>
+    </w:p>
+    <w:p>
+      <w:pPr>
+        <w:pStyle w:val="Testonormale"/>
+        <w:numPr>
+          <w:ilvl w:val="0"/>
+          <w:numId w:val="3"/>
+        </w:numPr>
+        <w:rPr>
+          <w:rFonts w:ascii="Century Gothic" w:hAnsi="Century Gothic" w:cs="Courier New"/>
+          <w:sz w:val="22"/>
+          <w:szCs w:val="22"/>
+        </w:rPr>
+      </w:pPr>
+      <w:r>
+        <w:rPr>
+          <w:rFonts w:ascii="Century Gothic" w:hAnsi="Century Gothic" w:cs="Courier New"/>
+          <w:sz w:val="22"/>
+          <w:szCs w:val="22"/>
+        </w:rPr>
+        <w:t>/api/</w:t>
+      </w:r>
+      <w:proofErr w:type="spellStart"/>
+      <w:r>
+        <w:rPr>
+          <w:rFonts w:ascii="Century Gothic" w:hAnsi="Century Gothic" w:cs="Courier New"/>
+          <w:sz w:val="22"/>
+          <w:szCs w:val="22"/>
+        </w:rPr>
+        <w:t>auth</w:t>
+      </w:r>
+      <w:proofErr w:type="spellEnd"/>
+      <w:r>
+        <w:rPr>
+          <w:rFonts w:ascii="Century Gothic" w:hAnsi="Century Gothic" w:cs="Courier New"/>
+          <w:sz w:val="22"/>
+          <w:szCs w:val="22"/>
+        </w:rPr>
+        <w:t>/</w:t>
+      </w:r>
+      <w:proofErr w:type="spellStart"/>
+      <w:r>
+        <w:rPr>
+          <w:rFonts w:ascii="Century Gothic" w:hAnsi="Century Gothic" w:cs="Courier New"/>
+          <w:sz w:val="22"/>
+          <w:szCs w:val="22"/>
+        </w:rPr>
+        <w:t>logout</w:t>
+      </w:r>
+      <w:proofErr w:type="spellEnd"/>
+    </w:p>
+    <w:p>
+      <w:pPr>
+        <w:pStyle w:val="Testonormale"/>
+        <w:numPr>
+          <w:ilvl w:val="0"/>
+          <w:numId w:val="3"/>
+        </w:numPr>
+        <w:rPr>
+          <w:rFonts w:ascii="Century Gothic" w:hAnsi="Century Gothic" w:cs="Courier New"/>
+          <w:sz w:val="22"/>
+          <w:szCs w:val="22"/>
+        </w:rPr>
+      </w:pPr>
+      <w:r>
+        <w:rPr>
+          <w:rFonts w:ascii="Century Gothic" w:hAnsi="Century Gothic" w:cs="Courier New"/>
+          <w:sz w:val="22"/>
+          <w:szCs w:val="22"/>
+        </w:rPr>
+        <w:t>/api/preferiti</w:t>
+      </w:r>
+    </w:p>
+    <w:p>
+      <w:pPr>
+        <w:pStyle w:val="Testonormale"/>
+        <w:numPr>
+          <w:ilvl w:val="0"/>
+          <w:numId w:val="3"/>
+        </w:numPr>
+        <w:rPr>
+          <w:rFonts w:ascii="Century Gothic" w:hAnsi="Century Gothic" w:cs="Courier New"/>
+          <w:sz w:val="22"/>
+          <w:szCs w:val="22"/>
+        </w:rPr>
+      </w:pPr>
+      <w:r>
+        <w:rPr>
+          <w:rFonts w:ascii="Century Gothic" w:hAnsi="Century Gothic" w:cs="Courier New"/>
+          <w:sz w:val="22"/>
+          <w:szCs w:val="22"/>
+        </w:rPr>
+        <w:t>/api/annunci/create</w:t>
+      </w:r>
+    </w:p>
+    <w:p>
+      <w:pPr>
+        <w:pStyle w:val="Testonormale"/>
+        <w:numPr>
+          <w:ilvl w:val="0"/>
+          <w:numId w:val="3"/>
+        </w:numPr>
+        <w:rPr>
+          <w:rFonts w:ascii="Century Gothic" w:hAnsi="Century Gothic" w:cs="Courier New"/>
+          <w:sz w:val="22"/>
+          <w:szCs w:val="22"/>
+        </w:rPr>
+      </w:pPr>
+      <w:r>
+        <w:rPr>
+          <w:rFonts w:ascii="Century Gothic" w:hAnsi="Century Gothic" w:cs="Courier New"/>
+          <w:sz w:val="22"/>
+          <w:szCs w:val="22"/>
+        </w:rPr>
+        <w:t>/api/annunci/update/:id</w:t>
+      </w:r>
+    </w:p>
+    <w:p>
+      <w:pPr>
+        <w:pStyle w:val="Testonormale"/>
+        <w:numPr>
+          <w:ilvl w:val="0"/>
+          <w:numId w:val="3"/>
+        </w:numPr>
+        <w:rPr>
+          <w:rFonts w:ascii="Century Gothic" w:hAnsi="Century Gothic" w:cs="Courier New"/>
+          <w:sz w:val="22"/>
+          <w:szCs w:val="22"/>
+        </w:rPr>
+      </w:pPr>
+      <w:r>
+        <w:rPr>
+          <w:rFonts w:ascii="Century Gothic" w:hAnsi="Century Gothic" w:cs="Courier New"/>
+          <w:sz w:val="22"/>
+          <w:szCs w:val="22"/>
+        </w:rPr>
+        <w:t>/api/annunci/modifica/:id</w:t>
+      </w:r>
+    </w:p>
+    <w:p>
+      <w:pPr>
+        <w:pStyle w:val="Testonormale"/>
+        <w:rPr>
+          <w:rFonts w:ascii="Century Gothic" w:hAnsi="Century Gothic" w:cs="Courier New"/>
+        </w:rPr>
+      </w:pPr>
+    </w:p>
+    <w:p>
+      <w:pPr>
+        <w:pStyle w:val="Testonormale"/>
+        <w:spacing w:after="240"/>
+        <w:rPr>
+          <w:rFonts w:ascii="Century Gothic" w:hAnsi="Century Gothic" w:cs="Courier New"/>
+          <w:b/>
+          <w:sz w:val="22"/>
+          <w:szCs w:val="22"/>
+          <w:u w:val="single"/>
+        </w:rPr>
+      </w:pPr>
+      <w:r>
+        <w:rPr>
+          <w:rFonts w:ascii="Century Gothic" w:hAnsi="Century Gothic" w:cs="Courier New"/>
+          <w:b/>
+          <w:sz w:val="22"/>
+          <w:szCs w:val="22"/>
+          <w:u w:val="single"/>
+        </w:rPr>
+        <w:t>DELETE</w:t>
+      </w:r>
+    </w:p>
+    <w:p>
+      <w:pPr>
+        <w:pStyle w:val="Testonormale"/>
+        <w:numPr>
+          <w:ilvl w:val="0"/>
+          <w:numId w:val="3"/>
+        </w:numPr>
+        <w:rPr>
+          <w:rFonts w:ascii="Century Gothic" w:hAnsi="Century Gothic" w:cs="Courier New"/>
+          <w:sz w:val="22"/>
+          <w:szCs w:val="22"/>
+        </w:rPr>
+      </w:pPr>
+      <w:r>
+        <w:rPr>
+          <w:rFonts w:ascii="Century Gothic" w:hAnsi="Century Gothic" w:cs="Courier New"/>
+          <w:sz w:val="22"/>
+          <w:szCs w:val="22"/>
+        </w:rPr>
+        <w:t>/api/preferiti</w:t>
+      </w:r>
+      <w:proofErr w:type="gramStart"/>
+      <w:r>
+        <w:rPr>
+          <w:rFonts w:ascii="Century Gothic" w:hAnsi="Century Gothic" w:cs="Courier New"/>
+          <w:sz w:val="22"/>
+          <w:szCs w:val="22"/>
+        </w:rPr>
+        <w:t>/:</w:t>
+      </w:r>
+      <w:proofErr w:type="spellStart"/>
+      <w:r>
+        <w:rPr>
+          <w:rFonts w:ascii="Century Gothic" w:hAnsi="Century Gothic" w:cs="Courier New"/>
+          <w:sz w:val="22"/>
+          <w:szCs w:val="22"/>
+        </w:rPr>
+        <w:t>annuncio</w:t>
+      </w:r>
+      <w:proofErr w:type="gramEnd"/>
+      <w:r>
+        <w:rPr>
+          <w:rFonts w:ascii="Century Gothic" w:hAnsi="Century Gothic" w:cs="Courier New"/>
+          <w:sz w:val="22"/>
+          <w:szCs w:val="22"/>
+        </w:rPr>
+        <w:t>_id</w:t>
+      </w:r>
+      <w:proofErr w:type="spellEnd"/>
+    </w:p>
+    <w:p>
+      <w:pPr>
+        <w:pStyle w:val="Testonormale"/>
+        <w:numPr>
+          <w:ilvl w:val="0"/>
+          <w:numId w:val="3"/>
+        </w:numPr>
+        <w:rPr>
+          <w:rFonts w:ascii="Century Gothic" w:hAnsi="Century Gothic" w:cs="Courier New"/>
+          <w:sz w:val="22"/>
+          <w:szCs w:val="22"/>
+        </w:rPr>
+      </w:pPr>
+      <w:r>
+        <w:rPr>
+          <w:rFonts w:ascii="Century Gothic" w:hAnsi="Century Gothic" w:cs="Courier New"/>
+          <w:sz w:val="22"/>
+          <w:szCs w:val="22"/>
+        </w:rPr>
+        <w:t>/api/annunci/delete/:id</w:t>
+      </w:r>
+    </w:p>
+    <w:p>
+      <w:pPr>
+        <w:pStyle w:val="Testonormale"/>
+        <w:rPr>
+          <w:rFonts w:ascii="Century Gothic" w:hAnsi="Century Gothic" w:cs="Courier New"/>
+        </w:rPr>
+      </w:pPr>
+    </w:p>
+    <w:p>
+      <w:pPr>
+        <w:pStyle w:val="Testonormale"/>
+        <w:spacing w:after="240"/>
         <w:rPr>
           <w:rFonts w:ascii="Century Gothic" w:hAnsi="Century Gothic" w:cs="Courier New"/>
           <w:b/>
           <w:sz w:val="28"/>
           <w:szCs w:val="28"/>
         </w:rPr>
-        <w:t>DATABASE</w:t>
-      </w:r>
-    </w:p>
-    <w:p>
-      <w:pPr>
-        <w:pStyle w:val="Testonormale"/>
-        <w:jc w:val="both"/>
-        <w:rPr>
-          <w:rFonts w:ascii="Century Gothic" w:hAnsi="Century Gothic" w:cs="Courier New"/>
-          <w:sz w:val="22"/>
-          <w:szCs w:val="22"/>
-        </w:rPr>
-      </w:pPr>
-      <w:r>
-        <w:rPr>
-          <w:rFonts w:ascii="Century Gothic" w:hAnsi="Century Gothic" w:cs="Courier New"/>
-          <w:sz w:val="22"/>
-          <w:szCs w:val="22"/>
-        </w:rPr>
-        <w:lastRenderedPageBreak/>
-        <w:t>P</w:t>
-      </w:r>
-      <w:r>
-        <w:rPr>
-          <w:rFonts w:ascii="Century Gothic" w:hAnsi="Century Gothic" w:cs="Courier New"/>
-          <w:sz w:val="22"/>
-          <w:szCs w:val="22"/>
-        </w:rPr>
-        <w:t xml:space="preserve">er la creazione dell'applicazione abbiamo creato un database </w:t>
-      </w:r>
-      <w:r>
-        <w:rPr>
-          <w:rFonts w:ascii="Century Gothic" w:hAnsi="Century Gothic" w:cs="Courier New"/>
-          <w:sz w:val="22"/>
-          <w:szCs w:val="22"/>
-        </w:rPr>
-        <w:t>MySQL</w:t>
-      </w:r>
-      <w:r>
-        <w:rPr>
-          <w:rFonts w:ascii="Century Gothic" w:hAnsi="Century Gothic" w:cs="Courier New"/>
-          <w:sz w:val="22"/>
-          <w:szCs w:val="22"/>
-        </w:rPr>
-        <w:t xml:space="preserve"> denominato "studenthome".</w:t>
-      </w:r>
-    </w:p>
-    <w:p>
-      <w:pPr>
-        <w:pStyle w:val="Testonormale"/>
-        <w:jc w:val="both"/>
-        <w:rPr>
-          <w:rFonts w:ascii="Century Gothic" w:hAnsi="Century Gothic" w:cs="Courier New"/>
-          <w:sz w:val="22"/>
-          <w:szCs w:val="22"/>
-        </w:rPr>
-      </w:pPr>
-      <w:r>
-        <w:rPr>
-          <w:rFonts w:ascii="Century Gothic" w:hAnsi="Century Gothic" w:cs="Courier New"/>
-          <w:sz w:val="22"/>
-          <w:szCs w:val="22"/>
-        </w:rPr>
-        <w:t xml:space="preserve">Sono memorizzati tutti i dati in nove tabelle collegate tra loro con le ForeignKeys. La tabella che memorizza i dati dell'utente contiene le password crittografate per una elevata sicurezza. Il file che contiene le direttive per il collegamento al database denominato db.ts è collocato nella backend\scr\utils\ </w:t>
-      </w:r>
-    </w:p>
-    <w:p>
-      <w:pPr>
-        <w:pStyle w:val="Testonormale"/>
-        <w:rPr>
-          <w:rFonts w:ascii="Century Gothic" w:hAnsi="Century Gothic" w:cs="Courier New"/>
-        </w:rPr>
-      </w:pPr>
-    </w:p>
-    <w:p>
-      <w:pPr>
-        <w:pStyle w:val="Testonormale"/>
-        <w:spacing w:after="240"/>
-        <w:rPr>
-          <w:rFonts w:ascii="Century Gothic" w:hAnsi="Century Gothic" w:cs="Courier New"/>
-        </w:rPr>
       </w:pPr>
       <w:r>
         <w:rPr>
@@ -1985,6 +2402,185 @@
           <w:sz w:val="28"/>
           <w:szCs w:val="28"/>
         </w:rPr>
+        <w:t>DATABASE</w:t>
+      </w:r>
+    </w:p>
+    <w:p>
+      <w:pPr>
+        <w:pStyle w:val="Testonormale"/>
+        <w:jc w:val="both"/>
+        <w:rPr>
+          <w:rFonts w:ascii="Century Gothic" w:hAnsi="Century Gothic" w:cs="Courier New"/>
+          <w:sz w:val="22"/>
+          <w:szCs w:val="22"/>
+        </w:rPr>
+      </w:pPr>
+      <w:r>
+        <w:rPr>
+          <w:rFonts w:ascii="Century Gothic" w:hAnsi="Century Gothic" w:cs="Courier New"/>
+          <w:sz w:val="22"/>
+          <w:szCs w:val="22"/>
+        </w:rPr>
+        <w:lastRenderedPageBreak/>
+        <w:t>P</w:t>
+      </w:r>
+      <w:r>
+        <w:rPr>
+          <w:rFonts w:ascii="Century Gothic" w:hAnsi="Century Gothic" w:cs="Courier New"/>
+          <w:sz w:val="22"/>
+          <w:szCs w:val="22"/>
+        </w:rPr>
+        <w:t xml:space="preserve">er la creazione dell'applicazione abbiamo creato un database </w:t>
+      </w:r>
+      <w:r>
+        <w:rPr>
+          <w:rFonts w:ascii="Century Gothic" w:hAnsi="Century Gothic" w:cs="Courier New"/>
+          <w:sz w:val="22"/>
+          <w:szCs w:val="22"/>
+        </w:rPr>
+        <w:t>MySQL</w:t>
+      </w:r>
+      <w:r>
+        <w:rPr>
+          <w:rFonts w:ascii="Century Gothic" w:hAnsi="Century Gothic" w:cs="Courier New"/>
+          <w:sz w:val="22"/>
+          <w:szCs w:val="22"/>
+        </w:rPr>
+        <w:t xml:space="preserve"> denominato "</w:t>
+      </w:r>
+      <w:proofErr w:type="spellStart"/>
+      <w:r>
+        <w:rPr>
+          <w:rFonts w:ascii="Century Gothic" w:hAnsi="Century Gothic" w:cs="Courier New"/>
+          <w:sz w:val="22"/>
+          <w:szCs w:val="22"/>
+        </w:rPr>
+        <w:t>studenthome</w:t>
+      </w:r>
+      <w:proofErr w:type="spellEnd"/>
+      <w:r>
+        <w:rPr>
+          <w:rFonts w:ascii="Century Gothic" w:hAnsi="Century Gothic" w:cs="Courier New"/>
+          <w:sz w:val="22"/>
+          <w:szCs w:val="22"/>
+        </w:rPr>
+        <w:t>".</w:t>
+      </w:r>
+    </w:p>
+    <w:p>
+      <w:pPr>
+        <w:pStyle w:val="Testonormale"/>
+        <w:jc w:val="both"/>
+        <w:rPr>
+          <w:rFonts w:ascii="Century Gothic" w:hAnsi="Century Gothic" w:cs="Courier New"/>
+          <w:sz w:val="22"/>
+          <w:szCs w:val="22"/>
+        </w:rPr>
+      </w:pPr>
+      <w:r>
+        <w:rPr>
+          <w:rFonts w:ascii="Century Gothic" w:hAnsi="Century Gothic" w:cs="Courier New"/>
+          <w:sz w:val="22"/>
+          <w:szCs w:val="22"/>
+        </w:rPr>
+        <w:t xml:space="preserve">Sono memorizzati tutti i dati in nove tabelle collegate tra loro con le </w:t>
+      </w:r>
+      <w:proofErr w:type="spellStart"/>
+      <w:r>
+        <w:rPr>
+          <w:rFonts w:ascii="Century Gothic" w:hAnsi="Century Gothic" w:cs="Courier New"/>
+          <w:sz w:val="22"/>
+          <w:szCs w:val="22"/>
+        </w:rPr>
+        <w:t>ForeignKeys</w:t>
+      </w:r>
+      <w:proofErr w:type="spellEnd"/>
+      <w:r>
+        <w:rPr>
+          <w:rFonts w:ascii="Century Gothic" w:hAnsi="Century Gothic" w:cs="Courier New"/>
+          <w:sz w:val="22"/>
+          <w:szCs w:val="22"/>
+        </w:rPr>
+        <w:t xml:space="preserve">. La tabella che memorizza i dati dell'utente contiene le password crittografate per una elevata sicurezza. Il file che contiene le direttive per il collegamento al database denominato </w:t>
+      </w:r>
+      <w:proofErr w:type="spellStart"/>
+      <w:r>
+        <w:rPr>
+          <w:rFonts w:ascii="Century Gothic" w:hAnsi="Century Gothic" w:cs="Courier New"/>
+          <w:sz w:val="22"/>
+          <w:szCs w:val="22"/>
+        </w:rPr>
+        <w:t>db.ts</w:t>
+      </w:r>
+      <w:proofErr w:type="spellEnd"/>
+      <w:r>
+        <w:rPr>
+          <w:rFonts w:ascii="Century Gothic" w:hAnsi="Century Gothic" w:cs="Courier New"/>
+          <w:sz w:val="22"/>
+          <w:szCs w:val="22"/>
+        </w:rPr>
+        <w:t xml:space="preserve"> è collocato nella backend\</w:t>
+      </w:r>
+      <w:proofErr w:type="spellStart"/>
+      <w:r>
+        <w:rPr>
+          <w:rFonts w:ascii="Century Gothic" w:hAnsi="Century Gothic" w:cs="Courier New"/>
+          <w:sz w:val="22"/>
+          <w:szCs w:val="22"/>
+        </w:rPr>
+        <w:t>scr</w:t>
+      </w:r>
+      <w:proofErr w:type="spellEnd"/>
+      <w:r>
+        <w:rPr>
+          <w:rFonts w:ascii="Century Gothic" w:hAnsi="Century Gothic" w:cs="Courier New"/>
+          <w:sz w:val="22"/>
+          <w:szCs w:val="22"/>
+        </w:rPr>
+        <w:t>\</w:t>
+      </w:r>
+      <w:proofErr w:type="spellStart"/>
+      <w:r>
+        <w:rPr>
+          <w:rFonts w:ascii="Century Gothic" w:hAnsi="Century Gothic" w:cs="Courier New"/>
+          <w:sz w:val="22"/>
+          <w:szCs w:val="22"/>
+        </w:rPr>
+        <w:t>utils</w:t>
+      </w:r>
+      <w:proofErr w:type="spellEnd"/>
+      <w:r>
+        <w:rPr>
+          <w:rFonts w:ascii="Century Gothic" w:hAnsi="Century Gothic" w:cs="Courier New"/>
+          <w:sz w:val="22"/>
+          <w:szCs w:val="22"/>
+        </w:rPr>
+        <w:t xml:space="preserve">\ </w:t>
+      </w:r>
+    </w:p>
+    <w:p>
+      <w:pPr>
+        <w:pStyle w:val="Testonormale"/>
+        <w:rPr>
+          <w:rFonts w:ascii="Century Gothic" w:hAnsi="Century Gothic" w:cs="Courier New"/>
+        </w:rPr>
+      </w:pPr>
+    </w:p>
+    <w:p>
+      <w:pPr>
+        <w:pStyle w:val="Testonormale"/>
+        <w:spacing w:after="240"/>
+        <w:rPr>
+          <w:rFonts w:ascii="Century Gothic" w:hAnsi="Century Gothic" w:cs="Courier New"/>
+        </w:rPr>
+      </w:pPr>
+      <w:r>
+        <w:rPr>
+          <w:rFonts w:ascii="Century Gothic" w:hAnsi="Century Gothic" w:cs="Courier New"/>
+          <w:b/>
+          <w:sz w:val="28"/>
+          <w:szCs w:val="28"/>
+        </w:rPr>
         <w:t>Installazione</w:t>
       </w:r>
     </w:p>
@@ -2007,7 +2603,25 @@
           <w:sz w:val="22"/>
           <w:szCs w:val="22"/>
         </w:rPr>
-        <w:t xml:space="preserve">Clona il repository di github da: </w:t>
+        <w:t xml:space="preserve">Clona il repository di </w:t>
+      </w:r>
+      <w:proofErr w:type="spellStart"/>
+      <w:r>
+        <w:rPr>
+          <w:rFonts w:ascii="Century Gothic" w:hAnsi="Century Gothic" w:cs="Courier New"/>
+          <w:sz w:val="22"/>
+          <w:szCs w:val="22"/>
+        </w:rPr>
+        <w:t>github</w:t>
+      </w:r>
+      <w:proofErr w:type="spellEnd"/>
+      <w:r>
+        <w:rPr>
+          <w:rFonts w:ascii="Century Gothic" w:hAnsi="Century Gothic" w:cs="Courier New"/>
+          <w:sz w:val="22"/>
+          <w:szCs w:val="22"/>
+        </w:rPr>
+        <w:t xml:space="preserve"> da: </w:t>
       </w:r>
       <w:hyperlink r:id="rId7" w:history="1">
         <w:r>
@@ -2040,7 +2654,43 @@
           <w:sz w:val="22"/>
           <w:szCs w:val="22"/>
         </w:rPr>
-        <w:t>Eseguire il comando “npm i” in entrambe le cartelle backend e frontend per installare tutte le dipendenze e pacchetti</w:t>
+        <w:t>Eseguire il comando “</w:t>
+      </w:r>
+      <w:proofErr w:type="spellStart"/>
+      <w:r>
+        <w:rPr>
+          <w:rFonts w:ascii="Century Gothic" w:hAnsi="Century Gothic" w:cs="Courier New"/>
+          <w:sz w:val="22"/>
+          <w:szCs w:val="22"/>
+        </w:rPr>
+        <w:t>npm</w:t>
+      </w:r>
+      <w:proofErr w:type="spellEnd"/>
+      <w:r>
+        <w:rPr>
+          <w:rFonts w:ascii="Century Gothic" w:hAnsi="Century Gothic" w:cs="Courier New"/>
+          <w:sz w:val="22"/>
+          <w:szCs w:val="22"/>
+        </w:rPr>
+        <w:t xml:space="preserve"> i” in entrambe le cartelle backend e </w:t>
+      </w:r>
+      <w:proofErr w:type="spellStart"/>
+      <w:r>
+        <w:rPr>
+          <w:rFonts w:ascii="Century Gothic" w:hAnsi="Century Gothic" w:cs="Courier New"/>
+          <w:sz w:val="22"/>
+          <w:szCs w:val="22"/>
+        </w:rPr>
+        <w:t>frontend</w:t>
+      </w:r>
+      <w:proofErr w:type="spellEnd"/>
+      <w:r>
+        <w:rPr>
+          <w:rFonts w:ascii="Century Gothic" w:hAnsi="Century Gothic" w:cs="Courier New"/>
+          <w:sz w:val="22"/>
+          <w:szCs w:val="22"/>
+        </w:rPr>
+        <w:t xml:space="preserve"> per installare tutte le dipendenze e pacchetti</w:t>
       </w:r>
     </w:p>
     <w:p>
@@ -2078,8 +2728,18 @@
           <w:sz w:val="22"/>
           <w:szCs w:val="22"/>
         </w:rPr>
-        <w:t>eseguire il server MySQL, creare il DB con il file contenuto nella cartella backend-&gt;db</w:t>
-      </w:r>
+        <w:t>eseguire il server MySQL, creare il DB con il file contenuto nella cartella backend-&gt;</w:t>
+      </w:r>
+      <w:proofErr w:type="spellStart"/>
+      <w:r>
+        <w:rPr>
+          <w:rFonts w:ascii="Century Gothic" w:hAnsi="Century Gothic" w:cs="Courier New"/>
+          <w:sz w:val="22"/>
+          <w:szCs w:val="22"/>
+        </w:rPr>
+        <w:t>db</w:t>
+      </w:r>
+      <w:proofErr w:type="spellEnd"/>
     </w:p>
     <w:p>
       <w:pPr>
@@ -2100,7 +2760,79 @@
           <w:sz w:val="22"/>
           <w:szCs w:val="22"/>
         </w:rPr>
-        <w:t>Eseguire l’applicazione web con il comando “npm run dev” da eseguire in entrambe le cartelle frontend e backend. Utilizzare il link di vite per visitare l’app.</w:t>
+        <w:t>Eseguire l’applicazione web con il comando “</w:t>
+      </w:r>
+      <w:proofErr w:type="spellStart"/>
+      <w:r>
+        <w:rPr>
+          <w:rFonts w:ascii="Century Gothic" w:hAnsi="Century Gothic" w:cs="Courier New"/>
+          <w:sz w:val="22"/>
+          <w:szCs w:val="22"/>
+        </w:rPr>
+        <w:t>npm</w:t>
+      </w:r>
+      <w:proofErr w:type="spellEnd"/>
+      <w:r>
+        <w:rPr>
+          <w:rFonts w:ascii="Century Gothic" w:hAnsi="Century Gothic" w:cs="Courier New"/>
+          <w:sz w:val="22"/>
+          <w:szCs w:val="22"/>
+        </w:rPr>
+        <w:t xml:space="preserve"> </w:t>
+      </w:r>
+      <w:proofErr w:type="spellStart"/>
+      <w:r>
+        <w:rPr>
+          <w:rFonts w:ascii="Century Gothic" w:hAnsi="Century Gothic" w:cs="Courier New"/>
+          <w:sz w:val="22"/>
+          <w:szCs w:val="22"/>
+        </w:rPr>
+        <w:t>run</w:t>
+      </w:r>
+      <w:proofErr w:type="spellEnd"/>
+      <w:r>
+        <w:rPr>
+          <w:rFonts w:ascii="Century Gothic" w:hAnsi="Century Gothic" w:cs="Courier New"/>
+          <w:sz w:val="22"/>
+          <w:szCs w:val="22"/>
+        </w:rPr>
+        <w:t xml:space="preserve"> </w:t>
+      </w:r>
+      <w:proofErr w:type="spellStart"/>
+      <w:r>
+        <w:rPr>
+          <w:rFonts w:ascii="Century Gothic" w:hAnsi="Century Gothic" w:cs="Courier New"/>
+          <w:sz w:val="22"/>
+          <w:szCs w:val="22"/>
+        </w:rPr>
+        <w:t>dev</w:t>
+      </w:r>
+      <w:proofErr w:type="spellEnd"/>
+      <w:r>
+        <w:rPr>
+          <w:rFonts w:ascii="Century Gothic" w:hAnsi="Century Gothic" w:cs="Courier New"/>
+          <w:sz w:val="22"/>
+          <w:szCs w:val="22"/>
+        </w:rPr>
+        <w:t xml:space="preserve">” da eseguire in entrambe le cartelle </w:t>
+      </w:r>
+      <w:proofErr w:type="spellStart"/>
+      <w:r>
+        <w:rPr>
+          <w:rFonts w:ascii="Century Gothic" w:hAnsi="Century Gothic" w:cs="Courier New"/>
+          <w:sz w:val="22"/>
+          <w:szCs w:val="22"/>
+        </w:rPr>
+        <w:t>frontend</w:t>
+      </w:r>
+      <w:proofErr w:type="spellEnd"/>
+      <w:r>
+        <w:rPr>
+          <w:rFonts w:ascii="Century Gothic" w:hAnsi="Century Gothic" w:cs="Courier New"/>
+          <w:sz w:val="22"/>
+          <w:szCs w:val="22"/>
+        </w:rPr>
+        <w:t xml:space="preserve"> e backend. Utilizzare il link di vite per visitare l’app.</w:t>
       </w:r>
     </w:p>
     <w:p>
@@ -2227,7 +2959,7 @@
 </file>
 
 <file path=word/endnotes.xml><?xml version="1.0" encoding="utf-8"?>
-<w:endnotes xmlns:wpc="http://schemas.microsoft.com/office/word/2010/wordprocessingCanvas" xmlns:cx="http://schemas.microsoft.com/office/drawing/2014/chartex" xmlns:cx1="http://schemas.microsoft.com/office/drawing/2015/9/8/chartex" xmlns:cx2="http://schemas.microsoft.com/office/drawing/2015/10/21/chartex" xmlns:cx3="http://schemas.microsoft.com/office/drawing/2016/5/9/chartex" xmlns:cx4="http://schemas.microsoft.com/office/drawing/2016/5/10/chartex" xmlns:cx5="http://schemas.microsoft.com/office/drawing/2016/5/11/chartex" xmlns:cx6="http://schemas.microsoft.com/office/drawing/2016/5/12/chartex" xmlns:cx7="http://schemas.microsoft.com/office/drawing/2016/5/13/chartex" xmlns:cx8="http://schemas.microsoft.com/office/drawing/2016/5/14/chartex" xmlns:mc="http://schemas.openxmlformats.org/markup-compatibility/2006" xmlns:aink="http://schemas.microsoft.com/office/drawing/2016/ink" xmlns:am3d="http://schemas.microsoft.com/office/drawing/2017/model3d" xmlns:o="urn:schemas-microsoft-com:office:office" xmlns:oel="http://schemas.microsoft.com/office/2019/extlst" xmlns:r="http://schemas.openxmlformats.org/officeDocument/2006/relationships" xmlns:m="http://schemas.openxmlformats.org/officeDocument/2006/math" xmlns:v="urn:schemas-microsoft-com:vml" xmlns:wp14="http://schemas.microsoft.com/office/word/2010/wordprocessingDrawing" xmlns:wp="http://schemas.openxmlformats.org/drawingml/2006/wordprocessingDrawing" xmlns:w10="urn:schemas-microsoft-com:office:word" xmlns:w="http://schemas.openxmlformats.org/wordprocessingml/2006/main" xmlns:w14="http://schemas.microsoft.com/office/word/2010/wordml" xmlns:w15="http://schemas.microsoft.com/office/word/2012/wordml" xmlns:w16cex="http://schemas.microsoft.com/office/word/2018/wordml/cex" xmlns:w16cid="http://schemas.microsoft.com/office/word/2016/wordml/cid" xmlns:w16="http://schemas.microsoft.com/office/word/2018/wordml" xmlns:w16du="http://schemas.microsoft.com/office/word/2023/wordml/word16du" xmlns:w16sdtdh="http://schemas.microsoft.com/office/word/2020/wordml/sdtdatahash" xmlns:w16sdtfl="http://schemas.microsoft.com/office/word/2024/wordml/sdtformatlock" xmlns:w16se="http://schemas.microsoft.com/office/word/2015/wordml/symex" xmlns:wpg="http://schemas.microsoft.com/office/word/2010/wordprocessingGroup" xmlns:wpi="http://schemas.microsoft.com/office/word/2010/wordprocessingInk" xmlns:wne="http://schemas.microsoft.com/office/word/2006/wordml" xmlns:wps="http://schemas.microsoft.com/office/word/2010/wordprocessingShape" mc:Ignorable="w14 w15 w16se w16cid w16 w16cex w16sdtdh w16sdtfl w16du wp14">
+<w:endnotes xmlns:wpc="http://schemas.microsoft.com/office/word/2010/wordprocessingCanvas" xmlns:cx="http://schemas.microsoft.com/office/drawing/2014/chartex" xmlns:cx1="http://schemas.microsoft.com/office/drawing/2015/9/8/chartex" xmlns:cx2="http://schemas.microsoft.com/office/drawing/2015/10/21/chartex" xmlns:cx3="http://schemas.microsoft.com/office/drawing/2016/5/9/chartex" xmlns:cx4="http://schemas.microsoft.com/office/drawing/2016/5/10/chartex" xmlns:cx5="http://schemas.microsoft.com/office/drawing/2016/5/11/chartex" xmlns:cx6="http://schemas.microsoft.com/office/drawing/2016/5/12/chartex" xmlns:cx7="http://schemas.microsoft.com/office/drawing/2016/5/13/chartex" xmlns:cx8="http://schemas.microsoft.com/office/drawing/2016/5/14/chartex" xmlns:mc="http://schemas.openxmlformats.org/markup-compatibility/2006" xmlns:aink="http://schemas.microsoft.com/office/drawing/2016/ink" xmlns:am3d="http://schemas.microsoft.com/office/drawing/2017/model3d" xmlns:o="urn:schemas-microsoft-com:office:office" xmlns:r="http://schemas.openxmlformats.org/officeDocument/2006/relationships" xmlns:m="http://schemas.openxmlformats.org/officeDocument/2006/math" xmlns:v="urn:schemas-microsoft-com:vml" xmlns:wp14="http://schemas.microsoft.com/office/word/2010/wordprocessingDrawing" xmlns:wp="http://schemas.openxmlformats.org/drawingml/2006/wordprocessingDrawing" xmlns:w10="urn:schemas-microsoft-com:office:word" xmlns:w="http://schemas.openxmlformats.org/wordprocessingml/2006/main" xmlns:w14="http://schemas.microsoft.com/office/word/2010/wordml" xmlns:w15="http://schemas.microsoft.com/office/word/2012/wordml" xmlns:w16cid="http://schemas.microsoft.com/office/word/2016/wordml/cid" xmlns:w16se="http://schemas.microsoft.com/office/word/2015/wordml/symex" xmlns:wpg="http://schemas.microsoft.com/office/word/2010/wordprocessingGroup" xmlns:wpi="http://schemas.microsoft.com/office/word/2010/wordprocessingInk" xmlns:wne="http://schemas.microsoft.com/office/word/2006/wordml" xmlns:wps="http://schemas.microsoft.com/office/word/2010/wordprocessingShape" mc:Ignorable="w14 w15 w16se w16cid wp14">
   <w:endnote w:type="separator" w:id="-1">
     <w:p>
       <w:pPr>
@@ -2252,7 +2984,7 @@
 </file>
 
 <file path=word/footnotes.xml><?xml version="1.0" encoding="utf-8"?>
-<w:footnotes xmlns:wpc="http://schemas.microsoft.com/office/word/2010/wordprocessingCanvas" xmlns:cx="http://schemas.microsoft.com/office/drawing/2014/chartex" xmlns:cx1="http://schemas.microsoft.com/office/drawing/2015/9/8/chartex" xmlns:cx2="http://schemas.microsoft.com/office/drawing/2015/10/21/chartex" xmlns:cx3="http://schemas.microsoft.com/office/drawing/2016/5/9/chartex" xmlns:cx4="http://schemas.microsoft.com/office/drawing/2016/5/10/chartex" xmlns:cx5="http://schemas.microsoft.com/office/drawing/2016/5/11/chartex" xmlns:cx6="http://schemas.microsoft.com/office/drawing/2016/5/12/chartex" xmlns:cx7="http://schemas.microsoft.com/office/drawing/2016/5/13/chartex" xmlns:cx8="http://schemas.microsoft.com/office/drawing/2016/5/14/chartex" xmlns:mc="http://schemas.openxmlformats.org/markup-compatibility/2006" xmlns:aink="http://schemas.microsoft.com/office/drawing/2016/ink" xmlns:am3d="http://schemas.microsoft.com/office/drawing/2017/model3d" xmlns:o="urn:schemas-microsoft-com:office:office" xmlns:oel="http://schemas.microsoft.com/office/2019/extlst" xmlns:r="http://schemas.openxmlformats.org/officeDocument/2006/relationships" xmlns:m="http://schemas.openxmlformats.org/officeDocument/2006/math" xmlns:v="urn:schemas-microsoft-com:vml" xmlns:wp14="http://schemas.microsoft.com/office/word/2010/wordprocessingDrawing" xmlns:wp="http://schemas.openxmlformats.org/drawingml/2006/wordprocessingDrawing" xmlns:w10="urn:schemas-microsoft-com:office:word" xmlns:w="http://schemas.openxmlformats.org/wordprocessingml/2006/main" xmlns:w14="http://schemas.microsoft.com/office/word/2010/wordml" xmlns:w15="http://schemas.microsoft.com/office/word/2012/wordml" xmlns:w16cex="http://schemas.microsoft.com/office/word/2018/wordml/cex" xmlns:w16cid="http://schemas.microsoft.com/office/word/2016/wordml/cid" xmlns:w16="http://schemas.microsoft.com/office/word/2018/wordml" xmlns:w16du="http://schemas.microsoft.com/office/word/2023/wordml/word16du" xmlns:w16sdtdh="http://schemas.microsoft.com/office/word/2020/wordml/sdtdatahash" xmlns:w16sdtfl="http://schemas.microsoft.com/office/word/2024/wordml/sdtformatlock" xmlns:w16se="http://schemas.microsoft.com/office/word/2015/wordml/symex" xmlns:wpg="http://schemas.microsoft.com/office/word/2010/wordprocessingGroup" xmlns:wpi="http://schemas.microsoft.com/office/word/2010/wordprocessingInk" xmlns:wne="http://schemas.microsoft.com/office/word/2006/wordml" xmlns:wps="http://schemas.microsoft.com/office/word/2010/wordprocessingShape" mc:Ignorable="w14 w15 w16se w16cid w16 w16cex w16sdtdh w16sdtfl w16du wp14">
+<w:footnotes xmlns:wpc="http://schemas.microsoft.com/office/word/2010/wordprocessingCanvas" xmlns:cx="http://schemas.microsoft.com/office/drawing/2014/chartex" xmlns:cx1="http://schemas.microsoft.com/office/drawing/2015/9/8/chartex" xmlns:cx2="http://schemas.microsoft.com/office/drawing/2015/10/21/chartex" xmlns:cx3="http://schemas.microsoft.com/office/drawing/2016/5/9/chartex" xmlns:cx4="http://schemas.microsoft.com/office/drawing/2016/5/10/chartex" xmlns:cx5="http://schemas.microsoft.com/office/drawing/2016/5/11/chartex" xmlns:cx6="http://schemas.microsoft.com/office/drawing/2016/5/12/chartex" xmlns:cx7="http://schemas.microsoft.com/office/drawing/2016/5/13/chartex" xmlns:cx8="http://schemas.microsoft.com/office/drawing/2016/5/14/chartex" xmlns:mc="http://schemas.openxmlformats.org/markup-compatibility/2006" xmlns:aink="http://schemas.microsoft.com/office/drawing/2016/ink" xmlns:am3d="http://schemas.microsoft.com/office/drawing/2017/model3d" xmlns:o="urn:schemas-microsoft-com:office:office" xmlns:r="http://schemas.openxmlformats.org/officeDocument/2006/relationships" xmlns:m="http://schemas.openxmlformats.org/officeDocument/2006/math" xmlns:v="urn:schemas-microsoft-com:vml" xmlns:wp14="http://schemas.microsoft.com/office/word/2010/wordprocessingDrawing" xmlns:wp="http://schemas.openxmlformats.org/drawingml/2006/wordprocessingDrawing" xmlns:w10="urn:schemas-microsoft-com:office:word" xmlns:w="http://schemas.openxmlformats.org/wordprocessingml/2006/main" xmlns:w14="http://schemas.microsoft.com/office/word/2010/wordml" xmlns:w15="http://schemas.microsoft.com/office/word/2012/wordml" xmlns:w16cid="http://schemas.microsoft.com/office/word/2016/wordml/cid" xmlns:w16se="http://schemas.microsoft.com/office/word/2015/wordml/symex" xmlns:wpg="http://schemas.microsoft.com/office/word/2010/wordprocessingGroup" xmlns:wpi="http://schemas.microsoft.com/office/word/2010/wordprocessingInk" xmlns:wne="http://schemas.microsoft.com/office/word/2006/wordml" xmlns:wps="http://schemas.microsoft.com/office/word/2010/wordprocessingShape" mc:Ignorable="w14 w15 w16se w16cid wp14">
   <w:footnote w:type="separator" w:id="-1">
     <w:p>
       <w:pPr>
@@ -2277,7 +3009,7 @@
 </file>
 
 <file path=word/header1.xml><?xml version="1.0" encoding="utf-8"?>
-<w:hdr xmlns:wpc="http://schemas.microsoft.com/office/word/2010/wordprocessingCanvas" xmlns:cx="http://schemas.microsoft.com/office/drawing/2014/chartex" xmlns:cx1="http://schemas.microsoft.com/office/drawing/2015/9/8/chartex" xmlns:cx2="http://schemas.microsoft.com/office/drawing/2015/10/21/chartex" xmlns:cx3="http://schemas.microsoft.com/office/drawing/2016/5/9/chartex" xmlns:cx4="http://schemas.microsoft.com/office/drawing/2016/5/10/chartex" xmlns:cx5="http://schemas.microsoft.com/office/drawing/2016/5/11/chartex" xmlns:cx6="http://schemas.microsoft.com/office/drawing/2016/5/12/chartex" xmlns:cx7="http://schemas.microsoft.com/office/drawing/2016/5/13/chartex" xmlns:cx8="http://schemas.microsoft.com/office/drawing/2016/5/14/chartex" xmlns:mc="http://schemas.openxmlformats.org/markup-compatibility/2006" xmlns:aink="http://schemas.microsoft.com/office/drawing/2016/ink" xmlns:am3d="http://schemas.microsoft.com/office/drawing/2017/model3d" xmlns:o="urn:schemas-microsoft-com:office:office" xmlns:oel="http://schemas.microsoft.com/office/2019/extlst" xmlns:r="http://schemas.openxmlformats.org/officeDocument/2006/relationships" xmlns:m="http://schemas.openxmlformats.org/officeDocument/2006/math" xmlns:v="urn:schemas-microsoft-com:vml" xmlns:wp14="http://schemas.microsoft.com/office/word/2010/wordprocessingDrawing" xmlns:wp="http://schemas.openxmlformats.org/drawingml/2006/wordprocessingDrawing" xmlns:w10="urn:schemas-microsoft-com:office:word" xmlns:w="http://schemas.openxmlformats.org/wordprocessingml/2006/main" xmlns:w14="http://schemas.microsoft.com/office/word/2010/wordml" xmlns:w15="http://schemas.microsoft.com/office/word/2012/wordml" xmlns:w16cex="http://schemas.microsoft.com/office/word/2018/wordml/cex" xmlns:w16cid="http://schemas.microsoft.com/office/word/2016/wordml/cid" xmlns:w16="http://schemas.microsoft.com/office/word/2018/wordml" xmlns:w16du="http://schemas.microsoft.com/office/word/2023/wordml/word16du" xmlns:w16sdtdh="http://schemas.microsoft.com/office/word/2020/wordml/sdtdatahash" xmlns:w16sdtfl="http://schemas.microsoft.com/office/word/2024/wordml/sdtformatlock" xmlns:w16se="http://schemas.microsoft.com/office/word/2015/wordml/symex" xmlns:wpg="http://schemas.microsoft.com/office/word/2010/wordprocessingGroup" xmlns:wpi="http://schemas.microsoft.com/office/word/2010/wordprocessingInk" xmlns:wne="http://schemas.microsoft.com/office/word/2006/wordml" xmlns:wps="http://schemas.microsoft.com/office/word/2010/wordprocessingShape" mc:Ignorable="w14 w15 w16se w16cid w16 w16cex w16sdtdh w16sdtfl w16du wp14">
+<w:hdr xmlns:wpc="http://schemas.microsoft.com/office/word/2010/wordprocessingCanvas" xmlns:cx="http://schemas.microsoft.com/office/drawing/2014/chartex" xmlns:cx1="http://schemas.microsoft.com/office/drawing/2015/9/8/chartex" xmlns:cx2="http://schemas.microsoft.com/office/drawing/2015/10/21/chartex" xmlns:cx3="http://schemas.microsoft.com/office/drawing/2016/5/9/chartex" xmlns:cx4="http://schemas.microsoft.com/office/drawing/2016/5/10/chartex" xmlns:cx5="http://schemas.microsoft.com/office/drawing/2016/5/11/chartex" xmlns:cx6="http://schemas.microsoft.com/office/drawing/2016/5/12/chartex" xmlns:cx7="http://schemas.microsoft.com/office/drawing/2016/5/13/chartex" xmlns:cx8="http://schemas.microsoft.com/office/drawing/2016/5/14/chartex" xmlns:mc="http://schemas.openxmlformats.org/markup-compatibility/2006" xmlns:aink="http://schemas.microsoft.com/office/drawing/2016/ink" xmlns:am3d="http://schemas.microsoft.com/office/drawing/2017/model3d" xmlns:o="urn:schemas-microsoft-com:office:office" xmlns:r="http://schemas.openxmlformats.org/officeDocument/2006/relationships" xmlns:m="http://schemas.openxmlformats.org/officeDocument/2006/math" xmlns:v="urn:schemas-microsoft-com:vml" xmlns:wp14="http://schemas.microsoft.com/office/word/2010/wordprocessingDrawing" xmlns:wp="http://schemas.openxmlformats.org/drawingml/2006/wordprocessingDrawing" xmlns:w10="urn:schemas-microsoft-com:office:word" xmlns:w="http://schemas.openxmlformats.org/wordprocessingml/2006/main" xmlns:w14="http://schemas.microsoft.com/office/word/2010/wordml" xmlns:w15="http://schemas.microsoft.com/office/word/2012/wordml" xmlns:w16cid="http://schemas.microsoft.com/office/word/2016/wordml/cid" xmlns:w16se="http://schemas.microsoft.com/office/word/2015/wordml/symex" xmlns:wpg="http://schemas.microsoft.com/office/word/2010/wordprocessingGroup" xmlns:wpi="http://schemas.microsoft.com/office/word/2010/wordprocessingInk" xmlns:wne="http://schemas.microsoft.com/office/word/2006/wordml" xmlns:wps="http://schemas.microsoft.com/office/word/2010/wordprocessingShape" mc:Ignorable="w14 w15 w16se w16cid wp14">
   <w:p>
     <w:pPr>
       <w:pStyle w:val="Intestazione"/>
@@ -2290,7 +3022,7 @@
 </file>
 
 <file path=word/numbering.xml><?xml version="1.0" encoding="utf-8"?>
-<w:numbering xmlns:wpc="http://schemas.microsoft.com/office/word/2010/wordprocessingCanvas" xmlns:cx="http://schemas.microsoft.com/office/drawing/2014/chartex" xmlns:cx1="http://schemas.microsoft.com/office/drawing/2015/9/8/chartex" xmlns:cx2="http://schemas.microsoft.com/office/drawing/2015/10/21/chartex" xmlns:cx3="http://schemas.microsoft.com/office/drawing/2016/5/9/chartex" xmlns:cx4="http://schemas.microsoft.com/office/drawing/2016/5/10/chartex" xmlns:cx5="http://schemas.microsoft.com/office/drawing/2016/5/11/chartex" xmlns:cx6="http://schemas.microsoft.com/office/drawing/2016/5/12/chartex" xmlns:cx7="http://schemas.microsoft.com/office/drawing/2016/5/13/chartex" xmlns:cx8="http://schemas.microsoft.com/office/drawing/2016/5/14/chartex" xmlns:mc="http://schemas.openxmlformats.org/markup-compatibility/2006" xmlns:aink="http://schemas.microsoft.com/office/drawing/2016/ink" xmlns:am3d="http://schemas.microsoft.com/office/drawing/2017/model3d" xmlns:o="urn:schemas-microsoft-com:office:office" xmlns:oel="http://schemas.microsoft.com/office/2019/extlst" xmlns:r="http://schemas.openxmlformats.org/officeDocument/2006/relationships" xmlns:m="http://schemas.openxmlformats.org/officeDocument/2006/math" xmlns:v="urn:schemas-microsoft-com:vml" xmlns:wp14="http://schemas.microsoft.com/office/word/2010/wordprocessingDrawing" xmlns:wp="http://schemas.openxmlformats.org/drawingml/2006/wordprocessingDrawing" xmlns:w10="urn:schemas-microsoft-com:office:word" xmlns:w="http://schemas.openxmlformats.org/wordprocessingml/2006/main" xmlns:w14="http://schemas.microsoft.com/office/word/2010/wordml" xmlns:w15="http://schemas.microsoft.com/office/word/2012/wordml" xmlns:w16cex="http://schemas.microsoft.com/office/word/2018/wordml/cex" xmlns:w16cid="http://schemas.microsoft.com/office/word/2016/wordml/cid" xmlns:w16="http://schemas.microsoft.com/office/word/2018/wordml" xmlns:w16du="http://schemas.microsoft.com/office/word/2023/wordml/word16du" xmlns:w16sdtdh="http://schemas.microsoft.com/office/word/2020/wordml/sdtdatahash" xmlns:w16sdtfl="http://schemas.microsoft.com/office/word/2024/wordml/sdtformatlock" xmlns:w16se="http://schemas.microsoft.com/office/word/2015/wordml/symex" xmlns:wpg="http://schemas.microsoft.com/office/word/2010/wordprocessingGroup" xmlns:wpi="http://schemas.microsoft.com/office/word/2010/wordprocessingInk" xmlns:wne="http://schemas.microsoft.com/office/word/2006/wordml" xmlns:wps="http://schemas.microsoft.com/office/word/2010/wordprocessingShape" mc:Ignorable="w14 w15 w16se w16cid w16 w16cex w16sdtdh w16sdtfl w16du wp14">
+<w:numbering xmlns:wpc="http://schemas.microsoft.com/office/word/2010/wordprocessingCanvas" xmlns:cx="http://schemas.microsoft.com/office/drawing/2014/chartex" xmlns:cx1="http://schemas.microsoft.com/office/drawing/2015/9/8/chartex" xmlns:cx2="http://schemas.microsoft.com/office/drawing/2015/10/21/chartex" xmlns:cx3="http://schemas.microsoft.com/office/drawing/2016/5/9/chartex" xmlns:cx4="http://schemas.microsoft.com/office/drawing/2016/5/10/chartex" xmlns:cx5="http://schemas.microsoft.com/office/drawing/2016/5/11/chartex" xmlns:cx6="http://schemas.microsoft.com/office/drawing/2016/5/12/chartex" xmlns:cx7="http://schemas.microsoft.com/office/drawing/2016/5/13/chartex" xmlns:cx8="http://schemas.microsoft.com/office/drawing/2016/5/14/chartex" xmlns:mc="http://schemas.openxmlformats.org/markup-compatibility/2006" xmlns:aink="http://schemas.microsoft.com/office/drawing/2016/ink" xmlns:am3d="http://schemas.microsoft.com/office/drawing/2017/model3d" xmlns:o="urn:schemas-microsoft-com:office:office" xmlns:r="http://schemas.openxmlformats.org/officeDocument/2006/relationships" xmlns:m="http://schemas.openxmlformats.org/officeDocument/2006/math" xmlns:v="urn:schemas-microsoft-com:vml" xmlns:wp14="http://schemas.microsoft.com/office/word/2010/wordprocessingDrawing" xmlns:wp="http://schemas.openxmlformats.org/drawingml/2006/wordprocessingDrawing" xmlns:w10="urn:schemas-microsoft-com:office:word" xmlns:w="http://schemas.openxmlformats.org/wordprocessingml/2006/main" xmlns:w14="http://schemas.microsoft.com/office/word/2010/wordml" xmlns:w15="http://schemas.microsoft.com/office/word/2012/wordml" xmlns:w16cid="http://schemas.microsoft.com/office/word/2016/wordml/cid" xmlns:w16se="http://schemas.microsoft.com/office/word/2015/wordml/symex" xmlns:wpg="http://schemas.microsoft.com/office/word/2010/wordprocessingGroup" xmlns:wpi="http://schemas.microsoft.com/office/word/2010/wordprocessingInk" xmlns:wne="http://schemas.microsoft.com/office/word/2006/wordml" xmlns:wps="http://schemas.microsoft.com/office/word/2010/wordprocessingShape" mc:Ignorable="w14 w15 w16se w16cid wp14">
   <w:abstractNum w:abstractNumId="0" w15:restartNumberingAfterBreak="0">
     <w:nsid w:val="0EDA6935"/>
     <w:multiLevelType w:val="hybridMultilevel"/>
@@ -3613,47 +4345,47 @@
       </w:rPr>
     </w:lvl>
   </w:abstractNum>
-  <w:num w:numId="1" w16cid:durableId="1629966701">
+  <w:num w:numId="1">
     <w:abstractNumId w:val="0"/>
   </w:num>
-  <w:num w:numId="2" w16cid:durableId="1445687787">
+  <w:num w:numId="2">
     <w:abstractNumId w:val="4"/>
   </w:num>
-  <w:num w:numId="3" w16cid:durableId="101264031">
+  <w:num w:numId="3">
     <w:abstractNumId w:val="10"/>
   </w:num>
-  <w:num w:numId="4" w16cid:durableId="1274702189">
+  <w:num w:numId="4">
     <w:abstractNumId w:val="6"/>
   </w:num>
-  <w:num w:numId="5" w16cid:durableId="562642335">
+  <w:num w:numId="5">
     <w:abstractNumId w:val="7"/>
   </w:num>
-  <w:num w:numId="6" w16cid:durableId="1163083309">
+  <w:num w:numId="6">
     <w:abstractNumId w:val="2"/>
   </w:num>
-  <w:num w:numId="7" w16cid:durableId="68969620">
+  <w:num w:numId="7">
     <w:abstractNumId w:val="9"/>
   </w:num>
-  <w:num w:numId="8" w16cid:durableId="1303733114">
+  <w:num w:numId="8">
     <w:abstractNumId w:val="1"/>
   </w:num>
-  <w:num w:numId="9" w16cid:durableId="711613592">
+  <w:num w:numId="9">
     <w:abstractNumId w:val="11"/>
   </w:num>
-  <w:num w:numId="10" w16cid:durableId="1168328916">
+  <w:num w:numId="10">
     <w:abstractNumId w:val="5"/>
   </w:num>
-  <w:num w:numId="11" w16cid:durableId="1668169499">
+  <w:num w:numId="11">
     <w:abstractNumId w:val="3"/>
   </w:num>
-  <w:num w:numId="12" w16cid:durableId="31273608">
+  <w:num w:numId="12">
     <w:abstractNumId w:val="8"/>
   </w:num>
 </w:numbering>
 </file>
 
 <file path=word/styles.xml><?xml version="1.0" encoding="utf-8"?>
-<w:styles xmlns:mc="http://schemas.openxmlformats.org/markup-compatibility/2006" xmlns:r="http://schemas.openxmlformats.org/officeDocument/2006/relationships" xmlns:w="http://schemas.openxmlformats.org/wordprocessingml/2006/main" xmlns:w14="http://schemas.microsoft.com/office/word/2010/wordml" xmlns:w15="http://schemas.microsoft.com/office/word/2012/wordml" xmlns:w16cex="http://schemas.microsoft.com/office/word/2018/wordml/cex" xmlns:w16cid="http://schemas.microsoft.com/office/word/2016/wordml/cid" xmlns:w16="http://schemas.microsoft.com/office/word/2018/wordml" xmlns:w16du="http://schemas.microsoft.com/office/word/2023/wordml/word16du" xmlns:w16sdtdh="http://schemas.microsoft.com/office/word/2020/wordml/sdtdatahash" xmlns:w16sdtfl="http://schemas.microsoft.com/office/word/2024/wordml/sdtformatlock" xmlns:w16se="http://schemas.microsoft.com/office/word/2015/wordml/symex" mc:Ignorable="w14 w15 w16se w16cid w16 w16cex w16sdtdh w16sdtfl w16du">
+<w:styles xmlns:mc="http://schemas.openxmlformats.org/markup-compatibility/2006" xmlns:r="http://schemas.openxmlformats.org/officeDocument/2006/relationships" xmlns:w="http://schemas.openxmlformats.org/wordprocessingml/2006/main" xmlns:w14="http://schemas.microsoft.com/office/word/2010/wordml" xmlns:w15="http://schemas.microsoft.com/office/word/2012/wordml" xmlns:w16cid="http://schemas.microsoft.com/office/word/2016/wordml/cid" xmlns:w16se="http://schemas.microsoft.com/office/word/2015/wordml/symex" mc:Ignorable="w14 w15 w16se w16cid">
   <w:docDefaults>
     <w:rPrDefault>
       <w:rPr>
@@ -3669,7 +4401,7 @@
       </w:pPr>
     </w:pPrDefault>
   </w:docDefaults>
-  <w:latentStyles w:defLockedState="0" w:defUIPriority="99" w:defSemiHidden="0" w:defUnhideWhenUsed="0" w:defQFormat="0" w:count="376">
+  <w:latentStyles w:defLockedState="0" w:defUIPriority="99" w:defSemiHidden="0" w:defUnhideWhenUsed="0" w:defQFormat="0" w:count="375">
     <w:lsdException w:name="Normal" w:uiPriority="0" w:qFormat="1"/>
     <w:lsdException w:name="heading 1" w:uiPriority="9" w:qFormat="1"/>
     <w:lsdException w:name="heading 2" w:semiHidden="1" w:uiPriority="9" w:unhideWhenUsed="1" w:qFormat="1"/>
@@ -4045,7 +4777,6 @@
     <w:lsdException w:name="Smart Hyperlink" w:semiHidden="1" w:unhideWhenUsed="1"/>
     <w:lsdException w:name="Hashtag" w:semiHidden="1" w:unhideWhenUsed="1"/>
     <w:lsdException w:name="Unresolved Mention" w:semiHidden="1" w:unhideWhenUsed="1"/>
-    <w:lsdException w:name="Smart Link" w:semiHidden="1" w:unhideWhenUsed="1"/>
   </w:latentStyles>
   <w:style w:type="paragraph" w:default="1" w:styleId="Normale">
     <w:name w:val="Normal"/>

</xml_diff>

<commit_message>
UPDATE - revision bozza_relazione.docx command line
</commit_message>
<xml_diff>
--- a/StudentHome/bozza_relazione.docx
+++ b/StudentHome/bozza_relazione.docx
@@ -977,8 +977,6 @@
           <w:rFonts w:ascii="Century Gothic" w:hAnsi="Century Gothic" w:cs="Courier New"/>
         </w:rPr>
       </w:pPr>
-      <w:bookmarkStart w:id="0" w:name="_GoBack"/>
-      <w:bookmarkEnd w:id="0"/>
     </w:p>
     <w:p>
       <w:pPr>
@@ -2832,7 +2830,115 @@
           <w:sz w:val="22"/>
           <w:szCs w:val="22"/>
         </w:rPr>
-        <w:t xml:space="preserve"> e backend. Utilizzare il link di vite per visitare l’app.</w:t>
+        <w:t xml:space="preserve"> e backend.</w:t>
+      </w:r>
+      <w:r>
+        <w:rPr>
+          <w:rFonts w:ascii="Century Gothic" w:hAnsi="Century Gothic" w:cs="Courier New"/>
+          <w:sz w:val="22"/>
+          <w:szCs w:val="22"/>
+        </w:rPr>
+        <w:t xml:space="preserve"> Se si vuole accedere all’app da altro device in rete lato </w:t>
+      </w:r>
+      <w:proofErr w:type="spellStart"/>
+      <w:r>
+        <w:rPr>
+          <w:rFonts w:ascii="Century Gothic" w:hAnsi="Century Gothic" w:cs="Courier New"/>
+          <w:sz w:val="22"/>
+          <w:szCs w:val="22"/>
+        </w:rPr>
+        <w:t>frontend</w:t>
+      </w:r>
+      <w:proofErr w:type="spellEnd"/>
+      <w:r>
+        <w:rPr>
+          <w:rFonts w:ascii="Century Gothic" w:hAnsi="Century Gothic" w:cs="Courier New"/>
+          <w:sz w:val="22"/>
+          <w:szCs w:val="22"/>
+        </w:rPr>
+        <w:t xml:space="preserve"> usare il comando “</w:t>
+      </w:r>
+      <w:proofErr w:type="spellStart"/>
+      <w:r>
+        <w:rPr>
+          <w:rFonts w:ascii="Century Gothic" w:hAnsi="Century Gothic" w:cs="Courier New"/>
+          <w:sz w:val="22"/>
+          <w:szCs w:val="22"/>
+        </w:rPr>
+        <w:t>npm</w:t>
+      </w:r>
+      <w:proofErr w:type="spellEnd"/>
+      <w:r>
+        <w:rPr>
+          <w:rFonts w:ascii="Century Gothic" w:hAnsi="Century Gothic" w:cs="Courier New"/>
+          <w:sz w:val="22"/>
+          <w:szCs w:val="22"/>
+        </w:rPr>
+        <w:t xml:space="preserve"> </w:t>
+      </w:r>
+      <w:proofErr w:type="spellStart"/>
+      <w:r>
+        <w:rPr>
+          <w:rFonts w:ascii="Century Gothic" w:hAnsi="Century Gothic" w:cs="Courier New"/>
+          <w:sz w:val="22"/>
+          <w:szCs w:val="22"/>
+        </w:rPr>
+        <w:t>run</w:t>
+      </w:r>
+      <w:proofErr w:type="spellEnd"/>
+      <w:r>
+        <w:rPr>
+          <w:rFonts w:ascii="Century Gothic" w:hAnsi="Century Gothic" w:cs="Courier New"/>
+          <w:sz w:val="22"/>
+          <w:szCs w:val="22"/>
+        </w:rPr>
+        <w:t xml:space="preserve"> </w:t>
+      </w:r>
+      <w:proofErr w:type="spellStart"/>
+      <w:r>
+        <w:rPr>
+          <w:rFonts w:ascii="Century Gothic" w:hAnsi="Century Gothic" w:cs="Courier New"/>
+          <w:sz w:val="22"/>
+          <w:szCs w:val="22"/>
+        </w:rPr>
+        <w:t>dev</w:t>
+      </w:r>
+      <w:proofErr w:type="spellEnd"/>
+      <w:r>
+        <w:rPr>
+          <w:rFonts w:ascii="Century Gothic" w:hAnsi="Century Gothic" w:cs="Courier New"/>
+          <w:sz w:val="22"/>
+          <w:szCs w:val="22"/>
+        </w:rPr>
+        <w:t xml:space="preserve">  - -  - -</w:t>
+      </w:r>
+      <w:proofErr w:type="spellStart"/>
+      <w:r>
+        <w:rPr>
+          <w:rFonts w:ascii="Century Gothic" w:hAnsi="Century Gothic" w:cs="Courier New"/>
+          <w:sz w:val="22"/>
+          <w:szCs w:val="22"/>
+        </w:rPr>
+        <w:t>host</w:t>
+      </w:r>
+      <w:proofErr w:type="spellEnd"/>
+      <w:r>
+        <w:rPr>
+          <w:rFonts w:ascii="Century Gothic" w:hAnsi="Century Gothic" w:cs="Courier New"/>
+          <w:sz w:val="22"/>
+          <w:szCs w:val="22"/>
+        </w:rPr>
+        <w:t xml:space="preserve"> 0.0.0.0”</w:t>
+      </w:r>
+      <w:bookmarkStart w:id="0" w:name="_GoBack"/>
+      <w:bookmarkEnd w:id="0"/>
+      <w:r>
+        <w:rPr>
+          <w:rFonts w:ascii="Century Gothic" w:hAnsi="Century Gothic" w:cs="Courier New"/>
+          <w:sz w:val="22"/>
+          <w:szCs w:val="22"/>
+        </w:rPr>
+        <w:t xml:space="preserve"> Utilizzare il link di vite per visitare l’app.</w:t>
       </w:r>
     </w:p>
     <w:p>

</xml_diff>

<commit_message>
UPDATE - correct punctuation in instructions for running the web application in bozza_relazione.docx
</commit_message>
<xml_diff>
--- a/StudentHome/bozza_relazione.docx
+++ b/StudentHome/bozza_relazione.docx
@@ -1,6 +1,6 @@
 
 <file path=word/document.xml><?xml version="1.0" encoding="utf-8"?>
-<w:document xmlns:wpc="http://schemas.microsoft.com/office/word/2010/wordprocessingCanvas" xmlns:cx="http://schemas.microsoft.com/office/drawing/2014/chartex" xmlns:cx1="http://schemas.microsoft.com/office/drawing/2015/9/8/chartex" xmlns:cx2="http://schemas.microsoft.com/office/drawing/2015/10/21/chartex" xmlns:cx3="http://schemas.microsoft.com/office/drawing/2016/5/9/chartex" xmlns:cx4="http://schemas.microsoft.com/office/drawing/2016/5/10/chartex" xmlns:cx5="http://schemas.microsoft.com/office/drawing/2016/5/11/chartex" xmlns:cx6="http://schemas.microsoft.com/office/drawing/2016/5/12/chartex" xmlns:cx7="http://schemas.microsoft.com/office/drawing/2016/5/13/chartex" xmlns:cx8="http://schemas.microsoft.com/office/drawing/2016/5/14/chartex" xmlns:mc="http://schemas.openxmlformats.org/markup-compatibility/2006" xmlns:aink="http://schemas.microsoft.com/office/drawing/2016/ink" xmlns:am3d="http://schemas.microsoft.com/office/drawing/2017/model3d" xmlns:o="urn:schemas-microsoft-com:office:office" xmlns:r="http://schemas.openxmlformats.org/officeDocument/2006/relationships" xmlns:m="http://schemas.openxmlformats.org/officeDocument/2006/math" xmlns:v="urn:schemas-microsoft-com:vml" xmlns:wp14="http://schemas.microsoft.com/office/word/2010/wordprocessingDrawing" xmlns:wp="http://schemas.openxmlformats.org/drawingml/2006/wordprocessingDrawing" xmlns:w10="urn:schemas-microsoft-com:office:word" xmlns:w="http://schemas.openxmlformats.org/wordprocessingml/2006/main" xmlns:w14="http://schemas.microsoft.com/office/word/2010/wordml" xmlns:w15="http://schemas.microsoft.com/office/word/2012/wordml" xmlns:w16cid="http://schemas.microsoft.com/office/word/2016/wordml/cid" xmlns:w16se="http://schemas.microsoft.com/office/word/2015/wordml/symex" xmlns:wpg="http://schemas.microsoft.com/office/word/2010/wordprocessingGroup" xmlns:wpi="http://schemas.microsoft.com/office/word/2010/wordprocessingInk" xmlns:wne="http://schemas.microsoft.com/office/word/2006/wordml" xmlns:wps="http://schemas.microsoft.com/office/word/2010/wordprocessingShape" mc:Ignorable="w14 w15 w16se w16cid wp14">
+<w:document xmlns:wpc="http://schemas.microsoft.com/office/word/2010/wordprocessingCanvas" xmlns:cx="http://schemas.microsoft.com/office/drawing/2014/chartex" xmlns:cx1="http://schemas.microsoft.com/office/drawing/2015/9/8/chartex" xmlns:cx2="http://schemas.microsoft.com/office/drawing/2015/10/21/chartex" xmlns:cx3="http://schemas.microsoft.com/office/drawing/2016/5/9/chartex" xmlns:cx4="http://schemas.microsoft.com/office/drawing/2016/5/10/chartex" xmlns:cx5="http://schemas.microsoft.com/office/drawing/2016/5/11/chartex" xmlns:cx6="http://schemas.microsoft.com/office/drawing/2016/5/12/chartex" xmlns:cx7="http://schemas.microsoft.com/office/drawing/2016/5/13/chartex" xmlns:cx8="http://schemas.microsoft.com/office/drawing/2016/5/14/chartex" xmlns:mc="http://schemas.openxmlformats.org/markup-compatibility/2006" xmlns:aink="http://schemas.microsoft.com/office/drawing/2016/ink" xmlns:am3d="http://schemas.microsoft.com/office/drawing/2017/model3d" xmlns:o="urn:schemas-microsoft-com:office:office" xmlns:oel="http://schemas.microsoft.com/office/2019/extlst" xmlns:r="http://schemas.openxmlformats.org/officeDocument/2006/relationships" xmlns:m="http://schemas.openxmlformats.org/officeDocument/2006/math" xmlns:v="urn:schemas-microsoft-com:vml" xmlns:wp14="http://schemas.microsoft.com/office/word/2010/wordprocessingDrawing" xmlns:wp="http://schemas.openxmlformats.org/drawingml/2006/wordprocessingDrawing" xmlns:w10="urn:schemas-microsoft-com:office:word" xmlns:w="http://schemas.openxmlformats.org/wordprocessingml/2006/main" xmlns:w14="http://schemas.microsoft.com/office/word/2010/wordml" xmlns:w15="http://schemas.microsoft.com/office/word/2012/wordml" xmlns:w16cex="http://schemas.microsoft.com/office/word/2018/wordml/cex" xmlns:w16cid="http://schemas.microsoft.com/office/word/2016/wordml/cid" xmlns:w16="http://schemas.microsoft.com/office/word/2018/wordml" xmlns:w16du="http://schemas.microsoft.com/office/word/2023/wordml/word16du" xmlns:w16sdtdh="http://schemas.microsoft.com/office/word/2020/wordml/sdtdatahash" xmlns:w16sdtfl="http://schemas.microsoft.com/office/word/2024/wordml/sdtformatlock" xmlns:w16se="http://schemas.microsoft.com/office/word/2015/wordml/symex" xmlns:wpg="http://schemas.microsoft.com/office/word/2010/wordprocessingGroup" xmlns:wpi="http://schemas.microsoft.com/office/word/2010/wordprocessingInk" xmlns:wne="http://schemas.microsoft.com/office/word/2006/wordml" xmlns:wps="http://schemas.microsoft.com/office/word/2010/wordprocessingShape" mc:Ignorable="w14 w15 w16se w16cid w16 w16cex w16sdtdh w16sdtfl w16du wp14">
   <w:body>
     <w:p>
       <w:pPr>
@@ -61,25 +61,7 @@
           <w:sz w:val="22"/>
           <w:szCs w:val="22"/>
         </w:rPr>
-        <w:t xml:space="preserve">Benvenuti nel sito di </w:t>
-      </w:r>
-      <w:proofErr w:type="spellStart"/>
-      <w:r>
-        <w:rPr>
-          <w:rFonts w:ascii="Century Gothic" w:hAnsi="Century Gothic" w:cs="Courier New"/>
-          <w:sz w:val="22"/>
-          <w:szCs w:val="22"/>
-        </w:rPr>
-        <w:t>StudentHome</w:t>
-      </w:r>
-      <w:proofErr w:type="spellEnd"/>
-      <w:r>
-        <w:rPr>
-          <w:rFonts w:ascii="Century Gothic" w:hAnsi="Century Gothic" w:cs="Courier New"/>
-          <w:sz w:val="22"/>
-          <w:szCs w:val="22"/>
-        </w:rPr>
-        <w:t>. Questa applicazione web è un servizio gratuito per gli studenti</w:t>
+        <w:t>Benvenuti nel sito di StudentHome. Questa applicazione web è un servizio gratuito per gli studenti</w:t>
       </w:r>
       <w:r>
         <w:rPr>
@@ -700,18 +682,8 @@
           <w:sz w:val="22"/>
           <w:szCs w:val="22"/>
         </w:rPr>
-        <w:t xml:space="preserve">XAMPP per avviare il server </w:t>
-      </w:r>
-      <w:proofErr w:type="spellStart"/>
-      <w:r>
-        <w:rPr>
-          <w:rFonts w:ascii="Century Gothic" w:hAnsi="Century Gothic" w:cs="Courier New"/>
-          <w:sz w:val="22"/>
-          <w:szCs w:val="22"/>
-        </w:rPr>
-        <w:t>mysql</w:t>
-      </w:r>
-      <w:proofErr w:type="spellEnd"/>
+        <w:t>XAMPP per avviare il server mysql</w:t>
+      </w:r>
     </w:p>
     <w:p>
       <w:pPr>
@@ -774,41 +746,13 @@
           <w:szCs w:val="22"/>
         </w:rPr>
       </w:pPr>
-      <w:proofErr w:type="spellStart"/>
-      <w:r>
-        <w:rPr>
-          <w:rFonts w:ascii="Century Gothic" w:hAnsi="Century Gothic" w:cs="Courier New"/>
-          <w:sz w:val="22"/>
-          <w:szCs w:val="22"/>
-        </w:rPr>
-        <w:t>npm</w:t>
-      </w:r>
-      <w:proofErr w:type="spellEnd"/>
-      <w:r>
-        <w:rPr>
-          <w:rFonts w:ascii="Century Gothic" w:hAnsi="Century Gothic" w:cs="Courier New"/>
-          <w:sz w:val="22"/>
-          <w:szCs w:val="22"/>
-        </w:rPr>
-        <w:t xml:space="preserve"> per installazione di </w:t>
-      </w:r>
-      <w:proofErr w:type="spellStart"/>
-      <w:r>
-        <w:rPr>
-          <w:rFonts w:ascii="Century Gothic" w:hAnsi="Century Gothic" w:cs="Courier New"/>
-          <w:sz w:val="22"/>
-          <w:szCs w:val="22"/>
-        </w:rPr>
-        <w:t>packages</w:t>
-      </w:r>
-      <w:proofErr w:type="spellEnd"/>
-      <w:r>
-        <w:rPr>
-          <w:rFonts w:ascii="Century Gothic" w:hAnsi="Century Gothic" w:cs="Courier New"/>
-          <w:sz w:val="22"/>
-          <w:szCs w:val="22"/>
-        </w:rPr>
-        <w:t xml:space="preserve"> e avviare il server</w:t>
+      <w:r>
+        <w:rPr>
+          <w:rFonts w:ascii="Century Gothic" w:hAnsi="Century Gothic" w:cs="Courier New"/>
+          <w:sz w:val="22"/>
+          <w:szCs w:val="22"/>
+        </w:rPr>
+        <w:t>npm per installazione di packages e avviare il server</w:t>
       </w:r>
     </w:p>
     <w:p>
@@ -897,7 +841,6 @@
           <w:lang w:val="en-US"/>
         </w:rPr>
       </w:pPr>
-      <w:proofErr w:type="spellStart"/>
       <w:r>
         <w:rPr>
           <w:rFonts w:ascii="Century Gothic" w:hAnsi="Century Gothic" w:cs="Courier New"/>
@@ -907,7 +850,6 @@
         </w:rPr>
         <w:t>Vite</w:t>
       </w:r>
-      <w:proofErr w:type="spellEnd"/>
     </w:p>
     <w:p>
       <w:pPr>
@@ -923,7 +865,6 @@
           <w:lang w:val="en-US"/>
         </w:rPr>
       </w:pPr>
-      <w:proofErr w:type="spellStart"/>
       <w:r>
         <w:rPr>
           <w:rFonts w:ascii="Century Gothic" w:hAnsi="Century Gothic" w:cs="Courier New"/>
@@ -933,7 +874,6 @@
         </w:rPr>
         <w:t>Axios</w:t>
       </w:r>
-      <w:proofErr w:type="spellEnd"/>
     </w:p>
     <w:p>
       <w:pPr>
@@ -956,27 +896,23 @@
           <w:szCs w:val="22"/>
           <w:lang w:val="en-US"/>
         </w:rPr>
-        <w:t xml:space="preserve">Bootstrap per </w:t>
-      </w:r>
-      <w:proofErr w:type="spellStart"/>
-      <w:r>
-        <w:rPr>
-          <w:rFonts w:ascii="Century Gothic" w:hAnsi="Century Gothic" w:cs="Courier New"/>
-          <w:sz w:val="22"/>
-          <w:szCs w:val="22"/>
+        <w:t>Bootstrap per css</w:t>
+      </w:r>
+    </w:p>
+    <w:p>
+      <w:pPr>
+        <w:rPr>
+          <w:rFonts w:ascii="Century Gothic" w:hAnsi="Century Gothic" w:cs="Courier New"/>
           <w:lang w:val="en-US"/>
         </w:rPr>
-        <w:t>css</w:t>
-      </w:r>
-      <w:proofErr w:type="spellEnd"/>
-    </w:p>
-    <w:p>
-      <w:pPr>
-        <w:pStyle w:val="Testonormale"/>
-        <w:rPr>
-          <w:rFonts w:ascii="Century Gothic" w:hAnsi="Century Gothic" w:cs="Courier New"/>
-        </w:rPr>
-      </w:pPr>
+      </w:pPr>
+      <w:r>
+        <w:rPr>
+          <w:rFonts w:ascii="Century Gothic" w:hAnsi="Century Gothic" w:cs="Courier New"/>
+          <w:lang w:val="en-US"/>
+        </w:rPr>
+        <w:br w:type="page"/>
+      </w:r>
     </w:p>
     <w:p>
       <w:pPr>
@@ -989,7 +925,6 @@
           <w:szCs w:val="28"/>
         </w:rPr>
       </w:pPr>
-      <w:proofErr w:type="spellStart"/>
       <w:r>
         <w:rPr>
           <w:rFonts w:ascii="Century Gothic" w:hAnsi="Century Gothic" w:cs="Courier New"/>
@@ -997,1401 +932,1036 @@
           <w:sz w:val="28"/>
           <w:szCs w:val="28"/>
         </w:rPr>
-        <w:t>Packages</w:t>
-      </w:r>
-      <w:proofErr w:type="spellEnd"/>
-      <w:r>
+        <w:lastRenderedPageBreak/>
+        <w:t>Packages installati</w:t>
+      </w:r>
+    </w:p>
+    <w:p>
+      <w:pPr>
+        <w:pStyle w:val="Testonormale"/>
+        <w:numPr>
+          <w:ilvl w:val="0"/>
+          <w:numId w:val="6"/>
+        </w:numPr>
+        <w:jc w:val="both"/>
+        <w:rPr>
+          <w:rFonts w:ascii="Century Gothic" w:hAnsi="Century Gothic" w:cs="Courier New"/>
+          <w:sz w:val="22"/>
+          <w:szCs w:val="22"/>
+        </w:rPr>
+      </w:pPr>
+      <w:r>
+        <w:rPr>
+          <w:rFonts w:ascii="Century Gothic" w:hAnsi="Century Gothic" w:cs="Courier New"/>
+          <w:sz w:val="22"/>
+          <w:szCs w:val="22"/>
+        </w:rPr>
+        <w:t>c</w:t>
+      </w:r>
+      <w:r>
+        <w:rPr>
+          <w:rFonts w:ascii="Century Gothic" w:hAnsi="Century Gothic" w:cs="Courier New"/>
+          <w:sz w:val="22"/>
+          <w:szCs w:val="22"/>
+        </w:rPr>
+        <w:t>onnect-history-api-fallback</w:t>
+      </w:r>
+    </w:p>
+    <w:p>
+      <w:pPr>
+        <w:pStyle w:val="Testonormale"/>
+        <w:numPr>
+          <w:ilvl w:val="0"/>
+          <w:numId w:val="6"/>
+        </w:numPr>
+        <w:jc w:val="both"/>
+        <w:rPr>
+          <w:rFonts w:ascii="Century Gothic" w:hAnsi="Century Gothic" w:cs="Courier New"/>
+          <w:sz w:val="22"/>
+          <w:szCs w:val="22"/>
+        </w:rPr>
+      </w:pPr>
+      <w:r>
+        <w:rPr>
+          <w:rFonts w:ascii="Century Gothic" w:hAnsi="Century Gothic" w:cs="Courier New"/>
+          <w:sz w:val="22"/>
+          <w:szCs w:val="22"/>
+        </w:rPr>
+        <w:t>mysql2: otimizzato e compatibile con Promises, ideale per eseguire query asincrone in applicazioni Node.js</w:t>
+      </w:r>
+    </w:p>
+    <w:p>
+      <w:pPr>
+        <w:pStyle w:val="Testonormale"/>
+        <w:numPr>
+          <w:ilvl w:val="0"/>
+          <w:numId w:val="6"/>
+        </w:numPr>
+        <w:jc w:val="both"/>
+        <w:rPr>
+          <w:rFonts w:ascii="Century Gothic" w:hAnsi="Century Gothic" w:cs="Courier New"/>
+          <w:sz w:val="22"/>
+          <w:szCs w:val="22"/>
+        </w:rPr>
+      </w:pPr>
+      <w:r>
+        <w:rPr>
+          <w:rFonts w:ascii="Century Gothic" w:hAnsi="Century Gothic" w:cs="Courier New"/>
+          <w:sz w:val="22"/>
+          <w:szCs w:val="22"/>
+        </w:rPr>
+        <w:t>cookie-parser</w:t>
+      </w:r>
+      <w:r>
+        <w:rPr>
+          <w:rFonts w:ascii="Century Gothic" w:hAnsi="Century Gothic" w:cs="Courier New"/>
+          <w:sz w:val="22"/>
+          <w:szCs w:val="22"/>
+        </w:rPr>
+        <w:t xml:space="preserve">, </w:t>
+      </w:r>
+      <w:r>
+        <w:rPr>
+          <w:rFonts w:ascii="Century Gothic" w:hAnsi="Century Gothic" w:cs="Courier New"/>
+          <w:sz w:val="22"/>
+          <w:szCs w:val="22"/>
+        </w:rPr>
+        <w:t>jsonwebtoken</w:t>
+      </w:r>
+      <w:r>
+        <w:rPr>
+          <w:rFonts w:ascii="Century Gothic" w:hAnsi="Century Gothic" w:cs="Courier New"/>
+          <w:sz w:val="22"/>
+          <w:szCs w:val="22"/>
+        </w:rPr>
+        <w:t xml:space="preserve"> e </w:t>
+      </w:r>
+      <w:r>
+        <w:rPr>
+          <w:rFonts w:ascii="Century Gothic" w:hAnsi="Century Gothic" w:cs="Courier New"/>
+          <w:sz w:val="22"/>
+          <w:szCs w:val="22"/>
+        </w:rPr>
+        <w:t>bcrypt</w:t>
+      </w:r>
+      <w:r>
+        <w:rPr>
+          <w:rFonts w:ascii="Century Gothic" w:hAnsi="Century Gothic" w:cs="Courier New"/>
+          <w:sz w:val="22"/>
+          <w:szCs w:val="22"/>
+        </w:rPr>
+        <w:t>: utilizzati per la parte di autenticazione. Grazie a questi pacchetti è possibile realizzare una crittografia delle password</w:t>
+      </w:r>
+      <w:r>
+        <w:rPr>
+          <w:rFonts w:ascii="Century Gothic" w:hAnsi="Century Gothic" w:cs="Courier New"/>
+          <w:sz w:val="22"/>
+          <w:szCs w:val="22"/>
+        </w:rPr>
+        <w:t>, gestire i JWT e il parsing dei cookie</w:t>
+      </w:r>
+      <w:r>
+        <w:rPr>
+          <w:rFonts w:ascii="Century Gothic" w:hAnsi="Century Gothic" w:cs="Courier New"/>
+          <w:sz w:val="22"/>
+          <w:szCs w:val="22"/>
+        </w:rPr>
+        <w:t>. Sono stati installati anche i tipi per TypeScript.</w:t>
+      </w:r>
+    </w:p>
+    <w:p>
+      <w:pPr>
+        <w:pStyle w:val="Testonormale"/>
+        <w:numPr>
+          <w:ilvl w:val="0"/>
+          <w:numId w:val="6"/>
+        </w:numPr>
+        <w:jc w:val="both"/>
+        <w:rPr>
+          <w:rFonts w:ascii="Century Gothic" w:hAnsi="Century Gothic" w:cs="Courier New"/>
+          <w:sz w:val="22"/>
+          <w:szCs w:val="22"/>
+        </w:rPr>
+      </w:pPr>
+      <w:r>
+        <w:rPr>
+          <w:rFonts w:ascii="Century Gothic" w:hAnsi="Century Gothic" w:cs="Courier New"/>
+          <w:sz w:val="22"/>
+          <w:szCs w:val="22"/>
+        </w:rPr>
+        <w:t>m</w:t>
+      </w:r>
+      <w:r>
+        <w:rPr>
+          <w:rFonts w:ascii="Century Gothic" w:hAnsi="Century Gothic" w:cs="Courier New"/>
+          <w:sz w:val="22"/>
+          <w:szCs w:val="22"/>
+        </w:rPr>
+        <w:t>ulter</w:t>
+      </w:r>
+      <w:r>
+        <w:rPr>
+          <w:rFonts w:ascii="Century Gothic" w:hAnsi="Century Gothic" w:cs="Courier New"/>
+          <w:sz w:val="22"/>
+          <w:szCs w:val="22"/>
+        </w:rPr>
+        <w:t>: middleware per gestire l'upload di file in Node.js, particolarmente utile per elaborare form multipart/form-data.</w:t>
+      </w:r>
+    </w:p>
+    <w:p>
+      <w:pPr>
+        <w:pStyle w:val="Testonormale"/>
+        <w:rPr>
+          <w:rFonts w:ascii="Century Gothic" w:hAnsi="Century Gothic" w:cs="Courier New"/>
+        </w:rPr>
+      </w:pPr>
+    </w:p>
+    <w:p>
+      <w:pPr>
+        <w:pStyle w:val="Testonormale"/>
+        <w:spacing w:after="240"/>
         <w:rPr>
           <w:rFonts w:ascii="Century Gothic" w:hAnsi="Century Gothic" w:cs="Courier New"/>
           <w:b/>
           <w:sz w:val="28"/>
           <w:szCs w:val="28"/>
         </w:rPr>
-        <w:t xml:space="preserve"> installati</w:t>
-      </w:r>
-    </w:p>
-    <w:p>
-      <w:pPr>
-        <w:pStyle w:val="Testonormale"/>
-        <w:numPr>
-          <w:ilvl w:val="0"/>
-          <w:numId w:val="6"/>
-        </w:numPr>
-        <w:jc w:val="both"/>
-        <w:rPr>
-          <w:rFonts w:ascii="Century Gothic" w:hAnsi="Century Gothic" w:cs="Courier New"/>
-          <w:sz w:val="22"/>
-          <w:szCs w:val="22"/>
-        </w:rPr>
-      </w:pPr>
-      <w:proofErr w:type="spellStart"/>
-      <w:r>
-        <w:rPr>
-          <w:rFonts w:ascii="Century Gothic" w:hAnsi="Century Gothic" w:cs="Courier New"/>
-          <w:sz w:val="22"/>
-          <w:szCs w:val="22"/>
-        </w:rPr>
-        <w:lastRenderedPageBreak/>
-        <w:t>c</w:t>
-      </w:r>
-      <w:r>
-        <w:rPr>
-          <w:rFonts w:ascii="Century Gothic" w:hAnsi="Century Gothic" w:cs="Courier New"/>
-          <w:sz w:val="22"/>
-          <w:szCs w:val="22"/>
-        </w:rPr>
-        <w:t>onnect</w:t>
-      </w:r>
-      <w:proofErr w:type="spellEnd"/>
-      <w:r>
-        <w:rPr>
-          <w:rFonts w:ascii="Century Gothic" w:hAnsi="Century Gothic" w:cs="Courier New"/>
-          <w:sz w:val="22"/>
-          <w:szCs w:val="22"/>
-        </w:rPr>
-        <w:t>-history-api-</w:t>
-      </w:r>
-      <w:proofErr w:type="spellStart"/>
-      <w:r>
-        <w:rPr>
-          <w:rFonts w:ascii="Century Gothic" w:hAnsi="Century Gothic" w:cs="Courier New"/>
-          <w:sz w:val="22"/>
-          <w:szCs w:val="22"/>
-        </w:rPr>
-        <w:t>fallback</w:t>
-      </w:r>
-      <w:proofErr w:type="spellEnd"/>
-    </w:p>
-    <w:p>
-      <w:pPr>
-        <w:pStyle w:val="Testonormale"/>
-        <w:numPr>
-          <w:ilvl w:val="0"/>
-          <w:numId w:val="6"/>
-        </w:numPr>
-        <w:jc w:val="both"/>
-        <w:rPr>
-          <w:rFonts w:ascii="Century Gothic" w:hAnsi="Century Gothic" w:cs="Courier New"/>
-          <w:sz w:val="22"/>
-          <w:szCs w:val="22"/>
-        </w:rPr>
-      </w:pPr>
-      <w:r>
-        <w:rPr>
-          <w:rFonts w:ascii="Century Gothic" w:hAnsi="Century Gothic" w:cs="Courier New"/>
-          <w:sz w:val="22"/>
-          <w:szCs w:val="22"/>
-        </w:rPr>
-        <w:t xml:space="preserve">mysql2: </w:t>
-      </w:r>
-      <w:proofErr w:type="spellStart"/>
-      <w:r>
-        <w:rPr>
-          <w:rFonts w:ascii="Century Gothic" w:hAnsi="Century Gothic" w:cs="Courier New"/>
-          <w:sz w:val="22"/>
-          <w:szCs w:val="22"/>
-        </w:rPr>
-        <w:t>otimizzato</w:t>
-      </w:r>
-      <w:proofErr w:type="spellEnd"/>
-      <w:r>
-        <w:rPr>
-          <w:rFonts w:ascii="Century Gothic" w:hAnsi="Century Gothic" w:cs="Courier New"/>
-          <w:sz w:val="22"/>
-          <w:szCs w:val="22"/>
-        </w:rPr>
-        <w:t xml:space="preserve"> e compatibile con </w:t>
-      </w:r>
-      <w:proofErr w:type="spellStart"/>
-      <w:r>
-        <w:rPr>
-          <w:rFonts w:ascii="Century Gothic" w:hAnsi="Century Gothic" w:cs="Courier New"/>
-          <w:sz w:val="22"/>
-          <w:szCs w:val="22"/>
-        </w:rPr>
-        <w:t>Promises</w:t>
-      </w:r>
-      <w:proofErr w:type="spellEnd"/>
-      <w:r>
-        <w:rPr>
-          <w:rFonts w:ascii="Century Gothic" w:hAnsi="Century Gothic" w:cs="Courier New"/>
-          <w:sz w:val="22"/>
-          <w:szCs w:val="22"/>
-        </w:rPr>
-        <w:t xml:space="preserve">, ideale per eseguire </w:t>
-      </w:r>
-      <w:proofErr w:type="spellStart"/>
-      <w:r>
-        <w:rPr>
-          <w:rFonts w:ascii="Century Gothic" w:hAnsi="Century Gothic" w:cs="Courier New"/>
-          <w:sz w:val="22"/>
-          <w:szCs w:val="22"/>
-        </w:rPr>
-        <w:t>query</w:t>
-      </w:r>
-      <w:proofErr w:type="spellEnd"/>
-      <w:r>
-        <w:rPr>
-          <w:rFonts w:ascii="Century Gothic" w:hAnsi="Century Gothic" w:cs="Courier New"/>
-          <w:sz w:val="22"/>
-          <w:szCs w:val="22"/>
-        </w:rPr>
-        <w:t xml:space="preserve"> asincrone in applicazioni Node.js</w:t>
-      </w:r>
-    </w:p>
-    <w:p>
-      <w:pPr>
-        <w:pStyle w:val="Testonormale"/>
-        <w:numPr>
-          <w:ilvl w:val="0"/>
-          <w:numId w:val="6"/>
-        </w:numPr>
-        <w:jc w:val="both"/>
-        <w:rPr>
-          <w:rFonts w:ascii="Century Gothic" w:hAnsi="Century Gothic" w:cs="Courier New"/>
-          <w:sz w:val="22"/>
-          <w:szCs w:val="22"/>
-        </w:rPr>
-      </w:pPr>
-      <w:r>
-        <w:rPr>
-          <w:rFonts w:ascii="Century Gothic" w:hAnsi="Century Gothic" w:cs="Courier New"/>
-          <w:sz w:val="22"/>
-          <w:szCs w:val="22"/>
-        </w:rPr>
-        <w:t>cookie-</w:t>
-      </w:r>
-      <w:proofErr w:type="spellStart"/>
-      <w:r>
-        <w:rPr>
-          <w:rFonts w:ascii="Century Gothic" w:hAnsi="Century Gothic" w:cs="Courier New"/>
-          <w:sz w:val="22"/>
-          <w:szCs w:val="22"/>
-        </w:rPr>
-        <w:t>parser</w:t>
-      </w:r>
-      <w:proofErr w:type="spellEnd"/>
-      <w:r>
-        <w:rPr>
-          <w:rFonts w:ascii="Century Gothic" w:hAnsi="Century Gothic" w:cs="Courier New"/>
-          <w:sz w:val="22"/>
-          <w:szCs w:val="22"/>
-        </w:rPr>
-        <w:t xml:space="preserve">, </w:t>
-      </w:r>
-      <w:proofErr w:type="spellStart"/>
-      <w:r>
-        <w:rPr>
-          <w:rFonts w:ascii="Century Gothic" w:hAnsi="Century Gothic" w:cs="Courier New"/>
-          <w:sz w:val="22"/>
-          <w:szCs w:val="22"/>
-        </w:rPr>
-        <w:t>jsonwebtoken</w:t>
-      </w:r>
-      <w:proofErr w:type="spellEnd"/>
-      <w:r>
-        <w:rPr>
-          <w:rFonts w:ascii="Century Gothic" w:hAnsi="Century Gothic" w:cs="Courier New"/>
-          <w:sz w:val="22"/>
-          <w:szCs w:val="22"/>
-        </w:rPr>
-        <w:t xml:space="preserve"> e </w:t>
-      </w:r>
-      <w:proofErr w:type="spellStart"/>
-      <w:r>
-        <w:rPr>
-          <w:rFonts w:ascii="Century Gothic" w:hAnsi="Century Gothic" w:cs="Courier New"/>
-          <w:sz w:val="22"/>
-          <w:szCs w:val="22"/>
-        </w:rPr>
-        <w:t>bcrypt</w:t>
-      </w:r>
-      <w:proofErr w:type="spellEnd"/>
-      <w:r>
-        <w:rPr>
-          <w:rFonts w:ascii="Century Gothic" w:hAnsi="Century Gothic" w:cs="Courier New"/>
-          <w:sz w:val="22"/>
-          <w:szCs w:val="22"/>
-        </w:rPr>
-        <w:t>: utilizzati per la parte di autenticazione. Grazie a questi pacchetti è possibile realizzare una crittografia delle password</w:t>
-      </w:r>
-      <w:r>
-        <w:rPr>
-          <w:rFonts w:ascii="Century Gothic" w:hAnsi="Century Gothic" w:cs="Courier New"/>
-          <w:sz w:val="22"/>
-          <w:szCs w:val="22"/>
-        </w:rPr>
-        <w:t xml:space="preserve">, gestire i JWT e il </w:t>
-      </w:r>
-      <w:proofErr w:type="spellStart"/>
-      <w:r>
-        <w:rPr>
-          <w:rFonts w:ascii="Century Gothic" w:hAnsi="Century Gothic" w:cs="Courier New"/>
-          <w:sz w:val="22"/>
-          <w:szCs w:val="22"/>
-        </w:rPr>
-        <w:t>parsing</w:t>
-      </w:r>
-      <w:proofErr w:type="spellEnd"/>
-      <w:r>
-        <w:rPr>
-          <w:rFonts w:ascii="Century Gothic" w:hAnsi="Century Gothic" w:cs="Courier New"/>
-          <w:sz w:val="22"/>
-          <w:szCs w:val="22"/>
-        </w:rPr>
-        <w:t xml:space="preserve"> dei cookie</w:t>
-      </w:r>
-      <w:r>
-        <w:rPr>
-          <w:rFonts w:ascii="Century Gothic" w:hAnsi="Century Gothic" w:cs="Courier New"/>
-          <w:sz w:val="22"/>
-          <w:szCs w:val="22"/>
-        </w:rPr>
-        <w:t xml:space="preserve">. Sono stati installati anche i tipi per </w:t>
-      </w:r>
-      <w:proofErr w:type="spellStart"/>
-      <w:r>
-        <w:rPr>
-          <w:rFonts w:ascii="Century Gothic" w:hAnsi="Century Gothic" w:cs="Courier New"/>
-          <w:sz w:val="22"/>
-          <w:szCs w:val="22"/>
-        </w:rPr>
-        <w:t>TypeScript</w:t>
-      </w:r>
-      <w:proofErr w:type="spellEnd"/>
-      <w:r>
-        <w:rPr>
-          <w:rFonts w:ascii="Century Gothic" w:hAnsi="Century Gothic" w:cs="Courier New"/>
-          <w:sz w:val="22"/>
-          <w:szCs w:val="22"/>
-        </w:rPr>
-        <w:t>.</w:t>
-      </w:r>
-    </w:p>
-    <w:p>
-      <w:pPr>
-        <w:pStyle w:val="Testonormale"/>
-        <w:numPr>
-          <w:ilvl w:val="0"/>
-          <w:numId w:val="6"/>
-        </w:numPr>
-        <w:jc w:val="both"/>
-        <w:rPr>
-          <w:rFonts w:ascii="Century Gothic" w:hAnsi="Century Gothic" w:cs="Courier New"/>
-          <w:sz w:val="22"/>
-          <w:szCs w:val="22"/>
-        </w:rPr>
-      </w:pPr>
-      <w:proofErr w:type="spellStart"/>
-      <w:r>
-        <w:rPr>
-          <w:rFonts w:ascii="Century Gothic" w:hAnsi="Century Gothic" w:cs="Courier New"/>
-          <w:sz w:val="22"/>
-          <w:szCs w:val="22"/>
-        </w:rPr>
-        <w:t>m</w:t>
-      </w:r>
-      <w:r>
-        <w:rPr>
-          <w:rFonts w:ascii="Century Gothic" w:hAnsi="Century Gothic" w:cs="Courier New"/>
-          <w:sz w:val="22"/>
-          <w:szCs w:val="22"/>
-        </w:rPr>
-        <w:t>ulter</w:t>
-      </w:r>
-      <w:proofErr w:type="spellEnd"/>
-      <w:r>
-        <w:rPr>
-          <w:rFonts w:ascii="Century Gothic" w:hAnsi="Century Gothic" w:cs="Courier New"/>
-          <w:sz w:val="22"/>
-          <w:szCs w:val="22"/>
-        </w:rPr>
-        <w:t xml:space="preserve">: middleware per gestire l'upload di file in Node.js, particolarmente utile per elaborare </w:t>
-      </w:r>
-      <w:proofErr w:type="spellStart"/>
-      <w:r>
-        <w:rPr>
-          <w:rFonts w:ascii="Century Gothic" w:hAnsi="Century Gothic" w:cs="Courier New"/>
-          <w:sz w:val="22"/>
-          <w:szCs w:val="22"/>
-        </w:rPr>
-        <w:t>form</w:t>
-      </w:r>
-      <w:proofErr w:type="spellEnd"/>
-      <w:r>
-        <w:rPr>
-          <w:rFonts w:ascii="Century Gothic" w:hAnsi="Century Gothic" w:cs="Courier New"/>
-          <w:sz w:val="22"/>
-          <w:szCs w:val="22"/>
-        </w:rPr>
-        <w:t xml:space="preserve"> </w:t>
-      </w:r>
-      <w:proofErr w:type="spellStart"/>
-      <w:r>
-        <w:rPr>
-          <w:rFonts w:ascii="Century Gothic" w:hAnsi="Century Gothic" w:cs="Courier New"/>
-          <w:sz w:val="22"/>
-          <w:szCs w:val="22"/>
-        </w:rPr>
-        <w:t>multipart</w:t>
-      </w:r>
-      <w:proofErr w:type="spellEnd"/>
-      <w:r>
-        <w:rPr>
-          <w:rFonts w:ascii="Century Gothic" w:hAnsi="Century Gothic" w:cs="Courier New"/>
-          <w:sz w:val="22"/>
-          <w:szCs w:val="22"/>
-        </w:rPr>
-        <w:t>/</w:t>
-      </w:r>
-      <w:proofErr w:type="spellStart"/>
-      <w:r>
-        <w:rPr>
-          <w:rFonts w:ascii="Century Gothic" w:hAnsi="Century Gothic" w:cs="Courier New"/>
-          <w:sz w:val="22"/>
-          <w:szCs w:val="22"/>
-        </w:rPr>
-        <w:t>form</w:t>
-      </w:r>
-      <w:proofErr w:type="spellEnd"/>
-      <w:r>
-        <w:rPr>
-          <w:rFonts w:ascii="Century Gothic" w:hAnsi="Century Gothic" w:cs="Courier New"/>
-          <w:sz w:val="22"/>
-          <w:szCs w:val="22"/>
-        </w:rPr>
-        <w:t>-data.</w:t>
-      </w:r>
-    </w:p>
-    <w:p>
-      <w:pPr>
-        <w:pStyle w:val="Testonormale"/>
-        <w:rPr>
-          <w:rFonts w:ascii="Century Gothic" w:hAnsi="Century Gothic" w:cs="Courier New"/>
-        </w:rPr>
-      </w:pPr>
-    </w:p>
-    <w:p>
-      <w:pPr>
-        <w:pStyle w:val="Testonormale"/>
-        <w:spacing w:after="240"/>
+      </w:pPr>
+      <w:r>
         <w:rPr>
           <w:rFonts w:ascii="Century Gothic" w:hAnsi="Century Gothic" w:cs="Courier New"/>
           <w:b/>
           <w:sz w:val="28"/>
           <w:szCs w:val="28"/>
         </w:rPr>
-      </w:pPr>
-      <w:r>
+        <w:t>Struttura progetto</w:t>
+      </w:r>
+    </w:p>
+    <w:p>
+      <w:pPr>
+        <w:pStyle w:val="Testonormale"/>
+        <w:jc w:val="both"/>
+        <w:rPr>
+          <w:rFonts w:ascii="Century Gothic" w:hAnsi="Century Gothic" w:cs="Courier New"/>
+          <w:sz w:val="22"/>
+          <w:szCs w:val="22"/>
+        </w:rPr>
+      </w:pPr>
+      <w:r>
+        <w:rPr>
+          <w:rFonts w:ascii="Century Gothic" w:hAnsi="Century Gothic" w:cs="Courier New"/>
+          <w:sz w:val="22"/>
+          <w:szCs w:val="22"/>
+        </w:rPr>
+        <w:t>S</w:t>
+      </w:r>
+      <w:r>
+        <w:rPr>
+          <w:rFonts w:ascii="Century Gothic" w:hAnsi="Century Gothic" w:cs="Courier New"/>
+          <w:sz w:val="22"/>
+          <w:szCs w:val="22"/>
+        </w:rPr>
+        <w:t>udd</w:t>
+      </w:r>
+      <w:r>
+        <w:rPr>
+          <w:rFonts w:ascii="Century Gothic" w:hAnsi="Century Gothic" w:cs="Courier New"/>
+          <w:sz w:val="22"/>
+          <w:szCs w:val="22"/>
+        </w:rPr>
+        <w:t>i</w:t>
+      </w:r>
+      <w:r>
+        <w:rPr>
+          <w:rFonts w:ascii="Century Gothic" w:hAnsi="Century Gothic" w:cs="Courier New"/>
+          <w:sz w:val="22"/>
+          <w:szCs w:val="22"/>
+        </w:rPr>
+        <w:t>viso in frontend e backend realizzati rispettivamente con Vue.js e Express</w:t>
+      </w:r>
+    </w:p>
+    <w:p>
+      <w:pPr>
+        <w:pStyle w:val="Testonormale"/>
+        <w:jc w:val="both"/>
+        <w:rPr>
+          <w:rFonts w:ascii="Century Gothic" w:hAnsi="Century Gothic" w:cs="Courier New"/>
+          <w:sz w:val="22"/>
+          <w:szCs w:val="22"/>
+        </w:rPr>
+      </w:pPr>
+    </w:p>
+    <w:p>
+      <w:pPr>
+        <w:pStyle w:val="Testonormale"/>
+        <w:spacing w:after="240"/>
         <w:rPr>
           <w:rFonts w:ascii="Century Gothic" w:hAnsi="Century Gothic" w:cs="Courier New"/>
           <w:b/>
           <w:sz w:val="28"/>
           <w:szCs w:val="28"/>
         </w:rPr>
-        <w:t>Struttura progetto</w:t>
-      </w:r>
-    </w:p>
-    <w:p>
-      <w:pPr>
-        <w:pStyle w:val="Testonormale"/>
-        <w:jc w:val="both"/>
-        <w:rPr>
-          <w:rFonts w:ascii="Century Gothic" w:hAnsi="Century Gothic" w:cs="Courier New"/>
-          <w:sz w:val="22"/>
-          <w:szCs w:val="22"/>
-        </w:rPr>
-      </w:pPr>
-      <w:r>
-        <w:rPr>
-          <w:rFonts w:ascii="Century Gothic" w:hAnsi="Century Gothic" w:cs="Courier New"/>
-          <w:sz w:val="22"/>
-          <w:szCs w:val="22"/>
-        </w:rPr>
-        <w:t>S</w:t>
-      </w:r>
-      <w:r>
-        <w:rPr>
-          <w:rFonts w:ascii="Century Gothic" w:hAnsi="Century Gothic" w:cs="Courier New"/>
-          <w:sz w:val="22"/>
-          <w:szCs w:val="22"/>
-        </w:rPr>
-        <w:t>udd</w:t>
-      </w:r>
-      <w:r>
-        <w:rPr>
-          <w:rFonts w:ascii="Century Gothic" w:hAnsi="Century Gothic" w:cs="Courier New"/>
-          <w:sz w:val="22"/>
-          <w:szCs w:val="22"/>
-        </w:rPr>
-        <w:t>i</w:t>
-      </w:r>
-      <w:r>
-        <w:rPr>
-          <w:rFonts w:ascii="Century Gothic" w:hAnsi="Century Gothic" w:cs="Courier New"/>
-          <w:sz w:val="22"/>
-          <w:szCs w:val="22"/>
-        </w:rPr>
-        <w:t xml:space="preserve">viso in </w:t>
-      </w:r>
-      <w:proofErr w:type="spellStart"/>
-      <w:r>
-        <w:rPr>
-          <w:rFonts w:ascii="Century Gothic" w:hAnsi="Century Gothic" w:cs="Courier New"/>
-          <w:sz w:val="22"/>
-          <w:szCs w:val="22"/>
-        </w:rPr>
-        <w:t>frontend</w:t>
-      </w:r>
-      <w:proofErr w:type="spellEnd"/>
-      <w:r>
-        <w:rPr>
-          <w:rFonts w:ascii="Century Gothic" w:hAnsi="Century Gothic" w:cs="Courier New"/>
-          <w:sz w:val="22"/>
-          <w:szCs w:val="22"/>
-        </w:rPr>
-        <w:t xml:space="preserve"> e backend realizzati rispettivamente con Vue.js e Express</w:t>
-      </w:r>
-    </w:p>
-    <w:p>
-      <w:pPr>
-        <w:pStyle w:val="Testonormale"/>
-        <w:jc w:val="both"/>
-        <w:rPr>
-          <w:rFonts w:ascii="Century Gothic" w:hAnsi="Century Gothic" w:cs="Courier New"/>
-          <w:sz w:val="22"/>
-          <w:szCs w:val="22"/>
-        </w:rPr>
-      </w:pPr>
-    </w:p>
-    <w:p>
-      <w:pPr>
-        <w:pStyle w:val="Testonormale"/>
-        <w:spacing w:after="240"/>
+      </w:pPr>
+      <w:r>
         <w:rPr>
           <w:rFonts w:ascii="Century Gothic" w:hAnsi="Century Gothic" w:cs="Courier New"/>
           <w:b/>
           <w:sz w:val="28"/>
           <w:szCs w:val="28"/>
         </w:rPr>
-      </w:pPr>
-      <w:r>
+        <w:t>API endpoint</w:t>
+      </w:r>
+    </w:p>
+    <w:p>
+      <w:pPr>
+        <w:pStyle w:val="Testonormale"/>
+        <w:rPr>
+          <w:rFonts w:ascii="Century Gothic" w:hAnsi="Century Gothic" w:cs="Courier New"/>
+        </w:rPr>
+      </w:pPr>
+    </w:p>
+    <w:p>
+      <w:pPr>
+        <w:pStyle w:val="Testonormale"/>
+        <w:spacing w:after="240"/>
+        <w:rPr>
+          <w:rFonts w:ascii="Century Gothic" w:hAnsi="Century Gothic" w:cs="Courier New"/>
+          <w:b/>
+          <w:sz w:val="22"/>
+          <w:szCs w:val="22"/>
+          <w:u w:val="single"/>
+        </w:rPr>
+      </w:pPr>
+      <w:r>
+        <w:rPr>
+          <w:rFonts w:ascii="Century Gothic" w:hAnsi="Century Gothic" w:cs="Courier New"/>
+          <w:b/>
+          <w:sz w:val="22"/>
+          <w:szCs w:val="22"/>
+          <w:u w:val="single"/>
+        </w:rPr>
+        <w:t>GET</w:t>
+      </w:r>
+    </w:p>
+    <w:p>
+      <w:pPr>
+        <w:pStyle w:val="Testonormale"/>
+        <w:numPr>
+          <w:ilvl w:val="0"/>
+          <w:numId w:val="3"/>
+        </w:numPr>
+        <w:rPr>
+          <w:rFonts w:ascii="Century Gothic" w:hAnsi="Century Gothic" w:cs="Courier New"/>
+          <w:sz w:val="22"/>
+          <w:szCs w:val="22"/>
+        </w:rPr>
+      </w:pPr>
+      <w:r>
+        <w:rPr>
+          <w:rFonts w:ascii="Century Gothic" w:hAnsi="Century Gothic" w:cs="Courier New"/>
+          <w:sz w:val="22"/>
+          <w:szCs w:val="22"/>
+        </w:rPr>
+        <w:t>/api/news</w:t>
+      </w:r>
+    </w:p>
+    <w:p>
+      <w:pPr>
+        <w:pStyle w:val="Testonormale"/>
+        <w:numPr>
+          <w:ilvl w:val="0"/>
+          <w:numId w:val="3"/>
+        </w:numPr>
+        <w:rPr>
+          <w:rFonts w:ascii="Century Gothic" w:hAnsi="Century Gothic" w:cs="Courier New"/>
+          <w:sz w:val="22"/>
+          <w:szCs w:val="22"/>
+        </w:rPr>
+      </w:pPr>
+      <w:r>
+        <w:rPr>
+          <w:rFonts w:ascii="Century Gothic" w:hAnsi="Century Gothic" w:cs="Courier New"/>
+          <w:sz w:val="22"/>
+          <w:szCs w:val="22"/>
+        </w:rPr>
+        <w:t>/api/news/:id</w:t>
+      </w:r>
+    </w:p>
+    <w:p>
+      <w:pPr>
+        <w:pStyle w:val="Testonormale"/>
+        <w:numPr>
+          <w:ilvl w:val="0"/>
+          <w:numId w:val="3"/>
+        </w:numPr>
+        <w:rPr>
+          <w:rFonts w:ascii="Century Gothic" w:hAnsi="Century Gothic" w:cs="Courier New"/>
+          <w:sz w:val="22"/>
+          <w:szCs w:val="22"/>
+        </w:rPr>
+      </w:pPr>
+      <w:r>
+        <w:rPr>
+          <w:rFonts w:ascii="Century Gothic" w:hAnsi="Century Gothic" w:cs="Courier New"/>
+          <w:sz w:val="22"/>
+          <w:szCs w:val="22"/>
+        </w:rPr>
+        <w:t>/api/auth/profile</w:t>
+      </w:r>
+    </w:p>
+    <w:p>
+      <w:pPr>
+        <w:pStyle w:val="Testonormale"/>
+        <w:numPr>
+          <w:ilvl w:val="0"/>
+          <w:numId w:val="3"/>
+        </w:numPr>
+        <w:rPr>
+          <w:rFonts w:ascii="Century Gothic" w:hAnsi="Century Gothic" w:cs="Courier New"/>
+          <w:sz w:val="22"/>
+          <w:szCs w:val="22"/>
+        </w:rPr>
+      </w:pPr>
+      <w:r>
+        <w:rPr>
+          <w:rFonts w:ascii="Century Gothic" w:hAnsi="Century Gothic" w:cs="Courier New"/>
+          <w:sz w:val="22"/>
+          <w:szCs w:val="22"/>
+        </w:rPr>
+        <w:t>/api/annunci</w:t>
+      </w:r>
+    </w:p>
+    <w:p>
+      <w:pPr>
+        <w:pStyle w:val="Testonormale"/>
+        <w:numPr>
+          <w:ilvl w:val="0"/>
+          <w:numId w:val="3"/>
+        </w:numPr>
+        <w:rPr>
+          <w:rFonts w:ascii="Century Gothic" w:hAnsi="Century Gothic" w:cs="Courier New"/>
+          <w:sz w:val="22"/>
+          <w:szCs w:val="22"/>
+        </w:rPr>
+      </w:pPr>
+      <w:r>
+        <w:rPr>
+          <w:rFonts w:ascii="Century Gothic" w:hAnsi="Century Gothic" w:cs="Courier New"/>
+          <w:sz w:val="22"/>
+          <w:szCs w:val="22"/>
+        </w:rPr>
+        <w:t>/api/lastannunci</w:t>
+      </w:r>
+    </w:p>
+    <w:p>
+      <w:pPr>
+        <w:pStyle w:val="Testonormale"/>
+        <w:numPr>
+          <w:ilvl w:val="0"/>
+          <w:numId w:val="3"/>
+        </w:numPr>
+        <w:rPr>
+          <w:rFonts w:ascii="Century Gothic" w:hAnsi="Century Gothic" w:cs="Courier New"/>
+          <w:sz w:val="22"/>
+          <w:szCs w:val="22"/>
+        </w:rPr>
+      </w:pPr>
+      <w:r>
+        <w:rPr>
+          <w:rFonts w:ascii="Century Gothic" w:hAnsi="Century Gothic" w:cs="Courier New"/>
+          <w:sz w:val="22"/>
+          <w:szCs w:val="22"/>
+        </w:rPr>
+        <w:t>/api/annunci/:id</w:t>
+      </w:r>
+    </w:p>
+    <w:p>
+      <w:pPr>
+        <w:pStyle w:val="Testonormale"/>
+        <w:numPr>
+          <w:ilvl w:val="0"/>
+          <w:numId w:val="3"/>
+        </w:numPr>
+        <w:rPr>
+          <w:rFonts w:ascii="Century Gothic" w:hAnsi="Century Gothic" w:cs="Courier New"/>
+          <w:sz w:val="22"/>
+          <w:szCs w:val="22"/>
+        </w:rPr>
+      </w:pPr>
+      <w:r>
+        <w:rPr>
+          <w:rFonts w:ascii="Century Gothic" w:hAnsi="Century Gothic" w:cs="Courier New"/>
+          <w:sz w:val="22"/>
+          <w:szCs w:val="22"/>
+        </w:rPr>
+        <w:t>/api/annuncinoattivi</w:t>
+      </w:r>
+    </w:p>
+    <w:p>
+      <w:pPr>
+        <w:pStyle w:val="Testonormale"/>
+        <w:numPr>
+          <w:ilvl w:val="0"/>
+          <w:numId w:val="3"/>
+        </w:numPr>
+        <w:rPr>
+          <w:rFonts w:ascii="Century Gothic" w:hAnsi="Century Gothic" w:cs="Courier New"/>
+          <w:sz w:val="22"/>
+          <w:szCs w:val="22"/>
+        </w:rPr>
+      </w:pPr>
+      <w:r>
+        <w:rPr>
+          <w:rFonts w:ascii="Century Gothic" w:hAnsi="Century Gothic" w:cs="Courier New"/>
+          <w:sz w:val="22"/>
+          <w:szCs w:val="22"/>
+        </w:rPr>
+        <w:t>/api/annunci/prezzo/:prezzomax</w:t>
+      </w:r>
+    </w:p>
+    <w:p>
+      <w:pPr>
+        <w:pStyle w:val="Testonormale"/>
+        <w:numPr>
+          <w:ilvl w:val="0"/>
+          <w:numId w:val="3"/>
+        </w:numPr>
+        <w:rPr>
+          <w:rFonts w:ascii="Century Gothic" w:hAnsi="Century Gothic" w:cs="Courier New"/>
+          <w:sz w:val="22"/>
+          <w:szCs w:val="22"/>
+        </w:rPr>
+      </w:pPr>
+      <w:r>
+        <w:rPr>
+          <w:rFonts w:ascii="Century Gothic" w:hAnsi="Century Gothic" w:cs="Courier New"/>
+          <w:sz w:val="22"/>
+          <w:szCs w:val="22"/>
+        </w:rPr>
+        <w:t>/api/annunci/tipo/:tipo/:prezzomax</w:t>
+      </w:r>
+    </w:p>
+    <w:p>
+      <w:pPr>
+        <w:pStyle w:val="Testonormale"/>
+        <w:numPr>
+          <w:ilvl w:val="0"/>
+          <w:numId w:val="3"/>
+        </w:numPr>
+        <w:rPr>
+          <w:rFonts w:ascii="Century Gothic" w:hAnsi="Century Gothic" w:cs="Courier New"/>
+          <w:sz w:val="22"/>
+          <w:szCs w:val="22"/>
+        </w:rPr>
+      </w:pPr>
+      <w:r>
+        <w:rPr>
+          <w:rFonts w:ascii="Century Gothic" w:hAnsi="Century Gothic" w:cs="Courier New"/>
+          <w:sz w:val="22"/>
+          <w:szCs w:val="22"/>
+        </w:rPr>
+        <w:t>/api/annunci/quartiere/:id/:prezzomax</w:t>
+      </w:r>
+    </w:p>
+    <w:p>
+      <w:pPr>
+        <w:pStyle w:val="Testonormale"/>
+        <w:numPr>
+          <w:ilvl w:val="0"/>
+          <w:numId w:val="3"/>
+        </w:numPr>
+        <w:rPr>
+          <w:rFonts w:ascii="Century Gothic" w:hAnsi="Century Gothic" w:cs="Courier New"/>
+          <w:sz w:val="22"/>
+          <w:szCs w:val="22"/>
+        </w:rPr>
+      </w:pPr>
+      <w:r>
+        <w:rPr>
+          <w:rFonts w:ascii="Century Gothic" w:hAnsi="Century Gothic" w:cs="Courier New"/>
+          <w:sz w:val="22"/>
+          <w:szCs w:val="22"/>
+        </w:rPr>
+        <w:t>/api/annunci/filter/:tipo/:quartiere/:prezzomax</w:t>
+      </w:r>
+    </w:p>
+    <w:p>
+      <w:pPr>
+        <w:pStyle w:val="Testonormale"/>
+        <w:numPr>
+          <w:ilvl w:val="0"/>
+          <w:numId w:val="3"/>
+        </w:numPr>
+        <w:rPr>
+          <w:rFonts w:ascii="Century Gothic" w:hAnsi="Century Gothic" w:cs="Courier New"/>
+          <w:sz w:val="22"/>
+          <w:szCs w:val="22"/>
+        </w:rPr>
+      </w:pPr>
+      <w:r>
+        <w:rPr>
+          <w:rFonts w:ascii="Century Gothic" w:hAnsi="Century Gothic" w:cs="Courier New"/>
+          <w:sz w:val="22"/>
+          <w:szCs w:val="22"/>
+        </w:rPr>
+        <w:t>/api/annunci/utente/:mail</w:t>
+      </w:r>
+    </w:p>
+    <w:p>
+      <w:pPr>
+        <w:pStyle w:val="Testonormale"/>
+        <w:numPr>
+          <w:ilvl w:val="0"/>
+          <w:numId w:val="3"/>
+        </w:numPr>
+        <w:rPr>
+          <w:rFonts w:ascii="Century Gothic" w:hAnsi="Century Gothic" w:cs="Courier New"/>
+          <w:sz w:val="22"/>
+          <w:szCs w:val="22"/>
+        </w:rPr>
+      </w:pPr>
+      <w:r>
+        <w:rPr>
+          <w:rFonts w:ascii="Century Gothic" w:hAnsi="Century Gothic" w:cs="Courier New"/>
+          <w:sz w:val="22"/>
+          <w:szCs w:val="22"/>
+        </w:rPr>
+        <w:t>/api/tipi-annuncio</w:t>
+      </w:r>
+    </w:p>
+    <w:p>
+      <w:pPr>
+        <w:pStyle w:val="Testonormale"/>
+        <w:numPr>
+          <w:ilvl w:val="0"/>
+          <w:numId w:val="3"/>
+        </w:numPr>
+        <w:rPr>
+          <w:rFonts w:ascii="Century Gothic" w:hAnsi="Century Gothic" w:cs="Courier New"/>
+          <w:sz w:val="22"/>
+          <w:szCs w:val="22"/>
+        </w:rPr>
+      </w:pPr>
+      <w:r>
+        <w:rPr>
+          <w:rFonts w:ascii="Century Gothic" w:hAnsi="Century Gothic" w:cs="Courier New"/>
+          <w:sz w:val="22"/>
+          <w:szCs w:val="22"/>
+        </w:rPr>
+        <w:t>/api/servizi</w:t>
+      </w:r>
+    </w:p>
+    <w:p>
+      <w:pPr>
+        <w:pStyle w:val="Testonormale"/>
+        <w:numPr>
+          <w:ilvl w:val="0"/>
+          <w:numId w:val="3"/>
+        </w:numPr>
+        <w:rPr>
+          <w:rFonts w:ascii="Century Gothic" w:hAnsi="Century Gothic" w:cs="Courier New"/>
+          <w:sz w:val="22"/>
+          <w:szCs w:val="22"/>
+        </w:rPr>
+      </w:pPr>
+      <w:r>
+        <w:rPr>
+          <w:rFonts w:ascii="Century Gothic" w:hAnsi="Century Gothic" w:cs="Courier New"/>
+          <w:sz w:val="22"/>
+          <w:szCs w:val="22"/>
+        </w:rPr>
+        <w:t>/api/quartieri</w:t>
+      </w:r>
+    </w:p>
+    <w:p>
+      <w:pPr>
+        <w:pStyle w:val="Testonormale"/>
+        <w:numPr>
+          <w:ilvl w:val="0"/>
+          <w:numId w:val="3"/>
+        </w:numPr>
+        <w:rPr>
+          <w:rFonts w:ascii="Century Gothic" w:hAnsi="Century Gothic" w:cs="Courier New"/>
+          <w:sz w:val="22"/>
+          <w:szCs w:val="22"/>
+        </w:rPr>
+      </w:pPr>
+      <w:r>
+        <w:rPr>
+          <w:rFonts w:ascii="Century Gothic" w:hAnsi="Century Gothic" w:cs="Courier New"/>
+          <w:sz w:val="22"/>
+          <w:szCs w:val="22"/>
+        </w:rPr>
+        <w:t>/api/preferiti</w:t>
+      </w:r>
+    </w:p>
+    <w:p>
+      <w:pPr>
+        <w:pStyle w:val="Testonormale"/>
+        <w:rPr>
+          <w:rFonts w:ascii="Century Gothic" w:hAnsi="Century Gothic" w:cs="Courier New"/>
+        </w:rPr>
+      </w:pPr>
+    </w:p>
+    <w:p>
+      <w:pPr>
+        <w:pStyle w:val="Testonormale"/>
+        <w:spacing w:after="240"/>
+        <w:rPr>
+          <w:rFonts w:ascii="Century Gothic" w:hAnsi="Century Gothic" w:cs="Courier New"/>
+          <w:b/>
+          <w:sz w:val="22"/>
+          <w:szCs w:val="22"/>
+          <w:u w:val="single"/>
+        </w:rPr>
+      </w:pPr>
+      <w:r>
+        <w:rPr>
+          <w:rFonts w:ascii="Century Gothic" w:hAnsi="Century Gothic" w:cs="Courier New"/>
+          <w:b/>
+          <w:sz w:val="22"/>
+          <w:szCs w:val="22"/>
+          <w:u w:val="single"/>
+        </w:rPr>
+        <w:t>POST</w:t>
+      </w:r>
+    </w:p>
+    <w:p>
+      <w:pPr>
+        <w:pStyle w:val="Testonormale"/>
+        <w:numPr>
+          <w:ilvl w:val="0"/>
+          <w:numId w:val="3"/>
+        </w:numPr>
+        <w:rPr>
+          <w:rFonts w:ascii="Century Gothic" w:hAnsi="Century Gothic" w:cs="Courier New"/>
+          <w:sz w:val="22"/>
+          <w:szCs w:val="22"/>
+        </w:rPr>
+      </w:pPr>
+      <w:r>
+        <w:rPr>
+          <w:rFonts w:ascii="Century Gothic" w:hAnsi="Century Gothic" w:cs="Courier New"/>
+          <w:sz w:val="22"/>
+          <w:szCs w:val="22"/>
+        </w:rPr>
+        <w:t>/api/auth/register</w:t>
+      </w:r>
+    </w:p>
+    <w:p>
+      <w:pPr>
+        <w:pStyle w:val="Testonormale"/>
+        <w:numPr>
+          <w:ilvl w:val="0"/>
+          <w:numId w:val="3"/>
+        </w:numPr>
+        <w:rPr>
+          <w:rFonts w:ascii="Century Gothic" w:hAnsi="Century Gothic" w:cs="Courier New"/>
+          <w:sz w:val="22"/>
+          <w:szCs w:val="22"/>
+        </w:rPr>
+      </w:pPr>
+      <w:r>
+        <w:rPr>
+          <w:rFonts w:ascii="Century Gothic" w:hAnsi="Century Gothic" w:cs="Courier New"/>
+          <w:sz w:val="22"/>
+          <w:szCs w:val="22"/>
+        </w:rPr>
+        <w:t>/api/auth/login</w:t>
+      </w:r>
+    </w:p>
+    <w:p>
+      <w:pPr>
+        <w:pStyle w:val="Testonormale"/>
+        <w:numPr>
+          <w:ilvl w:val="0"/>
+          <w:numId w:val="3"/>
+        </w:numPr>
+        <w:rPr>
+          <w:rFonts w:ascii="Century Gothic" w:hAnsi="Century Gothic" w:cs="Courier New"/>
+          <w:sz w:val="22"/>
+          <w:szCs w:val="22"/>
+        </w:rPr>
+      </w:pPr>
+      <w:r>
+        <w:rPr>
+          <w:rFonts w:ascii="Century Gothic" w:hAnsi="Century Gothic" w:cs="Courier New"/>
+          <w:sz w:val="22"/>
+          <w:szCs w:val="22"/>
+        </w:rPr>
+        <w:t>/api/auth/logout</w:t>
+      </w:r>
+    </w:p>
+    <w:p>
+      <w:pPr>
+        <w:pStyle w:val="Testonormale"/>
+        <w:numPr>
+          <w:ilvl w:val="0"/>
+          <w:numId w:val="3"/>
+        </w:numPr>
+        <w:rPr>
+          <w:rFonts w:ascii="Century Gothic" w:hAnsi="Century Gothic" w:cs="Courier New"/>
+          <w:sz w:val="22"/>
+          <w:szCs w:val="22"/>
+        </w:rPr>
+      </w:pPr>
+      <w:r>
+        <w:rPr>
+          <w:rFonts w:ascii="Century Gothic" w:hAnsi="Century Gothic" w:cs="Courier New"/>
+          <w:sz w:val="22"/>
+          <w:szCs w:val="22"/>
+        </w:rPr>
+        <w:t>/api/preferiti</w:t>
+      </w:r>
+    </w:p>
+    <w:p>
+      <w:pPr>
+        <w:pStyle w:val="Testonormale"/>
+        <w:numPr>
+          <w:ilvl w:val="0"/>
+          <w:numId w:val="3"/>
+        </w:numPr>
+        <w:rPr>
+          <w:rFonts w:ascii="Century Gothic" w:hAnsi="Century Gothic" w:cs="Courier New"/>
+          <w:sz w:val="22"/>
+          <w:szCs w:val="22"/>
+        </w:rPr>
+      </w:pPr>
+      <w:r>
+        <w:rPr>
+          <w:rFonts w:ascii="Century Gothic" w:hAnsi="Century Gothic" w:cs="Courier New"/>
+          <w:sz w:val="22"/>
+          <w:szCs w:val="22"/>
+        </w:rPr>
+        <w:t>/api/annunci/create</w:t>
+      </w:r>
+    </w:p>
+    <w:p>
+      <w:pPr>
+        <w:pStyle w:val="Testonormale"/>
+        <w:numPr>
+          <w:ilvl w:val="0"/>
+          <w:numId w:val="3"/>
+        </w:numPr>
+        <w:rPr>
+          <w:rFonts w:ascii="Century Gothic" w:hAnsi="Century Gothic" w:cs="Courier New"/>
+          <w:sz w:val="22"/>
+          <w:szCs w:val="22"/>
+        </w:rPr>
+      </w:pPr>
+      <w:r>
+        <w:rPr>
+          <w:rFonts w:ascii="Century Gothic" w:hAnsi="Century Gothic" w:cs="Courier New"/>
+          <w:sz w:val="22"/>
+          <w:szCs w:val="22"/>
+        </w:rPr>
+        <w:t>/api/annunci/update/:id</w:t>
+      </w:r>
+    </w:p>
+    <w:p>
+      <w:pPr>
+        <w:pStyle w:val="Testonormale"/>
+        <w:numPr>
+          <w:ilvl w:val="0"/>
+          <w:numId w:val="3"/>
+        </w:numPr>
+        <w:rPr>
+          <w:rFonts w:ascii="Century Gothic" w:hAnsi="Century Gothic" w:cs="Courier New"/>
+          <w:sz w:val="22"/>
+          <w:szCs w:val="22"/>
+        </w:rPr>
+      </w:pPr>
+      <w:r>
+        <w:rPr>
+          <w:rFonts w:ascii="Century Gothic" w:hAnsi="Century Gothic" w:cs="Courier New"/>
+          <w:sz w:val="22"/>
+          <w:szCs w:val="22"/>
+        </w:rPr>
+        <w:t>/api/annunci/modifica/:id</w:t>
+      </w:r>
+    </w:p>
+    <w:p>
+      <w:pPr>
+        <w:pStyle w:val="Testonormale"/>
+        <w:rPr>
+          <w:rFonts w:ascii="Century Gothic" w:hAnsi="Century Gothic" w:cs="Courier New"/>
+        </w:rPr>
+      </w:pPr>
+    </w:p>
+    <w:p>
+      <w:pPr>
+        <w:pStyle w:val="Testonormale"/>
+        <w:spacing w:after="240"/>
+        <w:rPr>
+          <w:rFonts w:ascii="Century Gothic" w:hAnsi="Century Gothic" w:cs="Courier New"/>
+          <w:b/>
+          <w:sz w:val="22"/>
+          <w:szCs w:val="22"/>
+          <w:u w:val="single"/>
+        </w:rPr>
+      </w:pPr>
+      <w:r>
+        <w:rPr>
+          <w:rFonts w:ascii="Century Gothic" w:hAnsi="Century Gothic" w:cs="Courier New"/>
+          <w:b/>
+          <w:sz w:val="22"/>
+          <w:szCs w:val="22"/>
+          <w:u w:val="single"/>
+        </w:rPr>
+        <w:t>DELETE</w:t>
+      </w:r>
+    </w:p>
+    <w:p>
+      <w:pPr>
+        <w:pStyle w:val="Testonormale"/>
+        <w:numPr>
+          <w:ilvl w:val="0"/>
+          <w:numId w:val="3"/>
+        </w:numPr>
+        <w:rPr>
+          <w:rFonts w:ascii="Century Gothic" w:hAnsi="Century Gothic" w:cs="Courier New"/>
+          <w:sz w:val="22"/>
+          <w:szCs w:val="22"/>
+        </w:rPr>
+      </w:pPr>
+      <w:r>
+        <w:rPr>
+          <w:rFonts w:ascii="Century Gothic" w:hAnsi="Century Gothic" w:cs="Courier New"/>
+          <w:sz w:val="22"/>
+          <w:szCs w:val="22"/>
+        </w:rPr>
+        <w:t>/api/preferiti/:annuncio_id</w:t>
+      </w:r>
+    </w:p>
+    <w:p>
+      <w:pPr>
+        <w:pStyle w:val="Testonormale"/>
+        <w:numPr>
+          <w:ilvl w:val="0"/>
+          <w:numId w:val="3"/>
+        </w:numPr>
+        <w:rPr>
+          <w:rFonts w:ascii="Century Gothic" w:hAnsi="Century Gothic" w:cs="Courier New"/>
+          <w:sz w:val="22"/>
+          <w:szCs w:val="22"/>
+        </w:rPr>
+      </w:pPr>
+      <w:r>
+        <w:rPr>
+          <w:rFonts w:ascii="Century Gothic" w:hAnsi="Century Gothic" w:cs="Courier New"/>
+          <w:sz w:val="22"/>
+          <w:szCs w:val="22"/>
+        </w:rPr>
+        <w:t>/api/annunci/delete/:id</w:t>
+      </w:r>
+    </w:p>
+    <w:p>
+      <w:pPr>
+        <w:pStyle w:val="Testonormale"/>
+        <w:rPr>
+          <w:rFonts w:ascii="Century Gothic" w:hAnsi="Century Gothic" w:cs="Courier New"/>
+        </w:rPr>
+      </w:pPr>
+    </w:p>
+    <w:p>
+      <w:pPr>
+        <w:pStyle w:val="Testonormale"/>
+        <w:spacing w:after="240"/>
         <w:rPr>
           <w:rFonts w:ascii="Century Gothic" w:hAnsi="Century Gothic" w:cs="Courier New"/>
           <w:b/>
           <w:sz w:val="28"/>
           <w:szCs w:val="28"/>
         </w:rPr>
-        <w:t>API endpoint</w:t>
-      </w:r>
-    </w:p>
-    <w:p>
-      <w:pPr>
-        <w:pStyle w:val="Testonormale"/>
-        <w:rPr>
-          <w:rFonts w:ascii="Century Gothic" w:hAnsi="Century Gothic" w:cs="Courier New"/>
-        </w:rPr>
-      </w:pPr>
-    </w:p>
-    <w:p>
-      <w:pPr>
-        <w:pStyle w:val="Testonormale"/>
-        <w:spacing w:after="240"/>
-        <w:rPr>
-          <w:rFonts w:ascii="Century Gothic" w:hAnsi="Century Gothic" w:cs="Courier New"/>
-          <w:b/>
-          <w:sz w:val="22"/>
-          <w:szCs w:val="22"/>
-          <w:u w:val="single"/>
-        </w:rPr>
-      </w:pPr>
-      <w:r>
-        <w:rPr>
-          <w:rFonts w:ascii="Century Gothic" w:hAnsi="Century Gothic" w:cs="Courier New"/>
-          <w:b/>
-          <w:sz w:val="22"/>
-          <w:szCs w:val="22"/>
-          <w:u w:val="single"/>
-        </w:rPr>
-        <w:t>GET</w:t>
-      </w:r>
-    </w:p>
-    <w:p>
-      <w:pPr>
-        <w:pStyle w:val="Testonormale"/>
-        <w:numPr>
-          <w:ilvl w:val="0"/>
-          <w:numId w:val="3"/>
-        </w:numPr>
-        <w:rPr>
-          <w:rFonts w:ascii="Century Gothic" w:hAnsi="Century Gothic" w:cs="Courier New"/>
-          <w:sz w:val="22"/>
-          <w:szCs w:val="22"/>
-        </w:rPr>
-      </w:pPr>
-      <w:r>
-        <w:rPr>
-          <w:rFonts w:ascii="Century Gothic" w:hAnsi="Century Gothic" w:cs="Courier New"/>
-          <w:sz w:val="22"/>
-          <w:szCs w:val="22"/>
-        </w:rPr>
-        <w:t>/api/news</w:t>
-      </w:r>
-    </w:p>
-    <w:p>
-      <w:pPr>
-        <w:pStyle w:val="Testonormale"/>
-        <w:numPr>
-          <w:ilvl w:val="0"/>
-          <w:numId w:val="3"/>
-        </w:numPr>
-        <w:rPr>
-          <w:rFonts w:ascii="Century Gothic" w:hAnsi="Century Gothic" w:cs="Courier New"/>
-          <w:sz w:val="22"/>
-          <w:szCs w:val="22"/>
-        </w:rPr>
-      </w:pPr>
-      <w:r>
-        <w:rPr>
-          <w:rFonts w:ascii="Century Gothic" w:hAnsi="Century Gothic" w:cs="Courier New"/>
-          <w:sz w:val="22"/>
-          <w:szCs w:val="22"/>
-        </w:rPr>
-        <w:t>/api/news/:id</w:t>
-      </w:r>
-    </w:p>
-    <w:p>
-      <w:pPr>
-        <w:pStyle w:val="Testonormale"/>
-        <w:numPr>
-          <w:ilvl w:val="0"/>
-          <w:numId w:val="3"/>
-        </w:numPr>
-        <w:rPr>
-          <w:rFonts w:ascii="Century Gothic" w:hAnsi="Century Gothic" w:cs="Courier New"/>
-          <w:sz w:val="22"/>
-          <w:szCs w:val="22"/>
-        </w:rPr>
-      </w:pPr>
-      <w:r>
-        <w:rPr>
-          <w:rFonts w:ascii="Century Gothic" w:hAnsi="Century Gothic" w:cs="Courier New"/>
-          <w:sz w:val="22"/>
-          <w:szCs w:val="22"/>
-        </w:rPr>
-        <w:t>/api/</w:t>
-      </w:r>
-      <w:proofErr w:type="spellStart"/>
-      <w:r>
-        <w:rPr>
-          <w:rFonts w:ascii="Century Gothic" w:hAnsi="Century Gothic" w:cs="Courier New"/>
-          <w:sz w:val="22"/>
-          <w:szCs w:val="22"/>
-        </w:rPr>
-        <w:t>auth</w:t>
-      </w:r>
-      <w:proofErr w:type="spellEnd"/>
-      <w:r>
-        <w:rPr>
-          <w:rFonts w:ascii="Century Gothic" w:hAnsi="Century Gothic" w:cs="Courier New"/>
-          <w:sz w:val="22"/>
-          <w:szCs w:val="22"/>
-        </w:rPr>
-        <w:t>/</w:t>
-      </w:r>
-      <w:proofErr w:type="spellStart"/>
-      <w:r>
-        <w:rPr>
-          <w:rFonts w:ascii="Century Gothic" w:hAnsi="Century Gothic" w:cs="Courier New"/>
-          <w:sz w:val="22"/>
-          <w:szCs w:val="22"/>
-        </w:rPr>
-        <w:t>profile</w:t>
-      </w:r>
-      <w:proofErr w:type="spellEnd"/>
-    </w:p>
-    <w:p>
-      <w:pPr>
-        <w:pStyle w:val="Testonormale"/>
-        <w:numPr>
-          <w:ilvl w:val="0"/>
-          <w:numId w:val="3"/>
-        </w:numPr>
-        <w:rPr>
-          <w:rFonts w:ascii="Century Gothic" w:hAnsi="Century Gothic" w:cs="Courier New"/>
-          <w:sz w:val="22"/>
-          <w:szCs w:val="22"/>
-        </w:rPr>
-      </w:pPr>
-      <w:r>
-        <w:rPr>
-          <w:rFonts w:ascii="Century Gothic" w:hAnsi="Century Gothic" w:cs="Courier New"/>
-          <w:sz w:val="22"/>
-          <w:szCs w:val="22"/>
-        </w:rPr>
-        <w:t>/api/annunci</w:t>
-      </w:r>
-    </w:p>
-    <w:p>
-      <w:pPr>
-        <w:pStyle w:val="Testonormale"/>
-        <w:numPr>
-          <w:ilvl w:val="0"/>
-          <w:numId w:val="3"/>
-        </w:numPr>
-        <w:rPr>
-          <w:rFonts w:ascii="Century Gothic" w:hAnsi="Century Gothic" w:cs="Courier New"/>
-          <w:sz w:val="22"/>
-          <w:szCs w:val="22"/>
-        </w:rPr>
-      </w:pPr>
-      <w:r>
-        <w:rPr>
-          <w:rFonts w:ascii="Century Gothic" w:hAnsi="Century Gothic" w:cs="Courier New"/>
-          <w:sz w:val="22"/>
-          <w:szCs w:val="22"/>
-        </w:rPr>
-        <w:t>/api/</w:t>
-      </w:r>
-      <w:proofErr w:type="spellStart"/>
-      <w:r>
-        <w:rPr>
-          <w:rFonts w:ascii="Century Gothic" w:hAnsi="Century Gothic" w:cs="Courier New"/>
-          <w:sz w:val="22"/>
-          <w:szCs w:val="22"/>
-        </w:rPr>
-        <w:t>lastannunci</w:t>
-      </w:r>
-      <w:proofErr w:type="spellEnd"/>
-    </w:p>
-    <w:p>
-      <w:pPr>
-        <w:pStyle w:val="Testonormale"/>
-        <w:numPr>
-          <w:ilvl w:val="0"/>
-          <w:numId w:val="3"/>
-        </w:numPr>
-        <w:rPr>
-          <w:rFonts w:ascii="Century Gothic" w:hAnsi="Century Gothic" w:cs="Courier New"/>
-          <w:sz w:val="22"/>
-          <w:szCs w:val="22"/>
-        </w:rPr>
-      </w:pPr>
-      <w:r>
-        <w:rPr>
-          <w:rFonts w:ascii="Century Gothic" w:hAnsi="Century Gothic" w:cs="Courier New"/>
-          <w:sz w:val="22"/>
-          <w:szCs w:val="22"/>
-        </w:rPr>
-        <w:t>/api/annunci/:id</w:t>
-      </w:r>
-    </w:p>
-    <w:p>
-      <w:pPr>
-        <w:pStyle w:val="Testonormale"/>
-        <w:numPr>
-          <w:ilvl w:val="0"/>
-          <w:numId w:val="3"/>
-        </w:numPr>
-        <w:rPr>
-          <w:rFonts w:ascii="Century Gothic" w:hAnsi="Century Gothic" w:cs="Courier New"/>
-          <w:sz w:val="22"/>
-          <w:szCs w:val="22"/>
-        </w:rPr>
-      </w:pPr>
-      <w:r>
-        <w:rPr>
-          <w:rFonts w:ascii="Century Gothic" w:hAnsi="Century Gothic" w:cs="Courier New"/>
-          <w:sz w:val="22"/>
-          <w:szCs w:val="22"/>
-        </w:rPr>
-        <w:t>/api/</w:t>
-      </w:r>
-      <w:proofErr w:type="spellStart"/>
-      <w:r>
-        <w:rPr>
-          <w:rFonts w:ascii="Century Gothic" w:hAnsi="Century Gothic" w:cs="Courier New"/>
-          <w:sz w:val="22"/>
-          <w:szCs w:val="22"/>
-        </w:rPr>
-        <w:t>annuncinoattivi</w:t>
-      </w:r>
-      <w:proofErr w:type="spellEnd"/>
-    </w:p>
-    <w:p>
-      <w:pPr>
-        <w:pStyle w:val="Testonormale"/>
-        <w:numPr>
-          <w:ilvl w:val="0"/>
-          <w:numId w:val="3"/>
-        </w:numPr>
-        <w:rPr>
-          <w:rFonts w:ascii="Century Gothic" w:hAnsi="Century Gothic" w:cs="Courier New"/>
-          <w:sz w:val="22"/>
-          <w:szCs w:val="22"/>
-        </w:rPr>
-      </w:pPr>
-      <w:r>
-        <w:rPr>
-          <w:rFonts w:ascii="Century Gothic" w:hAnsi="Century Gothic" w:cs="Courier New"/>
-          <w:sz w:val="22"/>
-          <w:szCs w:val="22"/>
-        </w:rPr>
-        <w:t>/api/annunci/prezzo</w:t>
-      </w:r>
-      <w:proofErr w:type="gramStart"/>
-      <w:r>
-        <w:rPr>
-          <w:rFonts w:ascii="Century Gothic" w:hAnsi="Century Gothic" w:cs="Courier New"/>
-          <w:sz w:val="22"/>
-          <w:szCs w:val="22"/>
-        </w:rPr>
-        <w:t>/:</w:t>
-      </w:r>
-      <w:proofErr w:type="spellStart"/>
-      <w:r>
-        <w:rPr>
-          <w:rFonts w:ascii="Century Gothic" w:hAnsi="Century Gothic" w:cs="Courier New"/>
-          <w:sz w:val="22"/>
-          <w:szCs w:val="22"/>
-        </w:rPr>
-        <w:t>prezzomax</w:t>
-      </w:r>
-      <w:proofErr w:type="spellEnd"/>
-      <w:proofErr w:type="gramEnd"/>
-    </w:p>
-    <w:p>
-      <w:pPr>
-        <w:pStyle w:val="Testonormale"/>
-        <w:numPr>
-          <w:ilvl w:val="0"/>
-          <w:numId w:val="3"/>
-        </w:numPr>
-        <w:rPr>
-          <w:rFonts w:ascii="Century Gothic" w:hAnsi="Century Gothic" w:cs="Courier New"/>
-          <w:sz w:val="22"/>
-          <w:szCs w:val="22"/>
-        </w:rPr>
-      </w:pPr>
-      <w:r>
-        <w:rPr>
-          <w:rFonts w:ascii="Century Gothic" w:hAnsi="Century Gothic" w:cs="Courier New"/>
-          <w:sz w:val="22"/>
-          <w:szCs w:val="22"/>
-        </w:rPr>
-        <w:t>/api/annunci/tipo</w:t>
-      </w:r>
-      <w:proofErr w:type="gramStart"/>
-      <w:r>
-        <w:rPr>
-          <w:rFonts w:ascii="Century Gothic" w:hAnsi="Century Gothic" w:cs="Courier New"/>
-          <w:sz w:val="22"/>
-          <w:szCs w:val="22"/>
-        </w:rPr>
-        <w:t>/:tipo</w:t>
-      </w:r>
-      <w:proofErr w:type="gramEnd"/>
-      <w:r>
-        <w:rPr>
-          <w:rFonts w:ascii="Century Gothic" w:hAnsi="Century Gothic" w:cs="Courier New"/>
-          <w:sz w:val="22"/>
-          <w:szCs w:val="22"/>
-        </w:rPr>
-        <w:t>/:</w:t>
-      </w:r>
-      <w:proofErr w:type="spellStart"/>
-      <w:r>
-        <w:rPr>
-          <w:rFonts w:ascii="Century Gothic" w:hAnsi="Century Gothic" w:cs="Courier New"/>
-          <w:sz w:val="22"/>
-          <w:szCs w:val="22"/>
-        </w:rPr>
-        <w:t>prezzomax</w:t>
-      </w:r>
-      <w:proofErr w:type="spellEnd"/>
-    </w:p>
-    <w:p>
-      <w:pPr>
-        <w:pStyle w:val="Testonormale"/>
-        <w:numPr>
-          <w:ilvl w:val="0"/>
-          <w:numId w:val="3"/>
-        </w:numPr>
-        <w:rPr>
-          <w:rFonts w:ascii="Century Gothic" w:hAnsi="Century Gothic" w:cs="Courier New"/>
-          <w:sz w:val="22"/>
-          <w:szCs w:val="22"/>
-        </w:rPr>
-      </w:pPr>
-      <w:r>
-        <w:rPr>
-          <w:rFonts w:ascii="Century Gothic" w:hAnsi="Century Gothic" w:cs="Courier New"/>
-          <w:sz w:val="22"/>
-          <w:szCs w:val="22"/>
-        </w:rPr>
-        <w:t>/api/annunci/quartiere/:id</w:t>
-      </w:r>
-      <w:proofErr w:type="gramStart"/>
-      <w:r>
-        <w:rPr>
-          <w:rFonts w:ascii="Century Gothic" w:hAnsi="Century Gothic" w:cs="Courier New"/>
-          <w:sz w:val="22"/>
-          <w:szCs w:val="22"/>
-        </w:rPr>
-        <w:t>/:</w:t>
-      </w:r>
-      <w:proofErr w:type="spellStart"/>
-      <w:r>
-        <w:rPr>
-          <w:rFonts w:ascii="Century Gothic" w:hAnsi="Century Gothic" w:cs="Courier New"/>
-          <w:sz w:val="22"/>
-          <w:szCs w:val="22"/>
-        </w:rPr>
-        <w:t>prezzomax</w:t>
-      </w:r>
-      <w:proofErr w:type="spellEnd"/>
-      <w:proofErr w:type="gramEnd"/>
-    </w:p>
-    <w:p>
-      <w:pPr>
-        <w:pStyle w:val="Testonormale"/>
-        <w:numPr>
-          <w:ilvl w:val="0"/>
-          <w:numId w:val="3"/>
-        </w:numPr>
-        <w:rPr>
-          <w:rFonts w:ascii="Century Gothic" w:hAnsi="Century Gothic" w:cs="Courier New"/>
-          <w:sz w:val="22"/>
-          <w:szCs w:val="22"/>
-        </w:rPr>
-      </w:pPr>
-      <w:r>
-        <w:rPr>
-          <w:rFonts w:ascii="Century Gothic" w:hAnsi="Century Gothic" w:cs="Courier New"/>
-          <w:sz w:val="22"/>
-          <w:szCs w:val="22"/>
-        </w:rPr>
-        <w:t>/api/annunci/filter</w:t>
-      </w:r>
-      <w:proofErr w:type="gramStart"/>
-      <w:r>
-        <w:rPr>
-          <w:rFonts w:ascii="Century Gothic" w:hAnsi="Century Gothic" w:cs="Courier New"/>
-          <w:sz w:val="22"/>
-          <w:szCs w:val="22"/>
-        </w:rPr>
-        <w:t>/:tipo</w:t>
-      </w:r>
-      <w:proofErr w:type="gramEnd"/>
-      <w:r>
-        <w:rPr>
-          <w:rFonts w:ascii="Century Gothic" w:hAnsi="Century Gothic" w:cs="Courier New"/>
-          <w:sz w:val="22"/>
-          <w:szCs w:val="22"/>
-        </w:rPr>
-        <w:t>/:quartiere/:</w:t>
-      </w:r>
-      <w:proofErr w:type="spellStart"/>
-      <w:r>
-        <w:rPr>
-          <w:rFonts w:ascii="Century Gothic" w:hAnsi="Century Gothic" w:cs="Courier New"/>
-          <w:sz w:val="22"/>
-          <w:szCs w:val="22"/>
-        </w:rPr>
-        <w:t>prezzomax</w:t>
-      </w:r>
-      <w:proofErr w:type="spellEnd"/>
-    </w:p>
-    <w:p>
-      <w:pPr>
-        <w:pStyle w:val="Testonormale"/>
-        <w:numPr>
-          <w:ilvl w:val="0"/>
-          <w:numId w:val="3"/>
-        </w:numPr>
-        <w:rPr>
-          <w:rFonts w:ascii="Century Gothic" w:hAnsi="Century Gothic" w:cs="Courier New"/>
-          <w:sz w:val="22"/>
-          <w:szCs w:val="22"/>
-        </w:rPr>
-      </w:pPr>
-      <w:r>
-        <w:rPr>
-          <w:rFonts w:ascii="Century Gothic" w:hAnsi="Century Gothic" w:cs="Courier New"/>
-          <w:sz w:val="22"/>
-          <w:szCs w:val="22"/>
-        </w:rPr>
-        <w:t>/api/annunci/utente</w:t>
-      </w:r>
-      <w:proofErr w:type="gramStart"/>
-      <w:r>
-        <w:rPr>
-          <w:rFonts w:ascii="Century Gothic" w:hAnsi="Century Gothic" w:cs="Courier New"/>
-          <w:sz w:val="22"/>
-          <w:szCs w:val="22"/>
-        </w:rPr>
-        <w:t>/:mail</w:t>
-      </w:r>
-      <w:proofErr w:type="gramEnd"/>
-    </w:p>
-    <w:p>
-      <w:pPr>
-        <w:pStyle w:val="Testonormale"/>
-        <w:numPr>
-          <w:ilvl w:val="0"/>
-          <w:numId w:val="3"/>
-        </w:numPr>
-        <w:rPr>
-          <w:rFonts w:ascii="Century Gothic" w:hAnsi="Century Gothic" w:cs="Courier New"/>
-          <w:sz w:val="22"/>
-          <w:szCs w:val="22"/>
-        </w:rPr>
-      </w:pPr>
-      <w:r>
-        <w:rPr>
-          <w:rFonts w:ascii="Century Gothic" w:hAnsi="Century Gothic" w:cs="Courier New"/>
-          <w:sz w:val="22"/>
-          <w:szCs w:val="22"/>
-        </w:rPr>
-        <w:t>/api/tipi-annuncio</w:t>
-      </w:r>
-    </w:p>
-    <w:p>
-      <w:pPr>
-        <w:pStyle w:val="Testonormale"/>
-        <w:numPr>
-          <w:ilvl w:val="0"/>
-          <w:numId w:val="3"/>
-        </w:numPr>
-        <w:rPr>
-          <w:rFonts w:ascii="Century Gothic" w:hAnsi="Century Gothic" w:cs="Courier New"/>
-          <w:sz w:val="22"/>
-          <w:szCs w:val="22"/>
-        </w:rPr>
-      </w:pPr>
-      <w:r>
-        <w:rPr>
-          <w:rFonts w:ascii="Century Gothic" w:hAnsi="Century Gothic" w:cs="Courier New"/>
-          <w:sz w:val="22"/>
-          <w:szCs w:val="22"/>
-        </w:rPr>
-        <w:t>/api/servizi</w:t>
-      </w:r>
-    </w:p>
-    <w:p>
-      <w:pPr>
-        <w:pStyle w:val="Testonormale"/>
-        <w:numPr>
-          <w:ilvl w:val="0"/>
-          <w:numId w:val="3"/>
-        </w:numPr>
-        <w:rPr>
-          <w:rFonts w:ascii="Century Gothic" w:hAnsi="Century Gothic" w:cs="Courier New"/>
-          <w:sz w:val="22"/>
-          <w:szCs w:val="22"/>
-        </w:rPr>
-      </w:pPr>
-      <w:r>
-        <w:rPr>
-          <w:rFonts w:ascii="Century Gothic" w:hAnsi="Century Gothic" w:cs="Courier New"/>
-          <w:sz w:val="22"/>
-          <w:szCs w:val="22"/>
-        </w:rPr>
-        <w:t>/api/quartieri</w:t>
-      </w:r>
-    </w:p>
-    <w:p>
-      <w:pPr>
-        <w:pStyle w:val="Testonormale"/>
-        <w:numPr>
-          <w:ilvl w:val="0"/>
-          <w:numId w:val="3"/>
-        </w:numPr>
-        <w:rPr>
-          <w:rFonts w:ascii="Century Gothic" w:hAnsi="Century Gothic" w:cs="Courier New"/>
-          <w:sz w:val="22"/>
-          <w:szCs w:val="22"/>
-        </w:rPr>
-      </w:pPr>
-      <w:r>
-        <w:rPr>
-          <w:rFonts w:ascii="Century Gothic" w:hAnsi="Century Gothic" w:cs="Courier New"/>
-          <w:sz w:val="22"/>
-          <w:szCs w:val="22"/>
-        </w:rPr>
-        <w:t>/api/preferiti</w:t>
-      </w:r>
-    </w:p>
-    <w:p>
-      <w:pPr>
-        <w:pStyle w:val="Testonormale"/>
-        <w:rPr>
-          <w:rFonts w:ascii="Century Gothic" w:hAnsi="Century Gothic" w:cs="Courier New"/>
-        </w:rPr>
-      </w:pPr>
-    </w:p>
-    <w:p>
-      <w:pPr>
-        <w:pStyle w:val="Testonormale"/>
-        <w:spacing w:after="240"/>
-        <w:rPr>
-          <w:rFonts w:ascii="Century Gothic" w:hAnsi="Century Gothic" w:cs="Courier New"/>
-          <w:b/>
-          <w:sz w:val="22"/>
-          <w:szCs w:val="22"/>
-          <w:u w:val="single"/>
-        </w:rPr>
-      </w:pPr>
-      <w:r>
-        <w:rPr>
-          <w:rFonts w:ascii="Century Gothic" w:hAnsi="Century Gothic" w:cs="Courier New"/>
-          <w:b/>
-          <w:sz w:val="22"/>
-          <w:szCs w:val="22"/>
-          <w:u w:val="single"/>
-        </w:rPr>
-        <w:t>POST</w:t>
-      </w:r>
-    </w:p>
-    <w:p>
-      <w:pPr>
-        <w:pStyle w:val="Testonormale"/>
-        <w:numPr>
-          <w:ilvl w:val="0"/>
-          <w:numId w:val="3"/>
-        </w:numPr>
-        <w:rPr>
-          <w:rFonts w:ascii="Century Gothic" w:hAnsi="Century Gothic" w:cs="Courier New"/>
-          <w:sz w:val="22"/>
-          <w:szCs w:val="22"/>
-        </w:rPr>
-      </w:pPr>
-      <w:r>
-        <w:rPr>
-          <w:rFonts w:ascii="Century Gothic" w:hAnsi="Century Gothic" w:cs="Courier New"/>
-          <w:sz w:val="22"/>
-          <w:szCs w:val="22"/>
-        </w:rPr>
-        <w:t>/api/</w:t>
-      </w:r>
-      <w:proofErr w:type="spellStart"/>
-      <w:r>
-        <w:rPr>
-          <w:rFonts w:ascii="Century Gothic" w:hAnsi="Century Gothic" w:cs="Courier New"/>
-          <w:sz w:val="22"/>
-          <w:szCs w:val="22"/>
-        </w:rPr>
-        <w:t>auth</w:t>
-      </w:r>
-      <w:proofErr w:type="spellEnd"/>
-      <w:r>
-        <w:rPr>
-          <w:rFonts w:ascii="Century Gothic" w:hAnsi="Century Gothic" w:cs="Courier New"/>
-          <w:sz w:val="22"/>
-          <w:szCs w:val="22"/>
-        </w:rPr>
-        <w:t>/register</w:t>
-      </w:r>
-    </w:p>
-    <w:p>
-      <w:pPr>
-        <w:pStyle w:val="Testonormale"/>
-        <w:numPr>
-          <w:ilvl w:val="0"/>
-          <w:numId w:val="3"/>
-        </w:numPr>
-        <w:rPr>
-          <w:rFonts w:ascii="Century Gothic" w:hAnsi="Century Gothic" w:cs="Courier New"/>
-          <w:sz w:val="22"/>
-          <w:szCs w:val="22"/>
-        </w:rPr>
-      </w:pPr>
-      <w:r>
-        <w:rPr>
-          <w:rFonts w:ascii="Century Gothic" w:hAnsi="Century Gothic" w:cs="Courier New"/>
-          <w:sz w:val="22"/>
-          <w:szCs w:val="22"/>
-        </w:rPr>
-        <w:t>/api/</w:t>
-      </w:r>
-      <w:proofErr w:type="spellStart"/>
-      <w:r>
-        <w:rPr>
-          <w:rFonts w:ascii="Century Gothic" w:hAnsi="Century Gothic" w:cs="Courier New"/>
-          <w:sz w:val="22"/>
-          <w:szCs w:val="22"/>
-        </w:rPr>
-        <w:t>auth</w:t>
-      </w:r>
-      <w:proofErr w:type="spellEnd"/>
-      <w:r>
-        <w:rPr>
-          <w:rFonts w:ascii="Century Gothic" w:hAnsi="Century Gothic" w:cs="Courier New"/>
-          <w:sz w:val="22"/>
-          <w:szCs w:val="22"/>
-        </w:rPr>
-        <w:t>/login</w:t>
-      </w:r>
-    </w:p>
-    <w:p>
-      <w:pPr>
-        <w:pStyle w:val="Testonormale"/>
-        <w:numPr>
-          <w:ilvl w:val="0"/>
-          <w:numId w:val="3"/>
-        </w:numPr>
-        <w:rPr>
-          <w:rFonts w:ascii="Century Gothic" w:hAnsi="Century Gothic" w:cs="Courier New"/>
-          <w:sz w:val="22"/>
-          <w:szCs w:val="22"/>
-        </w:rPr>
-      </w:pPr>
-      <w:r>
-        <w:rPr>
-          <w:rFonts w:ascii="Century Gothic" w:hAnsi="Century Gothic" w:cs="Courier New"/>
-          <w:sz w:val="22"/>
-          <w:szCs w:val="22"/>
-        </w:rPr>
-        <w:t>/api/</w:t>
-      </w:r>
-      <w:proofErr w:type="spellStart"/>
-      <w:r>
-        <w:rPr>
-          <w:rFonts w:ascii="Century Gothic" w:hAnsi="Century Gothic" w:cs="Courier New"/>
-          <w:sz w:val="22"/>
-          <w:szCs w:val="22"/>
-        </w:rPr>
-        <w:t>auth</w:t>
-      </w:r>
-      <w:proofErr w:type="spellEnd"/>
-      <w:r>
-        <w:rPr>
-          <w:rFonts w:ascii="Century Gothic" w:hAnsi="Century Gothic" w:cs="Courier New"/>
-          <w:sz w:val="22"/>
-          <w:szCs w:val="22"/>
-        </w:rPr>
-        <w:t>/</w:t>
-      </w:r>
-      <w:proofErr w:type="spellStart"/>
-      <w:r>
-        <w:rPr>
-          <w:rFonts w:ascii="Century Gothic" w:hAnsi="Century Gothic" w:cs="Courier New"/>
-          <w:sz w:val="22"/>
-          <w:szCs w:val="22"/>
-        </w:rPr>
-        <w:t>logout</w:t>
-      </w:r>
-      <w:proofErr w:type="spellEnd"/>
-    </w:p>
-    <w:p>
-      <w:pPr>
-        <w:pStyle w:val="Testonormale"/>
-        <w:numPr>
-          <w:ilvl w:val="0"/>
-          <w:numId w:val="3"/>
-        </w:numPr>
-        <w:rPr>
-          <w:rFonts w:ascii="Century Gothic" w:hAnsi="Century Gothic" w:cs="Courier New"/>
-          <w:sz w:val="22"/>
-          <w:szCs w:val="22"/>
-        </w:rPr>
-      </w:pPr>
-      <w:r>
-        <w:rPr>
-          <w:rFonts w:ascii="Century Gothic" w:hAnsi="Century Gothic" w:cs="Courier New"/>
-          <w:sz w:val="22"/>
-          <w:szCs w:val="22"/>
-        </w:rPr>
-        <w:t>/api/preferiti</w:t>
-      </w:r>
-    </w:p>
-    <w:p>
-      <w:pPr>
-        <w:pStyle w:val="Testonormale"/>
-        <w:numPr>
-          <w:ilvl w:val="0"/>
-          <w:numId w:val="3"/>
-        </w:numPr>
-        <w:rPr>
-          <w:rFonts w:ascii="Century Gothic" w:hAnsi="Century Gothic" w:cs="Courier New"/>
-          <w:sz w:val="22"/>
-          <w:szCs w:val="22"/>
-        </w:rPr>
-      </w:pPr>
-      <w:r>
-        <w:rPr>
-          <w:rFonts w:ascii="Century Gothic" w:hAnsi="Century Gothic" w:cs="Courier New"/>
-          <w:sz w:val="22"/>
-          <w:szCs w:val="22"/>
-        </w:rPr>
-        <w:t>/api/annunci/create</w:t>
-      </w:r>
-    </w:p>
-    <w:p>
-      <w:pPr>
-        <w:pStyle w:val="Testonormale"/>
-        <w:numPr>
-          <w:ilvl w:val="0"/>
-          <w:numId w:val="3"/>
-        </w:numPr>
-        <w:rPr>
-          <w:rFonts w:ascii="Century Gothic" w:hAnsi="Century Gothic" w:cs="Courier New"/>
-          <w:sz w:val="22"/>
-          <w:szCs w:val="22"/>
-        </w:rPr>
-      </w:pPr>
-      <w:r>
-        <w:rPr>
-          <w:rFonts w:ascii="Century Gothic" w:hAnsi="Century Gothic" w:cs="Courier New"/>
-          <w:sz w:val="22"/>
-          <w:szCs w:val="22"/>
-        </w:rPr>
-        <w:t>/api/annunci/update/:id</w:t>
-      </w:r>
-    </w:p>
-    <w:p>
-      <w:pPr>
-        <w:pStyle w:val="Testonormale"/>
-        <w:numPr>
-          <w:ilvl w:val="0"/>
-          <w:numId w:val="3"/>
-        </w:numPr>
-        <w:rPr>
-          <w:rFonts w:ascii="Century Gothic" w:hAnsi="Century Gothic" w:cs="Courier New"/>
-          <w:sz w:val="22"/>
-          <w:szCs w:val="22"/>
-        </w:rPr>
-      </w:pPr>
-      <w:r>
-        <w:rPr>
-          <w:rFonts w:ascii="Century Gothic" w:hAnsi="Century Gothic" w:cs="Courier New"/>
-          <w:sz w:val="22"/>
-          <w:szCs w:val="22"/>
-        </w:rPr>
-        <w:t>/api/annunci/modifica/:id</w:t>
-      </w:r>
-    </w:p>
-    <w:p>
-      <w:pPr>
-        <w:pStyle w:val="Testonormale"/>
-        <w:rPr>
-          <w:rFonts w:ascii="Century Gothic" w:hAnsi="Century Gothic" w:cs="Courier New"/>
-        </w:rPr>
-      </w:pPr>
-    </w:p>
-    <w:p>
-      <w:pPr>
-        <w:pStyle w:val="Testonormale"/>
-        <w:spacing w:after="240"/>
-        <w:rPr>
-          <w:rFonts w:ascii="Century Gothic" w:hAnsi="Century Gothic" w:cs="Courier New"/>
-          <w:b/>
-          <w:sz w:val="22"/>
-          <w:szCs w:val="22"/>
-          <w:u w:val="single"/>
-        </w:rPr>
-      </w:pPr>
-      <w:r>
-        <w:rPr>
-          <w:rFonts w:ascii="Century Gothic" w:hAnsi="Century Gothic" w:cs="Courier New"/>
-          <w:b/>
-          <w:sz w:val="22"/>
-          <w:szCs w:val="22"/>
-          <w:u w:val="single"/>
-        </w:rPr>
-        <w:t>DELETE</w:t>
-      </w:r>
-    </w:p>
-    <w:p>
-      <w:pPr>
-        <w:pStyle w:val="Testonormale"/>
-        <w:numPr>
-          <w:ilvl w:val="0"/>
-          <w:numId w:val="3"/>
-        </w:numPr>
-        <w:rPr>
-          <w:rFonts w:ascii="Century Gothic" w:hAnsi="Century Gothic" w:cs="Courier New"/>
-          <w:sz w:val="22"/>
-          <w:szCs w:val="22"/>
-        </w:rPr>
-      </w:pPr>
-      <w:r>
-        <w:rPr>
-          <w:rFonts w:ascii="Century Gothic" w:hAnsi="Century Gothic" w:cs="Courier New"/>
-          <w:sz w:val="22"/>
-          <w:szCs w:val="22"/>
-        </w:rPr>
-        <w:t>/api/preferiti</w:t>
-      </w:r>
-      <w:proofErr w:type="gramStart"/>
-      <w:r>
-        <w:rPr>
-          <w:rFonts w:ascii="Century Gothic" w:hAnsi="Century Gothic" w:cs="Courier New"/>
-          <w:sz w:val="22"/>
-          <w:szCs w:val="22"/>
-        </w:rPr>
-        <w:t>/:</w:t>
-      </w:r>
-      <w:proofErr w:type="spellStart"/>
-      <w:r>
-        <w:rPr>
-          <w:rFonts w:ascii="Century Gothic" w:hAnsi="Century Gothic" w:cs="Courier New"/>
-          <w:sz w:val="22"/>
-          <w:szCs w:val="22"/>
-        </w:rPr>
-        <w:t>annuncio</w:t>
-      </w:r>
-      <w:proofErr w:type="gramEnd"/>
-      <w:r>
-        <w:rPr>
-          <w:rFonts w:ascii="Century Gothic" w:hAnsi="Century Gothic" w:cs="Courier New"/>
-          <w:sz w:val="22"/>
-          <w:szCs w:val="22"/>
-        </w:rPr>
-        <w:t>_id</w:t>
-      </w:r>
-      <w:proofErr w:type="spellEnd"/>
-    </w:p>
-    <w:p>
-      <w:pPr>
-        <w:pStyle w:val="Testonormale"/>
-        <w:numPr>
-          <w:ilvl w:val="0"/>
-          <w:numId w:val="3"/>
-        </w:numPr>
-        <w:rPr>
-          <w:rFonts w:ascii="Century Gothic" w:hAnsi="Century Gothic" w:cs="Courier New"/>
-          <w:sz w:val="22"/>
-          <w:szCs w:val="22"/>
-        </w:rPr>
-      </w:pPr>
-      <w:r>
-        <w:rPr>
-          <w:rFonts w:ascii="Century Gothic" w:hAnsi="Century Gothic" w:cs="Courier New"/>
-          <w:sz w:val="22"/>
-          <w:szCs w:val="22"/>
-        </w:rPr>
-        <w:t>/api/annunci/delete/:id</w:t>
-      </w:r>
-    </w:p>
-    <w:p>
-      <w:pPr>
-        <w:pStyle w:val="Testonormale"/>
-        <w:rPr>
-          <w:rFonts w:ascii="Century Gothic" w:hAnsi="Century Gothic" w:cs="Courier New"/>
-        </w:rPr>
-      </w:pPr>
-    </w:p>
-    <w:p>
-      <w:pPr>
-        <w:pStyle w:val="Testonormale"/>
-        <w:spacing w:after="240"/>
+      </w:pPr>
+      <w:r>
         <w:rPr>
           <w:rFonts w:ascii="Century Gothic" w:hAnsi="Century Gothic" w:cs="Courier New"/>
           <w:b/>
           <w:sz w:val="28"/>
           <w:szCs w:val="28"/>
         </w:rPr>
+        <w:lastRenderedPageBreak/>
+        <w:t>DATABASE</w:t>
+      </w:r>
+    </w:p>
+    <w:p>
+      <w:pPr>
+        <w:pStyle w:val="Testonormale"/>
+        <w:jc w:val="both"/>
+        <w:rPr>
+          <w:rFonts w:ascii="Century Gothic" w:hAnsi="Century Gothic" w:cs="Courier New"/>
+          <w:sz w:val="22"/>
+          <w:szCs w:val="22"/>
+        </w:rPr>
+      </w:pPr>
+      <w:r>
+        <w:rPr>
+          <w:rFonts w:ascii="Century Gothic" w:hAnsi="Century Gothic" w:cs="Courier New"/>
+          <w:sz w:val="22"/>
+          <w:szCs w:val="22"/>
+        </w:rPr>
+        <w:t>P</w:t>
+      </w:r>
+      <w:r>
+        <w:rPr>
+          <w:rFonts w:ascii="Century Gothic" w:hAnsi="Century Gothic" w:cs="Courier New"/>
+          <w:sz w:val="22"/>
+          <w:szCs w:val="22"/>
+        </w:rPr>
+        <w:t xml:space="preserve">er la creazione dell'applicazione abbiamo creato un database </w:t>
+      </w:r>
+      <w:r>
+        <w:rPr>
+          <w:rFonts w:ascii="Century Gothic" w:hAnsi="Century Gothic" w:cs="Courier New"/>
+          <w:sz w:val="22"/>
+          <w:szCs w:val="22"/>
+        </w:rPr>
+        <w:t>MySQL</w:t>
+      </w:r>
+      <w:r>
+        <w:rPr>
+          <w:rFonts w:ascii="Century Gothic" w:hAnsi="Century Gothic" w:cs="Courier New"/>
+          <w:sz w:val="22"/>
+          <w:szCs w:val="22"/>
+        </w:rPr>
+        <w:t xml:space="preserve"> denominato "studenthome".</w:t>
+      </w:r>
+    </w:p>
+    <w:p>
+      <w:pPr>
+        <w:pStyle w:val="Testonormale"/>
+        <w:jc w:val="both"/>
+        <w:rPr>
+          <w:rFonts w:ascii="Century Gothic" w:hAnsi="Century Gothic" w:cs="Courier New"/>
+          <w:sz w:val="22"/>
+          <w:szCs w:val="22"/>
+        </w:rPr>
+      </w:pPr>
+      <w:r>
+        <w:rPr>
+          <w:rFonts w:ascii="Century Gothic" w:hAnsi="Century Gothic" w:cs="Courier New"/>
+          <w:sz w:val="22"/>
+          <w:szCs w:val="22"/>
+        </w:rPr>
+        <w:t xml:space="preserve">Sono memorizzati tutti i dati in nove tabelle collegate tra loro con le ForeignKeys. La tabella che memorizza i dati dell'utente contiene le password crittografate per una elevata sicurezza. Il file che contiene le direttive per il collegamento al database denominato db.ts è collocato nella backend\scr\utils\ </w:t>
+      </w:r>
+    </w:p>
+    <w:p>
+      <w:pPr>
+        <w:pStyle w:val="Testonormale"/>
+        <w:rPr>
+          <w:rFonts w:ascii="Century Gothic" w:hAnsi="Century Gothic" w:cs="Courier New"/>
+        </w:rPr>
+      </w:pPr>
+    </w:p>
+    <w:p>
+      <w:pPr>
+        <w:pStyle w:val="Testonormale"/>
+        <w:spacing w:after="240"/>
+        <w:rPr>
+          <w:rFonts w:ascii="Century Gothic" w:hAnsi="Century Gothic" w:cs="Courier New"/>
+        </w:rPr>
       </w:pPr>
       <w:r>
         <w:rPr>
@@ -2400,185 +1970,6 @@
           <w:sz w:val="28"/>
           <w:szCs w:val="28"/>
         </w:rPr>
-        <w:t>DATABASE</w:t>
-      </w:r>
-    </w:p>
-    <w:p>
-      <w:pPr>
-        <w:pStyle w:val="Testonormale"/>
-        <w:jc w:val="both"/>
-        <w:rPr>
-          <w:rFonts w:ascii="Century Gothic" w:hAnsi="Century Gothic" w:cs="Courier New"/>
-          <w:sz w:val="22"/>
-          <w:szCs w:val="22"/>
-        </w:rPr>
-      </w:pPr>
-      <w:r>
-        <w:rPr>
-          <w:rFonts w:ascii="Century Gothic" w:hAnsi="Century Gothic" w:cs="Courier New"/>
-          <w:sz w:val="22"/>
-          <w:szCs w:val="22"/>
-        </w:rPr>
-        <w:lastRenderedPageBreak/>
-        <w:t>P</w:t>
-      </w:r>
-      <w:r>
-        <w:rPr>
-          <w:rFonts w:ascii="Century Gothic" w:hAnsi="Century Gothic" w:cs="Courier New"/>
-          <w:sz w:val="22"/>
-          <w:szCs w:val="22"/>
-        </w:rPr>
-        <w:t xml:space="preserve">er la creazione dell'applicazione abbiamo creato un database </w:t>
-      </w:r>
-      <w:r>
-        <w:rPr>
-          <w:rFonts w:ascii="Century Gothic" w:hAnsi="Century Gothic" w:cs="Courier New"/>
-          <w:sz w:val="22"/>
-          <w:szCs w:val="22"/>
-        </w:rPr>
-        <w:t>MySQL</w:t>
-      </w:r>
-      <w:r>
-        <w:rPr>
-          <w:rFonts w:ascii="Century Gothic" w:hAnsi="Century Gothic" w:cs="Courier New"/>
-          <w:sz w:val="22"/>
-          <w:szCs w:val="22"/>
-        </w:rPr>
-        <w:t xml:space="preserve"> denominato "</w:t>
-      </w:r>
-      <w:proofErr w:type="spellStart"/>
-      <w:r>
-        <w:rPr>
-          <w:rFonts w:ascii="Century Gothic" w:hAnsi="Century Gothic" w:cs="Courier New"/>
-          <w:sz w:val="22"/>
-          <w:szCs w:val="22"/>
-        </w:rPr>
-        <w:t>studenthome</w:t>
-      </w:r>
-      <w:proofErr w:type="spellEnd"/>
-      <w:r>
-        <w:rPr>
-          <w:rFonts w:ascii="Century Gothic" w:hAnsi="Century Gothic" w:cs="Courier New"/>
-          <w:sz w:val="22"/>
-          <w:szCs w:val="22"/>
-        </w:rPr>
-        <w:t>".</w:t>
-      </w:r>
-    </w:p>
-    <w:p>
-      <w:pPr>
-        <w:pStyle w:val="Testonormale"/>
-        <w:jc w:val="both"/>
-        <w:rPr>
-          <w:rFonts w:ascii="Century Gothic" w:hAnsi="Century Gothic" w:cs="Courier New"/>
-          <w:sz w:val="22"/>
-          <w:szCs w:val="22"/>
-        </w:rPr>
-      </w:pPr>
-      <w:r>
-        <w:rPr>
-          <w:rFonts w:ascii="Century Gothic" w:hAnsi="Century Gothic" w:cs="Courier New"/>
-          <w:sz w:val="22"/>
-          <w:szCs w:val="22"/>
-        </w:rPr>
-        <w:t xml:space="preserve">Sono memorizzati tutti i dati in nove tabelle collegate tra loro con le </w:t>
-      </w:r>
-      <w:proofErr w:type="spellStart"/>
-      <w:r>
-        <w:rPr>
-          <w:rFonts w:ascii="Century Gothic" w:hAnsi="Century Gothic" w:cs="Courier New"/>
-          <w:sz w:val="22"/>
-          <w:szCs w:val="22"/>
-        </w:rPr>
-        <w:t>ForeignKeys</w:t>
-      </w:r>
-      <w:proofErr w:type="spellEnd"/>
-      <w:r>
-        <w:rPr>
-          <w:rFonts w:ascii="Century Gothic" w:hAnsi="Century Gothic" w:cs="Courier New"/>
-          <w:sz w:val="22"/>
-          <w:szCs w:val="22"/>
-        </w:rPr>
-        <w:t xml:space="preserve">. La tabella che memorizza i dati dell'utente contiene le password crittografate per una elevata sicurezza. Il file che contiene le direttive per il collegamento al database denominato </w:t>
-      </w:r>
-      <w:proofErr w:type="spellStart"/>
-      <w:r>
-        <w:rPr>
-          <w:rFonts w:ascii="Century Gothic" w:hAnsi="Century Gothic" w:cs="Courier New"/>
-          <w:sz w:val="22"/>
-          <w:szCs w:val="22"/>
-        </w:rPr>
-        <w:t>db.ts</w:t>
-      </w:r>
-      <w:proofErr w:type="spellEnd"/>
-      <w:r>
-        <w:rPr>
-          <w:rFonts w:ascii="Century Gothic" w:hAnsi="Century Gothic" w:cs="Courier New"/>
-          <w:sz w:val="22"/>
-          <w:szCs w:val="22"/>
-        </w:rPr>
-        <w:t xml:space="preserve"> è collocato nella backend\</w:t>
-      </w:r>
-      <w:proofErr w:type="spellStart"/>
-      <w:r>
-        <w:rPr>
-          <w:rFonts w:ascii="Century Gothic" w:hAnsi="Century Gothic" w:cs="Courier New"/>
-          <w:sz w:val="22"/>
-          <w:szCs w:val="22"/>
-        </w:rPr>
-        <w:t>scr</w:t>
-      </w:r>
-      <w:proofErr w:type="spellEnd"/>
-      <w:r>
-        <w:rPr>
-          <w:rFonts w:ascii="Century Gothic" w:hAnsi="Century Gothic" w:cs="Courier New"/>
-          <w:sz w:val="22"/>
-          <w:szCs w:val="22"/>
-        </w:rPr>
-        <w:t>\</w:t>
-      </w:r>
-      <w:proofErr w:type="spellStart"/>
-      <w:r>
-        <w:rPr>
-          <w:rFonts w:ascii="Century Gothic" w:hAnsi="Century Gothic" w:cs="Courier New"/>
-          <w:sz w:val="22"/>
-          <w:szCs w:val="22"/>
-        </w:rPr>
-        <w:t>utils</w:t>
-      </w:r>
-      <w:proofErr w:type="spellEnd"/>
-      <w:r>
-        <w:rPr>
-          <w:rFonts w:ascii="Century Gothic" w:hAnsi="Century Gothic" w:cs="Courier New"/>
-          <w:sz w:val="22"/>
-          <w:szCs w:val="22"/>
-        </w:rPr>
-        <w:t xml:space="preserve">\ </w:t>
-      </w:r>
-    </w:p>
-    <w:p>
-      <w:pPr>
-        <w:pStyle w:val="Testonormale"/>
-        <w:rPr>
-          <w:rFonts w:ascii="Century Gothic" w:hAnsi="Century Gothic" w:cs="Courier New"/>
-        </w:rPr>
-      </w:pPr>
-    </w:p>
-    <w:p>
-      <w:pPr>
-        <w:pStyle w:val="Testonormale"/>
-        <w:spacing w:after="240"/>
-        <w:rPr>
-          <w:rFonts w:ascii="Century Gothic" w:hAnsi="Century Gothic" w:cs="Courier New"/>
-        </w:rPr>
-      </w:pPr>
-      <w:r>
-        <w:rPr>
-          <w:rFonts w:ascii="Century Gothic" w:hAnsi="Century Gothic" w:cs="Courier New"/>
-          <w:b/>
-          <w:sz w:val="28"/>
-          <w:szCs w:val="28"/>
-        </w:rPr>
         <w:t>Installazione</w:t>
       </w:r>
     </w:p>
@@ -2601,25 +1992,7 @@
           <w:sz w:val="22"/>
           <w:szCs w:val="22"/>
         </w:rPr>
-        <w:t xml:space="preserve">Clona il repository di </w:t>
-      </w:r>
-      <w:proofErr w:type="spellStart"/>
-      <w:r>
-        <w:rPr>
-          <w:rFonts w:ascii="Century Gothic" w:hAnsi="Century Gothic" w:cs="Courier New"/>
-          <w:sz w:val="22"/>
-          <w:szCs w:val="22"/>
-        </w:rPr>
-        <w:t>github</w:t>
-      </w:r>
-      <w:proofErr w:type="spellEnd"/>
-      <w:r>
-        <w:rPr>
-          <w:rFonts w:ascii="Century Gothic" w:hAnsi="Century Gothic" w:cs="Courier New"/>
-          <w:sz w:val="22"/>
-          <w:szCs w:val="22"/>
-        </w:rPr>
-        <w:t xml:space="preserve"> da: </w:t>
+        <w:t xml:space="preserve">Clona il repository di github da: </w:t>
       </w:r>
       <w:hyperlink r:id="rId7" w:history="1">
         <w:r>
@@ -2652,43 +2025,7 @@
           <w:sz w:val="22"/>
           <w:szCs w:val="22"/>
         </w:rPr>
-        <w:t>Eseguire il comando “</w:t>
-      </w:r>
-      <w:proofErr w:type="spellStart"/>
-      <w:r>
-        <w:rPr>
-          <w:rFonts w:ascii="Century Gothic" w:hAnsi="Century Gothic" w:cs="Courier New"/>
-          <w:sz w:val="22"/>
-          <w:szCs w:val="22"/>
-        </w:rPr>
-        <w:t>npm</w:t>
-      </w:r>
-      <w:proofErr w:type="spellEnd"/>
-      <w:r>
-        <w:rPr>
-          <w:rFonts w:ascii="Century Gothic" w:hAnsi="Century Gothic" w:cs="Courier New"/>
-          <w:sz w:val="22"/>
-          <w:szCs w:val="22"/>
-        </w:rPr>
-        <w:t xml:space="preserve"> i” in entrambe le cartelle backend e </w:t>
-      </w:r>
-      <w:proofErr w:type="spellStart"/>
-      <w:r>
-        <w:rPr>
-          <w:rFonts w:ascii="Century Gothic" w:hAnsi="Century Gothic" w:cs="Courier New"/>
-          <w:sz w:val="22"/>
-          <w:szCs w:val="22"/>
-        </w:rPr>
-        <w:t>frontend</w:t>
-      </w:r>
-      <w:proofErr w:type="spellEnd"/>
-      <w:r>
-        <w:rPr>
-          <w:rFonts w:ascii="Century Gothic" w:hAnsi="Century Gothic" w:cs="Courier New"/>
-          <w:sz w:val="22"/>
-          <w:szCs w:val="22"/>
-        </w:rPr>
-        <w:t xml:space="preserve"> per installare tutte le dipendenze e pacchetti</w:t>
+        <w:t>Eseguire il comando “npm i” in entrambe le cartelle backend e frontend per installare tutte le dipendenze e pacchetti</w:t>
       </w:r>
     </w:p>
     <w:p>
@@ -2726,18 +2063,8 @@
           <w:sz w:val="22"/>
           <w:szCs w:val="22"/>
         </w:rPr>
-        <w:t>eseguire il server MySQL, creare il DB con il file contenuto nella cartella backend-&gt;</w:t>
-      </w:r>
-      <w:proofErr w:type="spellStart"/>
-      <w:r>
-        <w:rPr>
-          <w:rFonts w:ascii="Century Gothic" w:hAnsi="Century Gothic" w:cs="Courier New"/>
-          <w:sz w:val="22"/>
-          <w:szCs w:val="22"/>
-        </w:rPr>
-        <w:t>db</w:t>
-      </w:r>
-      <w:proofErr w:type="spellEnd"/>
+        <w:t>eseguire il server MySQL, creare il DB con il file contenuto nella cartella backend-&gt;db</w:t>
+      </w:r>
     </w:p>
     <w:p>
       <w:pPr>
@@ -2758,180 +2085,32 @@
           <w:sz w:val="22"/>
           <w:szCs w:val="22"/>
         </w:rPr>
-        <w:t>Eseguire l’applicazione web con il comando “</w:t>
-      </w:r>
-      <w:proofErr w:type="spellStart"/>
-      <w:r>
-        <w:rPr>
-          <w:rFonts w:ascii="Century Gothic" w:hAnsi="Century Gothic" w:cs="Courier New"/>
-          <w:sz w:val="22"/>
-          <w:szCs w:val="22"/>
-        </w:rPr>
-        <w:t>npm</w:t>
-      </w:r>
-      <w:proofErr w:type="spellEnd"/>
-      <w:r>
-        <w:rPr>
-          <w:rFonts w:ascii="Century Gothic" w:hAnsi="Century Gothic" w:cs="Courier New"/>
-          <w:sz w:val="22"/>
-          <w:szCs w:val="22"/>
-        </w:rPr>
-        <w:t xml:space="preserve"> </w:t>
-      </w:r>
-      <w:proofErr w:type="spellStart"/>
-      <w:r>
-        <w:rPr>
-          <w:rFonts w:ascii="Century Gothic" w:hAnsi="Century Gothic" w:cs="Courier New"/>
-          <w:sz w:val="22"/>
-          <w:szCs w:val="22"/>
-        </w:rPr>
-        <w:t>run</w:t>
-      </w:r>
-      <w:proofErr w:type="spellEnd"/>
-      <w:r>
-        <w:rPr>
-          <w:rFonts w:ascii="Century Gothic" w:hAnsi="Century Gothic" w:cs="Courier New"/>
-          <w:sz w:val="22"/>
-          <w:szCs w:val="22"/>
-        </w:rPr>
-        <w:t xml:space="preserve"> </w:t>
-      </w:r>
-      <w:proofErr w:type="spellStart"/>
-      <w:r>
-        <w:rPr>
-          <w:rFonts w:ascii="Century Gothic" w:hAnsi="Century Gothic" w:cs="Courier New"/>
-          <w:sz w:val="22"/>
-          <w:szCs w:val="22"/>
-        </w:rPr>
-        <w:t>dev</w:t>
-      </w:r>
-      <w:proofErr w:type="spellEnd"/>
-      <w:r>
-        <w:rPr>
-          <w:rFonts w:ascii="Century Gothic" w:hAnsi="Century Gothic" w:cs="Courier New"/>
-          <w:sz w:val="22"/>
-          <w:szCs w:val="22"/>
-        </w:rPr>
-        <w:t xml:space="preserve">” da eseguire in entrambe le cartelle </w:t>
-      </w:r>
-      <w:proofErr w:type="spellStart"/>
-      <w:r>
-        <w:rPr>
-          <w:rFonts w:ascii="Century Gothic" w:hAnsi="Century Gothic" w:cs="Courier New"/>
-          <w:sz w:val="22"/>
-          <w:szCs w:val="22"/>
-        </w:rPr>
-        <w:t>frontend</w:t>
-      </w:r>
-      <w:proofErr w:type="spellEnd"/>
-      <w:r>
-        <w:rPr>
-          <w:rFonts w:ascii="Century Gothic" w:hAnsi="Century Gothic" w:cs="Courier New"/>
-          <w:sz w:val="22"/>
-          <w:szCs w:val="22"/>
-        </w:rPr>
-        <w:t xml:space="preserve"> e backend.</w:t>
-      </w:r>
-      <w:r>
-        <w:rPr>
-          <w:rFonts w:ascii="Century Gothic" w:hAnsi="Century Gothic" w:cs="Courier New"/>
-          <w:sz w:val="22"/>
-          <w:szCs w:val="22"/>
-        </w:rPr>
-        <w:t xml:space="preserve"> Se si vuole accedere all’app da altro device in rete lato </w:t>
-      </w:r>
-      <w:proofErr w:type="spellStart"/>
-      <w:r>
-        <w:rPr>
-          <w:rFonts w:ascii="Century Gothic" w:hAnsi="Century Gothic" w:cs="Courier New"/>
-          <w:sz w:val="22"/>
-          <w:szCs w:val="22"/>
-        </w:rPr>
-        <w:t>frontend</w:t>
-      </w:r>
-      <w:proofErr w:type="spellEnd"/>
-      <w:r>
-        <w:rPr>
-          <w:rFonts w:ascii="Century Gothic" w:hAnsi="Century Gothic" w:cs="Courier New"/>
-          <w:sz w:val="22"/>
-          <w:szCs w:val="22"/>
-        </w:rPr>
-        <w:t xml:space="preserve"> usare il comando “</w:t>
-      </w:r>
-      <w:proofErr w:type="spellStart"/>
-      <w:r>
-        <w:rPr>
-          <w:rFonts w:ascii="Century Gothic" w:hAnsi="Century Gothic" w:cs="Courier New"/>
-          <w:sz w:val="22"/>
-          <w:szCs w:val="22"/>
-        </w:rPr>
-        <w:t>npm</w:t>
-      </w:r>
-      <w:proofErr w:type="spellEnd"/>
-      <w:r>
-        <w:rPr>
-          <w:rFonts w:ascii="Century Gothic" w:hAnsi="Century Gothic" w:cs="Courier New"/>
-          <w:sz w:val="22"/>
-          <w:szCs w:val="22"/>
-        </w:rPr>
-        <w:t xml:space="preserve"> </w:t>
-      </w:r>
-      <w:proofErr w:type="spellStart"/>
-      <w:r>
-        <w:rPr>
-          <w:rFonts w:ascii="Century Gothic" w:hAnsi="Century Gothic" w:cs="Courier New"/>
-          <w:sz w:val="22"/>
-          <w:szCs w:val="22"/>
-        </w:rPr>
-        <w:t>run</w:t>
-      </w:r>
-      <w:proofErr w:type="spellEnd"/>
-      <w:r>
-        <w:rPr>
-          <w:rFonts w:ascii="Century Gothic" w:hAnsi="Century Gothic" w:cs="Courier New"/>
-          <w:sz w:val="22"/>
-          <w:szCs w:val="22"/>
-        </w:rPr>
-        <w:t xml:space="preserve"> </w:t>
-      </w:r>
-      <w:proofErr w:type="spellStart"/>
-      <w:r>
-        <w:rPr>
-          <w:rFonts w:ascii="Century Gothic" w:hAnsi="Century Gothic" w:cs="Courier New"/>
-          <w:sz w:val="22"/>
-          <w:szCs w:val="22"/>
-        </w:rPr>
-        <w:t>dev</w:t>
-      </w:r>
-      <w:proofErr w:type="spellEnd"/>
-      <w:r>
-        <w:rPr>
-          <w:rFonts w:ascii="Century Gothic" w:hAnsi="Century Gothic" w:cs="Courier New"/>
-          <w:sz w:val="22"/>
-          <w:szCs w:val="22"/>
-        </w:rPr>
-        <w:t xml:space="preserve">  - -  - -</w:t>
-      </w:r>
-      <w:proofErr w:type="spellStart"/>
-      <w:r>
-        <w:rPr>
-          <w:rFonts w:ascii="Century Gothic" w:hAnsi="Century Gothic" w:cs="Courier New"/>
-          <w:sz w:val="22"/>
-          <w:szCs w:val="22"/>
-        </w:rPr>
-        <w:t>host</w:t>
-      </w:r>
-      <w:proofErr w:type="spellEnd"/>
-      <w:r>
-        <w:rPr>
-          <w:rFonts w:ascii="Century Gothic" w:hAnsi="Century Gothic" w:cs="Courier New"/>
-          <w:sz w:val="22"/>
-          <w:szCs w:val="22"/>
-        </w:rPr>
-        <w:t xml:space="preserve"> 0.0.0.0”</w:t>
-      </w:r>
-      <w:bookmarkStart w:id="0" w:name="_GoBack"/>
-      <w:bookmarkEnd w:id="0"/>
+        <w:t>Eseguire l’applicazione web con il comando “npm run dev” da eseguire in entrambe le cartelle frontend e backend.</w:t>
+      </w:r>
+      <w:r>
+        <w:rPr>
+          <w:rFonts w:ascii="Century Gothic" w:hAnsi="Century Gothic" w:cs="Courier New"/>
+          <w:sz w:val="22"/>
+          <w:szCs w:val="22"/>
+        </w:rPr>
+        <w:t xml:space="preserve"> Se si vuole accedere all’app da altro device in rete</w:t>
+      </w:r>
+      <w:r>
+        <w:rPr>
+          <w:rFonts w:ascii="Century Gothic" w:hAnsi="Century Gothic" w:cs="Courier New"/>
+          <w:sz w:val="22"/>
+          <w:szCs w:val="22"/>
+        </w:rPr>
+        <w:t>,</w:t>
+      </w:r>
+      <w:r>
+        <w:rPr>
+          <w:rFonts w:ascii="Century Gothic" w:hAnsi="Century Gothic" w:cs="Courier New"/>
+          <w:sz w:val="22"/>
+          <w:szCs w:val="22"/>
+        </w:rPr>
+        <w:t xml:space="preserve"> lato frontend usare il comando “npm run dev  - -  - -host 0.0.0.0”</w:t>
+      </w:r>
       <w:r>
         <w:rPr>
           <w:rFonts w:ascii="Century Gothic" w:hAnsi="Century Gothic" w:cs="Courier New"/>
@@ -3065,7 +2244,7 @@
 </file>
 
 <file path=word/endnotes.xml><?xml version="1.0" encoding="utf-8"?>
-<w:endnotes xmlns:wpc="http://schemas.microsoft.com/office/word/2010/wordprocessingCanvas" xmlns:cx="http://schemas.microsoft.com/office/drawing/2014/chartex" xmlns:cx1="http://schemas.microsoft.com/office/drawing/2015/9/8/chartex" xmlns:cx2="http://schemas.microsoft.com/office/drawing/2015/10/21/chartex" xmlns:cx3="http://schemas.microsoft.com/office/drawing/2016/5/9/chartex" xmlns:cx4="http://schemas.microsoft.com/office/drawing/2016/5/10/chartex" xmlns:cx5="http://schemas.microsoft.com/office/drawing/2016/5/11/chartex" xmlns:cx6="http://schemas.microsoft.com/office/drawing/2016/5/12/chartex" xmlns:cx7="http://schemas.microsoft.com/office/drawing/2016/5/13/chartex" xmlns:cx8="http://schemas.microsoft.com/office/drawing/2016/5/14/chartex" xmlns:mc="http://schemas.openxmlformats.org/markup-compatibility/2006" xmlns:aink="http://schemas.microsoft.com/office/drawing/2016/ink" xmlns:am3d="http://schemas.microsoft.com/office/drawing/2017/model3d" xmlns:o="urn:schemas-microsoft-com:office:office" xmlns:r="http://schemas.openxmlformats.org/officeDocument/2006/relationships" xmlns:m="http://schemas.openxmlformats.org/officeDocument/2006/math" xmlns:v="urn:schemas-microsoft-com:vml" xmlns:wp14="http://schemas.microsoft.com/office/word/2010/wordprocessingDrawing" xmlns:wp="http://schemas.openxmlformats.org/drawingml/2006/wordprocessingDrawing" xmlns:w10="urn:schemas-microsoft-com:office:word" xmlns:w="http://schemas.openxmlformats.org/wordprocessingml/2006/main" xmlns:w14="http://schemas.microsoft.com/office/word/2010/wordml" xmlns:w15="http://schemas.microsoft.com/office/word/2012/wordml" xmlns:w16cid="http://schemas.microsoft.com/office/word/2016/wordml/cid" xmlns:w16se="http://schemas.microsoft.com/office/word/2015/wordml/symex" xmlns:wpg="http://schemas.microsoft.com/office/word/2010/wordprocessingGroup" xmlns:wpi="http://schemas.microsoft.com/office/word/2010/wordprocessingInk" xmlns:wne="http://schemas.microsoft.com/office/word/2006/wordml" xmlns:wps="http://schemas.microsoft.com/office/word/2010/wordprocessingShape" mc:Ignorable="w14 w15 w16se w16cid wp14">
+<w:endnotes xmlns:wpc="http://schemas.microsoft.com/office/word/2010/wordprocessingCanvas" xmlns:cx="http://schemas.microsoft.com/office/drawing/2014/chartex" xmlns:cx1="http://schemas.microsoft.com/office/drawing/2015/9/8/chartex" xmlns:cx2="http://schemas.microsoft.com/office/drawing/2015/10/21/chartex" xmlns:cx3="http://schemas.microsoft.com/office/drawing/2016/5/9/chartex" xmlns:cx4="http://schemas.microsoft.com/office/drawing/2016/5/10/chartex" xmlns:cx5="http://schemas.microsoft.com/office/drawing/2016/5/11/chartex" xmlns:cx6="http://schemas.microsoft.com/office/drawing/2016/5/12/chartex" xmlns:cx7="http://schemas.microsoft.com/office/drawing/2016/5/13/chartex" xmlns:cx8="http://schemas.microsoft.com/office/drawing/2016/5/14/chartex" xmlns:mc="http://schemas.openxmlformats.org/markup-compatibility/2006" xmlns:aink="http://schemas.microsoft.com/office/drawing/2016/ink" xmlns:am3d="http://schemas.microsoft.com/office/drawing/2017/model3d" xmlns:o="urn:schemas-microsoft-com:office:office" xmlns:oel="http://schemas.microsoft.com/office/2019/extlst" xmlns:r="http://schemas.openxmlformats.org/officeDocument/2006/relationships" xmlns:m="http://schemas.openxmlformats.org/officeDocument/2006/math" xmlns:v="urn:schemas-microsoft-com:vml" xmlns:wp14="http://schemas.microsoft.com/office/word/2010/wordprocessingDrawing" xmlns:wp="http://schemas.openxmlformats.org/drawingml/2006/wordprocessingDrawing" xmlns:w10="urn:schemas-microsoft-com:office:word" xmlns:w="http://schemas.openxmlformats.org/wordprocessingml/2006/main" xmlns:w14="http://schemas.microsoft.com/office/word/2010/wordml" xmlns:w15="http://schemas.microsoft.com/office/word/2012/wordml" xmlns:w16cex="http://schemas.microsoft.com/office/word/2018/wordml/cex" xmlns:w16cid="http://schemas.microsoft.com/office/word/2016/wordml/cid" xmlns:w16="http://schemas.microsoft.com/office/word/2018/wordml" xmlns:w16du="http://schemas.microsoft.com/office/word/2023/wordml/word16du" xmlns:w16sdtdh="http://schemas.microsoft.com/office/word/2020/wordml/sdtdatahash" xmlns:w16sdtfl="http://schemas.microsoft.com/office/word/2024/wordml/sdtformatlock" xmlns:w16se="http://schemas.microsoft.com/office/word/2015/wordml/symex" xmlns:wpg="http://schemas.microsoft.com/office/word/2010/wordprocessingGroup" xmlns:wpi="http://schemas.microsoft.com/office/word/2010/wordprocessingInk" xmlns:wne="http://schemas.microsoft.com/office/word/2006/wordml" xmlns:wps="http://schemas.microsoft.com/office/word/2010/wordprocessingShape" mc:Ignorable="w14 w15 w16se w16cid w16 w16cex w16sdtdh w16sdtfl w16du wp14">
   <w:endnote w:type="separator" w:id="-1">
     <w:p>
       <w:pPr>
@@ -3090,7 +2269,7 @@
 </file>
 
 <file path=word/footnotes.xml><?xml version="1.0" encoding="utf-8"?>
-<w:footnotes xmlns:wpc="http://schemas.microsoft.com/office/word/2010/wordprocessingCanvas" xmlns:cx="http://schemas.microsoft.com/office/drawing/2014/chartex" xmlns:cx1="http://schemas.microsoft.com/office/drawing/2015/9/8/chartex" xmlns:cx2="http://schemas.microsoft.com/office/drawing/2015/10/21/chartex" xmlns:cx3="http://schemas.microsoft.com/office/drawing/2016/5/9/chartex" xmlns:cx4="http://schemas.microsoft.com/office/drawing/2016/5/10/chartex" xmlns:cx5="http://schemas.microsoft.com/office/drawing/2016/5/11/chartex" xmlns:cx6="http://schemas.microsoft.com/office/drawing/2016/5/12/chartex" xmlns:cx7="http://schemas.microsoft.com/office/drawing/2016/5/13/chartex" xmlns:cx8="http://schemas.microsoft.com/office/drawing/2016/5/14/chartex" xmlns:mc="http://schemas.openxmlformats.org/markup-compatibility/2006" xmlns:aink="http://schemas.microsoft.com/office/drawing/2016/ink" xmlns:am3d="http://schemas.microsoft.com/office/drawing/2017/model3d" xmlns:o="urn:schemas-microsoft-com:office:office" xmlns:r="http://schemas.openxmlformats.org/officeDocument/2006/relationships" xmlns:m="http://schemas.openxmlformats.org/officeDocument/2006/math" xmlns:v="urn:schemas-microsoft-com:vml" xmlns:wp14="http://schemas.microsoft.com/office/word/2010/wordprocessingDrawing" xmlns:wp="http://schemas.openxmlformats.org/drawingml/2006/wordprocessingDrawing" xmlns:w10="urn:schemas-microsoft-com:office:word" xmlns:w="http://schemas.openxmlformats.org/wordprocessingml/2006/main" xmlns:w14="http://schemas.microsoft.com/office/word/2010/wordml" xmlns:w15="http://schemas.microsoft.com/office/word/2012/wordml" xmlns:w16cid="http://schemas.microsoft.com/office/word/2016/wordml/cid" xmlns:w16se="http://schemas.microsoft.com/office/word/2015/wordml/symex" xmlns:wpg="http://schemas.microsoft.com/office/word/2010/wordprocessingGroup" xmlns:wpi="http://schemas.microsoft.com/office/word/2010/wordprocessingInk" xmlns:wne="http://schemas.microsoft.com/office/word/2006/wordml" xmlns:wps="http://schemas.microsoft.com/office/word/2010/wordprocessingShape" mc:Ignorable="w14 w15 w16se w16cid wp14">
+<w:footnotes xmlns:wpc="http://schemas.microsoft.com/office/word/2010/wordprocessingCanvas" xmlns:cx="http://schemas.microsoft.com/office/drawing/2014/chartex" xmlns:cx1="http://schemas.microsoft.com/office/drawing/2015/9/8/chartex" xmlns:cx2="http://schemas.microsoft.com/office/drawing/2015/10/21/chartex" xmlns:cx3="http://schemas.microsoft.com/office/drawing/2016/5/9/chartex" xmlns:cx4="http://schemas.microsoft.com/office/drawing/2016/5/10/chartex" xmlns:cx5="http://schemas.microsoft.com/office/drawing/2016/5/11/chartex" xmlns:cx6="http://schemas.microsoft.com/office/drawing/2016/5/12/chartex" xmlns:cx7="http://schemas.microsoft.com/office/drawing/2016/5/13/chartex" xmlns:cx8="http://schemas.microsoft.com/office/drawing/2016/5/14/chartex" xmlns:mc="http://schemas.openxmlformats.org/markup-compatibility/2006" xmlns:aink="http://schemas.microsoft.com/office/drawing/2016/ink" xmlns:am3d="http://schemas.microsoft.com/office/drawing/2017/model3d" xmlns:o="urn:schemas-microsoft-com:office:office" xmlns:oel="http://schemas.microsoft.com/office/2019/extlst" xmlns:r="http://schemas.openxmlformats.org/officeDocument/2006/relationships" xmlns:m="http://schemas.openxmlformats.org/officeDocument/2006/math" xmlns:v="urn:schemas-microsoft-com:vml" xmlns:wp14="http://schemas.microsoft.com/office/word/2010/wordprocessingDrawing" xmlns:wp="http://schemas.openxmlformats.org/drawingml/2006/wordprocessingDrawing" xmlns:w10="urn:schemas-microsoft-com:office:word" xmlns:w="http://schemas.openxmlformats.org/wordprocessingml/2006/main" xmlns:w14="http://schemas.microsoft.com/office/word/2010/wordml" xmlns:w15="http://schemas.microsoft.com/office/word/2012/wordml" xmlns:w16cex="http://schemas.microsoft.com/office/word/2018/wordml/cex" xmlns:w16cid="http://schemas.microsoft.com/office/word/2016/wordml/cid" xmlns:w16="http://schemas.microsoft.com/office/word/2018/wordml" xmlns:w16du="http://schemas.microsoft.com/office/word/2023/wordml/word16du" xmlns:w16sdtdh="http://schemas.microsoft.com/office/word/2020/wordml/sdtdatahash" xmlns:w16sdtfl="http://schemas.microsoft.com/office/word/2024/wordml/sdtformatlock" xmlns:w16se="http://schemas.microsoft.com/office/word/2015/wordml/symex" xmlns:wpg="http://schemas.microsoft.com/office/word/2010/wordprocessingGroup" xmlns:wpi="http://schemas.microsoft.com/office/word/2010/wordprocessingInk" xmlns:wne="http://schemas.microsoft.com/office/word/2006/wordml" xmlns:wps="http://schemas.microsoft.com/office/word/2010/wordprocessingShape" mc:Ignorable="w14 w15 w16se w16cid w16 w16cex w16sdtdh w16sdtfl w16du wp14">
   <w:footnote w:type="separator" w:id="-1">
     <w:p>
       <w:pPr>
@@ -3115,7 +2294,7 @@
 </file>
 
 <file path=word/header1.xml><?xml version="1.0" encoding="utf-8"?>
-<w:hdr xmlns:wpc="http://schemas.microsoft.com/office/word/2010/wordprocessingCanvas" xmlns:cx="http://schemas.microsoft.com/office/drawing/2014/chartex" xmlns:cx1="http://schemas.microsoft.com/office/drawing/2015/9/8/chartex" xmlns:cx2="http://schemas.microsoft.com/office/drawing/2015/10/21/chartex" xmlns:cx3="http://schemas.microsoft.com/office/drawing/2016/5/9/chartex" xmlns:cx4="http://schemas.microsoft.com/office/drawing/2016/5/10/chartex" xmlns:cx5="http://schemas.microsoft.com/office/drawing/2016/5/11/chartex" xmlns:cx6="http://schemas.microsoft.com/office/drawing/2016/5/12/chartex" xmlns:cx7="http://schemas.microsoft.com/office/drawing/2016/5/13/chartex" xmlns:cx8="http://schemas.microsoft.com/office/drawing/2016/5/14/chartex" xmlns:mc="http://schemas.openxmlformats.org/markup-compatibility/2006" xmlns:aink="http://schemas.microsoft.com/office/drawing/2016/ink" xmlns:am3d="http://schemas.microsoft.com/office/drawing/2017/model3d" xmlns:o="urn:schemas-microsoft-com:office:office" xmlns:r="http://schemas.openxmlformats.org/officeDocument/2006/relationships" xmlns:m="http://schemas.openxmlformats.org/officeDocument/2006/math" xmlns:v="urn:schemas-microsoft-com:vml" xmlns:wp14="http://schemas.microsoft.com/office/word/2010/wordprocessingDrawing" xmlns:wp="http://schemas.openxmlformats.org/drawingml/2006/wordprocessingDrawing" xmlns:w10="urn:schemas-microsoft-com:office:word" xmlns:w="http://schemas.openxmlformats.org/wordprocessingml/2006/main" xmlns:w14="http://schemas.microsoft.com/office/word/2010/wordml" xmlns:w15="http://schemas.microsoft.com/office/word/2012/wordml" xmlns:w16cid="http://schemas.microsoft.com/office/word/2016/wordml/cid" xmlns:w16se="http://schemas.microsoft.com/office/word/2015/wordml/symex" xmlns:wpg="http://schemas.microsoft.com/office/word/2010/wordprocessingGroup" xmlns:wpi="http://schemas.microsoft.com/office/word/2010/wordprocessingInk" xmlns:wne="http://schemas.microsoft.com/office/word/2006/wordml" xmlns:wps="http://schemas.microsoft.com/office/word/2010/wordprocessingShape" mc:Ignorable="w14 w15 w16se w16cid wp14">
+<w:hdr xmlns:wpc="http://schemas.microsoft.com/office/word/2010/wordprocessingCanvas" xmlns:cx="http://schemas.microsoft.com/office/drawing/2014/chartex" xmlns:cx1="http://schemas.microsoft.com/office/drawing/2015/9/8/chartex" xmlns:cx2="http://schemas.microsoft.com/office/drawing/2015/10/21/chartex" xmlns:cx3="http://schemas.microsoft.com/office/drawing/2016/5/9/chartex" xmlns:cx4="http://schemas.microsoft.com/office/drawing/2016/5/10/chartex" xmlns:cx5="http://schemas.microsoft.com/office/drawing/2016/5/11/chartex" xmlns:cx6="http://schemas.microsoft.com/office/drawing/2016/5/12/chartex" xmlns:cx7="http://schemas.microsoft.com/office/drawing/2016/5/13/chartex" xmlns:cx8="http://schemas.microsoft.com/office/drawing/2016/5/14/chartex" xmlns:mc="http://schemas.openxmlformats.org/markup-compatibility/2006" xmlns:aink="http://schemas.microsoft.com/office/drawing/2016/ink" xmlns:am3d="http://schemas.microsoft.com/office/drawing/2017/model3d" xmlns:o="urn:schemas-microsoft-com:office:office" xmlns:oel="http://schemas.microsoft.com/office/2019/extlst" xmlns:r="http://schemas.openxmlformats.org/officeDocument/2006/relationships" xmlns:m="http://schemas.openxmlformats.org/officeDocument/2006/math" xmlns:v="urn:schemas-microsoft-com:vml" xmlns:wp14="http://schemas.microsoft.com/office/word/2010/wordprocessingDrawing" xmlns:wp="http://schemas.openxmlformats.org/drawingml/2006/wordprocessingDrawing" xmlns:w10="urn:schemas-microsoft-com:office:word" xmlns:w="http://schemas.openxmlformats.org/wordprocessingml/2006/main" xmlns:w14="http://schemas.microsoft.com/office/word/2010/wordml" xmlns:w15="http://schemas.microsoft.com/office/word/2012/wordml" xmlns:w16cex="http://schemas.microsoft.com/office/word/2018/wordml/cex" xmlns:w16cid="http://schemas.microsoft.com/office/word/2016/wordml/cid" xmlns:w16="http://schemas.microsoft.com/office/word/2018/wordml" xmlns:w16du="http://schemas.microsoft.com/office/word/2023/wordml/word16du" xmlns:w16sdtdh="http://schemas.microsoft.com/office/word/2020/wordml/sdtdatahash" xmlns:w16sdtfl="http://schemas.microsoft.com/office/word/2024/wordml/sdtformatlock" xmlns:w16se="http://schemas.microsoft.com/office/word/2015/wordml/symex" xmlns:wpg="http://schemas.microsoft.com/office/word/2010/wordprocessingGroup" xmlns:wpi="http://schemas.microsoft.com/office/word/2010/wordprocessingInk" xmlns:wne="http://schemas.microsoft.com/office/word/2006/wordml" xmlns:wps="http://schemas.microsoft.com/office/word/2010/wordprocessingShape" mc:Ignorable="w14 w15 w16se w16cid w16 w16cex w16sdtdh w16sdtfl w16du wp14">
   <w:p>
     <w:pPr>
       <w:pStyle w:val="Intestazione"/>
@@ -3128,7 +2307,7 @@
 </file>
 
 <file path=word/numbering.xml><?xml version="1.0" encoding="utf-8"?>
-<w:numbering xmlns:wpc="http://schemas.microsoft.com/office/word/2010/wordprocessingCanvas" xmlns:cx="http://schemas.microsoft.com/office/drawing/2014/chartex" xmlns:cx1="http://schemas.microsoft.com/office/drawing/2015/9/8/chartex" xmlns:cx2="http://schemas.microsoft.com/office/drawing/2015/10/21/chartex" xmlns:cx3="http://schemas.microsoft.com/office/drawing/2016/5/9/chartex" xmlns:cx4="http://schemas.microsoft.com/office/drawing/2016/5/10/chartex" xmlns:cx5="http://schemas.microsoft.com/office/drawing/2016/5/11/chartex" xmlns:cx6="http://schemas.microsoft.com/office/drawing/2016/5/12/chartex" xmlns:cx7="http://schemas.microsoft.com/office/drawing/2016/5/13/chartex" xmlns:cx8="http://schemas.microsoft.com/office/drawing/2016/5/14/chartex" xmlns:mc="http://schemas.openxmlformats.org/markup-compatibility/2006" xmlns:aink="http://schemas.microsoft.com/office/drawing/2016/ink" xmlns:am3d="http://schemas.microsoft.com/office/drawing/2017/model3d" xmlns:o="urn:schemas-microsoft-com:office:office" xmlns:r="http://schemas.openxmlformats.org/officeDocument/2006/relationships" xmlns:m="http://schemas.openxmlformats.org/officeDocument/2006/math" xmlns:v="urn:schemas-microsoft-com:vml" xmlns:wp14="http://schemas.microsoft.com/office/word/2010/wordprocessingDrawing" xmlns:wp="http://schemas.openxmlformats.org/drawingml/2006/wordprocessingDrawing" xmlns:w10="urn:schemas-microsoft-com:office:word" xmlns:w="http://schemas.openxmlformats.org/wordprocessingml/2006/main" xmlns:w14="http://schemas.microsoft.com/office/word/2010/wordml" xmlns:w15="http://schemas.microsoft.com/office/word/2012/wordml" xmlns:w16cid="http://schemas.microsoft.com/office/word/2016/wordml/cid" xmlns:w16se="http://schemas.microsoft.com/office/word/2015/wordml/symex" xmlns:wpg="http://schemas.microsoft.com/office/word/2010/wordprocessingGroup" xmlns:wpi="http://schemas.microsoft.com/office/word/2010/wordprocessingInk" xmlns:wne="http://schemas.microsoft.com/office/word/2006/wordml" xmlns:wps="http://schemas.microsoft.com/office/word/2010/wordprocessingShape" mc:Ignorable="w14 w15 w16se w16cid wp14">
+<w:numbering xmlns:wpc="http://schemas.microsoft.com/office/word/2010/wordprocessingCanvas" xmlns:cx="http://schemas.microsoft.com/office/drawing/2014/chartex" xmlns:cx1="http://schemas.microsoft.com/office/drawing/2015/9/8/chartex" xmlns:cx2="http://schemas.microsoft.com/office/drawing/2015/10/21/chartex" xmlns:cx3="http://schemas.microsoft.com/office/drawing/2016/5/9/chartex" xmlns:cx4="http://schemas.microsoft.com/office/drawing/2016/5/10/chartex" xmlns:cx5="http://schemas.microsoft.com/office/drawing/2016/5/11/chartex" xmlns:cx6="http://schemas.microsoft.com/office/drawing/2016/5/12/chartex" xmlns:cx7="http://schemas.microsoft.com/office/drawing/2016/5/13/chartex" xmlns:cx8="http://schemas.microsoft.com/office/drawing/2016/5/14/chartex" xmlns:mc="http://schemas.openxmlformats.org/markup-compatibility/2006" xmlns:aink="http://schemas.microsoft.com/office/drawing/2016/ink" xmlns:am3d="http://schemas.microsoft.com/office/drawing/2017/model3d" xmlns:o="urn:schemas-microsoft-com:office:office" xmlns:oel="http://schemas.microsoft.com/office/2019/extlst" xmlns:r="http://schemas.openxmlformats.org/officeDocument/2006/relationships" xmlns:m="http://schemas.openxmlformats.org/officeDocument/2006/math" xmlns:v="urn:schemas-microsoft-com:vml" xmlns:wp14="http://schemas.microsoft.com/office/word/2010/wordprocessingDrawing" xmlns:wp="http://schemas.openxmlformats.org/drawingml/2006/wordprocessingDrawing" xmlns:w10="urn:schemas-microsoft-com:office:word" xmlns:w="http://schemas.openxmlformats.org/wordprocessingml/2006/main" xmlns:w14="http://schemas.microsoft.com/office/word/2010/wordml" xmlns:w15="http://schemas.microsoft.com/office/word/2012/wordml" xmlns:w16cex="http://schemas.microsoft.com/office/word/2018/wordml/cex" xmlns:w16cid="http://schemas.microsoft.com/office/word/2016/wordml/cid" xmlns:w16="http://schemas.microsoft.com/office/word/2018/wordml" xmlns:w16du="http://schemas.microsoft.com/office/word/2023/wordml/word16du" xmlns:w16sdtdh="http://schemas.microsoft.com/office/word/2020/wordml/sdtdatahash" xmlns:w16sdtfl="http://schemas.microsoft.com/office/word/2024/wordml/sdtformatlock" xmlns:w16se="http://schemas.microsoft.com/office/word/2015/wordml/symex" xmlns:wpg="http://schemas.microsoft.com/office/word/2010/wordprocessingGroup" xmlns:wpi="http://schemas.microsoft.com/office/word/2010/wordprocessingInk" xmlns:wne="http://schemas.microsoft.com/office/word/2006/wordml" xmlns:wps="http://schemas.microsoft.com/office/word/2010/wordprocessingShape" mc:Ignorable="w14 w15 w16se w16cid w16 w16cex w16sdtdh w16sdtfl w16du wp14">
   <w:abstractNum w:abstractNumId="0" w15:restartNumberingAfterBreak="0">
     <w:nsid w:val="0EDA6935"/>
     <w:multiLevelType w:val="hybridMultilevel"/>
@@ -4451,47 +3630,47 @@
       </w:rPr>
     </w:lvl>
   </w:abstractNum>
-  <w:num w:numId="1">
+  <w:num w:numId="1" w16cid:durableId="910654282">
     <w:abstractNumId w:val="0"/>
   </w:num>
-  <w:num w:numId="2">
+  <w:num w:numId="2" w16cid:durableId="1083721290">
     <w:abstractNumId w:val="4"/>
   </w:num>
-  <w:num w:numId="3">
+  <w:num w:numId="3" w16cid:durableId="880093121">
     <w:abstractNumId w:val="10"/>
   </w:num>
-  <w:num w:numId="4">
+  <w:num w:numId="4" w16cid:durableId="819421787">
     <w:abstractNumId w:val="6"/>
   </w:num>
-  <w:num w:numId="5">
+  <w:num w:numId="5" w16cid:durableId="1884562210">
     <w:abstractNumId w:val="7"/>
   </w:num>
-  <w:num w:numId="6">
+  <w:num w:numId="6" w16cid:durableId="1291397527">
     <w:abstractNumId w:val="2"/>
   </w:num>
-  <w:num w:numId="7">
+  <w:num w:numId="7" w16cid:durableId="837428081">
     <w:abstractNumId w:val="9"/>
   </w:num>
-  <w:num w:numId="8">
+  <w:num w:numId="8" w16cid:durableId="510803690">
     <w:abstractNumId w:val="1"/>
   </w:num>
-  <w:num w:numId="9">
+  <w:num w:numId="9" w16cid:durableId="1355696199">
     <w:abstractNumId w:val="11"/>
   </w:num>
-  <w:num w:numId="10">
+  <w:num w:numId="10" w16cid:durableId="1844664824">
     <w:abstractNumId w:val="5"/>
   </w:num>
-  <w:num w:numId="11">
+  <w:num w:numId="11" w16cid:durableId="2118016449">
     <w:abstractNumId w:val="3"/>
   </w:num>
-  <w:num w:numId="12">
+  <w:num w:numId="12" w16cid:durableId="152920272">
     <w:abstractNumId w:val="8"/>
   </w:num>
 </w:numbering>
 </file>
 
 <file path=word/styles.xml><?xml version="1.0" encoding="utf-8"?>
-<w:styles xmlns:mc="http://schemas.openxmlformats.org/markup-compatibility/2006" xmlns:r="http://schemas.openxmlformats.org/officeDocument/2006/relationships" xmlns:w="http://schemas.openxmlformats.org/wordprocessingml/2006/main" xmlns:w14="http://schemas.microsoft.com/office/word/2010/wordml" xmlns:w15="http://schemas.microsoft.com/office/word/2012/wordml" xmlns:w16cid="http://schemas.microsoft.com/office/word/2016/wordml/cid" xmlns:w16se="http://schemas.microsoft.com/office/word/2015/wordml/symex" mc:Ignorable="w14 w15 w16se w16cid">
+<w:styles xmlns:mc="http://schemas.openxmlformats.org/markup-compatibility/2006" xmlns:r="http://schemas.openxmlformats.org/officeDocument/2006/relationships" xmlns:w="http://schemas.openxmlformats.org/wordprocessingml/2006/main" xmlns:w14="http://schemas.microsoft.com/office/word/2010/wordml" xmlns:w15="http://schemas.microsoft.com/office/word/2012/wordml" xmlns:w16cex="http://schemas.microsoft.com/office/word/2018/wordml/cex" xmlns:w16cid="http://schemas.microsoft.com/office/word/2016/wordml/cid" xmlns:w16="http://schemas.microsoft.com/office/word/2018/wordml" xmlns:w16du="http://schemas.microsoft.com/office/word/2023/wordml/word16du" xmlns:w16sdtdh="http://schemas.microsoft.com/office/word/2020/wordml/sdtdatahash" xmlns:w16sdtfl="http://schemas.microsoft.com/office/word/2024/wordml/sdtformatlock" xmlns:w16se="http://schemas.microsoft.com/office/word/2015/wordml/symex" mc:Ignorable="w14 w15 w16se w16cid w16 w16cex w16sdtdh w16sdtfl w16du">
   <w:docDefaults>
     <w:rPrDefault>
       <w:rPr>
@@ -4507,7 +3686,7 @@
       </w:pPr>
     </w:pPrDefault>
   </w:docDefaults>
-  <w:latentStyles w:defLockedState="0" w:defUIPriority="99" w:defSemiHidden="0" w:defUnhideWhenUsed="0" w:defQFormat="0" w:count="375">
+  <w:latentStyles w:defLockedState="0" w:defUIPriority="99" w:defSemiHidden="0" w:defUnhideWhenUsed="0" w:defQFormat="0" w:count="376">
     <w:lsdException w:name="Normal" w:uiPriority="0" w:qFormat="1"/>
     <w:lsdException w:name="heading 1" w:uiPriority="9" w:qFormat="1"/>
     <w:lsdException w:name="heading 2" w:semiHidden="1" w:uiPriority="9" w:unhideWhenUsed="1" w:qFormat="1"/>
@@ -4883,6 +4062,7 @@
     <w:lsdException w:name="Smart Hyperlink" w:semiHidden="1" w:unhideWhenUsed="1"/>
     <w:lsdException w:name="Hashtag" w:semiHidden="1" w:unhideWhenUsed="1"/>
     <w:lsdException w:name="Unresolved Mention" w:semiHidden="1" w:unhideWhenUsed="1"/>
+    <w:lsdException w:name="Smart Link" w:semiHidden="1" w:unhideWhenUsed="1"/>
   </w:latentStyles>
   <w:style w:type="paragraph" w:default="1" w:styleId="Normale">
     <w:name w:val="Normal"/>

</xml_diff>

<commit_message>
UPDATE - add API endpoint for activating announcements
</commit_message>
<xml_diff>
--- a/StudentHome/bozza_relazione.docx
+++ b/StudentHome/bozza_relazione.docx
@@ -1778,6 +1778,28 @@
           <w:szCs w:val="22"/>
         </w:rPr>
         <w:t>/api/annunci/modifica/:id</w:t>
+      </w:r>
+    </w:p>
+    <w:p>
+      <w:pPr>
+        <w:pStyle w:val="Testonormale"/>
+        <w:numPr>
+          <w:ilvl w:val="0"/>
+          <w:numId w:val="3"/>
+        </w:numPr>
+        <w:rPr>
+          <w:rFonts w:ascii="Century Gothic" w:hAnsi="Century Gothic" w:cs="Courier New"/>
+          <w:sz w:val="22"/>
+          <w:szCs w:val="22"/>
+        </w:rPr>
+      </w:pPr>
+      <w:r>
+        <w:rPr>
+          <w:rFonts w:ascii="Century Gothic" w:hAnsi="Century Gothic" w:cs="Courier New"/>
+          <w:sz w:val="22"/>
+          <w:szCs w:val="22"/>
+        </w:rPr>
+        <w:t>/api/annunci/attiva/:id</w:t>
       </w:r>
     </w:p>
     <w:p>
@@ -4190,6 +4212,17 @@
     <w:uiPriority w:val="99"/>
     <w:rsid w:val="00155228"/>
   </w:style>
+  <w:style w:type="paragraph" w:styleId="Paragrafoelenco">
+    <w:name w:val="List Paragraph"/>
+    <w:basedOn w:val="Normale"/>
+    <w:uiPriority w:val="34"/>
+    <w:qFormat/>
+    <w:rsid w:val="000C4043"/>
+    <w:pPr>
+      <w:ind w:left="720"/>
+      <w:contextualSpacing/>
+    </w:pPr>
+  </w:style>
 </w:styles>
 </file>
 

</xml_diff>

<commit_message>
UPDATE - correct phrasing for enabling inactive announcements in README and bozza_relazione.docx
</commit_message>
<xml_diff>
--- a/StudentHome/bozza_relazione.docx
+++ b/StudentHome/bozza_relazione.docx
@@ -631,7 +631,13 @@
         <w:rPr>
           <w:rFonts w:ascii="Century Gothic" w:hAnsi="Century Gothic" w:cs="Courier New"/>
         </w:rPr>
-        <w:t>Attraverso il DB possono abilitare gli annunci non attivi</w:t>
+        <w:t>A</w:t>
+      </w:r>
+      <w:r>
+        <w:rPr>
+          <w:rFonts w:ascii="Century Gothic" w:hAnsi="Century Gothic" w:cs="Courier New"/>
+        </w:rPr>
+        <w:t>bilitare gli annunci non attivi</w:t>
       </w:r>
     </w:p>
     <w:p>

</xml_diff>